<commit_message>
Optimize CV: restructure offshore site experience details in classic_cv.html and convert_to_word.py to use exactly Company, Client, Project, Duration, Vessel/Barge, Position Title structure, regenerate Muhammad_Amin_Azman_CV.docx
</commit_message>
<xml_diff>
--- a/Muhammad_Amin_Azman_CV.docx
+++ b/Muhammad_Amin_Azman_CV.docx
@@ -2410,17 +2410,6 @@
         <w:t>OFFSHORE/SITE EXPERIENCE</w:t>
       </w:r>
     </w:p>
-    <w:p>
-      <w:r>
-        <w:rPr>
-          <w:rFonts w:ascii="Arial" w:hAnsi="Arial"/>
-          <w:b/>
-          <w:color w:val="0F172A"/>
-          <w:sz w:val="21"/>
-        </w:rPr>
-        <w:t>SAPURA SUBSEA SERVICES SDN BHD</w:t>
-      </w:r>
-    </w:p>
     <w:tbl>
       <w:tblPr>
         <w:tblW w:type="auto" w:w="0"/>
@@ -2432,6 +2421,84 @@
         <w:gridCol w:w="3360"/>
         <w:gridCol w:w="3360"/>
       </w:tblGrid>
+      <w:tr>
+        <w:trPr>
+          <w:cantSplit/>
+        </w:trPr>
+        <w:tc>
+          <w:tcPr>
+            <w:tcW w:type="dxa" w:w="2592"/>
+            <w:tcMar>
+              <w:top w:w="60" w:type="dxa"/>
+              <w:bottom w:w="60" w:type="dxa"/>
+              <w:left w:w="0" w:type="dxa"/>
+              <w:right w:w="50" w:type="dxa"/>
+            </w:tcMar>
+          </w:tcPr>
+          <w:p>
+            <w:pPr>
+              <w:spacing w:before="40" w:after="40"/>
+            </w:pPr>
+            <w:r>
+              <w:rPr>
+                <w:rFonts w:ascii="Arial" w:hAnsi="Arial"/>
+                <w:b/>
+                <w:color w:val="475569"/>
+                <w:sz w:val="19"/>
+              </w:rPr>
+              <w:t>Company</w:t>
+            </w:r>
+          </w:p>
+        </w:tc>
+        <w:tc>
+          <w:tcPr>
+            <w:tcW w:type="dxa" w:w="288"/>
+            <w:tcMar>
+              <w:top w:w="60" w:type="dxa"/>
+              <w:bottom w:w="60" w:type="dxa"/>
+              <w:left w:w="0" w:type="dxa"/>
+              <w:right w:w="0" w:type="dxa"/>
+            </w:tcMar>
+          </w:tcPr>
+          <w:p>
+            <w:pPr>
+              <w:spacing w:before="40" w:after="40"/>
+            </w:pPr>
+            <w:r>
+              <w:rPr>
+                <w:rFonts w:ascii="Arial" w:hAnsi="Arial"/>
+                <w:color w:val="94A3B8"/>
+                <w:sz w:val="19"/>
+              </w:rPr>
+              <w:t>:</w:t>
+            </w:r>
+          </w:p>
+        </w:tc>
+        <w:tc>
+          <w:tcPr>
+            <w:tcW w:type="dxa" w:w="7200"/>
+            <w:tcMar>
+              <w:top w:w="60" w:type="dxa"/>
+              <w:bottom w:w="60" w:type="dxa"/>
+              <w:left w:w="50" w:type="dxa"/>
+              <w:right w:w="0" w:type="dxa"/>
+            </w:tcMar>
+          </w:tcPr>
+          <w:p>
+            <w:pPr>
+              <w:spacing w:before="40" w:after="40"/>
+            </w:pPr>
+            <w:r>
+              <w:rPr>
+                <w:rFonts w:ascii="Arial" w:hAnsi="Arial"/>
+                <w:color w:val="0F172A"/>
+                <w:sz w:val="19"/>
+              </w:rPr>
+              <w:t>Sapura Subsea Services Sdn Bhd</w:t>
+            </w:r>
+          </w:p>
+        </w:tc>
+      </w:tr>
       <w:tr>
         <w:trPr>
           <w:cantSplit/>
@@ -2583,7 +2650,7 @@
                 <w:color w:val="0F172A"/>
                 <w:sz w:val="19"/>
               </w:rPr>
-              <w:t>Major Platform Inspection at Tangga Barat Field by Mini ROV</w:t>
+              <w:t>Major Platform Inspection at Tangga Barat Field by Mini ROV (Platform TBCP, Tangga Barat Field, Terengganu Waters, Malaysia)</w:t>
             </w:r>
           </w:p>
         </w:tc>
@@ -2691,7 +2758,7 @@
                 <w:color w:val="475569"/>
                 <w:sz w:val="19"/>
               </w:rPr>
-              <w:t>Platform/Vessel</w:t>
+              <w:t>Vessel/Barge</w:t>
             </w:r>
           </w:p>
         </w:tc>
@@ -2739,7 +2806,6 @@
                 <w:color w:val="0F172A"/>
                 <w:sz w:val="19"/>
               </w:rPr>
-              <w:t>Platform TBCP</w:t>
             </w:r>
           </w:p>
         </w:tc>
@@ -2906,17 +2972,6 @@
       </w:r>
     </w:p>
     <w:p/>
-    <w:p>
-      <w:r>
-        <w:rPr>
-          <w:rFonts w:ascii="Arial" w:hAnsi="Arial"/>
-          <w:b/>
-          <w:color w:val="0F172A"/>
-          <w:sz w:val="21"/>
-        </w:rPr>
-        <w:t>TANJUNG OFFSHORE SERVICES SDN BHD</w:t>
-      </w:r>
-    </w:p>
     <w:tbl>
       <w:tblPr>
         <w:tblW w:type="auto" w:w="0"/>
@@ -2928,6 +2983,84 @@
         <w:gridCol w:w="3360"/>
         <w:gridCol w:w="3360"/>
       </w:tblGrid>
+      <w:tr>
+        <w:trPr>
+          <w:cantSplit/>
+        </w:trPr>
+        <w:tc>
+          <w:tcPr>
+            <w:tcW w:type="dxa" w:w="2592"/>
+            <w:tcMar>
+              <w:top w:w="60" w:type="dxa"/>
+              <w:bottom w:w="60" w:type="dxa"/>
+              <w:left w:w="0" w:type="dxa"/>
+              <w:right w:w="50" w:type="dxa"/>
+            </w:tcMar>
+          </w:tcPr>
+          <w:p>
+            <w:pPr>
+              <w:spacing w:before="40" w:after="40"/>
+            </w:pPr>
+            <w:r>
+              <w:rPr>
+                <w:rFonts w:ascii="Arial" w:hAnsi="Arial"/>
+                <w:b/>
+                <w:color w:val="475569"/>
+                <w:sz w:val="19"/>
+              </w:rPr>
+              <w:t>Company</w:t>
+            </w:r>
+          </w:p>
+        </w:tc>
+        <w:tc>
+          <w:tcPr>
+            <w:tcW w:type="dxa" w:w="288"/>
+            <w:tcMar>
+              <w:top w:w="60" w:type="dxa"/>
+              <w:bottom w:w="60" w:type="dxa"/>
+              <w:left w:w="0" w:type="dxa"/>
+              <w:right w:w="0" w:type="dxa"/>
+            </w:tcMar>
+          </w:tcPr>
+          <w:p>
+            <w:pPr>
+              <w:spacing w:before="40" w:after="40"/>
+            </w:pPr>
+            <w:r>
+              <w:rPr>
+                <w:rFonts w:ascii="Arial" w:hAnsi="Arial"/>
+                <w:color w:val="94A3B8"/>
+                <w:sz w:val="19"/>
+              </w:rPr>
+              <w:t>:</w:t>
+            </w:r>
+          </w:p>
+        </w:tc>
+        <w:tc>
+          <w:tcPr>
+            <w:tcW w:type="dxa" w:w="7200"/>
+            <w:tcMar>
+              <w:top w:w="60" w:type="dxa"/>
+              <w:bottom w:w="60" w:type="dxa"/>
+              <w:left w:w="50" w:type="dxa"/>
+              <w:right w:w="0" w:type="dxa"/>
+            </w:tcMar>
+          </w:tcPr>
+          <w:p>
+            <w:pPr>
+              <w:spacing w:before="40" w:after="40"/>
+            </w:pPr>
+            <w:r>
+              <w:rPr>
+                <w:rFonts w:ascii="Arial" w:hAnsi="Arial"/>
+                <w:color w:val="0F172A"/>
+                <w:sz w:val="19"/>
+              </w:rPr>
+              <w:t>Tanjung Offshore Services Sdn Bhd</w:t>
+            </w:r>
+          </w:p>
+        </w:tc>
+      </w:tr>
       <w:tr>
         <w:trPr>
           <w:cantSplit/>
@@ -3079,7 +3212,7 @@
                 <w:color w:val="0F172A"/>
                 <w:sz w:val="19"/>
               </w:rPr>
-              <w:t>Subsea intermediate inspection for Class &amp; Statutory Certification</w:t>
+              <w:t>Subsea intermediate inspection for Class &amp; Statutory Certification (Bayan Field, Sarawak Waters)</w:t>
             </w:r>
           </w:p>
         </w:tc>
@@ -3187,7 +3320,7 @@
                 <w:color w:val="475569"/>
                 <w:sz w:val="19"/>
               </w:rPr>
-              <w:t>Platform/Vessel</w:t>
+              <w:t>Vessel/Barge</w:t>
             </w:r>
           </w:p>
         </w:tc>
@@ -3235,7 +3368,7 @@
                 <w:color w:val="0F172A"/>
                 <w:sz w:val="19"/>
               </w:rPr>
-              <w:t>T7 Elise MOPU (4-Legged Jack-Up), Bayan Field, Sarawak Waters</w:t>
+              <w:t>T7 Elise MOPU (4-Legged Jack-Up)</w:t>
             </w:r>
           </w:p>
         </w:tc>
@@ -3402,17 +3535,6 @@
       </w:r>
     </w:p>
     <w:p/>
-    <w:p>
-      <w:r>
-        <w:rPr>
-          <w:rFonts w:ascii="Arial" w:hAnsi="Arial"/>
-          <w:b/>
-          <w:color w:val="0F172A"/>
-          <w:sz w:val="21"/>
-        </w:rPr>
-        <w:t>SIRRIHAT SUBSEA SERVICES SDN BHD</w:t>
-      </w:r>
-    </w:p>
     <w:tbl>
       <w:tblPr>
         <w:tblW w:type="auto" w:w="0"/>
@@ -3424,6 +3546,84 @@
         <w:gridCol w:w="3360"/>
         <w:gridCol w:w="3360"/>
       </w:tblGrid>
+      <w:tr>
+        <w:trPr>
+          <w:cantSplit/>
+        </w:trPr>
+        <w:tc>
+          <w:tcPr>
+            <w:tcW w:type="dxa" w:w="2592"/>
+            <w:tcMar>
+              <w:top w:w="60" w:type="dxa"/>
+              <w:bottom w:w="60" w:type="dxa"/>
+              <w:left w:w="0" w:type="dxa"/>
+              <w:right w:w="50" w:type="dxa"/>
+            </w:tcMar>
+          </w:tcPr>
+          <w:p>
+            <w:pPr>
+              <w:spacing w:before="40" w:after="40"/>
+            </w:pPr>
+            <w:r>
+              <w:rPr>
+                <w:rFonts w:ascii="Arial" w:hAnsi="Arial"/>
+                <w:b/>
+                <w:color w:val="475569"/>
+                <w:sz w:val="19"/>
+              </w:rPr>
+              <w:t>Company</w:t>
+            </w:r>
+          </w:p>
+        </w:tc>
+        <w:tc>
+          <w:tcPr>
+            <w:tcW w:type="dxa" w:w="288"/>
+            <w:tcMar>
+              <w:top w:w="60" w:type="dxa"/>
+              <w:bottom w:w="60" w:type="dxa"/>
+              <w:left w:w="0" w:type="dxa"/>
+              <w:right w:w="0" w:type="dxa"/>
+            </w:tcMar>
+          </w:tcPr>
+          <w:p>
+            <w:pPr>
+              <w:spacing w:before="40" w:after="40"/>
+            </w:pPr>
+            <w:r>
+              <w:rPr>
+                <w:rFonts w:ascii="Arial" w:hAnsi="Arial"/>
+                <w:color w:val="94A3B8"/>
+                <w:sz w:val="19"/>
+              </w:rPr>
+              <w:t>:</w:t>
+            </w:r>
+          </w:p>
+        </w:tc>
+        <w:tc>
+          <w:tcPr>
+            <w:tcW w:type="dxa" w:w="7200"/>
+            <w:tcMar>
+              <w:top w:w="60" w:type="dxa"/>
+              <w:bottom w:w="60" w:type="dxa"/>
+              <w:left w:w="50" w:type="dxa"/>
+              <w:right w:w="0" w:type="dxa"/>
+            </w:tcMar>
+          </w:tcPr>
+          <w:p>
+            <w:pPr>
+              <w:spacing w:before="40" w:after="40"/>
+            </w:pPr>
+            <w:r>
+              <w:rPr>
+                <w:rFonts w:ascii="Arial" w:hAnsi="Arial"/>
+                <w:color w:val="0F172A"/>
+                <w:sz w:val="19"/>
+              </w:rPr>
+              <w:t>Sirrihat Subsea Services Sdn Bhd</w:t>
+            </w:r>
+          </w:p>
+        </w:tc>
+      </w:tr>
       <w:tr>
         <w:trPr>
           <w:cantSplit/>
@@ -3575,7 +3775,7 @@
                 <w:color w:val="0F172A"/>
                 <w:sz w:val="19"/>
               </w:rPr>
-              <w:t>Platform Baseline Inspection Campaign</w:t>
+              <w:t>Platform Baseline Inspection Campaign (KSCPP &amp; KSDP-A Platforms, Kasawari Field, Sarawak Waters)</w:t>
             </w:r>
           </w:p>
         </w:tc>
@@ -3683,7 +3883,7 @@
                 <w:color w:val="475569"/>
                 <w:sz w:val="19"/>
               </w:rPr>
-              <w:t>Platform/Vessel</w:t>
+              <w:t>Vessel/Barge</w:t>
             </w:r>
           </w:p>
         </w:tc>
@@ -3731,7 +3931,6 @@
                 <w:color w:val="0F172A"/>
                 <w:sz w:val="19"/>
               </w:rPr>
-              <w:t>KSCPP &amp; KSDP-A Platforms, Kasawari Field, Sarawak Waters</w:t>
             </w:r>
           </w:p>
         </w:tc>
@@ -3898,17 +4097,6 @@
       </w:r>
     </w:p>
     <w:p/>
-    <w:p>
-      <w:r>
-        <w:rPr>
-          <w:rFonts w:ascii="Arial" w:hAnsi="Arial"/>
-          <w:b/>
-          <w:color w:val="0F172A"/>
-          <w:sz w:val="21"/>
-        </w:rPr>
-        <w:t>SAPURA SUBSEA SERVICES</w:t>
-      </w:r>
-    </w:p>
     <w:tbl>
       <w:tblPr>
         <w:tblW w:type="auto" w:w="0"/>
@@ -3920,6 +4108,84 @@
         <w:gridCol w:w="3360"/>
         <w:gridCol w:w="3360"/>
       </w:tblGrid>
+      <w:tr>
+        <w:trPr>
+          <w:cantSplit/>
+        </w:trPr>
+        <w:tc>
+          <w:tcPr>
+            <w:tcW w:type="dxa" w:w="2592"/>
+            <w:tcMar>
+              <w:top w:w="60" w:type="dxa"/>
+              <w:bottom w:w="60" w:type="dxa"/>
+              <w:left w:w="0" w:type="dxa"/>
+              <w:right w:w="50" w:type="dxa"/>
+            </w:tcMar>
+          </w:tcPr>
+          <w:p>
+            <w:pPr>
+              <w:spacing w:before="40" w:after="40"/>
+            </w:pPr>
+            <w:r>
+              <w:rPr>
+                <w:rFonts w:ascii="Arial" w:hAnsi="Arial"/>
+                <w:b/>
+                <w:color w:val="475569"/>
+                <w:sz w:val="19"/>
+              </w:rPr>
+              <w:t>Company</w:t>
+            </w:r>
+          </w:p>
+        </w:tc>
+        <w:tc>
+          <w:tcPr>
+            <w:tcW w:type="dxa" w:w="288"/>
+            <w:tcMar>
+              <w:top w:w="60" w:type="dxa"/>
+              <w:bottom w:w="60" w:type="dxa"/>
+              <w:left w:w="0" w:type="dxa"/>
+              <w:right w:w="0" w:type="dxa"/>
+            </w:tcMar>
+          </w:tcPr>
+          <w:p>
+            <w:pPr>
+              <w:spacing w:before="40" w:after="40"/>
+            </w:pPr>
+            <w:r>
+              <w:rPr>
+                <w:rFonts w:ascii="Arial" w:hAnsi="Arial"/>
+                <w:color w:val="94A3B8"/>
+                <w:sz w:val="19"/>
+              </w:rPr>
+              <w:t>:</w:t>
+            </w:r>
+          </w:p>
+        </w:tc>
+        <w:tc>
+          <w:tcPr>
+            <w:tcW w:type="dxa" w:w="7200"/>
+            <w:tcMar>
+              <w:top w:w="60" w:type="dxa"/>
+              <w:bottom w:w="60" w:type="dxa"/>
+              <w:left w:w="50" w:type="dxa"/>
+              <w:right w:w="0" w:type="dxa"/>
+            </w:tcMar>
+          </w:tcPr>
+          <w:p>
+            <w:pPr>
+              <w:spacing w:before="40" w:after="40"/>
+            </w:pPr>
+            <w:r>
+              <w:rPr>
+                <w:rFonts w:ascii="Arial" w:hAnsi="Arial"/>
+                <w:color w:val="0F172A"/>
+                <w:sz w:val="19"/>
+              </w:rPr>
+              <w:t>Sapura Subsea Services</w:t>
+            </w:r>
+          </w:p>
+        </w:tc>
+      </w:tr>
       <w:tr>
         <w:trPr>
           <w:cantSplit/>
@@ -4071,7 +4337,7 @@
                 <w:color w:val="0F172A"/>
                 <w:sz w:val="19"/>
               </w:rPr>
-              <w:t>Subsea Inspections &amp; Operations Support</w:t>
+              <w:t>Subsea Inspections &amp; Operations Support (SKA Sarawak Waters)</w:t>
             </w:r>
           </w:p>
         </w:tc>
@@ -4179,7 +4445,7 @@
                 <w:color w:val="475569"/>
                 <w:sz w:val="19"/>
               </w:rPr>
-              <w:t>Platform/Vessel</w:t>
+              <w:t>Vessel/Barge</w:t>
             </w:r>
           </w:p>
         </w:tc>
@@ -4227,7 +4493,7 @@
                 <w:color w:val="0F172A"/>
                 <w:sz w:val="19"/>
               </w:rPr>
-              <w:t>Sapura Conquest (Vessel), SKA Sarawak Waters</w:t>
+              <w:t>Sapura Conquest (Vessel)</w:t>
             </w:r>
           </w:p>
         </w:tc>
@@ -4417,17 +4683,6 @@
       </w:r>
     </w:p>
     <w:p/>
-    <w:p>
-      <w:r>
-        <w:rPr>
-          <w:rFonts w:ascii="Arial" w:hAnsi="Arial"/>
-          <w:b/>
-          <w:color w:val="0F172A"/>
-          <w:sz w:val="21"/>
-        </w:rPr>
-        <w:t>ALAM MARITIM RESOURCES BERHAD</w:t>
-      </w:r>
-    </w:p>
     <w:tbl>
       <w:tblPr>
         <w:tblW w:type="auto" w:w="0"/>
@@ -4439,6 +4694,84 @@
         <w:gridCol w:w="3360"/>
         <w:gridCol w:w="3360"/>
       </w:tblGrid>
+      <w:tr>
+        <w:trPr>
+          <w:cantSplit/>
+        </w:trPr>
+        <w:tc>
+          <w:tcPr>
+            <w:tcW w:type="dxa" w:w="2592"/>
+            <w:tcMar>
+              <w:top w:w="60" w:type="dxa"/>
+              <w:bottom w:w="60" w:type="dxa"/>
+              <w:left w:w="0" w:type="dxa"/>
+              <w:right w:w="50" w:type="dxa"/>
+            </w:tcMar>
+          </w:tcPr>
+          <w:p>
+            <w:pPr>
+              <w:spacing w:before="40" w:after="40"/>
+            </w:pPr>
+            <w:r>
+              <w:rPr>
+                <w:rFonts w:ascii="Arial" w:hAnsi="Arial"/>
+                <w:b/>
+                <w:color w:val="475569"/>
+                <w:sz w:val="19"/>
+              </w:rPr>
+              <w:t>Company</w:t>
+            </w:r>
+          </w:p>
+        </w:tc>
+        <w:tc>
+          <w:tcPr>
+            <w:tcW w:type="dxa" w:w="288"/>
+            <w:tcMar>
+              <w:top w:w="60" w:type="dxa"/>
+              <w:bottom w:w="60" w:type="dxa"/>
+              <w:left w:w="0" w:type="dxa"/>
+              <w:right w:w="0" w:type="dxa"/>
+            </w:tcMar>
+          </w:tcPr>
+          <w:p>
+            <w:pPr>
+              <w:spacing w:before="40" w:after="40"/>
+            </w:pPr>
+            <w:r>
+              <w:rPr>
+                <w:rFonts w:ascii="Arial" w:hAnsi="Arial"/>
+                <w:color w:val="94A3B8"/>
+                <w:sz w:val="19"/>
+              </w:rPr>
+              <w:t>:</w:t>
+            </w:r>
+          </w:p>
+        </w:tc>
+        <w:tc>
+          <w:tcPr>
+            <w:tcW w:type="dxa" w:w="7200"/>
+            <w:tcMar>
+              <w:top w:w="60" w:type="dxa"/>
+              <w:bottom w:w="60" w:type="dxa"/>
+              <w:left w:w="50" w:type="dxa"/>
+              <w:right w:w="0" w:type="dxa"/>
+            </w:tcMar>
+          </w:tcPr>
+          <w:p>
+            <w:pPr>
+              <w:spacing w:before="40" w:after="40"/>
+            </w:pPr>
+            <w:r>
+              <w:rPr>
+                <w:rFonts w:ascii="Arial" w:hAnsi="Arial"/>
+                <w:color w:val="0F172A"/>
+                <w:sz w:val="19"/>
+              </w:rPr>
+              <w:t>Alam Maritim Resources Berhad</w:t>
+            </w:r>
+          </w:p>
+        </w:tc>
+      </w:tr>
       <w:tr>
         <w:trPr>
           <w:cantSplit/>
@@ -4590,7 +4923,7 @@
                 <w:color w:val="0F172A"/>
                 <w:sz w:val="19"/>
               </w:rPr>
-              <w:t>Major Platform &amp; Pipeline Inspection Campaign</w:t>
+              <w:t>Major Platform &amp; Pipeline Inspection Campaign (SKA Sarawak Waters)</w:t>
             </w:r>
           </w:p>
         </w:tc>
@@ -4698,7 +5031,7 @@
                 <w:color w:val="475569"/>
                 <w:sz w:val="19"/>
               </w:rPr>
-              <w:t>Platform/Vessel</w:t>
+              <w:t>Vessel/Barge</w:t>
             </w:r>
           </w:p>
         </w:tc>
@@ -4746,7 +5079,7 @@
                 <w:color w:val="0F172A"/>
                 <w:sz w:val="19"/>
               </w:rPr>
-              <w:t>Meo Resolution (Vessel), SKA Sarawak Waters</w:t>
+              <w:t>Meo Resolution (Vessel)</w:t>
             </w:r>
           </w:p>
         </w:tc>
@@ -4913,17 +5246,6 @@
       </w:r>
     </w:p>
     <w:p/>
-    <w:p>
-      <w:r>
-        <w:rPr>
-          <w:rFonts w:ascii="Arial" w:hAnsi="Arial"/>
-          <w:b/>
-          <w:color w:val="0F172A"/>
-          <w:sz w:val="21"/>
-        </w:rPr>
-        <w:t>KL PETROGAS &amp; SURYA NAUTIKA</w:t>
-      </w:r>
-    </w:p>
     <w:tbl>
       <w:tblPr>
         <w:tblW w:type="auto" w:w="0"/>
@@ -4935,6 +5257,84 @@
         <w:gridCol w:w="3360"/>
         <w:gridCol w:w="3360"/>
       </w:tblGrid>
+      <w:tr>
+        <w:trPr>
+          <w:cantSplit/>
+        </w:trPr>
+        <w:tc>
+          <w:tcPr>
+            <w:tcW w:type="dxa" w:w="2592"/>
+            <w:tcMar>
+              <w:top w:w="60" w:type="dxa"/>
+              <w:bottom w:w="60" w:type="dxa"/>
+              <w:left w:w="0" w:type="dxa"/>
+              <w:right w:w="50" w:type="dxa"/>
+            </w:tcMar>
+          </w:tcPr>
+          <w:p>
+            <w:pPr>
+              <w:spacing w:before="40" w:after="40"/>
+            </w:pPr>
+            <w:r>
+              <w:rPr>
+                <w:rFonts w:ascii="Arial" w:hAnsi="Arial"/>
+                <w:b/>
+                <w:color w:val="475569"/>
+                <w:sz w:val="19"/>
+              </w:rPr>
+              <w:t>Company</w:t>
+            </w:r>
+          </w:p>
+        </w:tc>
+        <w:tc>
+          <w:tcPr>
+            <w:tcW w:type="dxa" w:w="288"/>
+            <w:tcMar>
+              <w:top w:w="60" w:type="dxa"/>
+              <w:bottom w:w="60" w:type="dxa"/>
+              <w:left w:w="0" w:type="dxa"/>
+              <w:right w:w="0" w:type="dxa"/>
+            </w:tcMar>
+          </w:tcPr>
+          <w:p>
+            <w:pPr>
+              <w:spacing w:before="40" w:after="40"/>
+            </w:pPr>
+            <w:r>
+              <w:rPr>
+                <w:rFonts w:ascii="Arial" w:hAnsi="Arial"/>
+                <w:color w:val="94A3B8"/>
+                <w:sz w:val="19"/>
+              </w:rPr>
+              <w:t>:</w:t>
+            </w:r>
+          </w:p>
+        </w:tc>
+        <w:tc>
+          <w:tcPr>
+            <w:tcW w:type="dxa" w:w="7200"/>
+            <w:tcMar>
+              <w:top w:w="60" w:type="dxa"/>
+              <w:bottom w:w="60" w:type="dxa"/>
+              <w:left w:w="50" w:type="dxa"/>
+              <w:right w:w="0" w:type="dxa"/>
+            </w:tcMar>
+          </w:tcPr>
+          <w:p>
+            <w:pPr>
+              <w:spacing w:before="40" w:after="40"/>
+            </w:pPr>
+            <w:r>
+              <w:rPr>
+                <w:rFonts w:ascii="Arial" w:hAnsi="Arial"/>
+                <w:color w:val="0F172A"/>
+                <w:sz w:val="19"/>
+              </w:rPr>
+              <w:t>KL Petrogas &amp; Surya Nautika</w:t>
+            </w:r>
+          </w:p>
+        </w:tc>
+      </w:tr>
       <w:tr>
         <w:trPr>
           <w:cantSplit/>
@@ -5086,7 +5486,7 @@
                 <w:color w:val="0F172A"/>
                 <w:sz w:val="19"/>
               </w:rPr>
-              <w:t>Subsea Inspections &amp; Operations Support</w:t>
+              <w:t>Subsea Inspections &amp; Operations Support (MTJDA Malaysia-Thai Waters)</w:t>
             </w:r>
           </w:p>
         </w:tc>
@@ -5194,7 +5594,7 @@
                 <w:color w:val="475569"/>
                 <w:sz w:val="19"/>
               </w:rPr>
-              <w:t>Platform/Vessel</w:t>
+              <w:t>Vessel/Barge</w:t>
             </w:r>
           </w:p>
         </w:tc>
@@ -5242,7 +5642,7 @@
                 <w:color w:val="0F172A"/>
                 <w:sz w:val="19"/>
               </w:rPr>
-              <w:t>Mermaid Sapphire (Vessel), MTJDA Malaysia-Thai Waters</w:t>
+              <w:t>Mermaid Sapphire (Vessel)</w:t>
             </w:r>
           </w:p>
         </w:tc>
@@ -5386,17 +5786,6 @@
       </w:r>
     </w:p>
     <w:p/>
-    <w:p>
-      <w:r>
-        <w:rPr>
-          <w:rFonts w:ascii="Arial" w:hAnsi="Arial"/>
-          <w:b/>
-          <w:color w:val="0F172A"/>
-          <w:sz w:val="21"/>
-        </w:rPr>
-        <w:t>T7 GLOBAL BHD</w:t>
-      </w:r>
-    </w:p>
     <w:tbl>
       <w:tblPr>
         <w:tblW w:type="auto" w:w="0"/>
@@ -5408,6 +5797,84 @@
         <w:gridCol w:w="3360"/>
         <w:gridCol w:w="3360"/>
       </w:tblGrid>
+      <w:tr>
+        <w:trPr>
+          <w:cantSplit/>
+        </w:trPr>
+        <w:tc>
+          <w:tcPr>
+            <w:tcW w:type="dxa" w:w="2592"/>
+            <w:tcMar>
+              <w:top w:w="60" w:type="dxa"/>
+              <w:bottom w:w="60" w:type="dxa"/>
+              <w:left w:w="0" w:type="dxa"/>
+              <w:right w:w="50" w:type="dxa"/>
+            </w:tcMar>
+          </w:tcPr>
+          <w:p>
+            <w:pPr>
+              <w:spacing w:before="40" w:after="40"/>
+            </w:pPr>
+            <w:r>
+              <w:rPr>
+                <w:rFonts w:ascii="Arial" w:hAnsi="Arial"/>
+                <w:b/>
+                <w:color w:val="475569"/>
+                <w:sz w:val="19"/>
+              </w:rPr>
+              <w:t>Company</w:t>
+            </w:r>
+          </w:p>
+        </w:tc>
+        <w:tc>
+          <w:tcPr>
+            <w:tcW w:type="dxa" w:w="288"/>
+            <w:tcMar>
+              <w:top w:w="60" w:type="dxa"/>
+              <w:bottom w:w="60" w:type="dxa"/>
+              <w:left w:w="0" w:type="dxa"/>
+              <w:right w:w="0" w:type="dxa"/>
+            </w:tcMar>
+          </w:tcPr>
+          <w:p>
+            <w:pPr>
+              <w:spacing w:before="40" w:after="40"/>
+            </w:pPr>
+            <w:r>
+              <w:rPr>
+                <w:rFonts w:ascii="Arial" w:hAnsi="Arial"/>
+                <w:color w:val="94A3B8"/>
+                <w:sz w:val="19"/>
+              </w:rPr>
+              <w:t>:</w:t>
+            </w:r>
+          </w:p>
+        </w:tc>
+        <w:tc>
+          <w:tcPr>
+            <w:tcW w:type="dxa" w:w="7200"/>
+            <w:tcMar>
+              <w:top w:w="60" w:type="dxa"/>
+              <w:bottom w:w="60" w:type="dxa"/>
+              <w:left w:w="50" w:type="dxa"/>
+              <w:right w:w="0" w:type="dxa"/>
+            </w:tcMar>
+          </w:tcPr>
+          <w:p>
+            <w:pPr>
+              <w:spacing w:before="40" w:after="40"/>
+            </w:pPr>
+            <w:r>
+              <w:rPr>
+                <w:rFonts w:ascii="Arial" w:hAnsi="Arial"/>
+                <w:color w:val="0F172A"/>
+                <w:sz w:val="19"/>
+              </w:rPr>
+              <w:t>T7 Global Bhd</w:t>
+            </w:r>
+          </w:p>
+        </w:tc>
+      </w:tr>
       <w:tr>
         <w:trPr>
           <w:cantSplit/>
@@ -5559,7 +6026,7 @@
                 <w:color w:val="0F172A"/>
                 <w:sz w:val="19"/>
               </w:rPr>
-              <w:t>Dulang PMA Major Platform Inspection</w:t>
+              <w:t>Dulang PMA Major Platform Inspection (Dulang PMA Field, Terengganu Waters, Malaysia)</w:t>
             </w:r>
           </w:p>
         </w:tc>
@@ -5667,7 +6134,7 @@
                 <w:color w:val="475569"/>
                 <w:sz w:val="19"/>
               </w:rPr>
-              <w:t>Platform/Vessel</w:t>
+              <w:t>Vessel/Barge</w:t>
             </w:r>
           </w:p>
         </w:tc>
@@ -5715,7 +6182,7 @@
                 <w:color w:val="0F172A"/>
                 <w:sz w:val="19"/>
               </w:rPr>
-              <w:t>AWB Petra (Vessel), Dulang PMA Field, Terengganu Waters, Malaysia</w:t>
+              <w:t>AWB Petra (Vessel)</w:t>
             </w:r>
           </w:p>
         </w:tc>
@@ -5859,17 +6326,6 @@
       </w:r>
     </w:p>
     <w:p/>
-    <w:p>
-      <w:r>
-        <w:rPr>
-          <w:rFonts w:ascii="Arial" w:hAnsi="Arial"/>
-          <w:b/>
-          <w:color w:val="0F172A"/>
-          <w:sz w:val="21"/>
-        </w:rPr>
-        <w:t>T7 GLOBAL BHD</w:t>
-      </w:r>
-    </w:p>
     <w:tbl>
       <w:tblPr>
         <w:tblW w:type="auto" w:w="0"/>
@@ -5881,6 +6337,84 @@
         <w:gridCol w:w="3360"/>
         <w:gridCol w:w="3360"/>
       </w:tblGrid>
+      <w:tr>
+        <w:trPr>
+          <w:cantSplit/>
+        </w:trPr>
+        <w:tc>
+          <w:tcPr>
+            <w:tcW w:type="dxa" w:w="2592"/>
+            <w:tcMar>
+              <w:top w:w="60" w:type="dxa"/>
+              <w:bottom w:w="60" w:type="dxa"/>
+              <w:left w:w="0" w:type="dxa"/>
+              <w:right w:w="50" w:type="dxa"/>
+            </w:tcMar>
+          </w:tcPr>
+          <w:p>
+            <w:pPr>
+              <w:spacing w:before="40" w:after="40"/>
+            </w:pPr>
+            <w:r>
+              <w:rPr>
+                <w:rFonts w:ascii="Arial" w:hAnsi="Arial"/>
+                <w:b/>
+                <w:color w:val="475569"/>
+                <w:sz w:val="19"/>
+              </w:rPr>
+              <w:t>Company</w:t>
+            </w:r>
+          </w:p>
+        </w:tc>
+        <w:tc>
+          <w:tcPr>
+            <w:tcW w:type="dxa" w:w="288"/>
+            <w:tcMar>
+              <w:top w:w="60" w:type="dxa"/>
+              <w:bottom w:w="60" w:type="dxa"/>
+              <w:left w:w="0" w:type="dxa"/>
+              <w:right w:w="0" w:type="dxa"/>
+            </w:tcMar>
+          </w:tcPr>
+          <w:p>
+            <w:pPr>
+              <w:spacing w:before="40" w:after="40"/>
+            </w:pPr>
+            <w:r>
+              <w:rPr>
+                <w:rFonts w:ascii="Arial" w:hAnsi="Arial"/>
+                <w:color w:val="94A3B8"/>
+                <w:sz w:val="19"/>
+              </w:rPr>
+              <w:t>:</w:t>
+            </w:r>
+          </w:p>
+        </w:tc>
+        <w:tc>
+          <w:tcPr>
+            <w:tcW w:type="dxa" w:w="7200"/>
+            <w:tcMar>
+              <w:top w:w="60" w:type="dxa"/>
+              <w:bottom w:w="60" w:type="dxa"/>
+              <w:left w:w="50" w:type="dxa"/>
+              <w:right w:w="0" w:type="dxa"/>
+            </w:tcMar>
+          </w:tcPr>
+          <w:p>
+            <w:pPr>
+              <w:spacing w:before="40" w:after="40"/>
+            </w:pPr>
+            <w:r>
+              <w:rPr>
+                <w:rFonts w:ascii="Arial" w:hAnsi="Arial"/>
+                <w:color w:val="0F172A"/>
+                <w:sz w:val="19"/>
+              </w:rPr>
+              <w:t>T7 Global Bhd</w:t>
+            </w:r>
+          </w:p>
+        </w:tc>
+      </w:tr>
       <w:tr>
         <w:trPr>
           <w:cantSplit/>
@@ -6032,7 +6566,7 @@
                 <w:color w:val="0F172A"/>
                 <w:sz w:val="19"/>
               </w:rPr>
-              <w:t>EWDP-Gas Platform Inspection</w:t>
+              <w:t>EWDP-Gas Platform Inspection (ERB West Field, Sabah Waters, Malaysia)</w:t>
             </w:r>
           </w:p>
         </w:tc>
@@ -6140,7 +6674,7 @@
                 <w:color w:val="475569"/>
                 <w:sz w:val="19"/>
               </w:rPr>
-              <w:t>Platform/Vessel</w:t>
+              <w:t>Vessel/Barge</w:t>
             </w:r>
           </w:p>
         </w:tc>
@@ -6188,7 +6722,7 @@
                 <w:color w:val="0F172A"/>
                 <w:sz w:val="19"/>
               </w:rPr>
-              <w:t>AWB Perdana Excelsior (Vessel), ERB West Field, Sabah Waters, Malaysia</w:t>
+              <w:t>AWB Perdana Excelsior (Vessel)</w:t>
             </w:r>
           </w:p>
         </w:tc>
@@ -6332,17 +6866,6 @@
       </w:r>
     </w:p>
     <w:p/>
-    <w:p>
-      <w:r>
-        <w:rPr>
-          <w:rFonts w:ascii="Arial" w:hAnsi="Arial"/>
-          <w:b/>
-          <w:color w:val="0F172A"/>
-          <w:sz w:val="21"/>
-        </w:rPr>
-        <w:t>T7 GLOBAL BHD</w:t>
-      </w:r>
-    </w:p>
     <w:tbl>
       <w:tblPr>
         <w:tblW w:type="auto" w:w="0"/>
@@ -6354,6 +6877,84 @@
         <w:gridCol w:w="3360"/>
         <w:gridCol w:w="3360"/>
       </w:tblGrid>
+      <w:tr>
+        <w:trPr>
+          <w:cantSplit/>
+        </w:trPr>
+        <w:tc>
+          <w:tcPr>
+            <w:tcW w:type="dxa" w:w="2592"/>
+            <w:tcMar>
+              <w:top w:w="60" w:type="dxa"/>
+              <w:bottom w:w="60" w:type="dxa"/>
+              <w:left w:w="0" w:type="dxa"/>
+              <w:right w:w="50" w:type="dxa"/>
+            </w:tcMar>
+          </w:tcPr>
+          <w:p>
+            <w:pPr>
+              <w:spacing w:before="40" w:after="40"/>
+            </w:pPr>
+            <w:r>
+              <w:rPr>
+                <w:rFonts w:ascii="Arial" w:hAnsi="Arial"/>
+                <w:b/>
+                <w:color w:val="475569"/>
+                <w:sz w:val="19"/>
+              </w:rPr>
+              <w:t>Company</w:t>
+            </w:r>
+          </w:p>
+        </w:tc>
+        <w:tc>
+          <w:tcPr>
+            <w:tcW w:type="dxa" w:w="288"/>
+            <w:tcMar>
+              <w:top w:w="60" w:type="dxa"/>
+              <w:bottom w:w="60" w:type="dxa"/>
+              <w:left w:w="0" w:type="dxa"/>
+              <w:right w:w="0" w:type="dxa"/>
+            </w:tcMar>
+          </w:tcPr>
+          <w:p>
+            <w:pPr>
+              <w:spacing w:before="40" w:after="40"/>
+            </w:pPr>
+            <w:r>
+              <w:rPr>
+                <w:rFonts w:ascii="Arial" w:hAnsi="Arial"/>
+                <w:color w:val="94A3B8"/>
+                <w:sz w:val="19"/>
+              </w:rPr>
+              <w:t>:</w:t>
+            </w:r>
+          </w:p>
+        </w:tc>
+        <w:tc>
+          <w:tcPr>
+            <w:tcW w:type="dxa" w:w="7200"/>
+            <w:tcMar>
+              <w:top w:w="60" w:type="dxa"/>
+              <w:bottom w:w="60" w:type="dxa"/>
+              <w:left w:w="50" w:type="dxa"/>
+              <w:right w:w="0" w:type="dxa"/>
+            </w:tcMar>
+          </w:tcPr>
+          <w:p>
+            <w:pPr>
+              <w:spacing w:before="40" w:after="40"/>
+            </w:pPr>
+            <w:r>
+              <w:rPr>
+                <w:rFonts w:ascii="Arial" w:hAnsi="Arial"/>
+                <w:color w:val="0F172A"/>
+                <w:sz w:val="19"/>
+              </w:rPr>
+              <w:t>T7 Global Bhd</w:t>
+            </w:r>
+          </w:p>
+        </w:tc>
+      </w:tr>
       <w:tr>
         <w:trPr>
           <w:cantSplit/>
@@ -6505,7 +7106,7 @@
                 <w:color w:val="0F172A"/>
                 <w:sz w:val="19"/>
               </w:rPr>
-              <w:t>EWDP-Production Platform Inspection</w:t>
+              <w:t>EWDP-Production Platform Inspection (ERB West Field, Sabah Waters, Malaysia)</w:t>
             </w:r>
           </w:p>
         </w:tc>
@@ -6613,7 +7214,7 @@
                 <w:color w:val="475569"/>
                 <w:sz w:val="19"/>
               </w:rPr>
-              <w:t>Platform/Vessel</w:t>
+              <w:t>Vessel/Barge</w:t>
             </w:r>
           </w:p>
         </w:tc>
@@ -6661,7 +7262,7 @@
                 <w:color w:val="0F172A"/>
                 <w:sz w:val="19"/>
               </w:rPr>
-              <w:t>SK Marco Polo (Vessel), ERB West Field, Sabah Waters, Malaysia</w:t>
+              <w:t>SK Marco Polo (Vessel)</w:t>
             </w:r>
           </w:p>
         </w:tc>
@@ -6805,17 +7406,6 @@
       </w:r>
     </w:p>
     <w:p/>
-    <w:p>
-      <w:r>
-        <w:rPr>
-          <w:rFonts w:ascii="Arial" w:hAnsi="Arial"/>
-          <w:b/>
-          <w:color w:val="0F172A"/>
-          <w:sz w:val="21"/>
-        </w:rPr>
-        <w:t>SAPURA SUBSEA SERVICES SDN BHD</w:t>
-      </w:r>
-    </w:p>
     <w:tbl>
       <w:tblPr>
         <w:tblW w:type="auto" w:w="0"/>
@@ -6827,6 +7417,84 @@
         <w:gridCol w:w="3360"/>
         <w:gridCol w:w="3360"/>
       </w:tblGrid>
+      <w:tr>
+        <w:trPr>
+          <w:cantSplit/>
+        </w:trPr>
+        <w:tc>
+          <w:tcPr>
+            <w:tcW w:type="dxa" w:w="2592"/>
+            <w:tcMar>
+              <w:top w:w="60" w:type="dxa"/>
+              <w:bottom w:w="60" w:type="dxa"/>
+              <w:left w:w="0" w:type="dxa"/>
+              <w:right w:w="50" w:type="dxa"/>
+            </w:tcMar>
+          </w:tcPr>
+          <w:p>
+            <w:pPr>
+              <w:spacing w:before="40" w:after="40"/>
+            </w:pPr>
+            <w:r>
+              <w:rPr>
+                <w:rFonts w:ascii="Arial" w:hAnsi="Arial"/>
+                <w:b/>
+                <w:color w:val="475569"/>
+                <w:sz w:val="19"/>
+              </w:rPr>
+              <w:t>Company</w:t>
+            </w:r>
+          </w:p>
+        </w:tc>
+        <w:tc>
+          <w:tcPr>
+            <w:tcW w:type="dxa" w:w="288"/>
+            <w:tcMar>
+              <w:top w:w="60" w:type="dxa"/>
+              <w:bottom w:w="60" w:type="dxa"/>
+              <w:left w:w="0" w:type="dxa"/>
+              <w:right w:w="0" w:type="dxa"/>
+            </w:tcMar>
+          </w:tcPr>
+          <w:p>
+            <w:pPr>
+              <w:spacing w:before="40" w:after="40"/>
+            </w:pPr>
+            <w:r>
+              <w:rPr>
+                <w:rFonts w:ascii="Arial" w:hAnsi="Arial"/>
+                <w:color w:val="94A3B8"/>
+                <w:sz w:val="19"/>
+              </w:rPr>
+              <w:t>:</w:t>
+            </w:r>
+          </w:p>
+        </w:tc>
+        <w:tc>
+          <w:tcPr>
+            <w:tcW w:type="dxa" w:w="7200"/>
+            <w:tcMar>
+              <w:top w:w="60" w:type="dxa"/>
+              <w:bottom w:w="60" w:type="dxa"/>
+              <w:left w:w="50" w:type="dxa"/>
+              <w:right w:w="0" w:type="dxa"/>
+            </w:tcMar>
+          </w:tcPr>
+          <w:p>
+            <w:pPr>
+              <w:spacing w:before="40" w:after="40"/>
+            </w:pPr>
+            <w:r>
+              <w:rPr>
+                <w:rFonts w:ascii="Arial" w:hAnsi="Arial"/>
+                <w:color w:val="0F172A"/>
+                <w:sz w:val="19"/>
+              </w:rPr>
+              <w:t>Sapura Subsea Services Sdn Bhd</w:t>
+            </w:r>
+          </w:p>
+        </w:tc>
+      </w:tr>
       <w:tr>
         <w:trPr>
           <w:cantSplit/>
@@ -6978,7 +7646,7 @@
                 <w:color w:val="0F172A"/>
                 <w:sz w:val="19"/>
               </w:rPr>
-              <w:t>BLOCK H and K Deepwater Inspection by ROV</w:t>
+              <w:t>BLOCK H and K Deepwater Inspection by ROV (Block H &amp; K Deepwater Field, Sabah Waters, Malaysia)</w:t>
             </w:r>
           </w:p>
         </w:tc>
@@ -7086,7 +7754,7 @@
                 <w:color w:val="475569"/>
                 <w:sz w:val="19"/>
               </w:rPr>
-              <w:t>Platform/Vessel</w:t>
+              <w:t>Vessel/Barge</w:t>
             </w:r>
           </w:p>
         </w:tc>
@@ -7134,7 +7802,7 @@
                 <w:color w:val="0F172A"/>
                 <w:sz w:val="19"/>
               </w:rPr>
-              <w:t>DP2DSV Sapura Jane (Vessel), Block H &amp; K Deepwater Field, Sabah Waters, Malaysia</w:t>
+              <w:t>DP2DSV Sapura Jane (Vessel)</w:t>
             </w:r>
           </w:p>
         </w:tc>

</xml_diff>

<commit_message>
Optimize CV layout: unify all offshore campaigns and onshore/office roles into a single Detailed Campaign & Employment Timeline section sorted in reverse chronological order, update classic_cv.html and convert_to_word.py, regenerate Muhammad_Amin_Azman_CV.docx
</commit_message>
<xml_diff>
--- a/Muhammad_Amin_Azman_CV.docx
+++ b/Muhammad_Amin_Azman_CV.docx
@@ -1571,843 +1571,7 @@
           <w:color w:val="0F172A"/>
           <w:sz w:val="23"/>
         </w:rPr>
-        <w:t>WORKING EXPERIENCE</w:t>
-      </w:r>
-    </w:p>
-    <w:p>
-      <w:r>
-        <w:rPr>
-          <w:rFonts w:ascii="Arial" w:hAnsi="Arial"/>
-          <w:b/>
-          <w:color w:val="0F172A"/>
-          <w:sz w:val="21"/>
-        </w:rPr>
-        <w:t>FUGRO MIDDLE EAST</w:t>
-      </w:r>
-    </w:p>
-    <w:tbl>
-      <w:tblPr>
-        <w:tblW w:type="auto" w:w="0"/>
-        <w:tblLayout w:type="fixed"/>
-        <w:tblLook w:firstColumn="1" w:firstRow="1" w:lastColumn="0" w:lastRow="0" w:noHBand="0" w:noVBand="1" w:val="04A0"/>
-      </w:tblPr>
-      <w:tblGrid>
-        <w:gridCol w:w="3360"/>
-        <w:gridCol w:w="3360"/>
-        <w:gridCol w:w="3360"/>
-      </w:tblGrid>
-      <w:tr>
-        <w:trPr>
-          <w:cantSplit/>
-        </w:trPr>
-        <w:tc>
-          <w:tcPr>
-            <w:tcW w:type="dxa" w:w="2592"/>
-            <w:tcMar>
-              <w:top w:w="60" w:type="dxa"/>
-              <w:bottom w:w="60" w:type="dxa"/>
-              <w:left w:w="0" w:type="dxa"/>
-              <w:right w:w="50" w:type="dxa"/>
-            </w:tcMar>
-          </w:tcPr>
-          <w:p>
-            <w:pPr>
-              <w:spacing w:before="40" w:after="40"/>
-            </w:pPr>
-            <w:r>
-              <w:rPr>
-                <w:rFonts w:ascii="Arial" w:hAnsi="Arial"/>
-                <w:b/>
-                <w:color w:val="475569"/>
-                <w:sz w:val="19"/>
-              </w:rPr>
-              <w:t>Position Title</w:t>
-            </w:r>
-          </w:p>
-        </w:tc>
-        <w:tc>
-          <w:tcPr>
-            <w:tcW w:type="dxa" w:w="288"/>
-            <w:tcMar>
-              <w:top w:w="60" w:type="dxa"/>
-              <w:bottom w:w="60" w:type="dxa"/>
-              <w:left w:w="0" w:type="dxa"/>
-              <w:right w:w="0" w:type="dxa"/>
-            </w:tcMar>
-          </w:tcPr>
-          <w:p>
-            <w:pPr>
-              <w:spacing w:before="40" w:after="40"/>
-            </w:pPr>
-            <w:r>
-              <w:rPr>
-                <w:rFonts w:ascii="Arial" w:hAnsi="Arial"/>
-                <w:color w:val="94A3B8"/>
-                <w:sz w:val="19"/>
-              </w:rPr>
-              <w:t>:</w:t>
-            </w:r>
-          </w:p>
-        </w:tc>
-        <w:tc>
-          <w:tcPr>
-            <w:tcW w:type="dxa" w:w="7200"/>
-            <w:tcMar>
-              <w:top w:w="60" w:type="dxa"/>
-              <w:bottom w:w="60" w:type="dxa"/>
-              <w:left w:w="50" w:type="dxa"/>
-              <w:right w:w="0" w:type="dxa"/>
-            </w:tcMar>
-          </w:tcPr>
-          <w:p>
-            <w:pPr>
-              <w:spacing w:before="40" w:after="40"/>
-            </w:pPr>
-            <w:r>
-              <w:rPr>
-                <w:rFonts w:ascii="Arial" w:hAnsi="Arial"/>
-                <w:color w:val="0F172A"/>
-                <w:sz w:val="19"/>
-              </w:rPr>
-              <w:t>3.4U Inspection Engineer (Advanced Technology Onboarding)</w:t>
-            </w:r>
-          </w:p>
-        </w:tc>
-      </w:tr>
-      <w:tr>
-        <w:trPr>
-          <w:cantSplit/>
-        </w:trPr>
-        <w:tc>
-          <w:tcPr>
-            <w:tcW w:type="dxa" w:w="2592"/>
-            <w:tcMar>
-              <w:top w:w="60" w:type="dxa"/>
-              <w:bottom w:w="60" w:type="dxa"/>
-              <w:left w:w="0" w:type="dxa"/>
-              <w:right w:w="50" w:type="dxa"/>
-            </w:tcMar>
-          </w:tcPr>
-          <w:p>
-            <w:pPr>
-              <w:spacing w:before="40" w:after="40"/>
-            </w:pPr>
-            <w:r>
-              <w:rPr>
-                <w:rFonts w:ascii="Arial" w:hAnsi="Arial"/>
-                <w:b/>
-                <w:color w:val="475569"/>
-                <w:sz w:val="19"/>
-              </w:rPr>
-              <w:t>Duration</w:t>
-            </w:r>
-          </w:p>
-        </w:tc>
-        <w:tc>
-          <w:tcPr>
-            <w:tcW w:type="dxa" w:w="288"/>
-            <w:tcMar>
-              <w:top w:w="60" w:type="dxa"/>
-              <w:bottom w:w="60" w:type="dxa"/>
-              <w:left w:w="0" w:type="dxa"/>
-              <w:right w:w="0" w:type="dxa"/>
-            </w:tcMar>
-          </w:tcPr>
-          <w:p>
-            <w:pPr>
-              <w:spacing w:before="40" w:after="40"/>
-            </w:pPr>
-            <w:r>
-              <w:rPr>
-                <w:rFonts w:ascii="Arial" w:hAnsi="Arial"/>
-                <w:color w:val="94A3B8"/>
-                <w:sz w:val="19"/>
-              </w:rPr>
-              <w:t>:</w:t>
-            </w:r>
-          </w:p>
-        </w:tc>
-        <w:tc>
-          <w:tcPr>
-            <w:tcW w:type="dxa" w:w="7200"/>
-            <w:tcMar>
-              <w:top w:w="60" w:type="dxa"/>
-              <w:bottom w:w="60" w:type="dxa"/>
-              <w:left w:w="50" w:type="dxa"/>
-              <w:right w:w="0" w:type="dxa"/>
-            </w:tcMar>
-          </w:tcPr>
-          <w:p>
-            <w:pPr>
-              <w:spacing w:before="40" w:after="40"/>
-            </w:pPr>
-            <w:r>
-              <w:rPr>
-                <w:rFonts w:ascii="Arial" w:hAnsi="Arial"/>
-                <w:color w:val="0F172A"/>
-                <w:sz w:val="19"/>
-              </w:rPr>
-              <w:t>December 2025</w:t>
-            </w:r>
-          </w:p>
-        </w:tc>
-      </w:tr>
-    </w:tbl>
-    <w:p>
-      <w:pPr>
-        <w:spacing w:before="80" w:after="40"/>
-      </w:pPr>
-      <w:r>
-        <w:rPr>
-          <w:rFonts w:ascii="Arial" w:hAnsi="Arial"/>
-          <w:b/>
-          <w:sz w:val="19"/>
-        </w:rPr>
-        <w:t>Job Scope:</w:t>
-      </w:r>
-    </w:p>
-    <w:p>
-      <w:pPr>
-        <w:pStyle w:val="ListBullet"/>
-        <w:spacing w:before="40" w:after="60"/>
-        <w:ind w:left="504"/>
-      </w:pPr>
-      <w:r>
-        <w:rPr>
-          <w:rFonts w:ascii="Arial" w:hAnsi="Arial"/>
-          <w:b/>
-          <w:color w:val="1E293B"/>
-          <w:sz w:val="19"/>
-        </w:rPr>
-        <w:t xml:space="preserve">Systems Mastery &amp; Onboarding: </w:t>
-      </w:r>
-      <w:r>
-        <w:rPr>
-          <w:rFonts w:ascii="Arial" w:hAnsi="Arial"/>
-          <w:color w:val="475569"/>
-          <w:sz w:val="19"/>
-        </w:rPr>
-        <w:t>Completed comprehensive corporate training at Fugro HQ, JAFZA, mastering VOYIS Live Discovery, VSLAM Acquisition, Agisoft Photogrammetry, and FDVR &amp; Sense Structures data acquisition suites.</w:t>
-      </w:r>
-    </w:p>
-    <w:p>
-      <w:pPr>
-        <w:pStyle w:val="ListBullet"/>
-        <w:spacing w:before="40" w:after="60"/>
-        <w:ind w:left="504"/>
-      </w:pPr>
-      <w:r>
-        <w:rPr>
-          <w:rFonts w:ascii="Arial" w:hAnsi="Arial"/>
-          <w:b/>
-          <w:color w:val="1E293B"/>
-          <w:sz w:val="19"/>
-        </w:rPr>
-        <w:t xml:space="preserve">Tech Configuration: </w:t>
-      </w:r>
-      <w:r>
-        <w:rPr>
-          <w:rFonts w:ascii="Arial" w:hAnsi="Arial"/>
-          <w:color w:val="475569"/>
-          <w:sz w:val="19"/>
-        </w:rPr>
-        <w:t>Assisted in setting up subsea 3D photogrammetry and optical modeling software configurations, conducting simulated remote data acquisition workflows to ensure campaign readiness.</w:t>
-      </w:r>
-    </w:p>
-    <w:p/>
-    <w:p>
-      <w:r>
-        <w:rPr>
-          <w:rFonts w:ascii="Arial" w:hAnsi="Arial"/>
-          <w:b/>
-          <w:color w:val="0F172A"/>
-          <w:sz w:val="21"/>
-        </w:rPr>
-        <w:t>FUGRO MIDDLE EAST</w:t>
-      </w:r>
-    </w:p>
-    <w:tbl>
-      <w:tblPr>
-        <w:tblW w:type="auto" w:w="0"/>
-        <w:tblLayout w:type="fixed"/>
-        <w:tblLook w:firstColumn="1" w:firstRow="1" w:lastColumn="0" w:lastRow="0" w:noHBand="0" w:noVBand="1" w:val="04A0"/>
-      </w:tblPr>
-      <w:tblGrid>
-        <w:gridCol w:w="3360"/>
-        <w:gridCol w:w="3360"/>
-        <w:gridCol w:w="3360"/>
-      </w:tblGrid>
-      <w:tr>
-        <w:trPr>
-          <w:cantSplit/>
-        </w:trPr>
-        <w:tc>
-          <w:tcPr>
-            <w:tcW w:type="dxa" w:w="2592"/>
-            <w:tcMar>
-              <w:top w:w="60" w:type="dxa"/>
-              <w:bottom w:w="60" w:type="dxa"/>
-              <w:left w:w="0" w:type="dxa"/>
-              <w:right w:w="50" w:type="dxa"/>
-            </w:tcMar>
-          </w:tcPr>
-          <w:p>
-            <w:pPr>
-              <w:spacing w:before="40" w:after="40"/>
-            </w:pPr>
-            <w:r>
-              <w:rPr>
-                <w:rFonts w:ascii="Arial" w:hAnsi="Arial"/>
-                <w:b/>
-                <w:color w:val="475569"/>
-                <w:sz w:val="19"/>
-              </w:rPr>
-              <w:t>Position Title</w:t>
-            </w:r>
-          </w:p>
-        </w:tc>
-        <w:tc>
-          <w:tcPr>
-            <w:tcW w:type="dxa" w:w="288"/>
-            <w:tcMar>
-              <w:top w:w="60" w:type="dxa"/>
-              <w:bottom w:w="60" w:type="dxa"/>
-              <w:left w:w="0" w:type="dxa"/>
-              <w:right w:w="0" w:type="dxa"/>
-            </w:tcMar>
-          </w:tcPr>
-          <w:p>
-            <w:pPr>
-              <w:spacing w:before="40" w:after="40"/>
-            </w:pPr>
-            <w:r>
-              <w:rPr>
-                <w:rFonts w:ascii="Arial" w:hAnsi="Arial"/>
-                <w:color w:val="94A3B8"/>
-                <w:sz w:val="19"/>
-              </w:rPr>
-              <w:t>:</w:t>
-            </w:r>
-          </w:p>
-        </w:tc>
-        <w:tc>
-          <w:tcPr>
-            <w:tcW w:type="dxa" w:w="7200"/>
-            <w:tcMar>
-              <w:top w:w="60" w:type="dxa"/>
-              <w:bottom w:w="60" w:type="dxa"/>
-              <w:left w:w="50" w:type="dxa"/>
-              <w:right w:w="0" w:type="dxa"/>
-            </w:tcMar>
-          </w:tcPr>
-          <w:p>
-            <w:pPr>
-              <w:spacing w:before="40" w:after="40"/>
-            </w:pPr>
-            <w:r>
-              <w:rPr>
-                <w:rFonts w:ascii="Arial" w:hAnsi="Arial"/>
-                <w:color w:val="0F172A"/>
-                <w:sz w:val="19"/>
-              </w:rPr>
-              <w:t>3.4U Inspection Engineer (Project Readiness &amp; Scoping)</w:t>
-            </w:r>
-          </w:p>
-        </w:tc>
-      </w:tr>
-      <w:tr>
-        <w:trPr>
-          <w:cantSplit/>
-        </w:trPr>
-        <w:tc>
-          <w:tcPr>
-            <w:tcW w:type="dxa" w:w="2592"/>
-            <w:tcMar>
-              <w:top w:w="60" w:type="dxa"/>
-              <w:bottom w:w="60" w:type="dxa"/>
-              <w:left w:w="0" w:type="dxa"/>
-              <w:right w:w="50" w:type="dxa"/>
-            </w:tcMar>
-          </w:tcPr>
-          <w:p>
-            <w:pPr>
-              <w:spacing w:before="40" w:after="40"/>
-            </w:pPr>
-            <w:r>
-              <w:rPr>
-                <w:rFonts w:ascii="Arial" w:hAnsi="Arial"/>
-                <w:b/>
-                <w:color w:val="475569"/>
-                <w:sz w:val="19"/>
-              </w:rPr>
-              <w:t>Duration</w:t>
-            </w:r>
-          </w:p>
-        </w:tc>
-        <w:tc>
-          <w:tcPr>
-            <w:tcW w:type="dxa" w:w="288"/>
-            <w:tcMar>
-              <w:top w:w="60" w:type="dxa"/>
-              <w:bottom w:w="60" w:type="dxa"/>
-              <w:left w:w="0" w:type="dxa"/>
-              <w:right w:w="0" w:type="dxa"/>
-            </w:tcMar>
-          </w:tcPr>
-          <w:p>
-            <w:pPr>
-              <w:spacing w:before="40" w:after="40"/>
-            </w:pPr>
-            <w:r>
-              <w:rPr>
-                <w:rFonts w:ascii="Arial" w:hAnsi="Arial"/>
-                <w:color w:val="94A3B8"/>
-                <w:sz w:val="19"/>
-              </w:rPr>
-              <w:t>:</w:t>
-            </w:r>
-          </w:p>
-        </w:tc>
-        <w:tc>
-          <w:tcPr>
-            <w:tcW w:type="dxa" w:w="7200"/>
-            <w:tcMar>
-              <w:top w:w="60" w:type="dxa"/>
-              <w:bottom w:w="60" w:type="dxa"/>
-              <w:left w:w="50" w:type="dxa"/>
-              <w:right w:w="0" w:type="dxa"/>
-            </w:tcMar>
-          </w:tcPr>
-          <w:p>
-            <w:pPr>
-              <w:spacing w:before="40" w:after="40"/>
-            </w:pPr>
-            <w:r>
-              <w:rPr>
-                <w:rFonts w:ascii="Arial" w:hAnsi="Arial"/>
-                <w:color w:val="0F172A"/>
-                <w:sz w:val="19"/>
-              </w:rPr>
-              <w:t>October 2025</w:t>
-            </w:r>
-          </w:p>
-        </w:tc>
-      </w:tr>
-    </w:tbl>
-    <w:p>
-      <w:pPr>
-        <w:spacing w:before="80" w:after="40"/>
-      </w:pPr>
-      <w:r>
-        <w:rPr>
-          <w:rFonts w:ascii="Arial" w:hAnsi="Arial"/>
-          <w:b/>
-          <w:sz w:val="19"/>
-        </w:rPr>
-        <w:t>Job Scope:</w:t>
-      </w:r>
-    </w:p>
-    <w:p>
-      <w:pPr>
-        <w:pStyle w:val="ListBullet"/>
-        <w:spacing w:before="40" w:after="60"/>
-        <w:ind w:left="504"/>
-      </w:pPr>
-      <w:r>
-        <w:rPr>
-          <w:rFonts w:ascii="Arial" w:hAnsi="Arial"/>
-          <w:b/>
-          <w:color w:val="1E293B"/>
-          <w:sz w:val="19"/>
-        </w:rPr>
-        <w:t xml:space="preserve">Project Readiness: </w:t>
-      </w:r>
-      <w:r>
-        <w:rPr>
-          <w:rFonts w:ascii="Arial" w:hAnsi="Arial"/>
-          <w:color w:val="475569"/>
-          <w:sz w:val="19"/>
-        </w:rPr>
-        <w:t>Mobilized to Fugro HQ, JAFZA for initial framework preparation, executing detailed work pack reviews and asset scoping for the Upper Zakum jacket inspection and crossing survey.</w:t>
-      </w:r>
-    </w:p>
-    <w:p>
-      <w:pPr>
-        <w:pStyle w:val="ListBullet"/>
-        <w:spacing w:before="40" w:after="60"/>
-        <w:ind w:left="504"/>
-      </w:pPr>
-      <w:r>
-        <w:rPr>
-          <w:rFonts w:ascii="Arial" w:hAnsi="Arial"/>
-          <w:b/>
-          <w:color w:val="1E293B"/>
-          <w:sz w:val="19"/>
-        </w:rPr>
-        <w:t xml:space="preserve">Engineering Support: </w:t>
-      </w:r>
-      <w:r>
-        <w:rPr>
-          <w:rFonts w:ascii="Arial" w:hAnsi="Arial"/>
-          <w:color w:val="475569"/>
-          <w:sz w:val="19"/>
-        </w:rPr>
-        <w:t>Assisted in preliminary subsea 3D photogrammetry software setup, performing data-readiness checks on engineering drawings and jacket node mapping.</w:t>
-      </w:r>
-    </w:p>
-    <w:p/>
-    <w:p>
-      <w:r>
-        <w:rPr>
-          <w:rFonts w:ascii="Arial" w:hAnsi="Arial"/>
-          <w:b/>
-          <w:color w:val="0F172A"/>
-          <w:sz w:val="21"/>
-        </w:rPr>
-        <w:t>SIRRIHAT SUBSEA SERVICES SDN BHD</w:t>
-      </w:r>
-    </w:p>
-    <w:tbl>
-      <w:tblPr>
-        <w:tblW w:type="auto" w:w="0"/>
-        <w:tblLayout w:type="fixed"/>
-        <w:tblLook w:firstColumn="1" w:firstRow="1" w:lastColumn="0" w:lastRow="0" w:noHBand="0" w:noVBand="1" w:val="04A0"/>
-      </w:tblPr>
-      <w:tblGrid>
-        <w:gridCol w:w="3360"/>
-        <w:gridCol w:w="3360"/>
-        <w:gridCol w:w="3360"/>
-      </w:tblGrid>
-      <w:tr>
-        <w:trPr>
-          <w:cantSplit/>
-        </w:trPr>
-        <w:tc>
-          <w:tcPr>
-            <w:tcW w:type="dxa" w:w="2592"/>
-            <w:tcMar>
-              <w:top w:w="60" w:type="dxa"/>
-              <w:bottom w:w="60" w:type="dxa"/>
-              <w:left w:w="0" w:type="dxa"/>
-              <w:right w:w="50" w:type="dxa"/>
-            </w:tcMar>
-          </w:tcPr>
-          <w:p>
-            <w:pPr>
-              <w:spacing w:before="40" w:after="40"/>
-            </w:pPr>
-            <w:r>
-              <w:rPr>
-                <w:rFonts w:ascii="Arial" w:hAnsi="Arial"/>
-                <w:b/>
-                <w:color w:val="475569"/>
-                <w:sz w:val="19"/>
-              </w:rPr>
-              <w:t>Position Title</w:t>
-            </w:r>
-          </w:p>
-        </w:tc>
-        <w:tc>
-          <w:tcPr>
-            <w:tcW w:type="dxa" w:w="288"/>
-            <w:tcMar>
-              <w:top w:w="60" w:type="dxa"/>
-              <w:bottom w:w="60" w:type="dxa"/>
-              <w:left w:w="0" w:type="dxa"/>
-              <w:right w:w="0" w:type="dxa"/>
-            </w:tcMar>
-          </w:tcPr>
-          <w:p>
-            <w:pPr>
-              <w:spacing w:before="40" w:after="40"/>
-            </w:pPr>
-            <w:r>
-              <w:rPr>
-                <w:rFonts w:ascii="Arial" w:hAnsi="Arial"/>
-                <w:color w:val="94A3B8"/>
-                <w:sz w:val="19"/>
-              </w:rPr>
-              <w:t>:</w:t>
-            </w:r>
-          </w:p>
-        </w:tc>
-        <w:tc>
-          <w:tcPr>
-            <w:tcW w:type="dxa" w:w="7200"/>
-            <w:tcMar>
-              <w:top w:w="60" w:type="dxa"/>
-              <w:bottom w:w="60" w:type="dxa"/>
-              <w:left w:w="50" w:type="dxa"/>
-              <w:right w:w="0" w:type="dxa"/>
-            </w:tcMar>
-          </w:tcPr>
-          <w:p>
-            <w:pPr>
-              <w:spacing w:before="40" w:after="40"/>
-            </w:pPr>
-            <w:r>
-              <w:rPr>
-                <w:rFonts w:ascii="Arial" w:hAnsi="Arial"/>
-                <w:color w:val="0F172A"/>
-                <w:sz w:val="19"/>
-              </w:rPr>
-              <w:t>Data QA/QC Coordinator</w:t>
-            </w:r>
-          </w:p>
-        </w:tc>
-      </w:tr>
-      <w:tr>
-        <w:trPr>
-          <w:cantSplit/>
-        </w:trPr>
-        <w:tc>
-          <w:tcPr>
-            <w:tcW w:type="dxa" w:w="2592"/>
-            <w:tcMar>
-              <w:top w:w="60" w:type="dxa"/>
-              <w:bottom w:w="60" w:type="dxa"/>
-              <w:left w:w="0" w:type="dxa"/>
-              <w:right w:w="50" w:type="dxa"/>
-            </w:tcMar>
-          </w:tcPr>
-          <w:p>
-            <w:pPr>
-              <w:spacing w:before="40" w:after="40"/>
-            </w:pPr>
-            <w:r>
-              <w:rPr>
-                <w:rFonts w:ascii="Arial" w:hAnsi="Arial"/>
-                <w:b/>
-                <w:color w:val="475569"/>
-                <w:sz w:val="19"/>
-              </w:rPr>
-              <w:t>Duration</w:t>
-            </w:r>
-          </w:p>
-        </w:tc>
-        <w:tc>
-          <w:tcPr>
-            <w:tcW w:type="dxa" w:w="288"/>
-            <w:tcMar>
-              <w:top w:w="60" w:type="dxa"/>
-              <w:bottom w:w="60" w:type="dxa"/>
-              <w:left w:w="0" w:type="dxa"/>
-              <w:right w:w="0" w:type="dxa"/>
-            </w:tcMar>
-          </w:tcPr>
-          <w:p>
-            <w:pPr>
-              <w:spacing w:before="40" w:after="40"/>
-            </w:pPr>
-            <w:r>
-              <w:rPr>
-                <w:rFonts w:ascii="Arial" w:hAnsi="Arial"/>
-                <w:color w:val="94A3B8"/>
-                <w:sz w:val="19"/>
-              </w:rPr>
-              <w:t>:</w:t>
-            </w:r>
-          </w:p>
-        </w:tc>
-        <w:tc>
-          <w:tcPr>
-            <w:tcW w:type="dxa" w:w="7200"/>
-            <w:tcMar>
-              <w:top w:w="60" w:type="dxa"/>
-              <w:bottom w:w="60" w:type="dxa"/>
-              <w:left w:w="50" w:type="dxa"/>
-              <w:right w:w="0" w:type="dxa"/>
-            </w:tcMar>
-          </w:tcPr>
-          <w:p>
-            <w:pPr>
-              <w:spacing w:before="40" w:after="40"/>
-            </w:pPr>
-            <w:r>
-              <w:rPr>
-                <w:rFonts w:ascii="Arial" w:hAnsi="Arial"/>
-                <w:color w:val="0F172A"/>
-                <w:sz w:val="19"/>
-              </w:rPr>
-              <w:t>November 2022 – September 2023</w:t>
-            </w:r>
-          </w:p>
-        </w:tc>
-      </w:tr>
-    </w:tbl>
-    <w:p>
-      <w:pPr>
-        <w:spacing w:before="80" w:after="40"/>
-      </w:pPr>
-      <w:r>
-        <w:rPr>
-          <w:rFonts w:ascii="Arial" w:hAnsi="Arial"/>
-          <w:b/>
-          <w:sz w:val="19"/>
-        </w:rPr>
-        <w:t>Job Scope:</w:t>
-      </w:r>
-    </w:p>
-    <w:p>
-      <w:pPr>
-        <w:pStyle w:val="ListBullet"/>
-        <w:spacing w:before="40" w:after="60"/>
-        <w:ind w:left="504"/>
-      </w:pPr>
-      <w:r>
-        <w:rPr>
-          <w:rFonts w:ascii="Arial" w:hAnsi="Arial"/>
-          <w:b/>
-          <w:color w:val="1E293B"/>
-          <w:sz w:val="19"/>
-        </w:rPr>
-        <w:t xml:space="preserve">Final Reporting: </w:t>
-      </w:r>
-      <w:r>
-        <w:rPr>
-          <w:rFonts w:ascii="Arial" w:hAnsi="Arial"/>
-          <w:color w:val="475569"/>
-          <w:sz w:val="19"/>
-        </w:rPr>
-        <w:t>Converted rough daily logs from offshore operations into polished, formal client reports.</w:t>
-      </w:r>
-    </w:p>
-    <w:p>
-      <w:pPr>
-        <w:pStyle w:val="ListBullet"/>
-        <w:spacing w:before="40" w:after="60"/>
-        <w:ind w:left="504"/>
-      </w:pPr>
-      <w:r>
-        <w:rPr>
-          <w:rFonts w:ascii="Arial" w:hAnsi="Arial"/>
-          <w:b/>
-          <w:color w:val="1E293B"/>
-          <w:sz w:val="19"/>
-        </w:rPr>
-        <w:t xml:space="preserve">Data QA/QC: </w:t>
-      </w:r>
-      <w:r>
-        <w:rPr>
-          <w:rFonts w:ascii="Arial" w:hAnsi="Arial"/>
-          <w:color w:val="475569"/>
-          <w:sz w:val="19"/>
-        </w:rPr>
-        <w:t>Verified accuracy of subsea video footage, timestamps, and anomaly descriptions against physical logs.</w:t>
-      </w:r>
-    </w:p>
-    <w:p>
-      <w:pPr>
-        <w:pStyle w:val="ListBullet"/>
-        <w:spacing w:before="40" w:after="60"/>
-        <w:ind w:left="504"/>
-      </w:pPr>
-      <w:r>
-        <w:rPr>
-          <w:rFonts w:ascii="Arial" w:hAnsi="Arial"/>
-          <w:b/>
-          <w:color w:val="1E293B"/>
-          <w:sz w:val="19"/>
-        </w:rPr>
-        <w:t xml:space="preserve">Database Management: </w:t>
-      </w:r>
-      <w:r>
-        <w:rPr>
-          <w:rFonts w:ascii="Arial" w:hAnsi="Arial"/>
-          <w:color w:val="475569"/>
-          <w:sz w:val="19"/>
-        </w:rPr>
-        <w:t>Uploaded validated offshore data and inspection logs into integrity software systems.</w:t>
-      </w:r>
-    </w:p>
-    <w:p>
-      <w:pPr>
-        <w:pStyle w:val="ListBullet"/>
-        <w:spacing w:before="40" w:after="60"/>
-        <w:ind w:left="504"/>
-      </w:pPr>
-      <w:r>
-        <w:rPr>
-          <w:rFonts w:ascii="Arial" w:hAnsi="Arial"/>
-          <w:b/>
-          <w:color w:val="1E293B"/>
-          <w:sz w:val="19"/>
-        </w:rPr>
-        <w:t xml:space="preserve">Drawing Updates: </w:t>
-      </w:r>
-      <w:r>
-        <w:rPr>
-          <w:rFonts w:ascii="Arial" w:hAnsi="Arial"/>
-          <w:color w:val="475569"/>
-          <w:sz w:val="19"/>
-        </w:rPr>
-        <w:t>Marked up CAD and "As-Built" drawings to reflect new subsea findings and anomalies.</w:t>
-      </w:r>
-    </w:p>
-    <w:p>
-      <w:pPr>
-        <w:pStyle w:val="ListBullet"/>
-        <w:spacing w:before="40" w:after="60"/>
-        <w:ind w:left="504"/>
-      </w:pPr>
-      <w:r>
-        <w:rPr>
-          <w:rFonts w:ascii="Arial" w:hAnsi="Arial"/>
-          <w:b/>
-          <w:color w:val="1E293B"/>
-          <w:sz w:val="19"/>
-        </w:rPr>
-        <w:t xml:space="preserve">Work Pack Creation: </w:t>
-      </w:r>
-      <w:r>
-        <w:rPr>
-          <w:rFonts w:ascii="Arial" w:hAnsi="Arial"/>
-          <w:color w:val="475569"/>
-          <w:sz w:val="19"/>
-        </w:rPr>
-        <w:t>Wrote detailed, step-by-step inspection procedures and checklists for upcoming subsea campaigns.</w:t>
-      </w:r>
-    </w:p>
-    <w:p>
-      <w:pPr>
-        <w:pStyle w:val="ListBullet"/>
-        <w:spacing w:before="40" w:after="60"/>
-        <w:ind w:left="504"/>
-      </w:pPr>
-      <w:r>
-        <w:rPr>
-          <w:rFonts w:ascii="Arial" w:hAnsi="Arial"/>
-          <w:b/>
-          <w:color w:val="1E293B"/>
-          <w:sz w:val="19"/>
-        </w:rPr>
-        <w:t xml:space="preserve">Desktop Studies: </w:t>
-      </w:r>
-      <w:r>
-        <w:rPr>
-          <w:rFonts w:ascii="Arial" w:hAnsi="Arial"/>
-          <w:color w:val="475569"/>
-          <w:sz w:val="19"/>
-        </w:rPr>
-        <w:t>Reviewed historical integrity reports to identify targeted areas of interest for future monitoring.</w:t>
-      </w:r>
-    </w:p>
-    <w:p>
-      <w:pPr>
-        <w:keepNext/>
-        <w:spacing w:before="360" w:after="120"/>
-        <w:pBdr>
-          <w:bottom w:val="single" w:sz="12" w:space="4" w:color="0284C7"/>
-        </w:pBdr>
-      </w:pPr>
-      <w:r>
-        <w:rPr>
-          <w:rFonts w:ascii="Arial" w:hAnsi="Arial"/>
-          <w:b/>
-          <w:color w:val="0F172A"/>
-          <w:sz w:val="23"/>
-        </w:rPr>
-        <w:t>OFFSHORE/SITE EXPERIENCE</w:t>
+        <w:t>DETAILED CAMPAIGN &amp; EMPLOYMENT TIMELINE</w:t>
       </w:r>
     </w:p>
     <w:tbl>
@@ -2969,6 +2133,1084 @@
           <w:sz w:val="19"/>
         </w:rPr>
         <w:t>Compiled and finalized subsea inspection logs and anomaly records into draft client reports for Petronas Carigali.</w:t>
+      </w:r>
+    </w:p>
+    <w:p/>
+    <w:tbl>
+      <w:tblPr>
+        <w:tblW w:type="auto" w:w="0"/>
+        <w:tblLayout w:type="fixed"/>
+        <w:tblLook w:firstColumn="1" w:firstRow="1" w:lastColumn="0" w:lastRow="0" w:noHBand="0" w:noVBand="1" w:val="04A0"/>
+      </w:tblPr>
+      <w:tblGrid>
+        <w:gridCol w:w="3360"/>
+        <w:gridCol w:w="3360"/>
+        <w:gridCol w:w="3360"/>
+      </w:tblGrid>
+      <w:tr>
+        <w:trPr>
+          <w:cantSplit/>
+        </w:trPr>
+        <w:tc>
+          <w:tcPr>
+            <w:tcW w:type="dxa" w:w="2592"/>
+            <w:tcMar>
+              <w:top w:w="60" w:type="dxa"/>
+              <w:bottom w:w="60" w:type="dxa"/>
+              <w:left w:w="0" w:type="dxa"/>
+              <w:right w:w="50" w:type="dxa"/>
+            </w:tcMar>
+          </w:tcPr>
+          <w:p>
+            <w:pPr>
+              <w:spacing w:before="40" w:after="40"/>
+            </w:pPr>
+            <w:r>
+              <w:rPr>
+                <w:rFonts w:ascii="Arial" w:hAnsi="Arial"/>
+                <w:b/>
+                <w:color w:val="475569"/>
+                <w:sz w:val="19"/>
+              </w:rPr>
+              <w:t>Company</w:t>
+            </w:r>
+          </w:p>
+        </w:tc>
+        <w:tc>
+          <w:tcPr>
+            <w:tcW w:type="dxa" w:w="288"/>
+            <w:tcMar>
+              <w:top w:w="60" w:type="dxa"/>
+              <w:bottom w:w="60" w:type="dxa"/>
+              <w:left w:w="0" w:type="dxa"/>
+              <w:right w:w="0" w:type="dxa"/>
+            </w:tcMar>
+          </w:tcPr>
+          <w:p>
+            <w:pPr>
+              <w:spacing w:before="40" w:after="40"/>
+            </w:pPr>
+            <w:r>
+              <w:rPr>
+                <w:rFonts w:ascii="Arial" w:hAnsi="Arial"/>
+                <w:color w:val="94A3B8"/>
+                <w:sz w:val="19"/>
+              </w:rPr>
+              <w:t>:</w:t>
+            </w:r>
+          </w:p>
+        </w:tc>
+        <w:tc>
+          <w:tcPr>
+            <w:tcW w:type="dxa" w:w="7200"/>
+            <w:tcMar>
+              <w:top w:w="60" w:type="dxa"/>
+              <w:bottom w:w="60" w:type="dxa"/>
+              <w:left w:w="50" w:type="dxa"/>
+              <w:right w:w="0" w:type="dxa"/>
+            </w:tcMar>
+          </w:tcPr>
+          <w:p>
+            <w:pPr>
+              <w:spacing w:before="40" w:after="40"/>
+            </w:pPr>
+            <w:r>
+              <w:rPr>
+                <w:rFonts w:ascii="Arial" w:hAnsi="Arial"/>
+                <w:color w:val="0F172A"/>
+                <w:sz w:val="19"/>
+              </w:rPr>
+              <w:t>Fugro Middle East</w:t>
+            </w:r>
+          </w:p>
+        </w:tc>
+      </w:tr>
+      <w:tr>
+        <w:trPr>
+          <w:cantSplit/>
+        </w:trPr>
+        <w:tc>
+          <w:tcPr>
+            <w:tcW w:type="dxa" w:w="2592"/>
+            <w:tcMar>
+              <w:top w:w="60" w:type="dxa"/>
+              <w:bottom w:w="60" w:type="dxa"/>
+              <w:left w:w="0" w:type="dxa"/>
+              <w:right w:w="50" w:type="dxa"/>
+            </w:tcMar>
+          </w:tcPr>
+          <w:p>
+            <w:pPr>
+              <w:spacing w:before="40" w:after="40"/>
+            </w:pPr>
+            <w:r>
+              <w:rPr>
+                <w:rFonts w:ascii="Arial" w:hAnsi="Arial"/>
+                <w:b/>
+                <w:color w:val="475569"/>
+                <w:sz w:val="19"/>
+              </w:rPr>
+              <w:t>Client</w:t>
+            </w:r>
+          </w:p>
+        </w:tc>
+        <w:tc>
+          <w:tcPr>
+            <w:tcW w:type="dxa" w:w="288"/>
+            <w:tcMar>
+              <w:top w:w="60" w:type="dxa"/>
+              <w:bottom w:w="60" w:type="dxa"/>
+              <w:left w:w="0" w:type="dxa"/>
+              <w:right w:w="0" w:type="dxa"/>
+            </w:tcMar>
+          </w:tcPr>
+          <w:p>
+            <w:pPr>
+              <w:spacing w:before="40" w:after="40"/>
+            </w:pPr>
+            <w:r>
+              <w:rPr>
+                <w:rFonts w:ascii="Arial" w:hAnsi="Arial"/>
+                <w:color w:val="94A3B8"/>
+                <w:sz w:val="19"/>
+              </w:rPr>
+              <w:t>:</w:t>
+            </w:r>
+          </w:p>
+        </w:tc>
+        <w:tc>
+          <w:tcPr>
+            <w:tcW w:type="dxa" w:w="7200"/>
+            <w:tcMar>
+              <w:top w:w="60" w:type="dxa"/>
+              <w:bottom w:w="60" w:type="dxa"/>
+              <w:left w:w="50" w:type="dxa"/>
+              <w:right w:w="0" w:type="dxa"/>
+            </w:tcMar>
+          </w:tcPr>
+          <w:p>
+            <w:pPr>
+              <w:spacing w:before="40" w:after="40"/>
+            </w:pPr>
+            <w:r>
+              <w:rPr>
+                <w:rFonts w:ascii="Arial" w:hAnsi="Arial"/>
+                <w:color w:val="0F172A"/>
+                <w:sz w:val="19"/>
+              </w:rPr>
+              <w:t>ADNOC</w:t>
+            </w:r>
+          </w:p>
+        </w:tc>
+      </w:tr>
+      <w:tr>
+        <w:trPr>
+          <w:cantSplit/>
+        </w:trPr>
+        <w:tc>
+          <w:tcPr>
+            <w:tcW w:type="dxa" w:w="2592"/>
+            <w:tcMar>
+              <w:top w:w="60" w:type="dxa"/>
+              <w:bottom w:w="60" w:type="dxa"/>
+              <w:left w:w="0" w:type="dxa"/>
+              <w:right w:w="50" w:type="dxa"/>
+            </w:tcMar>
+          </w:tcPr>
+          <w:p>
+            <w:pPr>
+              <w:spacing w:before="40" w:after="40"/>
+            </w:pPr>
+            <w:r>
+              <w:rPr>
+                <w:rFonts w:ascii="Arial" w:hAnsi="Arial"/>
+                <w:b/>
+                <w:color w:val="475569"/>
+                <w:sz w:val="19"/>
+              </w:rPr>
+              <w:t>Project</w:t>
+            </w:r>
+          </w:p>
+        </w:tc>
+        <w:tc>
+          <w:tcPr>
+            <w:tcW w:type="dxa" w:w="288"/>
+            <w:tcMar>
+              <w:top w:w="60" w:type="dxa"/>
+              <w:bottom w:w="60" w:type="dxa"/>
+              <w:left w:w="0" w:type="dxa"/>
+              <w:right w:w="0" w:type="dxa"/>
+            </w:tcMar>
+          </w:tcPr>
+          <w:p>
+            <w:pPr>
+              <w:spacing w:before="40" w:after="40"/>
+            </w:pPr>
+            <w:r>
+              <w:rPr>
+                <w:rFonts w:ascii="Arial" w:hAnsi="Arial"/>
+                <w:color w:val="94A3B8"/>
+                <w:sz w:val="19"/>
+              </w:rPr>
+              <w:t>:</w:t>
+            </w:r>
+          </w:p>
+        </w:tc>
+        <w:tc>
+          <w:tcPr>
+            <w:tcW w:type="dxa" w:w="7200"/>
+            <w:tcMar>
+              <w:top w:w="60" w:type="dxa"/>
+              <w:bottom w:w="60" w:type="dxa"/>
+              <w:left w:w="50" w:type="dxa"/>
+              <w:right w:w="0" w:type="dxa"/>
+            </w:tcMar>
+          </w:tcPr>
+          <w:p>
+            <w:pPr>
+              <w:spacing w:before="40" w:after="40"/>
+            </w:pPr>
+            <w:r>
+              <w:rPr>
+                <w:rFonts w:ascii="Arial" w:hAnsi="Arial"/>
+                <w:color w:val="0F172A"/>
+                <w:sz w:val="19"/>
+              </w:rPr>
+              <w:t>Advanced Technology Onboarding (Upper Zakum Field Cluster Framework, Fugro HQ, JAFZA, Dubai)</w:t>
+            </w:r>
+          </w:p>
+        </w:tc>
+      </w:tr>
+      <w:tr>
+        <w:trPr>
+          <w:cantSplit/>
+        </w:trPr>
+        <w:tc>
+          <w:tcPr>
+            <w:tcW w:type="dxa" w:w="2592"/>
+            <w:tcMar>
+              <w:top w:w="60" w:type="dxa"/>
+              <w:bottom w:w="60" w:type="dxa"/>
+              <w:left w:w="0" w:type="dxa"/>
+              <w:right w:w="50" w:type="dxa"/>
+            </w:tcMar>
+          </w:tcPr>
+          <w:p>
+            <w:pPr>
+              <w:spacing w:before="40" w:after="40"/>
+            </w:pPr>
+            <w:r>
+              <w:rPr>
+                <w:rFonts w:ascii="Arial" w:hAnsi="Arial"/>
+                <w:b/>
+                <w:color w:val="475569"/>
+                <w:sz w:val="19"/>
+              </w:rPr>
+              <w:t>Duration</w:t>
+            </w:r>
+          </w:p>
+        </w:tc>
+        <w:tc>
+          <w:tcPr>
+            <w:tcW w:type="dxa" w:w="288"/>
+            <w:tcMar>
+              <w:top w:w="60" w:type="dxa"/>
+              <w:bottom w:w="60" w:type="dxa"/>
+              <w:left w:w="0" w:type="dxa"/>
+              <w:right w:w="0" w:type="dxa"/>
+            </w:tcMar>
+          </w:tcPr>
+          <w:p>
+            <w:pPr>
+              <w:spacing w:before="40" w:after="40"/>
+            </w:pPr>
+            <w:r>
+              <w:rPr>
+                <w:rFonts w:ascii="Arial" w:hAnsi="Arial"/>
+                <w:color w:val="94A3B8"/>
+                <w:sz w:val="19"/>
+              </w:rPr>
+              <w:t>:</w:t>
+            </w:r>
+          </w:p>
+        </w:tc>
+        <w:tc>
+          <w:tcPr>
+            <w:tcW w:type="dxa" w:w="7200"/>
+            <w:tcMar>
+              <w:top w:w="60" w:type="dxa"/>
+              <w:bottom w:w="60" w:type="dxa"/>
+              <w:left w:w="50" w:type="dxa"/>
+              <w:right w:w="0" w:type="dxa"/>
+            </w:tcMar>
+          </w:tcPr>
+          <w:p>
+            <w:pPr>
+              <w:spacing w:before="40" w:after="40"/>
+            </w:pPr>
+            <w:r>
+              <w:rPr>
+                <w:rFonts w:ascii="Arial" w:hAnsi="Arial"/>
+                <w:color w:val="0F172A"/>
+                <w:sz w:val="19"/>
+              </w:rPr>
+              <w:t>December 2025</w:t>
+            </w:r>
+          </w:p>
+        </w:tc>
+      </w:tr>
+      <w:tr>
+        <w:trPr>
+          <w:cantSplit/>
+        </w:trPr>
+        <w:tc>
+          <w:tcPr>
+            <w:tcW w:type="dxa" w:w="2592"/>
+            <w:tcMar>
+              <w:top w:w="60" w:type="dxa"/>
+              <w:bottom w:w="60" w:type="dxa"/>
+              <w:left w:w="0" w:type="dxa"/>
+              <w:right w:w="50" w:type="dxa"/>
+            </w:tcMar>
+          </w:tcPr>
+          <w:p>
+            <w:pPr>
+              <w:spacing w:before="40" w:after="40"/>
+            </w:pPr>
+            <w:r>
+              <w:rPr>
+                <w:rFonts w:ascii="Arial" w:hAnsi="Arial"/>
+                <w:b/>
+                <w:color w:val="475569"/>
+                <w:sz w:val="19"/>
+              </w:rPr>
+              <w:t>Vessel/Barge</w:t>
+            </w:r>
+          </w:p>
+        </w:tc>
+        <w:tc>
+          <w:tcPr>
+            <w:tcW w:type="dxa" w:w="288"/>
+            <w:tcMar>
+              <w:top w:w="60" w:type="dxa"/>
+              <w:bottom w:w="60" w:type="dxa"/>
+              <w:left w:w="0" w:type="dxa"/>
+              <w:right w:w="0" w:type="dxa"/>
+            </w:tcMar>
+          </w:tcPr>
+          <w:p>
+            <w:pPr>
+              <w:spacing w:before="40" w:after="40"/>
+            </w:pPr>
+            <w:r>
+              <w:rPr>
+                <w:rFonts w:ascii="Arial" w:hAnsi="Arial"/>
+                <w:color w:val="94A3B8"/>
+                <w:sz w:val="19"/>
+              </w:rPr>
+              <w:t>:</w:t>
+            </w:r>
+          </w:p>
+        </w:tc>
+        <w:tc>
+          <w:tcPr>
+            <w:tcW w:type="dxa" w:w="7200"/>
+            <w:tcMar>
+              <w:top w:w="60" w:type="dxa"/>
+              <w:bottom w:w="60" w:type="dxa"/>
+              <w:left w:w="50" w:type="dxa"/>
+              <w:right w:w="0" w:type="dxa"/>
+            </w:tcMar>
+          </w:tcPr>
+          <w:p>
+            <w:pPr>
+              <w:spacing w:before="40" w:after="40"/>
+            </w:pPr>
+            <w:r>
+              <w:rPr>
+                <w:rFonts w:ascii="Arial" w:hAnsi="Arial"/>
+                <w:color w:val="0F172A"/>
+                <w:sz w:val="19"/>
+              </w:rPr>
+            </w:r>
+          </w:p>
+        </w:tc>
+      </w:tr>
+      <w:tr>
+        <w:trPr>
+          <w:cantSplit/>
+        </w:trPr>
+        <w:tc>
+          <w:tcPr>
+            <w:tcW w:type="dxa" w:w="2592"/>
+            <w:tcMar>
+              <w:top w:w="60" w:type="dxa"/>
+              <w:bottom w:w="60" w:type="dxa"/>
+              <w:left w:w="0" w:type="dxa"/>
+              <w:right w:w="50" w:type="dxa"/>
+            </w:tcMar>
+          </w:tcPr>
+          <w:p>
+            <w:pPr>
+              <w:spacing w:before="40" w:after="40"/>
+            </w:pPr>
+            <w:r>
+              <w:rPr>
+                <w:rFonts w:ascii="Arial" w:hAnsi="Arial"/>
+                <w:b/>
+                <w:color w:val="475569"/>
+                <w:sz w:val="19"/>
+              </w:rPr>
+              <w:t>Position Title</w:t>
+            </w:r>
+          </w:p>
+        </w:tc>
+        <w:tc>
+          <w:tcPr>
+            <w:tcW w:type="dxa" w:w="288"/>
+            <w:tcMar>
+              <w:top w:w="60" w:type="dxa"/>
+              <w:bottom w:w="60" w:type="dxa"/>
+              <w:left w:w="0" w:type="dxa"/>
+              <w:right w:w="0" w:type="dxa"/>
+            </w:tcMar>
+          </w:tcPr>
+          <w:p>
+            <w:pPr>
+              <w:spacing w:before="40" w:after="40"/>
+            </w:pPr>
+            <w:r>
+              <w:rPr>
+                <w:rFonts w:ascii="Arial" w:hAnsi="Arial"/>
+                <w:color w:val="94A3B8"/>
+                <w:sz w:val="19"/>
+              </w:rPr>
+              <w:t>:</w:t>
+            </w:r>
+          </w:p>
+        </w:tc>
+        <w:tc>
+          <w:tcPr>
+            <w:tcW w:type="dxa" w:w="7200"/>
+            <w:tcMar>
+              <w:top w:w="60" w:type="dxa"/>
+              <w:bottom w:w="60" w:type="dxa"/>
+              <w:left w:w="50" w:type="dxa"/>
+              <w:right w:w="0" w:type="dxa"/>
+            </w:tcMar>
+          </w:tcPr>
+          <w:p>
+            <w:pPr>
+              <w:spacing w:before="40" w:after="40"/>
+            </w:pPr>
+            <w:r>
+              <w:rPr>
+                <w:rFonts w:ascii="Arial" w:hAnsi="Arial"/>
+                <w:color w:val="0F172A"/>
+                <w:sz w:val="19"/>
+              </w:rPr>
+              <w:t>3.4U Inspection Engineer (Advanced Technology Onboarding)</w:t>
+            </w:r>
+          </w:p>
+        </w:tc>
+      </w:tr>
+    </w:tbl>
+    <w:p>
+      <w:pPr>
+        <w:spacing w:before="80" w:after="40"/>
+      </w:pPr>
+      <w:r>
+        <w:rPr>
+          <w:rFonts w:ascii="Arial" w:hAnsi="Arial"/>
+          <w:b/>
+          <w:sz w:val="19"/>
+        </w:rPr>
+        <w:t>Scope/Details:</w:t>
+      </w:r>
+    </w:p>
+    <w:p>
+      <w:pPr>
+        <w:pStyle w:val="ListBullet"/>
+        <w:spacing w:before="40" w:after="60"/>
+        <w:ind w:left="504"/>
+      </w:pPr>
+      <w:r>
+        <w:rPr>
+          <w:rFonts w:ascii="Arial" w:hAnsi="Arial"/>
+          <w:b/>
+          <w:color w:val="1E293B"/>
+          <w:sz w:val="19"/>
+        </w:rPr>
+      </w:r>
+      <w:r>
+        <w:rPr>
+          <w:rFonts w:ascii="Arial" w:hAnsi="Arial"/>
+          <w:color w:val="475569"/>
+          <w:sz w:val="19"/>
+        </w:rPr>
+        <w:t>Systems Mastery &amp; Onboarding: Completed comprehensive corporate training at Fugro HQ, JAFZA, mastering VOYIS Live Discovery, VSLAM Acquisition, Agisoft Photogrammetry, and FDVR &amp; Sense Structures data acquisition suites.</w:t>
+      </w:r>
+    </w:p>
+    <w:p>
+      <w:pPr>
+        <w:pStyle w:val="ListBullet"/>
+        <w:spacing w:before="40" w:after="60"/>
+        <w:ind w:left="504"/>
+      </w:pPr>
+      <w:r>
+        <w:rPr>
+          <w:rFonts w:ascii="Arial" w:hAnsi="Arial"/>
+          <w:b/>
+          <w:color w:val="1E293B"/>
+          <w:sz w:val="19"/>
+        </w:rPr>
+      </w:r>
+      <w:r>
+        <w:rPr>
+          <w:rFonts w:ascii="Arial" w:hAnsi="Arial"/>
+          <w:color w:val="475569"/>
+          <w:sz w:val="19"/>
+        </w:rPr>
+        <w:t>Tech Configuration: Assisted in setting up subsea 3D photogrammetry and optical modeling software configurations, conducting simulated remote data acquisition workflows to ensure campaign readiness.</w:t>
+      </w:r>
+    </w:p>
+    <w:p/>
+    <w:tbl>
+      <w:tblPr>
+        <w:tblW w:type="auto" w:w="0"/>
+        <w:tblLayout w:type="fixed"/>
+        <w:tblLook w:firstColumn="1" w:firstRow="1" w:lastColumn="0" w:lastRow="0" w:noHBand="0" w:noVBand="1" w:val="04A0"/>
+      </w:tblPr>
+      <w:tblGrid>
+        <w:gridCol w:w="3360"/>
+        <w:gridCol w:w="3360"/>
+        <w:gridCol w:w="3360"/>
+      </w:tblGrid>
+      <w:tr>
+        <w:trPr>
+          <w:cantSplit/>
+        </w:trPr>
+        <w:tc>
+          <w:tcPr>
+            <w:tcW w:type="dxa" w:w="2592"/>
+            <w:tcMar>
+              <w:top w:w="60" w:type="dxa"/>
+              <w:bottom w:w="60" w:type="dxa"/>
+              <w:left w:w="0" w:type="dxa"/>
+              <w:right w:w="50" w:type="dxa"/>
+            </w:tcMar>
+          </w:tcPr>
+          <w:p>
+            <w:pPr>
+              <w:spacing w:before="40" w:after="40"/>
+            </w:pPr>
+            <w:r>
+              <w:rPr>
+                <w:rFonts w:ascii="Arial" w:hAnsi="Arial"/>
+                <w:b/>
+                <w:color w:val="475569"/>
+                <w:sz w:val="19"/>
+              </w:rPr>
+              <w:t>Company</w:t>
+            </w:r>
+          </w:p>
+        </w:tc>
+        <w:tc>
+          <w:tcPr>
+            <w:tcW w:type="dxa" w:w="288"/>
+            <w:tcMar>
+              <w:top w:w="60" w:type="dxa"/>
+              <w:bottom w:w="60" w:type="dxa"/>
+              <w:left w:w="0" w:type="dxa"/>
+              <w:right w:w="0" w:type="dxa"/>
+            </w:tcMar>
+          </w:tcPr>
+          <w:p>
+            <w:pPr>
+              <w:spacing w:before="40" w:after="40"/>
+            </w:pPr>
+            <w:r>
+              <w:rPr>
+                <w:rFonts w:ascii="Arial" w:hAnsi="Arial"/>
+                <w:color w:val="94A3B8"/>
+                <w:sz w:val="19"/>
+              </w:rPr>
+              <w:t>:</w:t>
+            </w:r>
+          </w:p>
+        </w:tc>
+        <w:tc>
+          <w:tcPr>
+            <w:tcW w:type="dxa" w:w="7200"/>
+            <w:tcMar>
+              <w:top w:w="60" w:type="dxa"/>
+              <w:bottom w:w="60" w:type="dxa"/>
+              <w:left w:w="50" w:type="dxa"/>
+              <w:right w:w="0" w:type="dxa"/>
+            </w:tcMar>
+          </w:tcPr>
+          <w:p>
+            <w:pPr>
+              <w:spacing w:before="40" w:after="40"/>
+            </w:pPr>
+            <w:r>
+              <w:rPr>
+                <w:rFonts w:ascii="Arial" w:hAnsi="Arial"/>
+                <w:color w:val="0F172A"/>
+                <w:sz w:val="19"/>
+              </w:rPr>
+              <w:t>Fugro Middle East</w:t>
+            </w:r>
+          </w:p>
+        </w:tc>
+      </w:tr>
+      <w:tr>
+        <w:trPr>
+          <w:cantSplit/>
+        </w:trPr>
+        <w:tc>
+          <w:tcPr>
+            <w:tcW w:type="dxa" w:w="2592"/>
+            <w:tcMar>
+              <w:top w:w="60" w:type="dxa"/>
+              <w:bottom w:w="60" w:type="dxa"/>
+              <w:left w:w="0" w:type="dxa"/>
+              <w:right w:w="50" w:type="dxa"/>
+            </w:tcMar>
+          </w:tcPr>
+          <w:p>
+            <w:pPr>
+              <w:spacing w:before="40" w:after="40"/>
+            </w:pPr>
+            <w:r>
+              <w:rPr>
+                <w:rFonts w:ascii="Arial" w:hAnsi="Arial"/>
+                <w:b/>
+                <w:color w:val="475569"/>
+                <w:sz w:val="19"/>
+              </w:rPr>
+              <w:t>Client</w:t>
+            </w:r>
+          </w:p>
+        </w:tc>
+        <w:tc>
+          <w:tcPr>
+            <w:tcW w:type="dxa" w:w="288"/>
+            <w:tcMar>
+              <w:top w:w="60" w:type="dxa"/>
+              <w:bottom w:w="60" w:type="dxa"/>
+              <w:left w:w="0" w:type="dxa"/>
+              <w:right w:w="0" w:type="dxa"/>
+            </w:tcMar>
+          </w:tcPr>
+          <w:p>
+            <w:pPr>
+              <w:spacing w:before="40" w:after="40"/>
+            </w:pPr>
+            <w:r>
+              <w:rPr>
+                <w:rFonts w:ascii="Arial" w:hAnsi="Arial"/>
+                <w:color w:val="94A3B8"/>
+                <w:sz w:val="19"/>
+              </w:rPr>
+              <w:t>:</w:t>
+            </w:r>
+          </w:p>
+        </w:tc>
+        <w:tc>
+          <w:tcPr>
+            <w:tcW w:type="dxa" w:w="7200"/>
+            <w:tcMar>
+              <w:top w:w="60" w:type="dxa"/>
+              <w:bottom w:w="60" w:type="dxa"/>
+              <w:left w:w="50" w:type="dxa"/>
+              <w:right w:w="0" w:type="dxa"/>
+            </w:tcMar>
+          </w:tcPr>
+          <w:p>
+            <w:pPr>
+              <w:spacing w:before="40" w:after="40"/>
+            </w:pPr>
+            <w:r>
+              <w:rPr>
+                <w:rFonts w:ascii="Arial" w:hAnsi="Arial"/>
+                <w:color w:val="0F172A"/>
+                <w:sz w:val="19"/>
+              </w:rPr>
+              <w:t>ADNOC</w:t>
+            </w:r>
+          </w:p>
+        </w:tc>
+      </w:tr>
+      <w:tr>
+        <w:trPr>
+          <w:cantSplit/>
+        </w:trPr>
+        <w:tc>
+          <w:tcPr>
+            <w:tcW w:type="dxa" w:w="2592"/>
+            <w:tcMar>
+              <w:top w:w="60" w:type="dxa"/>
+              <w:bottom w:w="60" w:type="dxa"/>
+              <w:left w:w="0" w:type="dxa"/>
+              <w:right w:w="50" w:type="dxa"/>
+            </w:tcMar>
+          </w:tcPr>
+          <w:p>
+            <w:pPr>
+              <w:spacing w:before="40" w:after="40"/>
+            </w:pPr>
+            <w:r>
+              <w:rPr>
+                <w:rFonts w:ascii="Arial" w:hAnsi="Arial"/>
+                <w:b/>
+                <w:color w:val="475569"/>
+                <w:sz w:val="19"/>
+              </w:rPr>
+              <w:t>Project</w:t>
+            </w:r>
+          </w:p>
+        </w:tc>
+        <w:tc>
+          <w:tcPr>
+            <w:tcW w:type="dxa" w:w="288"/>
+            <w:tcMar>
+              <w:top w:w="60" w:type="dxa"/>
+              <w:bottom w:w="60" w:type="dxa"/>
+              <w:left w:w="0" w:type="dxa"/>
+              <w:right w:w="0" w:type="dxa"/>
+            </w:tcMar>
+          </w:tcPr>
+          <w:p>
+            <w:pPr>
+              <w:spacing w:before="40" w:after="40"/>
+            </w:pPr>
+            <w:r>
+              <w:rPr>
+                <w:rFonts w:ascii="Arial" w:hAnsi="Arial"/>
+                <w:color w:val="94A3B8"/>
+                <w:sz w:val="19"/>
+              </w:rPr>
+              <w:t>:</w:t>
+            </w:r>
+          </w:p>
+        </w:tc>
+        <w:tc>
+          <w:tcPr>
+            <w:tcW w:type="dxa" w:w="7200"/>
+            <w:tcMar>
+              <w:top w:w="60" w:type="dxa"/>
+              <w:bottom w:w="60" w:type="dxa"/>
+              <w:left w:w="50" w:type="dxa"/>
+              <w:right w:w="0" w:type="dxa"/>
+            </w:tcMar>
+          </w:tcPr>
+          <w:p>
+            <w:pPr>
+              <w:spacing w:before="40" w:after="40"/>
+            </w:pPr>
+            <w:r>
+              <w:rPr>
+                <w:rFonts w:ascii="Arial" w:hAnsi="Arial"/>
+                <w:color w:val="0F172A"/>
+                <w:sz w:val="19"/>
+              </w:rPr>
+              <w:t>Project Readiness &amp; Scoping (Upper Zakum Field Cluster Framework, Fugro HQ, JAFZA, Dubai)</w:t>
+            </w:r>
+          </w:p>
+        </w:tc>
+      </w:tr>
+      <w:tr>
+        <w:trPr>
+          <w:cantSplit/>
+        </w:trPr>
+        <w:tc>
+          <w:tcPr>
+            <w:tcW w:type="dxa" w:w="2592"/>
+            <w:tcMar>
+              <w:top w:w="60" w:type="dxa"/>
+              <w:bottom w:w="60" w:type="dxa"/>
+              <w:left w:w="0" w:type="dxa"/>
+              <w:right w:w="50" w:type="dxa"/>
+            </w:tcMar>
+          </w:tcPr>
+          <w:p>
+            <w:pPr>
+              <w:spacing w:before="40" w:after="40"/>
+            </w:pPr>
+            <w:r>
+              <w:rPr>
+                <w:rFonts w:ascii="Arial" w:hAnsi="Arial"/>
+                <w:b/>
+                <w:color w:val="475569"/>
+                <w:sz w:val="19"/>
+              </w:rPr>
+              <w:t>Duration</w:t>
+            </w:r>
+          </w:p>
+        </w:tc>
+        <w:tc>
+          <w:tcPr>
+            <w:tcW w:type="dxa" w:w="288"/>
+            <w:tcMar>
+              <w:top w:w="60" w:type="dxa"/>
+              <w:bottom w:w="60" w:type="dxa"/>
+              <w:left w:w="0" w:type="dxa"/>
+              <w:right w:w="0" w:type="dxa"/>
+            </w:tcMar>
+          </w:tcPr>
+          <w:p>
+            <w:pPr>
+              <w:spacing w:before="40" w:after="40"/>
+            </w:pPr>
+            <w:r>
+              <w:rPr>
+                <w:rFonts w:ascii="Arial" w:hAnsi="Arial"/>
+                <w:color w:val="94A3B8"/>
+                <w:sz w:val="19"/>
+              </w:rPr>
+              <w:t>:</w:t>
+            </w:r>
+          </w:p>
+        </w:tc>
+        <w:tc>
+          <w:tcPr>
+            <w:tcW w:type="dxa" w:w="7200"/>
+            <w:tcMar>
+              <w:top w:w="60" w:type="dxa"/>
+              <w:bottom w:w="60" w:type="dxa"/>
+              <w:left w:w="50" w:type="dxa"/>
+              <w:right w:w="0" w:type="dxa"/>
+            </w:tcMar>
+          </w:tcPr>
+          <w:p>
+            <w:pPr>
+              <w:spacing w:before="40" w:after="40"/>
+            </w:pPr>
+            <w:r>
+              <w:rPr>
+                <w:rFonts w:ascii="Arial" w:hAnsi="Arial"/>
+                <w:color w:val="0F172A"/>
+                <w:sz w:val="19"/>
+              </w:rPr>
+              <w:t>October 2025</w:t>
+            </w:r>
+          </w:p>
+        </w:tc>
+      </w:tr>
+      <w:tr>
+        <w:trPr>
+          <w:cantSplit/>
+        </w:trPr>
+        <w:tc>
+          <w:tcPr>
+            <w:tcW w:type="dxa" w:w="2592"/>
+            <w:tcMar>
+              <w:top w:w="60" w:type="dxa"/>
+              <w:bottom w:w="60" w:type="dxa"/>
+              <w:left w:w="0" w:type="dxa"/>
+              <w:right w:w="50" w:type="dxa"/>
+            </w:tcMar>
+          </w:tcPr>
+          <w:p>
+            <w:pPr>
+              <w:spacing w:before="40" w:after="40"/>
+            </w:pPr>
+            <w:r>
+              <w:rPr>
+                <w:rFonts w:ascii="Arial" w:hAnsi="Arial"/>
+                <w:b/>
+                <w:color w:val="475569"/>
+                <w:sz w:val="19"/>
+              </w:rPr>
+              <w:t>Vessel/Barge</w:t>
+            </w:r>
+          </w:p>
+        </w:tc>
+        <w:tc>
+          <w:tcPr>
+            <w:tcW w:type="dxa" w:w="288"/>
+            <w:tcMar>
+              <w:top w:w="60" w:type="dxa"/>
+              <w:bottom w:w="60" w:type="dxa"/>
+              <w:left w:w="0" w:type="dxa"/>
+              <w:right w:w="0" w:type="dxa"/>
+            </w:tcMar>
+          </w:tcPr>
+          <w:p>
+            <w:pPr>
+              <w:spacing w:before="40" w:after="40"/>
+            </w:pPr>
+            <w:r>
+              <w:rPr>
+                <w:rFonts w:ascii="Arial" w:hAnsi="Arial"/>
+                <w:color w:val="94A3B8"/>
+                <w:sz w:val="19"/>
+              </w:rPr>
+              <w:t>:</w:t>
+            </w:r>
+          </w:p>
+        </w:tc>
+        <w:tc>
+          <w:tcPr>
+            <w:tcW w:type="dxa" w:w="7200"/>
+            <w:tcMar>
+              <w:top w:w="60" w:type="dxa"/>
+              <w:bottom w:w="60" w:type="dxa"/>
+              <w:left w:w="50" w:type="dxa"/>
+              <w:right w:w="0" w:type="dxa"/>
+            </w:tcMar>
+          </w:tcPr>
+          <w:p>
+            <w:pPr>
+              <w:spacing w:before="40" w:after="40"/>
+            </w:pPr>
+            <w:r>
+              <w:rPr>
+                <w:rFonts w:ascii="Arial" w:hAnsi="Arial"/>
+                <w:color w:val="0F172A"/>
+                <w:sz w:val="19"/>
+              </w:rPr>
+            </w:r>
+          </w:p>
+        </w:tc>
+      </w:tr>
+      <w:tr>
+        <w:trPr>
+          <w:cantSplit/>
+        </w:trPr>
+        <w:tc>
+          <w:tcPr>
+            <w:tcW w:type="dxa" w:w="2592"/>
+            <w:tcMar>
+              <w:top w:w="60" w:type="dxa"/>
+              <w:bottom w:w="60" w:type="dxa"/>
+              <w:left w:w="0" w:type="dxa"/>
+              <w:right w:w="50" w:type="dxa"/>
+            </w:tcMar>
+          </w:tcPr>
+          <w:p>
+            <w:pPr>
+              <w:spacing w:before="40" w:after="40"/>
+            </w:pPr>
+            <w:r>
+              <w:rPr>
+                <w:rFonts w:ascii="Arial" w:hAnsi="Arial"/>
+                <w:b/>
+                <w:color w:val="475569"/>
+                <w:sz w:val="19"/>
+              </w:rPr>
+              <w:t>Position Title</w:t>
+            </w:r>
+          </w:p>
+        </w:tc>
+        <w:tc>
+          <w:tcPr>
+            <w:tcW w:type="dxa" w:w="288"/>
+            <w:tcMar>
+              <w:top w:w="60" w:type="dxa"/>
+              <w:bottom w:w="60" w:type="dxa"/>
+              <w:left w:w="0" w:type="dxa"/>
+              <w:right w:w="0" w:type="dxa"/>
+            </w:tcMar>
+          </w:tcPr>
+          <w:p>
+            <w:pPr>
+              <w:spacing w:before="40" w:after="40"/>
+            </w:pPr>
+            <w:r>
+              <w:rPr>
+                <w:rFonts w:ascii="Arial" w:hAnsi="Arial"/>
+                <w:color w:val="94A3B8"/>
+                <w:sz w:val="19"/>
+              </w:rPr>
+              <w:t>:</w:t>
+            </w:r>
+          </w:p>
+        </w:tc>
+        <w:tc>
+          <w:tcPr>
+            <w:tcW w:type="dxa" w:w="7200"/>
+            <w:tcMar>
+              <w:top w:w="60" w:type="dxa"/>
+              <w:bottom w:w="60" w:type="dxa"/>
+              <w:left w:w="50" w:type="dxa"/>
+              <w:right w:w="0" w:type="dxa"/>
+            </w:tcMar>
+          </w:tcPr>
+          <w:p>
+            <w:pPr>
+              <w:spacing w:before="40" w:after="40"/>
+            </w:pPr>
+            <w:r>
+              <w:rPr>
+                <w:rFonts w:ascii="Arial" w:hAnsi="Arial"/>
+                <w:color w:val="0F172A"/>
+                <w:sz w:val="19"/>
+              </w:rPr>
+              <w:t>3.4U Inspection Engineer (Project Readiness &amp; Scoping)</w:t>
+            </w:r>
+          </w:p>
+        </w:tc>
+      </w:tr>
+    </w:tbl>
+    <w:p>
+      <w:pPr>
+        <w:spacing w:before="80" w:after="40"/>
+      </w:pPr>
+      <w:r>
+        <w:rPr>
+          <w:rFonts w:ascii="Arial" w:hAnsi="Arial"/>
+          <w:b/>
+          <w:sz w:val="19"/>
+        </w:rPr>
+        <w:t>Scope/Details:</w:t>
+      </w:r>
+    </w:p>
+    <w:p>
+      <w:pPr>
+        <w:pStyle w:val="ListBullet"/>
+        <w:spacing w:before="40" w:after="60"/>
+        <w:ind w:left="504"/>
+      </w:pPr>
+      <w:r>
+        <w:rPr>
+          <w:rFonts w:ascii="Arial" w:hAnsi="Arial"/>
+          <w:b/>
+          <w:color w:val="1E293B"/>
+          <w:sz w:val="19"/>
+        </w:rPr>
+      </w:r>
+      <w:r>
+        <w:rPr>
+          <w:rFonts w:ascii="Arial" w:hAnsi="Arial"/>
+          <w:color w:val="475569"/>
+          <w:sz w:val="19"/>
+        </w:rPr>
+        <w:t>Project Readiness: Mobilized to Fugro HQ, JAFZA for initial framework preparation, executing detailed work pack reviews and asset scoping for the Upper Zakum jacket inspection and crossing survey.</w:t>
+      </w:r>
+    </w:p>
+    <w:p>
+      <w:pPr>
+        <w:pStyle w:val="ListBullet"/>
+        <w:spacing w:before="40" w:after="60"/>
+        <w:ind w:left="504"/>
+      </w:pPr>
+      <w:r>
+        <w:rPr>
+          <w:rFonts w:ascii="Arial" w:hAnsi="Arial"/>
+          <w:b/>
+          <w:color w:val="1E293B"/>
+          <w:sz w:val="19"/>
+        </w:rPr>
+      </w:r>
+      <w:r>
+        <w:rPr>
+          <w:rFonts w:ascii="Arial" w:hAnsi="Arial"/>
+          <w:color w:val="475569"/>
+          <w:sz w:val="19"/>
+        </w:rPr>
+        <w:t>Engineering Support: Assisted in preliminary subsea 3D photogrammetry software setup, performing data-readiness checks on engineering drawings and jacket node mapping.</w:t>
       </w:r>
     </w:p>
     <w:p/>
@@ -7490,6 +7732,636 @@
                 <w:color w:val="0F172A"/>
                 <w:sz w:val="19"/>
               </w:rPr>
+              <w:t>Sirrihat Subsea Services Sdn Bhd</w:t>
+            </w:r>
+          </w:p>
+        </w:tc>
+      </w:tr>
+      <w:tr>
+        <w:trPr>
+          <w:cantSplit/>
+        </w:trPr>
+        <w:tc>
+          <w:tcPr>
+            <w:tcW w:type="dxa" w:w="2592"/>
+            <w:tcMar>
+              <w:top w:w="60" w:type="dxa"/>
+              <w:bottom w:w="60" w:type="dxa"/>
+              <w:left w:w="0" w:type="dxa"/>
+              <w:right w:w="50" w:type="dxa"/>
+            </w:tcMar>
+          </w:tcPr>
+          <w:p>
+            <w:pPr>
+              <w:spacing w:before="40" w:after="40"/>
+            </w:pPr>
+            <w:r>
+              <w:rPr>
+                <w:rFonts w:ascii="Arial" w:hAnsi="Arial"/>
+                <w:b/>
+                <w:color w:val="475569"/>
+                <w:sz w:val="19"/>
+              </w:rPr>
+              <w:t>Client</w:t>
+            </w:r>
+          </w:p>
+        </w:tc>
+        <w:tc>
+          <w:tcPr>
+            <w:tcW w:type="dxa" w:w="288"/>
+            <w:tcMar>
+              <w:top w:w="60" w:type="dxa"/>
+              <w:bottom w:w="60" w:type="dxa"/>
+              <w:left w:w="0" w:type="dxa"/>
+              <w:right w:w="0" w:type="dxa"/>
+            </w:tcMar>
+          </w:tcPr>
+          <w:p>
+            <w:pPr>
+              <w:spacing w:before="40" w:after="40"/>
+            </w:pPr>
+            <w:r>
+              <w:rPr>
+                <w:rFonts w:ascii="Arial" w:hAnsi="Arial"/>
+                <w:color w:val="94A3B8"/>
+                <w:sz w:val="19"/>
+              </w:rPr>
+              <w:t>:</w:t>
+            </w:r>
+          </w:p>
+        </w:tc>
+        <w:tc>
+          <w:tcPr>
+            <w:tcW w:type="dxa" w:w="7200"/>
+            <w:tcMar>
+              <w:top w:w="60" w:type="dxa"/>
+              <w:bottom w:w="60" w:type="dxa"/>
+              <w:left w:w="50" w:type="dxa"/>
+              <w:right w:w="0" w:type="dxa"/>
+            </w:tcMar>
+          </w:tcPr>
+          <w:p>
+            <w:pPr>
+              <w:spacing w:before="40" w:after="40"/>
+            </w:pPr>
+            <w:r>
+              <w:rPr>
+                <w:rFonts w:ascii="Arial" w:hAnsi="Arial"/>
+                <w:color w:val="0F172A"/>
+                <w:sz w:val="19"/>
+              </w:rPr>
+            </w:r>
+          </w:p>
+        </w:tc>
+      </w:tr>
+      <w:tr>
+        <w:trPr>
+          <w:cantSplit/>
+        </w:trPr>
+        <w:tc>
+          <w:tcPr>
+            <w:tcW w:type="dxa" w:w="2592"/>
+            <w:tcMar>
+              <w:top w:w="60" w:type="dxa"/>
+              <w:bottom w:w="60" w:type="dxa"/>
+              <w:left w:w="0" w:type="dxa"/>
+              <w:right w:w="50" w:type="dxa"/>
+            </w:tcMar>
+          </w:tcPr>
+          <w:p>
+            <w:pPr>
+              <w:spacing w:before="40" w:after="40"/>
+            </w:pPr>
+            <w:r>
+              <w:rPr>
+                <w:rFonts w:ascii="Arial" w:hAnsi="Arial"/>
+                <w:b/>
+                <w:color w:val="475569"/>
+                <w:sz w:val="19"/>
+              </w:rPr>
+              <w:t>Project</w:t>
+            </w:r>
+          </w:p>
+        </w:tc>
+        <w:tc>
+          <w:tcPr>
+            <w:tcW w:type="dxa" w:w="288"/>
+            <w:tcMar>
+              <w:top w:w="60" w:type="dxa"/>
+              <w:bottom w:w="60" w:type="dxa"/>
+              <w:left w:w="0" w:type="dxa"/>
+              <w:right w:w="0" w:type="dxa"/>
+            </w:tcMar>
+          </w:tcPr>
+          <w:p>
+            <w:pPr>
+              <w:spacing w:before="40" w:after="40"/>
+            </w:pPr>
+            <w:r>
+              <w:rPr>
+                <w:rFonts w:ascii="Arial" w:hAnsi="Arial"/>
+                <w:color w:val="94A3B8"/>
+                <w:sz w:val="19"/>
+              </w:rPr>
+              <w:t>:</w:t>
+            </w:r>
+          </w:p>
+        </w:tc>
+        <w:tc>
+          <w:tcPr>
+            <w:tcW w:type="dxa" w:w="7200"/>
+            <w:tcMar>
+              <w:top w:w="60" w:type="dxa"/>
+              <w:bottom w:w="60" w:type="dxa"/>
+              <w:left w:w="50" w:type="dxa"/>
+              <w:right w:w="0" w:type="dxa"/>
+            </w:tcMar>
+          </w:tcPr>
+          <w:p>
+            <w:pPr>
+              <w:spacing w:before="40" w:after="40"/>
+            </w:pPr>
+            <w:r>
+              <w:rPr>
+                <w:rFonts w:ascii="Arial" w:hAnsi="Arial"/>
+                <w:color w:val="0F172A"/>
+                <w:sz w:val="19"/>
+              </w:rPr>
+              <w:t>Onshore Engineering &amp; Reporting Support (Subang Jaya, Selangor, Malaysia)</w:t>
+            </w:r>
+          </w:p>
+        </w:tc>
+      </w:tr>
+      <w:tr>
+        <w:trPr>
+          <w:cantSplit/>
+        </w:trPr>
+        <w:tc>
+          <w:tcPr>
+            <w:tcW w:type="dxa" w:w="2592"/>
+            <w:tcMar>
+              <w:top w:w="60" w:type="dxa"/>
+              <w:bottom w:w="60" w:type="dxa"/>
+              <w:left w:w="0" w:type="dxa"/>
+              <w:right w:w="50" w:type="dxa"/>
+            </w:tcMar>
+          </w:tcPr>
+          <w:p>
+            <w:pPr>
+              <w:spacing w:before="40" w:after="40"/>
+            </w:pPr>
+            <w:r>
+              <w:rPr>
+                <w:rFonts w:ascii="Arial" w:hAnsi="Arial"/>
+                <w:b/>
+                <w:color w:val="475569"/>
+                <w:sz w:val="19"/>
+              </w:rPr>
+              <w:t>Duration</w:t>
+            </w:r>
+          </w:p>
+        </w:tc>
+        <w:tc>
+          <w:tcPr>
+            <w:tcW w:type="dxa" w:w="288"/>
+            <w:tcMar>
+              <w:top w:w="60" w:type="dxa"/>
+              <w:bottom w:w="60" w:type="dxa"/>
+              <w:left w:w="0" w:type="dxa"/>
+              <w:right w:w="0" w:type="dxa"/>
+            </w:tcMar>
+          </w:tcPr>
+          <w:p>
+            <w:pPr>
+              <w:spacing w:before="40" w:after="40"/>
+            </w:pPr>
+            <w:r>
+              <w:rPr>
+                <w:rFonts w:ascii="Arial" w:hAnsi="Arial"/>
+                <w:color w:val="94A3B8"/>
+                <w:sz w:val="19"/>
+              </w:rPr>
+              <w:t>:</w:t>
+            </w:r>
+          </w:p>
+        </w:tc>
+        <w:tc>
+          <w:tcPr>
+            <w:tcW w:type="dxa" w:w="7200"/>
+            <w:tcMar>
+              <w:top w:w="60" w:type="dxa"/>
+              <w:bottom w:w="60" w:type="dxa"/>
+              <w:left w:w="50" w:type="dxa"/>
+              <w:right w:w="0" w:type="dxa"/>
+            </w:tcMar>
+          </w:tcPr>
+          <w:p>
+            <w:pPr>
+              <w:spacing w:before="40" w:after="40"/>
+            </w:pPr>
+            <w:r>
+              <w:rPr>
+                <w:rFonts w:ascii="Arial" w:hAnsi="Arial"/>
+                <w:color w:val="0F172A"/>
+                <w:sz w:val="19"/>
+              </w:rPr>
+              <w:t>November 2022 – September 2023</w:t>
+            </w:r>
+          </w:p>
+        </w:tc>
+      </w:tr>
+      <w:tr>
+        <w:trPr>
+          <w:cantSplit/>
+        </w:trPr>
+        <w:tc>
+          <w:tcPr>
+            <w:tcW w:type="dxa" w:w="2592"/>
+            <w:tcMar>
+              <w:top w:w="60" w:type="dxa"/>
+              <w:bottom w:w="60" w:type="dxa"/>
+              <w:left w:w="0" w:type="dxa"/>
+              <w:right w:w="50" w:type="dxa"/>
+            </w:tcMar>
+          </w:tcPr>
+          <w:p>
+            <w:pPr>
+              <w:spacing w:before="40" w:after="40"/>
+            </w:pPr>
+            <w:r>
+              <w:rPr>
+                <w:rFonts w:ascii="Arial" w:hAnsi="Arial"/>
+                <w:b/>
+                <w:color w:val="475569"/>
+                <w:sz w:val="19"/>
+              </w:rPr>
+              <w:t>Vessel/Barge</w:t>
+            </w:r>
+          </w:p>
+        </w:tc>
+        <w:tc>
+          <w:tcPr>
+            <w:tcW w:type="dxa" w:w="288"/>
+            <w:tcMar>
+              <w:top w:w="60" w:type="dxa"/>
+              <w:bottom w:w="60" w:type="dxa"/>
+              <w:left w:w="0" w:type="dxa"/>
+              <w:right w:w="0" w:type="dxa"/>
+            </w:tcMar>
+          </w:tcPr>
+          <w:p>
+            <w:pPr>
+              <w:spacing w:before="40" w:after="40"/>
+            </w:pPr>
+            <w:r>
+              <w:rPr>
+                <w:rFonts w:ascii="Arial" w:hAnsi="Arial"/>
+                <w:color w:val="94A3B8"/>
+                <w:sz w:val="19"/>
+              </w:rPr>
+              <w:t>:</w:t>
+            </w:r>
+          </w:p>
+        </w:tc>
+        <w:tc>
+          <w:tcPr>
+            <w:tcW w:type="dxa" w:w="7200"/>
+            <w:tcMar>
+              <w:top w:w="60" w:type="dxa"/>
+              <w:bottom w:w="60" w:type="dxa"/>
+              <w:left w:w="50" w:type="dxa"/>
+              <w:right w:w="0" w:type="dxa"/>
+            </w:tcMar>
+          </w:tcPr>
+          <w:p>
+            <w:pPr>
+              <w:spacing w:before="40" w:after="40"/>
+            </w:pPr>
+            <w:r>
+              <w:rPr>
+                <w:rFonts w:ascii="Arial" w:hAnsi="Arial"/>
+                <w:color w:val="0F172A"/>
+                <w:sz w:val="19"/>
+              </w:rPr>
+            </w:r>
+          </w:p>
+        </w:tc>
+      </w:tr>
+      <w:tr>
+        <w:trPr>
+          <w:cantSplit/>
+        </w:trPr>
+        <w:tc>
+          <w:tcPr>
+            <w:tcW w:type="dxa" w:w="2592"/>
+            <w:tcMar>
+              <w:top w:w="60" w:type="dxa"/>
+              <w:bottom w:w="60" w:type="dxa"/>
+              <w:left w:w="0" w:type="dxa"/>
+              <w:right w:w="50" w:type="dxa"/>
+            </w:tcMar>
+          </w:tcPr>
+          <w:p>
+            <w:pPr>
+              <w:spacing w:before="40" w:after="40"/>
+            </w:pPr>
+            <w:r>
+              <w:rPr>
+                <w:rFonts w:ascii="Arial" w:hAnsi="Arial"/>
+                <w:b/>
+                <w:color w:val="475569"/>
+                <w:sz w:val="19"/>
+              </w:rPr>
+              <w:t>Position Title</w:t>
+            </w:r>
+          </w:p>
+        </w:tc>
+        <w:tc>
+          <w:tcPr>
+            <w:tcW w:type="dxa" w:w="288"/>
+            <w:tcMar>
+              <w:top w:w="60" w:type="dxa"/>
+              <w:bottom w:w="60" w:type="dxa"/>
+              <w:left w:w="0" w:type="dxa"/>
+              <w:right w:w="0" w:type="dxa"/>
+            </w:tcMar>
+          </w:tcPr>
+          <w:p>
+            <w:pPr>
+              <w:spacing w:before="40" w:after="40"/>
+            </w:pPr>
+            <w:r>
+              <w:rPr>
+                <w:rFonts w:ascii="Arial" w:hAnsi="Arial"/>
+                <w:color w:val="94A3B8"/>
+                <w:sz w:val="19"/>
+              </w:rPr>
+              <w:t>:</w:t>
+            </w:r>
+          </w:p>
+        </w:tc>
+        <w:tc>
+          <w:tcPr>
+            <w:tcW w:type="dxa" w:w="7200"/>
+            <w:tcMar>
+              <w:top w:w="60" w:type="dxa"/>
+              <w:bottom w:w="60" w:type="dxa"/>
+              <w:left w:w="50" w:type="dxa"/>
+              <w:right w:w="0" w:type="dxa"/>
+            </w:tcMar>
+          </w:tcPr>
+          <w:p>
+            <w:pPr>
+              <w:spacing w:before="40" w:after="40"/>
+            </w:pPr>
+            <w:r>
+              <w:rPr>
+                <w:rFonts w:ascii="Arial" w:hAnsi="Arial"/>
+                <w:color w:val="0F172A"/>
+                <w:sz w:val="19"/>
+              </w:rPr>
+              <w:t>Data QA/QC Coordinator</w:t>
+            </w:r>
+          </w:p>
+        </w:tc>
+      </w:tr>
+    </w:tbl>
+    <w:p>
+      <w:pPr>
+        <w:spacing w:before="80" w:after="40"/>
+      </w:pPr>
+      <w:r>
+        <w:rPr>
+          <w:rFonts w:ascii="Arial" w:hAnsi="Arial"/>
+          <w:b/>
+          <w:sz w:val="19"/>
+        </w:rPr>
+        <w:t>Scope/Details:</w:t>
+      </w:r>
+    </w:p>
+    <w:p>
+      <w:pPr>
+        <w:pStyle w:val="ListBullet"/>
+        <w:spacing w:before="40" w:after="60"/>
+        <w:ind w:left="504"/>
+      </w:pPr>
+      <w:r>
+        <w:rPr>
+          <w:rFonts w:ascii="Arial" w:hAnsi="Arial"/>
+          <w:b/>
+          <w:color w:val="1E293B"/>
+          <w:sz w:val="19"/>
+        </w:rPr>
+      </w:r>
+      <w:r>
+        <w:rPr>
+          <w:rFonts w:ascii="Arial" w:hAnsi="Arial"/>
+          <w:color w:val="475569"/>
+          <w:sz w:val="19"/>
+        </w:rPr>
+        <w:t>Final Reporting: Converted rough daily logs from offshore operations into polished, formal client reports.</w:t>
+      </w:r>
+    </w:p>
+    <w:p>
+      <w:pPr>
+        <w:pStyle w:val="ListBullet"/>
+        <w:spacing w:before="40" w:after="60"/>
+        <w:ind w:left="504"/>
+      </w:pPr>
+      <w:r>
+        <w:rPr>
+          <w:rFonts w:ascii="Arial" w:hAnsi="Arial"/>
+          <w:b/>
+          <w:color w:val="1E293B"/>
+          <w:sz w:val="19"/>
+        </w:rPr>
+      </w:r>
+      <w:r>
+        <w:rPr>
+          <w:rFonts w:ascii="Arial" w:hAnsi="Arial"/>
+          <w:color w:val="475569"/>
+          <w:sz w:val="19"/>
+        </w:rPr>
+        <w:t>Data QA/QC: Verified accuracy of subsea video footage, timestamps, and anomaly descriptions against physical logs.</w:t>
+      </w:r>
+    </w:p>
+    <w:p>
+      <w:pPr>
+        <w:pStyle w:val="ListBullet"/>
+        <w:spacing w:before="40" w:after="60"/>
+        <w:ind w:left="504"/>
+      </w:pPr>
+      <w:r>
+        <w:rPr>
+          <w:rFonts w:ascii="Arial" w:hAnsi="Arial"/>
+          <w:b/>
+          <w:color w:val="1E293B"/>
+          <w:sz w:val="19"/>
+        </w:rPr>
+      </w:r>
+      <w:r>
+        <w:rPr>
+          <w:rFonts w:ascii="Arial" w:hAnsi="Arial"/>
+          <w:color w:val="475569"/>
+          <w:sz w:val="19"/>
+        </w:rPr>
+        <w:t>Database Management: Uploaded validated offshore data and inspection logs into integrity software systems.</w:t>
+      </w:r>
+    </w:p>
+    <w:p>
+      <w:pPr>
+        <w:pStyle w:val="ListBullet"/>
+        <w:spacing w:before="40" w:after="60"/>
+        <w:ind w:left="504"/>
+      </w:pPr>
+      <w:r>
+        <w:rPr>
+          <w:rFonts w:ascii="Arial" w:hAnsi="Arial"/>
+          <w:b/>
+          <w:color w:val="1E293B"/>
+          <w:sz w:val="19"/>
+        </w:rPr>
+      </w:r>
+      <w:r>
+        <w:rPr>
+          <w:rFonts w:ascii="Arial" w:hAnsi="Arial"/>
+          <w:color w:val="475569"/>
+          <w:sz w:val="19"/>
+        </w:rPr>
+        <w:t>Drawing Updates: Marked up CAD and "As-Built" drawings to reflect new subsea findings and anomalies.</w:t>
+      </w:r>
+    </w:p>
+    <w:p>
+      <w:pPr>
+        <w:pStyle w:val="ListBullet"/>
+        <w:spacing w:before="40" w:after="60"/>
+        <w:ind w:left="504"/>
+      </w:pPr>
+      <w:r>
+        <w:rPr>
+          <w:rFonts w:ascii="Arial" w:hAnsi="Arial"/>
+          <w:b/>
+          <w:color w:val="1E293B"/>
+          <w:sz w:val="19"/>
+        </w:rPr>
+      </w:r>
+      <w:r>
+        <w:rPr>
+          <w:rFonts w:ascii="Arial" w:hAnsi="Arial"/>
+          <w:color w:val="475569"/>
+          <w:sz w:val="19"/>
+        </w:rPr>
+        <w:t>Work Pack Creation: Wrote detailed, step-by-step inspection procedures and checklists for upcoming subsea campaigns.</w:t>
+      </w:r>
+    </w:p>
+    <w:p>
+      <w:pPr>
+        <w:pStyle w:val="ListBullet"/>
+        <w:spacing w:before="40" w:after="60"/>
+        <w:ind w:left="504"/>
+      </w:pPr>
+      <w:r>
+        <w:rPr>
+          <w:rFonts w:ascii="Arial" w:hAnsi="Arial"/>
+          <w:b/>
+          <w:color w:val="1E293B"/>
+          <w:sz w:val="19"/>
+        </w:rPr>
+      </w:r>
+      <w:r>
+        <w:rPr>
+          <w:rFonts w:ascii="Arial" w:hAnsi="Arial"/>
+          <w:color w:val="475569"/>
+          <w:sz w:val="19"/>
+        </w:rPr>
+        <w:t>Desktop Studies: Reviewed historical integrity reports to identify targeted areas of interest for future monitoring.</w:t>
+      </w:r>
+    </w:p>
+    <w:p/>
+    <w:tbl>
+      <w:tblPr>
+        <w:tblW w:type="auto" w:w="0"/>
+        <w:tblLayout w:type="fixed"/>
+        <w:tblLook w:firstColumn="1" w:firstRow="1" w:lastColumn="0" w:lastRow="0" w:noHBand="0" w:noVBand="1" w:val="04A0"/>
+      </w:tblPr>
+      <w:tblGrid>
+        <w:gridCol w:w="3360"/>
+        <w:gridCol w:w="3360"/>
+        <w:gridCol w:w="3360"/>
+      </w:tblGrid>
+      <w:tr>
+        <w:trPr>
+          <w:cantSplit/>
+        </w:trPr>
+        <w:tc>
+          <w:tcPr>
+            <w:tcW w:type="dxa" w:w="2592"/>
+            <w:tcMar>
+              <w:top w:w="60" w:type="dxa"/>
+              <w:bottom w:w="60" w:type="dxa"/>
+              <w:left w:w="0" w:type="dxa"/>
+              <w:right w:w="50" w:type="dxa"/>
+            </w:tcMar>
+          </w:tcPr>
+          <w:p>
+            <w:pPr>
+              <w:spacing w:before="40" w:after="40"/>
+            </w:pPr>
+            <w:r>
+              <w:rPr>
+                <w:rFonts w:ascii="Arial" w:hAnsi="Arial"/>
+                <w:b/>
+                <w:color w:val="475569"/>
+                <w:sz w:val="19"/>
+              </w:rPr>
+              <w:t>Company</w:t>
+            </w:r>
+          </w:p>
+        </w:tc>
+        <w:tc>
+          <w:tcPr>
+            <w:tcW w:type="dxa" w:w="288"/>
+            <w:tcMar>
+              <w:top w:w="60" w:type="dxa"/>
+              <w:bottom w:w="60" w:type="dxa"/>
+              <w:left w:w="0" w:type="dxa"/>
+              <w:right w:w="0" w:type="dxa"/>
+            </w:tcMar>
+          </w:tcPr>
+          <w:p>
+            <w:pPr>
+              <w:spacing w:before="40" w:after="40"/>
+            </w:pPr>
+            <w:r>
+              <w:rPr>
+                <w:rFonts w:ascii="Arial" w:hAnsi="Arial"/>
+                <w:color w:val="94A3B8"/>
+                <w:sz w:val="19"/>
+              </w:rPr>
+              <w:t>:</w:t>
+            </w:r>
+          </w:p>
+        </w:tc>
+        <w:tc>
+          <w:tcPr>
+            <w:tcW w:type="dxa" w:w="7200"/>
+            <w:tcMar>
+              <w:top w:w="60" w:type="dxa"/>
+              <w:bottom w:w="60" w:type="dxa"/>
+              <w:left w:w="50" w:type="dxa"/>
+              <w:right w:w="0" w:type="dxa"/>
+            </w:tcMar>
+          </w:tcPr>
+          <w:p>
+            <w:pPr>
+              <w:spacing w:before="40" w:after="40"/>
+            </w:pPr>
+            <w:r>
+              <w:rPr>
+                <w:rFonts w:ascii="Arial" w:hAnsi="Arial"/>
+                <w:color w:val="0F172A"/>
+                <w:sz w:val="19"/>
+              </w:rPr>
               <w:t>Sapura Subsea Services Sdn Bhd</w:t>
             </w:r>
           </w:p>

</xml_diff>

<commit_message>
Optimize CV: remove empty Vessel/Barge row from Sapura Apr 2026 job card, change Vessel/Barge to Location: ROC, Fugro HQ, Jafza Dubai for Fugro Dec 2025 onboarding job card, regenerate Muhammad_Amin_Azman_CV.docx
</commit_message>
<xml_diff>
--- a/Muhammad_Amin_Azman_CV.docx
+++ b/Muhammad_Amin_Azman_CV.docx
@@ -1922,83 +1922,6 @@
                 <w:color w:val="475569"/>
                 <w:sz w:val="19"/>
               </w:rPr>
-              <w:t>Vessel/Barge</w:t>
-            </w:r>
-          </w:p>
-        </w:tc>
-        <w:tc>
-          <w:tcPr>
-            <w:tcW w:type="dxa" w:w="288"/>
-            <w:tcMar>
-              <w:top w:w="60" w:type="dxa"/>
-              <w:bottom w:w="60" w:type="dxa"/>
-              <w:left w:w="0" w:type="dxa"/>
-              <w:right w:w="0" w:type="dxa"/>
-            </w:tcMar>
-          </w:tcPr>
-          <w:p>
-            <w:pPr>
-              <w:spacing w:before="40" w:after="40"/>
-            </w:pPr>
-            <w:r>
-              <w:rPr>
-                <w:rFonts w:ascii="Arial" w:hAnsi="Arial"/>
-                <w:color w:val="94A3B8"/>
-                <w:sz w:val="19"/>
-              </w:rPr>
-              <w:t>:</w:t>
-            </w:r>
-          </w:p>
-        </w:tc>
-        <w:tc>
-          <w:tcPr>
-            <w:tcW w:type="dxa" w:w="7200"/>
-            <w:tcMar>
-              <w:top w:w="60" w:type="dxa"/>
-              <w:bottom w:w="60" w:type="dxa"/>
-              <w:left w:w="50" w:type="dxa"/>
-              <w:right w:w="0" w:type="dxa"/>
-            </w:tcMar>
-          </w:tcPr>
-          <w:p>
-            <w:pPr>
-              <w:spacing w:before="40" w:after="40"/>
-            </w:pPr>
-            <w:r>
-              <w:rPr>
-                <w:rFonts w:ascii="Arial" w:hAnsi="Arial"/>
-                <w:color w:val="0F172A"/>
-                <w:sz w:val="19"/>
-              </w:rPr>
-            </w:r>
-          </w:p>
-        </w:tc>
-      </w:tr>
-      <w:tr>
-        <w:trPr>
-          <w:cantSplit/>
-        </w:trPr>
-        <w:tc>
-          <w:tcPr>
-            <w:tcW w:type="dxa" w:w="2592"/>
-            <w:tcMar>
-              <w:top w:w="60" w:type="dxa"/>
-              <w:bottom w:w="60" w:type="dxa"/>
-              <w:left w:w="0" w:type="dxa"/>
-              <w:right w:w="50" w:type="dxa"/>
-            </w:tcMar>
-          </w:tcPr>
-          <w:p>
-            <w:pPr>
-              <w:spacing w:before="40" w:after="40"/>
-            </w:pPr>
-            <w:r>
-              <w:rPr>
-                <w:rFonts w:ascii="Arial" w:hAnsi="Arial"/>
-                <w:b/>
-                <w:color w:val="475569"/>
-                <w:sz w:val="19"/>
-              </w:rPr>
               <w:t>Position Title</w:t>
             </w:r>
           </w:p>
@@ -2484,7 +2407,7 @@
                 <w:color w:val="475569"/>
                 <w:sz w:val="19"/>
               </w:rPr>
-              <w:t>Vessel/Barge</w:t>
+              <w:t>Location</w:t>
             </w:r>
           </w:p>
         </w:tc>
@@ -2532,6 +2455,7 @@
                 <w:color w:val="0F172A"/>
                 <w:sz w:val="19"/>
               </w:rPr>
+              <w:t>ROC, Fugro HQ, Jafza Dubai</w:t>
             </w:r>
           </w:p>
         </w:tc>

</xml_diff>

<commit_message>
Optimize CV: move Sirrihat Data QA/QC Coordinator job card to the top of Detailed Campaign & Employment Timeline, update Client to Multiple Clients, set Location: Sirrihatt Office, regenerate Muhammad_Amin_Azman_CV.docx
</commit_message>
<xml_diff>
--- a/Muhammad_Amin_Azman_CV.docx
+++ b/Muhammad_Amin_Azman_CV.docx
@@ -1574,6 +1574,638 @@
         <w:t>DETAILED CAMPAIGN &amp; EMPLOYMENT TIMELINE</w:t>
       </w:r>
     </w:p>
+    <w:tbl>
+      <w:tblPr>
+        <w:tblW w:type="auto" w:w="0"/>
+        <w:tblLayout w:type="fixed"/>
+        <w:tblLook w:firstColumn="1" w:firstRow="1" w:lastColumn="0" w:lastRow="0" w:noHBand="0" w:noVBand="1" w:val="04A0"/>
+      </w:tblPr>
+      <w:tblGrid>
+        <w:gridCol w:w="3360"/>
+        <w:gridCol w:w="3360"/>
+        <w:gridCol w:w="3360"/>
+      </w:tblGrid>
+      <w:tr>
+        <w:trPr>
+          <w:cantSplit/>
+        </w:trPr>
+        <w:tc>
+          <w:tcPr>
+            <w:tcW w:type="dxa" w:w="2592"/>
+            <w:tcMar>
+              <w:top w:w="60" w:type="dxa"/>
+              <w:bottom w:w="60" w:type="dxa"/>
+              <w:left w:w="0" w:type="dxa"/>
+              <w:right w:w="50" w:type="dxa"/>
+            </w:tcMar>
+          </w:tcPr>
+          <w:p>
+            <w:pPr>
+              <w:spacing w:before="40" w:after="40"/>
+            </w:pPr>
+            <w:r>
+              <w:rPr>
+                <w:rFonts w:ascii="Arial" w:hAnsi="Arial"/>
+                <w:b/>
+                <w:color w:val="475569"/>
+                <w:sz w:val="19"/>
+              </w:rPr>
+              <w:t>Company</w:t>
+            </w:r>
+          </w:p>
+        </w:tc>
+        <w:tc>
+          <w:tcPr>
+            <w:tcW w:type="dxa" w:w="288"/>
+            <w:tcMar>
+              <w:top w:w="60" w:type="dxa"/>
+              <w:bottom w:w="60" w:type="dxa"/>
+              <w:left w:w="0" w:type="dxa"/>
+              <w:right w:w="0" w:type="dxa"/>
+            </w:tcMar>
+          </w:tcPr>
+          <w:p>
+            <w:pPr>
+              <w:spacing w:before="40" w:after="40"/>
+            </w:pPr>
+            <w:r>
+              <w:rPr>
+                <w:rFonts w:ascii="Arial" w:hAnsi="Arial"/>
+                <w:color w:val="94A3B8"/>
+                <w:sz w:val="19"/>
+              </w:rPr>
+              <w:t>:</w:t>
+            </w:r>
+          </w:p>
+        </w:tc>
+        <w:tc>
+          <w:tcPr>
+            <w:tcW w:type="dxa" w:w="7200"/>
+            <w:tcMar>
+              <w:top w:w="60" w:type="dxa"/>
+              <w:bottom w:w="60" w:type="dxa"/>
+              <w:left w:w="50" w:type="dxa"/>
+              <w:right w:w="0" w:type="dxa"/>
+            </w:tcMar>
+          </w:tcPr>
+          <w:p>
+            <w:pPr>
+              <w:spacing w:before="40" w:after="40"/>
+            </w:pPr>
+            <w:r>
+              <w:rPr>
+                <w:rFonts w:ascii="Arial" w:hAnsi="Arial"/>
+                <w:color w:val="0F172A"/>
+                <w:sz w:val="19"/>
+              </w:rPr>
+              <w:t>Sirrihat Subsea Services Sdn Bhd</w:t>
+            </w:r>
+          </w:p>
+        </w:tc>
+      </w:tr>
+      <w:tr>
+        <w:trPr>
+          <w:cantSplit/>
+        </w:trPr>
+        <w:tc>
+          <w:tcPr>
+            <w:tcW w:type="dxa" w:w="2592"/>
+            <w:tcMar>
+              <w:top w:w="60" w:type="dxa"/>
+              <w:bottom w:w="60" w:type="dxa"/>
+              <w:left w:w="0" w:type="dxa"/>
+              <w:right w:w="50" w:type="dxa"/>
+            </w:tcMar>
+          </w:tcPr>
+          <w:p>
+            <w:pPr>
+              <w:spacing w:before="40" w:after="40"/>
+            </w:pPr>
+            <w:r>
+              <w:rPr>
+                <w:rFonts w:ascii="Arial" w:hAnsi="Arial"/>
+                <w:b/>
+                <w:color w:val="475569"/>
+                <w:sz w:val="19"/>
+              </w:rPr>
+              <w:t>Client</w:t>
+            </w:r>
+          </w:p>
+        </w:tc>
+        <w:tc>
+          <w:tcPr>
+            <w:tcW w:type="dxa" w:w="288"/>
+            <w:tcMar>
+              <w:top w:w="60" w:type="dxa"/>
+              <w:bottom w:w="60" w:type="dxa"/>
+              <w:left w:w="0" w:type="dxa"/>
+              <w:right w:w="0" w:type="dxa"/>
+            </w:tcMar>
+          </w:tcPr>
+          <w:p>
+            <w:pPr>
+              <w:spacing w:before="40" w:after="40"/>
+            </w:pPr>
+            <w:r>
+              <w:rPr>
+                <w:rFonts w:ascii="Arial" w:hAnsi="Arial"/>
+                <w:color w:val="94A3B8"/>
+                <w:sz w:val="19"/>
+              </w:rPr>
+              <w:t>:</w:t>
+            </w:r>
+          </w:p>
+        </w:tc>
+        <w:tc>
+          <w:tcPr>
+            <w:tcW w:type="dxa" w:w="7200"/>
+            <w:tcMar>
+              <w:top w:w="60" w:type="dxa"/>
+              <w:bottom w:w="60" w:type="dxa"/>
+              <w:left w:w="50" w:type="dxa"/>
+              <w:right w:w="0" w:type="dxa"/>
+            </w:tcMar>
+          </w:tcPr>
+          <w:p>
+            <w:pPr>
+              <w:spacing w:before="40" w:after="40"/>
+            </w:pPr>
+            <w:r>
+              <w:rPr>
+                <w:rFonts w:ascii="Arial" w:hAnsi="Arial"/>
+                <w:color w:val="0F172A"/>
+                <w:sz w:val="19"/>
+              </w:rPr>
+              <w:t>Multiple Clients</w:t>
+            </w:r>
+          </w:p>
+        </w:tc>
+      </w:tr>
+      <w:tr>
+        <w:trPr>
+          <w:cantSplit/>
+        </w:trPr>
+        <w:tc>
+          <w:tcPr>
+            <w:tcW w:type="dxa" w:w="2592"/>
+            <w:tcMar>
+              <w:top w:w="60" w:type="dxa"/>
+              <w:bottom w:w="60" w:type="dxa"/>
+              <w:left w:w="0" w:type="dxa"/>
+              <w:right w:w="50" w:type="dxa"/>
+            </w:tcMar>
+          </w:tcPr>
+          <w:p>
+            <w:pPr>
+              <w:spacing w:before="40" w:after="40"/>
+            </w:pPr>
+            <w:r>
+              <w:rPr>
+                <w:rFonts w:ascii="Arial" w:hAnsi="Arial"/>
+                <w:b/>
+                <w:color w:val="475569"/>
+                <w:sz w:val="19"/>
+              </w:rPr>
+              <w:t>Project</w:t>
+            </w:r>
+          </w:p>
+        </w:tc>
+        <w:tc>
+          <w:tcPr>
+            <w:tcW w:type="dxa" w:w="288"/>
+            <w:tcMar>
+              <w:top w:w="60" w:type="dxa"/>
+              <w:bottom w:w="60" w:type="dxa"/>
+              <w:left w:w="0" w:type="dxa"/>
+              <w:right w:w="0" w:type="dxa"/>
+            </w:tcMar>
+          </w:tcPr>
+          <w:p>
+            <w:pPr>
+              <w:spacing w:before="40" w:after="40"/>
+            </w:pPr>
+            <w:r>
+              <w:rPr>
+                <w:rFonts w:ascii="Arial" w:hAnsi="Arial"/>
+                <w:color w:val="94A3B8"/>
+                <w:sz w:val="19"/>
+              </w:rPr>
+              <w:t>:</w:t>
+            </w:r>
+          </w:p>
+        </w:tc>
+        <w:tc>
+          <w:tcPr>
+            <w:tcW w:type="dxa" w:w="7200"/>
+            <w:tcMar>
+              <w:top w:w="60" w:type="dxa"/>
+              <w:bottom w:w="60" w:type="dxa"/>
+              <w:left w:w="50" w:type="dxa"/>
+              <w:right w:w="0" w:type="dxa"/>
+            </w:tcMar>
+          </w:tcPr>
+          <w:p>
+            <w:pPr>
+              <w:spacing w:before="40" w:after="40"/>
+            </w:pPr>
+            <w:r>
+              <w:rPr>
+                <w:rFonts w:ascii="Arial" w:hAnsi="Arial"/>
+                <w:color w:val="0F172A"/>
+                <w:sz w:val="19"/>
+              </w:rPr>
+              <w:t>Onshore Engineering &amp; Reporting Support (Subang Jaya, Selangor, Malaysia)</w:t>
+            </w:r>
+          </w:p>
+        </w:tc>
+      </w:tr>
+      <w:tr>
+        <w:trPr>
+          <w:cantSplit/>
+        </w:trPr>
+        <w:tc>
+          <w:tcPr>
+            <w:tcW w:type="dxa" w:w="2592"/>
+            <w:tcMar>
+              <w:top w:w="60" w:type="dxa"/>
+              <w:bottom w:w="60" w:type="dxa"/>
+              <w:left w:w="0" w:type="dxa"/>
+              <w:right w:w="50" w:type="dxa"/>
+            </w:tcMar>
+          </w:tcPr>
+          <w:p>
+            <w:pPr>
+              <w:spacing w:before="40" w:after="40"/>
+            </w:pPr>
+            <w:r>
+              <w:rPr>
+                <w:rFonts w:ascii="Arial" w:hAnsi="Arial"/>
+                <w:b/>
+                <w:color w:val="475569"/>
+                <w:sz w:val="19"/>
+              </w:rPr>
+              <w:t>Duration</w:t>
+            </w:r>
+          </w:p>
+        </w:tc>
+        <w:tc>
+          <w:tcPr>
+            <w:tcW w:type="dxa" w:w="288"/>
+            <w:tcMar>
+              <w:top w:w="60" w:type="dxa"/>
+              <w:bottom w:w="60" w:type="dxa"/>
+              <w:left w:w="0" w:type="dxa"/>
+              <w:right w:w="0" w:type="dxa"/>
+            </w:tcMar>
+          </w:tcPr>
+          <w:p>
+            <w:pPr>
+              <w:spacing w:before="40" w:after="40"/>
+            </w:pPr>
+            <w:r>
+              <w:rPr>
+                <w:rFonts w:ascii="Arial" w:hAnsi="Arial"/>
+                <w:color w:val="94A3B8"/>
+                <w:sz w:val="19"/>
+              </w:rPr>
+              <w:t>:</w:t>
+            </w:r>
+          </w:p>
+        </w:tc>
+        <w:tc>
+          <w:tcPr>
+            <w:tcW w:type="dxa" w:w="7200"/>
+            <w:tcMar>
+              <w:top w:w="60" w:type="dxa"/>
+              <w:bottom w:w="60" w:type="dxa"/>
+              <w:left w:w="50" w:type="dxa"/>
+              <w:right w:w="0" w:type="dxa"/>
+            </w:tcMar>
+          </w:tcPr>
+          <w:p>
+            <w:pPr>
+              <w:spacing w:before="40" w:after="40"/>
+            </w:pPr>
+            <w:r>
+              <w:rPr>
+                <w:rFonts w:ascii="Arial" w:hAnsi="Arial"/>
+                <w:color w:val="0F172A"/>
+                <w:sz w:val="19"/>
+              </w:rPr>
+              <w:t>November 2022 – September 2023</w:t>
+            </w:r>
+          </w:p>
+        </w:tc>
+      </w:tr>
+      <w:tr>
+        <w:trPr>
+          <w:cantSplit/>
+        </w:trPr>
+        <w:tc>
+          <w:tcPr>
+            <w:tcW w:type="dxa" w:w="2592"/>
+            <w:tcMar>
+              <w:top w:w="60" w:type="dxa"/>
+              <w:bottom w:w="60" w:type="dxa"/>
+              <w:left w:w="0" w:type="dxa"/>
+              <w:right w:w="50" w:type="dxa"/>
+            </w:tcMar>
+          </w:tcPr>
+          <w:p>
+            <w:pPr>
+              <w:spacing w:before="40" w:after="40"/>
+            </w:pPr>
+            <w:r>
+              <w:rPr>
+                <w:rFonts w:ascii="Arial" w:hAnsi="Arial"/>
+                <w:b/>
+                <w:color w:val="475569"/>
+                <w:sz w:val="19"/>
+              </w:rPr>
+              <w:t>Location</w:t>
+            </w:r>
+          </w:p>
+        </w:tc>
+        <w:tc>
+          <w:tcPr>
+            <w:tcW w:type="dxa" w:w="288"/>
+            <w:tcMar>
+              <w:top w:w="60" w:type="dxa"/>
+              <w:bottom w:w="60" w:type="dxa"/>
+              <w:left w:w="0" w:type="dxa"/>
+              <w:right w:w="0" w:type="dxa"/>
+            </w:tcMar>
+          </w:tcPr>
+          <w:p>
+            <w:pPr>
+              <w:spacing w:before="40" w:after="40"/>
+            </w:pPr>
+            <w:r>
+              <w:rPr>
+                <w:rFonts w:ascii="Arial" w:hAnsi="Arial"/>
+                <w:color w:val="94A3B8"/>
+                <w:sz w:val="19"/>
+              </w:rPr>
+              <w:t>:</w:t>
+            </w:r>
+          </w:p>
+        </w:tc>
+        <w:tc>
+          <w:tcPr>
+            <w:tcW w:type="dxa" w:w="7200"/>
+            <w:tcMar>
+              <w:top w:w="60" w:type="dxa"/>
+              <w:bottom w:w="60" w:type="dxa"/>
+              <w:left w:w="50" w:type="dxa"/>
+              <w:right w:w="0" w:type="dxa"/>
+            </w:tcMar>
+          </w:tcPr>
+          <w:p>
+            <w:pPr>
+              <w:spacing w:before="40" w:after="40"/>
+            </w:pPr>
+            <w:r>
+              <w:rPr>
+                <w:rFonts w:ascii="Arial" w:hAnsi="Arial"/>
+                <w:color w:val="0F172A"/>
+                <w:sz w:val="19"/>
+              </w:rPr>
+              <w:t>Sirrihatt Office</w:t>
+            </w:r>
+          </w:p>
+        </w:tc>
+      </w:tr>
+      <w:tr>
+        <w:trPr>
+          <w:cantSplit/>
+        </w:trPr>
+        <w:tc>
+          <w:tcPr>
+            <w:tcW w:type="dxa" w:w="2592"/>
+            <w:tcMar>
+              <w:top w:w="60" w:type="dxa"/>
+              <w:bottom w:w="60" w:type="dxa"/>
+              <w:left w:w="0" w:type="dxa"/>
+              <w:right w:w="50" w:type="dxa"/>
+            </w:tcMar>
+          </w:tcPr>
+          <w:p>
+            <w:pPr>
+              <w:spacing w:before="40" w:after="40"/>
+            </w:pPr>
+            <w:r>
+              <w:rPr>
+                <w:rFonts w:ascii="Arial" w:hAnsi="Arial"/>
+                <w:b/>
+                <w:color w:val="475569"/>
+                <w:sz w:val="19"/>
+              </w:rPr>
+              <w:t>Position Title</w:t>
+            </w:r>
+          </w:p>
+        </w:tc>
+        <w:tc>
+          <w:tcPr>
+            <w:tcW w:type="dxa" w:w="288"/>
+            <w:tcMar>
+              <w:top w:w="60" w:type="dxa"/>
+              <w:bottom w:w="60" w:type="dxa"/>
+              <w:left w:w="0" w:type="dxa"/>
+              <w:right w:w="0" w:type="dxa"/>
+            </w:tcMar>
+          </w:tcPr>
+          <w:p>
+            <w:pPr>
+              <w:spacing w:before="40" w:after="40"/>
+            </w:pPr>
+            <w:r>
+              <w:rPr>
+                <w:rFonts w:ascii="Arial" w:hAnsi="Arial"/>
+                <w:color w:val="94A3B8"/>
+                <w:sz w:val="19"/>
+              </w:rPr>
+              <w:t>:</w:t>
+            </w:r>
+          </w:p>
+        </w:tc>
+        <w:tc>
+          <w:tcPr>
+            <w:tcW w:type="dxa" w:w="7200"/>
+            <w:tcMar>
+              <w:top w:w="60" w:type="dxa"/>
+              <w:bottom w:w="60" w:type="dxa"/>
+              <w:left w:w="50" w:type="dxa"/>
+              <w:right w:w="0" w:type="dxa"/>
+            </w:tcMar>
+          </w:tcPr>
+          <w:p>
+            <w:pPr>
+              <w:spacing w:before="40" w:after="40"/>
+            </w:pPr>
+            <w:r>
+              <w:rPr>
+                <w:rFonts w:ascii="Arial" w:hAnsi="Arial"/>
+                <w:color w:val="0F172A"/>
+                <w:sz w:val="19"/>
+              </w:rPr>
+              <w:t>Data QA/QC Coordinator</w:t>
+            </w:r>
+          </w:p>
+        </w:tc>
+      </w:tr>
+    </w:tbl>
+    <w:p>
+      <w:pPr>
+        <w:spacing w:before="80" w:after="40"/>
+      </w:pPr>
+      <w:r>
+        <w:rPr>
+          <w:rFonts w:ascii="Arial" w:hAnsi="Arial"/>
+          <w:b/>
+          <w:sz w:val="19"/>
+        </w:rPr>
+        <w:t>Scope/Details:</w:t>
+      </w:r>
+    </w:p>
+    <w:p>
+      <w:pPr>
+        <w:pStyle w:val="ListBullet"/>
+        <w:spacing w:before="40" w:after="60"/>
+        <w:ind w:left="504"/>
+      </w:pPr>
+      <w:r>
+        <w:rPr>
+          <w:rFonts w:ascii="Arial" w:hAnsi="Arial"/>
+          <w:b/>
+          <w:color w:val="1E293B"/>
+          <w:sz w:val="19"/>
+        </w:rPr>
+      </w:r>
+      <w:r>
+        <w:rPr>
+          <w:rFonts w:ascii="Arial" w:hAnsi="Arial"/>
+          <w:color w:val="475569"/>
+          <w:sz w:val="19"/>
+        </w:rPr>
+        <w:t>Final Reporting: Converted rough daily logs from offshore operations into polished, formal client reports.</w:t>
+      </w:r>
+    </w:p>
+    <w:p>
+      <w:pPr>
+        <w:pStyle w:val="ListBullet"/>
+        <w:spacing w:before="40" w:after="60"/>
+        <w:ind w:left="504"/>
+      </w:pPr>
+      <w:r>
+        <w:rPr>
+          <w:rFonts w:ascii="Arial" w:hAnsi="Arial"/>
+          <w:b/>
+          <w:color w:val="1E293B"/>
+          <w:sz w:val="19"/>
+        </w:rPr>
+      </w:r>
+      <w:r>
+        <w:rPr>
+          <w:rFonts w:ascii="Arial" w:hAnsi="Arial"/>
+          <w:color w:val="475569"/>
+          <w:sz w:val="19"/>
+        </w:rPr>
+        <w:t>Data QA/QC: Verified accuracy of subsea video footage, timestamps, and anomaly descriptions against physical logs.</w:t>
+      </w:r>
+    </w:p>
+    <w:p>
+      <w:pPr>
+        <w:pStyle w:val="ListBullet"/>
+        <w:spacing w:before="40" w:after="60"/>
+        <w:ind w:left="504"/>
+      </w:pPr>
+      <w:r>
+        <w:rPr>
+          <w:rFonts w:ascii="Arial" w:hAnsi="Arial"/>
+          <w:b/>
+          <w:color w:val="1E293B"/>
+          <w:sz w:val="19"/>
+        </w:rPr>
+      </w:r>
+      <w:r>
+        <w:rPr>
+          <w:rFonts w:ascii="Arial" w:hAnsi="Arial"/>
+          <w:color w:val="475569"/>
+          <w:sz w:val="19"/>
+        </w:rPr>
+        <w:t>Database Management: Uploaded validated offshore data and inspection logs into integrity software systems.</w:t>
+      </w:r>
+    </w:p>
+    <w:p>
+      <w:pPr>
+        <w:pStyle w:val="ListBullet"/>
+        <w:spacing w:before="40" w:after="60"/>
+        <w:ind w:left="504"/>
+      </w:pPr>
+      <w:r>
+        <w:rPr>
+          <w:rFonts w:ascii="Arial" w:hAnsi="Arial"/>
+          <w:b/>
+          <w:color w:val="1E293B"/>
+          <w:sz w:val="19"/>
+        </w:rPr>
+      </w:r>
+      <w:r>
+        <w:rPr>
+          <w:rFonts w:ascii="Arial" w:hAnsi="Arial"/>
+          <w:color w:val="475569"/>
+          <w:sz w:val="19"/>
+        </w:rPr>
+        <w:t>Drawing Updates: Marked up CAD and "As-Built" drawings to reflect new subsea findings and anomalies.</w:t>
+      </w:r>
+    </w:p>
+    <w:p>
+      <w:pPr>
+        <w:pStyle w:val="ListBullet"/>
+        <w:spacing w:before="40" w:after="60"/>
+        <w:ind w:left="504"/>
+      </w:pPr>
+      <w:r>
+        <w:rPr>
+          <w:rFonts w:ascii="Arial" w:hAnsi="Arial"/>
+          <w:b/>
+          <w:color w:val="1E293B"/>
+          <w:sz w:val="19"/>
+        </w:rPr>
+      </w:r>
+      <w:r>
+        <w:rPr>
+          <w:rFonts w:ascii="Arial" w:hAnsi="Arial"/>
+          <w:color w:val="475569"/>
+          <w:sz w:val="19"/>
+        </w:rPr>
+        <w:t>Work Pack Creation: Wrote detailed, step-by-step inspection procedures and checklists for upcoming subsea campaigns.</w:t>
+      </w:r>
+    </w:p>
+    <w:p>
+      <w:pPr>
+        <w:pStyle w:val="ListBullet"/>
+        <w:spacing w:before="40" w:after="60"/>
+        <w:ind w:left="504"/>
+      </w:pPr>
+      <w:r>
+        <w:rPr>
+          <w:rFonts w:ascii="Arial" w:hAnsi="Arial"/>
+          <w:b/>
+          <w:color w:val="1E293B"/>
+          <w:sz w:val="19"/>
+        </w:rPr>
+      </w:r>
+      <w:r>
+        <w:rPr>
+          <w:rFonts w:ascii="Arial" w:hAnsi="Arial"/>
+          <w:color w:val="475569"/>
+          <w:sz w:val="19"/>
+        </w:rPr>
+        <w:t>Desktop Studies: Reviewed historical integrity reports to identify targeted areas of interest for future monitoring.</w:t>
+      </w:r>
+    </w:p>
+    <w:p/>
     <w:tbl>
       <w:tblPr>
         <w:tblW w:type="auto" w:w="0"/>
@@ -7006,7 +7638,7 @@
           <w:color w:val="475569"/>
           <w:sz w:val="19"/>
         </w:rPr>
-        <w:t>Performed subsea inspections using ROV Chinook with real-time data capture via Sirrihatt Inspection Suite and IDAMS Wincair.</w:t>
+        <w:t>Performed subsea inspections using ROV/Chinook with real-time data capture via Sirrihatt Inspection Suite and IDAMS Wincair.</w:t>
       </w:r>
     </w:p>
     <w:p>
@@ -7570,636 +8202,6 @@
           <w:sz w:val="19"/>
         </w:rPr>
         <w:t>Carried out major platform inspections at ERB West (EWDP-Production Platform), covering GVI, CVI, anode, caisson &amp; conductors, and clamp inspection tasks.</w:t>
-      </w:r>
-    </w:p>
-    <w:p/>
-    <w:tbl>
-      <w:tblPr>
-        <w:tblW w:type="auto" w:w="0"/>
-        <w:tblLayout w:type="fixed"/>
-        <w:tblLook w:firstColumn="1" w:firstRow="1" w:lastColumn="0" w:lastRow="0" w:noHBand="0" w:noVBand="1" w:val="04A0"/>
-      </w:tblPr>
-      <w:tblGrid>
-        <w:gridCol w:w="3360"/>
-        <w:gridCol w:w="3360"/>
-        <w:gridCol w:w="3360"/>
-      </w:tblGrid>
-      <w:tr>
-        <w:trPr>
-          <w:cantSplit/>
-        </w:trPr>
-        <w:tc>
-          <w:tcPr>
-            <w:tcW w:type="dxa" w:w="2592"/>
-            <w:tcMar>
-              <w:top w:w="60" w:type="dxa"/>
-              <w:bottom w:w="60" w:type="dxa"/>
-              <w:left w:w="0" w:type="dxa"/>
-              <w:right w:w="50" w:type="dxa"/>
-            </w:tcMar>
-          </w:tcPr>
-          <w:p>
-            <w:pPr>
-              <w:spacing w:before="40" w:after="40"/>
-            </w:pPr>
-            <w:r>
-              <w:rPr>
-                <w:rFonts w:ascii="Arial" w:hAnsi="Arial"/>
-                <w:b/>
-                <w:color w:val="475569"/>
-                <w:sz w:val="19"/>
-              </w:rPr>
-              <w:t>Company</w:t>
-            </w:r>
-          </w:p>
-        </w:tc>
-        <w:tc>
-          <w:tcPr>
-            <w:tcW w:type="dxa" w:w="288"/>
-            <w:tcMar>
-              <w:top w:w="60" w:type="dxa"/>
-              <w:bottom w:w="60" w:type="dxa"/>
-              <w:left w:w="0" w:type="dxa"/>
-              <w:right w:w="0" w:type="dxa"/>
-            </w:tcMar>
-          </w:tcPr>
-          <w:p>
-            <w:pPr>
-              <w:spacing w:before="40" w:after="40"/>
-            </w:pPr>
-            <w:r>
-              <w:rPr>
-                <w:rFonts w:ascii="Arial" w:hAnsi="Arial"/>
-                <w:color w:val="94A3B8"/>
-                <w:sz w:val="19"/>
-              </w:rPr>
-              <w:t>:</w:t>
-            </w:r>
-          </w:p>
-        </w:tc>
-        <w:tc>
-          <w:tcPr>
-            <w:tcW w:type="dxa" w:w="7200"/>
-            <w:tcMar>
-              <w:top w:w="60" w:type="dxa"/>
-              <w:bottom w:w="60" w:type="dxa"/>
-              <w:left w:w="50" w:type="dxa"/>
-              <w:right w:w="0" w:type="dxa"/>
-            </w:tcMar>
-          </w:tcPr>
-          <w:p>
-            <w:pPr>
-              <w:spacing w:before="40" w:after="40"/>
-            </w:pPr>
-            <w:r>
-              <w:rPr>
-                <w:rFonts w:ascii="Arial" w:hAnsi="Arial"/>
-                <w:color w:val="0F172A"/>
-                <w:sz w:val="19"/>
-              </w:rPr>
-              <w:t>Sirrihat Subsea Services Sdn Bhd</w:t>
-            </w:r>
-          </w:p>
-        </w:tc>
-      </w:tr>
-      <w:tr>
-        <w:trPr>
-          <w:cantSplit/>
-        </w:trPr>
-        <w:tc>
-          <w:tcPr>
-            <w:tcW w:type="dxa" w:w="2592"/>
-            <w:tcMar>
-              <w:top w:w="60" w:type="dxa"/>
-              <w:bottom w:w="60" w:type="dxa"/>
-              <w:left w:w="0" w:type="dxa"/>
-              <w:right w:w="50" w:type="dxa"/>
-            </w:tcMar>
-          </w:tcPr>
-          <w:p>
-            <w:pPr>
-              <w:spacing w:before="40" w:after="40"/>
-            </w:pPr>
-            <w:r>
-              <w:rPr>
-                <w:rFonts w:ascii="Arial" w:hAnsi="Arial"/>
-                <w:b/>
-                <w:color w:val="475569"/>
-                <w:sz w:val="19"/>
-              </w:rPr>
-              <w:t>Client</w:t>
-            </w:r>
-          </w:p>
-        </w:tc>
-        <w:tc>
-          <w:tcPr>
-            <w:tcW w:type="dxa" w:w="288"/>
-            <w:tcMar>
-              <w:top w:w="60" w:type="dxa"/>
-              <w:bottom w:w="60" w:type="dxa"/>
-              <w:left w:w="0" w:type="dxa"/>
-              <w:right w:w="0" w:type="dxa"/>
-            </w:tcMar>
-          </w:tcPr>
-          <w:p>
-            <w:pPr>
-              <w:spacing w:before="40" w:after="40"/>
-            </w:pPr>
-            <w:r>
-              <w:rPr>
-                <w:rFonts w:ascii="Arial" w:hAnsi="Arial"/>
-                <w:color w:val="94A3B8"/>
-                <w:sz w:val="19"/>
-              </w:rPr>
-              <w:t>:</w:t>
-            </w:r>
-          </w:p>
-        </w:tc>
-        <w:tc>
-          <w:tcPr>
-            <w:tcW w:type="dxa" w:w="7200"/>
-            <w:tcMar>
-              <w:top w:w="60" w:type="dxa"/>
-              <w:bottom w:w="60" w:type="dxa"/>
-              <w:left w:w="50" w:type="dxa"/>
-              <w:right w:w="0" w:type="dxa"/>
-            </w:tcMar>
-          </w:tcPr>
-          <w:p>
-            <w:pPr>
-              <w:spacing w:before="40" w:after="40"/>
-            </w:pPr>
-            <w:r>
-              <w:rPr>
-                <w:rFonts w:ascii="Arial" w:hAnsi="Arial"/>
-                <w:color w:val="0F172A"/>
-                <w:sz w:val="19"/>
-              </w:rPr>
-            </w:r>
-          </w:p>
-        </w:tc>
-      </w:tr>
-      <w:tr>
-        <w:trPr>
-          <w:cantSplit/>
-        </w:trPr>
-        <w:tc>
-          <w:tcPr>
-            <w:tcW w:type="dxa" w:w="2592"/>
-            <w:tcMar>
-              <w:top w:w="60" w:type="dxa"/>
-              <w:bottom w:w="60" w:type="dxa"/>
-              <w:left w:w="0" w:type="dxa"/>
-              <w:right w:w="50" w:type="dxa"/>
-            </w:tcMar>
-          </w:tcPr>
-          <w:p>
-            <w:pPr>
-              <w:spacing w:before="40" w:after="40"/>
-            </w:pPr>
-            <w:r>
-              <w:rPr>
-                <w:rFonts w:ascii="Arial" w:hAnsi="Arial"/>
-                <w:b/>
-                <w:color w:val="475569"/>
-                <w:sz w:val="19"/>
-              </w:rPr>
-              <w:t>Project</w:t>
-            </w:r>
-          </w:p>
-        </w:tc>
-        <w:tc>
-          <w:tcPr>
-            <w:tcW w:type="dxa" w:w="288"/>
-            <w:tcMar>
-              <w:top w:w="60" w:type="dxa"/>
-              <w:bottom w:w="60" w:type="dxa"/>
-              <w:left w:w="0" w:type="dxa"/>
-              <w:right w:w="0" w:type="dxa"/>
-            </w:tcMar>
-          </w:tcPr>
-          <w:p>
-            <w:pPr>
-              <w:spacing w:before="40" w:after="40"/>
-            </w:pPr>
-            <w:r>
-              <w:rPr>
-                <w:rFonts w:ascii="Arial" w:hAnsi="Arial"/>
-                <w:color w:val="94A3B8"/>
-                <w:sz w:val="19"/>
-              </w:rPr>
-              <w:t>:</w:t>
-            </w:r>
-          </w:p>
-        </w:tc>
-        <w:tc>
-          <w:tcPr>
-            <w:tcW w:type="dxa" w:w="7200"/>
-            <w:tcMar>
-              <w:top w:w="60" w:type="dxa"/>
-              <w:bottom w:w="60" w:type="dxa"/>
-              <w:left w:w="50" w:type="dxa"/>
-              <w:right w:w="0" w:type="dxa"/>
-            </w:tcMar>
-          </w:tcPr>
-          <w:p>
-            <w:pPr>
-              <w:spacing w:before="40" w:after="40"/>
-            </w:pPr>
-            <w:r>
-              <w:rPr>
-                <w:rFonts w:ascii="Arial" w:hAnsi="Arial"/>
-                <w:color w:val="0F172A"/>
-                <w:sz w:val="19"/>
-              </w:rPr>
-              <w:t>Onshore Engineering &amp; Reporting Support (Subang Jaya, Selangor, Malaysia)</w:t>
-            </w:r>
-          </w:p>
-        </w:tc>
-      </w:tr>
-      <w:tr>
-        <w:trPr>
-          <w:cantSplit/>
-        </w:trPr>
-        <w:tc>
-          <w:tcPr>
-            <w:tcW w:type="dxa" w:w="2592"/>
-            <w:tcMar>
-              <w:top w:w="60" w:type="dxa"/>
-              <w:bottom w:w="60" w:type="dxa"/>
-              <w:left w:w="0" w:type="dxa"/>
-              <w:right w:w="50" w:type="dxa"/>
-            </w:tcMar>
-          </w:tcPr>
-          <w:p>
-            <w:pPr>
-              <w:spacing w:before="40" w:after="40"/>
-            </w:pPr>
-            <w:r>
-              <w:rPr>
-                <w:rFonts w:ascii="Arial" w:hAnsi="Arial"/>
-                <w:b/>
-                <w:color w:val="475569"/>
-                <w:sz w:val="19"/>
-              </w:rPr>
-              <w:t>Duration</w:t>
-            </w:r>
-          </w:p>
-        </w:tc>
-        <w:tc>
-          <w:tcPr>
-            <w:tcW w:type="dxa" w:w="288"/>
-            <w:tcMar>
-              <w:top w:w="60" w:type="dxa"/>
-              <w:bottom w:w="60" w:type="dxa"/>
-              <w:left w:w="0" w:type="dxa"/>
-              <w:right w:w="0" w:type="dxa"/>
-            </w:tcMar>
-          </w:tcPr>
-          <w:p>
-            <w:pPr>
-              <w:spacing w:before="40" w:after="40"/>
-            </w:pPr>
-            <w:r>
-              <w:rPr>
-                <w:rFonts w:ascii="Arial" w:hAnsi="Arial"/>
-                <w:color w:val="94A3B8"/>
-                <w:sz w:val="19"/>
-              </w:rPr>
-              <w:t>:</w:t>
-            </w:r>
-          </w:p>
-        </w:tc>
-        <w:tc>
-          <w:tcPr>
-            <w:tcW w:type="dxa" w:w="7200"/>
-            <w:tcMar>
-              <w:top w:w="60" w:type="dxa"/>
-              <w:bottom w:w="60" w:type="dxa"/>
-              <w:left w:w="50" w:type="dxa"/>
-              <w:right w:w="0" w:type="dxa"/>
-            </w:tcMar>
-          </w:tcPr>
-          <w:p>
-            <w:pPr>
-              <w:spacing w:before="40" w:after="40"/>
-            </w:pPr>
-            <w:r>
-              <w:rPr>
-                <w:rFonts w:ascii="Arial" w:hAnsi="Arial"/>
-                <w:color w:val="0F172A"/>
-                <w:sz w:val="19"/>
-              </w:rPr>
-              <w:t>November 2022 – September 2023</w:t>
-            </w:r>
-          </w:p>
-        </w:tc>
-      </w:tr>
-      <w:tr>
-        <w:trPr>
-          <w:cantSplit/>
-        </w:trPr>
-        <w:tc>
-          <w:tcPr>
-            <w:tcW w:type="dxa" w:w="2592"/>
-            <w:tcMar>
-              <w:top w:w="60" w:type="dxa"/>
-              <w:bottom w:w="60" w:type="dxa"/>
-              <w:left w:w="0" w:type="dxa"/>
-              <w:right w:w="50" w:type="dxa"/>
-            </w:tcMar>
-          </w:tcPr>
-          <w:p>
-            <w:pPr>
-              <w:spacing w:before="40" w:after="40"/>
-            </w:pPr>
-            <w:r>
-              <w:rPr>
-                <w:rFonts w:ascii="Arial" w:hAnsi="Arial"/>
-                <w:b/>
-                <w:color w:val="475569"/>
-                <w:sz w:val="19"/>
-              </w:rPr>
-              <w:t>Vessel/Barge</w:t>
-            </w:r>
-          </w:p>
-        </w:tc>
-        <w:tc>
-          <w:tcPr>
-            <w:tcW w:type="dxa" w:w="288"/>
-            <w:tcMar>
-              <w:top w:w="60" w:type="dxa"/>
-              <w:bottom w:w="60" w:type="dxa"/>
-              <w:left w:w="0" w:type="dxa"/>
-              <w:right w:w="0" w:type="dxa"/>
-            </w:tcMar>
-          </w:tcPr>
-          <w:p>
-            <w:pPr>
-              <w:spacing w:before="40" w:after="40"/>
-            </w:pPr>
-            <w:r>
-              <w:rPr>
-                <w:rFonts w:ascii="Arial" w:hAnsi="Arial"/>
-                <w:color w:val="94A3B8"/>
-                <w:sz w:val="19"/>
-              </w:rPr>
-              <w:t>:</w:t>
-            </w:r>
-          </w:p>
-        </w:tc>
-        <w:tc>
-          <w:tcPr>
-            <w:tcW w:type="dxa" w:w="7200"/>
-            <w:tcMar>
-              <w:top w:w="60" w:type="dxa"/>
-              <w:bottom w:w="60" w:type="dxa"/>
-              <w:left w:w="50" w:type="dxa"/>
-              <w:right w:w="0" w:type="dxa"/>
-            </w:tcMar>
-          </w:tcPr>
-          <w:p>
-            <w:pPr>
-              <w:spacing w:before="40" w:after="40"/>
-            </w:pPr>
-            <w:r>
-              <w:rPr>
-                <w:rFonts w:ascii="Arial" w:hAnsi="Arial"/>
-                <w:color w:val="0F172A"/>
-                <w:sz w:val="19"/>
-              </w:rPr>
-            </w:r>
-          </w:p>
-        </w:tc>
-      </w:tr>
-      <w:tr>
-        <w:trPr>
-          <w:cantSplit/>
-        </w:trPr>
-        <w:tc>
-          <w:tcPr>
-            <w:tcW w:type="dxa" w:w="2592"/>
-            <w:tcMar>
-              <w:top w:w="60" w:type="dxa"/>
-              <w:bottom w:w="60" w:type="dxa"/>
-              <w:left w:w="0" w:type="dxa"/>
-              <w:right w:w="50" w:type="dxa"/>
-            </w:tcMar>
-          </w:tcPr>
-          <w:p>
-            <w:pPr>
-              <w:spacing w:before="40" w:after="40"/>
-            </w:pPr>
-            <w:r>
-              <w:rPr>
-                <w:rFonts w:ascii="Arial" w:hAnsi="Arial"/>
-                <w:b/>
-                <w:color w:val="475569"/>
-                <w:sz w:val="19"/>
-              </w:rPr>
-              <w:t>Position Title</w:t>
-            </w:r>
-          </w:p>
-        </w:tc>
-        <w:tc>
-          <w:tcPr>
-            <w:tcW w:type="dxa" w:w="288"/>
-            <w:tcMar>
-              <w:top w:w="60" w:type="dxa"/>
-              <w:bottom w:w="60" w:type="dxa"/>
-              <w:left w:w="0" w:type="dxa"/>
-              <w:right w:w="0" w:type="dxa"/>
-            </w:tcMar>
-          </w:tcPr>
-          <w:p>
-            <w:pPr>
-              <w:spacing w:before="40" w:after="40"/>
-            </w:pPr>
-            <w:r>
-              <w:rPr>
-                <w:rFonts w:ascii="Arial" w:hAnsi="Arial"/>
-                <w:color w:val="94A3B8"/>
-                <w:sz w:val="19"/>
-              </w:rPr>
-              <w:t>:</w:t>
-            </w:r>
-          </w:p>
-        </w:tc>
-        <w:tc>
-          <w:tcPr>
-            <w:tcW w:type="dxa" w:w="7200"/>
-            <w:tcMar>
-              <w:top w:w="60" w:type="dxa"/>
-              <w:bottom w:w="60" w:type="dxa"/>
-              <w:left w:w="50" w:type="dxa"/>
-              <w:right w:w="0" w:type="dxa"/>
-            </w:tcMar>
-          </w:tcPr>
-          <w:p>
-            <w:pPr>
-              <w:spacing w:before="40" w:after="40"/>
-            </w:pPr>
-            <w:r>
-              <w:rPr>
-                <w:rFonts w:ascii="Arial" w:hAnsi="Arial"/>
-                <w:color w:val="0F172A"/>
-                <w:sz w:val="19"/>
-              </w:rPr>
-              <w:t>Data QA/QC Coordinator</w:t>
-            </w:r>
-          </w:p>
-        </w:tc>
-      </w:tr>
-    </w:tbl>
-    <w:p>
-      <w:pPr>
-        <w:spacing w:before="80" w:after="40"/>
-      </w:pPr>
-      <w:r>
-        <w:rPr>
-          <w:rFonts w:ascii="Arial" w:hAnsi="Arial"/>
-          <w:b/>
-          <w:sz w:val="19"/>
-        </w:rPr>
-        <w:t>Scope/Details:</w:t>
-      </w:r>
-    </w:p>
-    <w:p>
-      <w:pPr>
-        <w:pStyle w:val="ListBullet"/>
-        <w:spacing w:before="40" w:after="60"/>
-        <w:ind w:left="504"/>
-      </w:pPr>
-      <w:r>
-        <w:rPr>
-          <w:rFonts w:ascii="Arial" w:hAnsi="Arial"/>
-          <w:b/>
-          <w:color w:val="1E293B"/>
-          <w:sz w:val="19"/>
-        </w:rPr>
-      </w:r>
-      <w:r>
-        <w:rPr>
-          <w:rFonts w:ascii="Arial" w:hAnsi="Arial"/>
-          <w:color w:val="475569"/>
-          <w:sz w:val="19"/>
-        </w:rPr>
-        <w:t>Final Reporting: Converted rough daily logs from offshore operations into polished, formal client reports.</w:t>
-      </w:r>
-    </w:p>
-    <w:p>
-      <w:pPr>
-        <w:pStyle w:val="ListBullet"/>
-        <w:spacing w:before="40" w:after="60"/>
-        <w:ind w:left="504"/>
-      </w:pPr>
-      <w:r>
-        <w:rPr>
-          <w:rFonts w:ascii="Arial" w:hAnsi="Arial"/>
-          <w:b/>
-          <w:color w:val="1E293B"/>
-          <w:sz w:val="19"/>
-        </w:rPr>
-      </w:r>
-      <w:r>
-        <w:rPr>
-          <w:rFonts w:ascii="Arial" w:hAnsi="Arial"/>
-          <w:color w:val="475569"/>
-          <w:sz w:val="19"/>
-        </w:rPr>
-        <w:t>Data QA/QC: Verified accuracy of subsea video footage, timestamps, and anomaly descriptions against physical logs.</w:t>
-      </w:r>
-    </w:p>
-    <w:p>
-      <w:pPr>
-        <w:pStyle w:val="ListBullet"/>
-        <w:spacing w:before="40" w:after="60"/>
-        <w:ind w:left="504"/>
-      </w:pPr>
-      <w:r>
-        <w:rPr>
-          <w:rFonts w:ascii="Arial" w:hAnsi="Arial"/>
-          <w:b/>
-          <w:color w:val="1E293B"/>
-          <w:sz w:val="19"/>
-        </w:rPr>
-      </w:r>
-      <w:r>
-        <w:rPr>
-          <w:rFonts w:ascii="Arial" w:hAnsi="Arial"/>
-          <w:color w:val="475569"/>
-          <w:sz w:val="19"/>
-        </w:rPr>
-        <w:t>Database Management: Uploaded validated offshore data and inspection logs into integrity software systems.</w:t>
-      </w:r>
-    </w:p>
-    <w:p>
-      <w:pPr>
-        <w:pStyle w:val="ListBullet"/>
-        <w:spacing w:before="40" w:after="60"/>
-        <w:ind w:left="504"/>
-      </w:pPr>
-      <w:r>
-        <w:rPr>
-          <w:rFonts w:ascii="Arial" w:hAnsi="Arial"/>
-          <w:b/>
-          <w:color w:val="1E293B"/>
-          <w:sz w:val="19"/>
-        </w:rPr>
-      </w:r>
-      <w:r>
-        <w:rPr>
-          <w:rFonts w:ascii="Arial" w:hAnsi="Arial"/>
-          <w:color w:val="475569"/>
-          <w:sz w:val="19"/>
-        </w:rPr>
-        <w:t>Drawing Updates: Marked up CAD and "As-Built" drawings to reflect new subsea findings and anomalies.</w:t>
-      </w:r>
-    </w:p>
-    <w:p>
-      <w:pPr>
-        <w:pStyle w:val="ListBullet"/>
-        <w:spacing w:before="40" w:after="60"/>
-        <w:ind w:left="504"/>
-      </w:pPr>
-      <w:r>
-        <w:rPr>
-          <w:rFonts w:ascii="Arial" w:hAnsi="Arial"/>
-          <w:b/>
-          <w:color w:val="1E293B"/>
-          <w:sz w:val="19"/>
-        </w:rPr>
-      </w:r>
-      <w:r>
-        <w:rPr>
-          <w:rFonts w:ascii="Arial" w:hAnsi="Arial"/>
-          <w:color w:val="475569"/>
-          <w:sz w:val="19"/>
-        </w:rPr>
-        <w:t>Work Pack Creation: Wrote detailed, step-by-step inspection procedures and checklists for upcoming subsea campaigns.</w:t>
-      </w:r>
-    </w:p>
-    <w:p>
-      <w:pPr>
-        <w:pStyle w:val="ListBullet"/>
-        <w:spacing w:before="40" w:after="60"/>
-        <w:ind w:left="504"/>
-      </w:pPr>
-      <w:r>
-        <w:rPr>
-          <w:rFonts w:ascii="Arial" w:hAnsi="Arial"/>
-          <w:b/>
-          <w:color w:val="1E293B"/>
-          <w:sz w:val="19"/>
-        </w:rPr>
-      </w:r>
-      <w:r>
-        <w:rPr>
-          <w:rFonts w:ascii="Arial" w:hAnsi="Arial"/>
-          <w:color w:val="475569"/>
-          <w:sz w:val="19"/>
-        </w:rPr>
-        <w:t>Desktop Studies: Reviewed historical integrity reports to identify targeted areas of interest for future monitoring.</w:t>
       </w:r>
     </w:p>
     <w:p/>

</xml_diff>

<commit_message>
Optimize CV: move Sirrihat Data QA/QC Coordinator job card to the bottom of Detailed Campaign & Employment Timeline, remove Client and Location details, regenerate Muhammad_Amin_Azman_CV.docx
</commit_message>
<xml_diff>
--- a/Muhammad_Amin_Azman_CV.docx
+++ b/Muhammad_Amin_Azman_CV.docx
@@ -1574,638 +1574,6 @@
         <w:t>DETAILED CAMPAIGN &amp; EMPLOYMENT TIMELINE</w:t>
       </w:r>
     </w:p>
-    <w:tbl>
-      <w:tblPr>
-        <w:tblW w:type="auto" w:w="0"/>
-        <w:tblLayout w:type="fixed"/>
-        <w:tblLook w:firstColumn="1" w:firstRow="1" w:lastColumn="0" w:lastRow="0" w:noHBand="0" w:noVBand="1" w:val="04A0"/>
-      </w:tblPr>
-      <w:tblGrid>
-        <w:gridCol w:w="3360"/>
-        <w:gridCol w:w="3360"/>
-        <w:gridCol w:w="3360"/>
-      </w:tblGrid>
-      <w:tr>
-        <w:trPr>
-          <w:cantSplit/>
-        </w:trPr>
-        <w:tc>
-          <w:tcPr>
-            <w:tcW w:type="dxa" w:w="2592"/>
-            <w:tcMar>
-              <w:top w:w="60" w:type="dxa"/>
-              <w:bottom w:w="60" w:type="dxa"/>
-              <w:left w:w="0" w:type="dxa"/>
-              <w:right w:w="50" w:type="dxa"/>
-            </w:tcMar>
-          </w:tcPr>
-          <w:p>
-            <w:pPr>
-              <w:spacing w:before="40" w:after="40"/>
-            </w:pPr>
-            <w:r>
-              <w:rPr>
-                <w:rFonts w:ascii="Arial" w:hAnsi="Arial"/>
-                <w:b/>
-                <w:color w:val="475569"/>
-                <w:sz w:val="19"/>
-              </w:rPr>
-              <w:t>Company</w:t>
-            </w:r>
-          </w:p>
-        </w:tc>
-        <w:tc>
-          <w:tcPr>
-            <w:tcW w:type="dxa" w:w="288"/>
-            <w:tcMar>
-              <w:top w:w="60" w:type="dxa"/>
-              <w:bottom w:w="60" w:type="dxa"/>
-              <w:left w:w="0" w:type="dxa"/>
-              <w:right w:w="0" w:type="dxa"/>
-            </w:tcMar>
-          </w:tcPr>
-          <w:p>
-            <w:pPr>
-              <w:spacing w:before="40" w:after="40"/>
-            </w:pPr>
-            <w:r>
-              <w:rPr>
-                <w:rFonts w:ascii="Arial" w:hAnsi="Arial"/>
-                <w:color w:val="94A3B8"/>
-                <w:sz w:val="19"/>
-              </w:rPr>
-              <w:t>:</w:t>
-            </w:r>
-          </w:p>
-        </w:tc>
-        <w:tc>
-          <w:tcPr>
-            <w:tcW w:type="dxa" w:w="7200"/>
-            <w:tcMar>
-              <w:top w:w="60" w:type="dxa"/>
-              <w:bottom w:w="60" w:type="dxa"/>
-              <w:left w:w="50" w:type="dxa"/>
-              <w:right w:w="0" w:type="dxa"/>
-            </w:tcMar>
-          </w:tcPr>
-          <w:p>
-            <w:pPr>
-              <w:spacing w:before="40" w:after="40"/>
-            </w:pPr>
-            <w:r>
-              <w:rPr>
-                <w:rFonts w:ascii="Arial" w:hAnsi="Arial"/>
-                <w:color w:val="0F172A"/>
-                <w:sz w:val="19"/>
-              </w:rPr>
-              <w:t>Sirrihat Subsea Services Sdn Bhd</w:t>
-            </w:r>
-          </w:p>
-        </w:tc>
-      </w:tr>
-      <w:tr>
-        <w:trPr>
-          <w:cantSplit/>
-        </w:trPr>
-        <w:tc>
-          <w:tcPr>
-            <w:tcW w:type="dxa" w:w="2592"/>
-            <w:tcMar>
-              <w:top w:w="60" w:type="dxa"/>
-              <w:bottom w:w="60" w:type="dxa"/>
-              <w:left w:w="0" w:type="dxa"/>
-              <w:right w:w="50" w:type="dxa"/>
-            </w:tcMar>
-          </w:tcPr>
-          <w:p>
-            <w:pPr>
-              <w:spacing w:before="40" w:after="40"/>
-            </w:pPr>
-            <w:r>
-              <w:rPr>
-                <w:rFonts w:ascii="Arial" w:hAnsi="Arial"/>
-                <w:b/>
-                <w:color w:val="475569"/>
-                <w:sz w:val="19"/>
-              </w:rPr>
-              <w:t>Client</w:t>
-            </w:r>
-          </w:p>
-        </w:tc>
-        <w:tc>
-          <w:tcPr>
-            <w:tcW w:type="dxa" w:w="288"/>
-            <w:tcMar>
-              <w:top w:w="60" w:type="dxa"/>
-              <w:bottom w:w="60" w:type="dxa"/>
-              <w:left w:w="0" w:type="dxa"/>
-              <w:right w:w="0" w:type="dxa"/>
-            </w:tcMar>
-          </w:tcPr>
-          <w:p>
-            <w:pPr>
-              <w:spacing w:before="40" w:after="40"/>
-            </w:pPr>
-            <w:r>
-              <w:rPr>
-                <w:rFonts w:ascii="Arial" w:hAnsi="Arial"/>
-                <w:color w:val="94A3B8"/>
-                <w:sz w:val="19"/>
-              </w:rPr>
-              <w:t>:</w:t>
-            </w:r>
-          </w:p>
-        </w:tc>
-        <w:tc>
-          <w:tcPr>
-            <w:tcW w:type="dxa" w:w="7200"/>
-            <w:tcMar>
-              <w:top w:w="60" w:type="dxa"/>
-              <w:bottom w:w="60" w:type="dxa"/>
-              <w:left w:w="50" w:type="dxa"/>
-              <w:right w:w="0" w:type="dxa"/>
-            </w:tcMar>
-          </w:tcPr>
-          <w:p>
-            <w:pPr>
-              <w:spacing w:before="40" w:after="40"/>
-            </w:pPr>
-            <w:r>
-              <w:rPr>
-                <w:rFonts w:ascii="Arial" w:hAnsi="Arial"/>
-                <w:color w:val="0F172A"/>
-                <w:sz w:val="19"/>
-              </w:rPr>
-              <w:t>Multiple Clients</w:t>
-            </w:r>
-          </w:p>
-        </w:tc>
-      </w:tr>
-      <w:tr>
-        <w:trPr>
-          <w:cantSplit/>
-        </w:trPr>
-        <w:tc>
-          <w:tcPr>
-            <w:tcW w:type="dxa" w:w="2592"/>
-            <w:tcMar>
-              <w:top w:w="60" w:type="dxa"/>
-              <w:bottom w:w="60" w:type="dxa"/>
-              <w:left w:w="0" w:type="dxa"/>
-              <w:right w:w="50" w:type="dxa"/>
-            </w:tcMar>
-          </w:tcPr>
-          <w:p>
-            <w:pPr>
-              <w:spacing w:before="40" w:after="40"/>
-            </w:pPr>
-            <w:r>
-              <w:rPr>
-                <w:rFonts w:ascii="Arial" w:hAnsi="Arial"/>
-                <w:b/>
-                <w:color w:val="475569"/>
-                <w:sz w:val="19"/>
-              </w:rPr>
-              <w:t>Project</w:t>
-            </w:r>
-          </w:p>
-        </w:tc>
-        <w:tc>
-          <w:tcPr>
-            <w:tcW w:type="dxa" w:w="288"/>
-            <w:tcMar>
-              <w:top w:w="60" w:type="dxa"/>
-              <w:bottom w:w="60" w:type="dxa"/>
-              <w:left w:w="0" w:type="dxa"/>
-              <w:right w:w="0" w:type="dxa"/>
-            </w:tcMar>
-          </w:tcPr>
-          <w:p>
-            <w:pPr>
-              <w:spacing w:before="40" w:after="40"/>
-            </w:pPr>
-            <w:r>
-              <w:rPr>
-                <w:rFonts w:ascii="Arial" w:hAnsi="Arial"/>
-                <w:color w:val="94A3B8"/>
-                <w:sz w:val="19"/>
-              </w:rPr>
-              <w:t>:</w:t>
-            </w:r>
-          </w:p>
-        </w:tc>
-        <w:tc>
-          <w:tcPr>
-            <w:tcW w:type="dxa" w:w="7200"/>
-            <w:tcMar>
-              <w:top w:w="60" w:type="dxa"/>
-              <w:bottom w:w="60" w:type="dxa"/>
-              <w:left w:w="50" w:type="dxa"/>
-              <w:right w:w="0" w:type="dxa"/>
-            </w:tcMar>
-          </w:tcPr>
-          <w:p>
-            <w:pPr>
-              <w:spacing w:before="40" w:after="40"/>
-            </w:pPr>
-            <w:r>
-              <w:rPr>
-                <w:rFonts w:ascii="Arial" w:hAnsi="Arial"/>
-                <w:color w:val="0F172A"/>
-                <w:sz w:val="19"/>
-              </w:rPr>
-              <w:t>Onshore Engineering &amp; Reporting Support (Subang Jaya, Selangor, Malaysia)</w:t>
-            </w:r>
-          </w:p>
-        </w:tc>
-      </w:tr>
-      <w:tr>
-        <w:trPr>
-          <w:cantSplit/>
-        </w:trPr>
-        <w:tc>
-          <w:tcPr>
-            <w:tcW w:type="dxa" w:w="2592"/>
-            <w:tcMar>
-              <w:top w:w="60" w:type="dxa"/>
-              <w:bottom w:w="60" w:type="dxa"/>
-              <w:left w:w="0" w:type="dxa"/>
-              <w:right w:w="50" w:type="dxa"/>
-            </w:tcMar>
-          </w:tcPr>
-          <w:p>
-            <w:pPr>
-              <w:spacing w:before="40" w:after="40"/>
-            </w:pPr>
-            <w:r>
-              <w:rPr>
-                <w:rFonts w:ascii="Arial" w:hAnsi="Arial"/>
-                <w:b/>
-                <w:color w:val="475569"/>
-                <w:sz w:val="19"/>
-              </w:rPr>
-              <w:t>Duration</w:t>
-            </w:r>
-          </w:p>
-        </w:tc>
-        <w:tc>
-          <w:tcPr>
-            <w:tcW w:type="dxa" w:w="288"/>
-            <w:tcMar>
-              <w:top w:w="60" w:type="dxa"/>
-              <w:bottom w:w="60" w:type="dxa"/>
-              <w:left w:w="0" w:type="dxa"/>
-              <w:right w:w="0" w:type="dxa"/>
-            </w:tcMar>
-          </w:tcPr>
-          <w:p>
-            <w:pPr>
-              <w:spacing w:before="40" w:after="40"/>
-            </w:pPr>
-            <w:r>
-              <w:rPr>
-                <w:rFonts w:ascii="Arial" w:hAnsi="Arial"/>
-                <w:color w:val="94A3B8"/>
-                <w:sz w:val="19"/>
-              </w:rPr>
-              <w:t>:</w:t>
-            </w:r>
-          </w:p>
-        </w:tc>
-        <w:tc>
-          <w:tcPr>
-            <w:tcW w:type="dxa" w:w="7200"/>
-            <w:tcMar>
-              <w:top w:w="60" w:type="dxa"/>
-              <w:bottom w:w="60" w:type="dxa"/>
-              <w:left w:w="50" w:type="dxa"/>
-              <w:right w:w="0" w:type="dxa"/>
-            </w:tcMar>
-          </w:tcPr>
-          <w:p>
-            <w:pPr>
-              <w:spacing w:before="40" w:after="40"/>
-            </w:pPr>
-            <w:r>
-              <w:rPr>
-                <w:rFonts w:ascii="Arial" w:hAnsi="Arial"/>
-                <w:color w:val="0F172A"/>
-                <w:sz w:val="19"/>
-              </w:rPr>
-              <w:t>November 2022 – September 2023</w:t>
-            </w:r>
-          </w:p>
-        </w:tc>
-      </w:tr>
-      <w:tr>
-        <w:trPr>
-          <w:cantSplit/>
-        </w:trPr>
-        <w:tc>
-          <w:tcPr>
-            <w:tcW w:type="dxa" w:w="2592"/>
-            <w:tcMar>
-              <w:top w:w="60" w:type="dxa"/>
-              <w:bottom w:w="60" w:type="dxa"/>
-              <w:left w:w="0" w:type="dxa"/>
-              <w:right w:w="50" w:type="dxa"/>
-            </w:tcMar>
-          </w:tcPr>
-          <w:p>
-            <w:pPr>
-              <w:spacing w:before="40" w:after="40"/>
-            </w:pPr>
-            <w:r>
-              <w:rPr>
-                <w:rFonts w:ascii="Arial" w:hAnsi="Arial"/>
-                <w:b/>
-                <w:color w:val="475569"/>
-                <w:sz w:val="19"/>
-              </w:rPr>
-              <w:t>Location</w:t>
-            </w:r>
-          </w:p>
-        </w:tc>
-        <w:tc>
-          <w:tcPr>
-            <w:tcW w:type="dxa" w:w="288"/>
-            <w:tcMar>
-              <w:top w:w="60" w:type="dxa"/>
-              <w:bottom w:w="60" w:type="dxa"/>
-              <w:left w:w="0" w:type="dxa"/>
-              <w:right w:w="0" w:type="dxa"/>
-            </w:tcMar>
-          </w:tcPr>
-          <w:p>
-            <w:pPr>
-              <w:spacing w:before="40" w:after="40"/>
-            </w:pPr>
-            <w:r>
-              <w:rPr>
-                <w:rFonts w:ascii="Arial" w:hAnsi="Arial"/>
-                <w:color w:val="94A3B8"/>
-                <w:sz w:val="19"/>
-              </w:rPr>
-              <w:t>:</w:t>
-            </w:r>
-          </w:p>
-        </w:tc>
-        <w:tc>
-          <w:tcPr>
-            <w:tcW w:type="dxa" w:w="7200"/>
-            <w:tcMar>
-              <w:top w:w="60" w:type="dxa"/>
-              <w:bottom w:w="60" w:type="dxa"/>
-              <w:left w:w="50" w:type="dxa"/>
-              <w:right w:w="0" w:type="dxa"/>
-            </w:tcMar>
-          </w:tcPr>
-          <w:p>
-            <w:pPr>
-              <w:spacing w:before="40" w:after="40"/>
-            </w:pPr>
-            <w:r>
-              <w:rPr>
-                <w:rFonts w:ascii="Arial" w:hAnsi="Arial"/>
-                <w:color w:val="0F172A"/>
-                <w:sz w:val="19"/>
-              </w:rPr>
-              <w:t>Sirrihatt Office</w:t>
-            </w:r>
-          </w:p>
-        </w:tc>
-      </w:tr>
-      <w:tr>
-        <w:trPr>
-          <w:cantSplit/>
-        </w:trPr>
-        <w:tc>
-          <w:tcPr>
-            <w:tcW w:type="dxa" w:w="2592"/>
-            <w:tcMar>
-              <w:top w:w="60" w:type="dxa"/>
-              <w:bottom w:w="60" w:type="dxa"/>
-              <w:left w:w="0" w:type="dxa"/>
-              <w:right w:w="50" w:type="dxa"/>
-            </w:tcMar>
-          </w:tcPr>
-          <w:p>
-            <w:pPr>
-              <w:spacing w:before="40" w:after="40"/>
-            </w:pPr>
-            <w:r>
-              <w:rPr>
-                <w:rFonts w:ascii="Arial" w:hAnsi="Arial"/>
-                <w:b/>
-                <w:color w:val="475569"/>
-                <w:sz w:val="19"/>
-              </w:rPr>
-              <w:t>Position Title</w:t>
-            </w:r>
-          </w:p>
-        </w:tc>
-        <w:tc>
-          <w:tcPr>
-            <w:tcW w:type="dxa" w:w="288"/>
-            <w:tcMar>
-              <w:top w:w="60" w:type="dxa"/>
-              <w:bottom w:w="60" w:type="dxa"/>
-              <w:left w:w="0" w:type="dxa"/>
-              <w:right w:w="0" w:type="dxa"/>
-            </w:tcMar>
-          </w:tcPr>
-          <w:p>
-            <w:pPr>
-              <w:spacing w:before="40" w:after="40"/>
-            </w:pPr>
-            <w:r>
-              <w:rPr>
-                <w:rFonts w:ascii="Arial" w:hAnsi="Arial"/>
-                <w:color w:val="94A3B8"/>
-                <w:sz w:val="19"/>
-              </w:rPr>
-              <w:t>:</w:t>
-            </w:r>
-          </w:p>
-        </w:tc>
-        <w:tc>
-          <w:tcPr>
-            <w:tcW w:type="dxa" w:w="7200"/>
-            <w:tcMar>
-              <w:top w:w="60" w:type="dxa"/>
-              <w:bottom w:w="60" w:type="dxa"/>
-              <w:left w:w="50" w:type="dxa"/>
-              <w:right w:w="0" w:type="dxa"/>
-            </w:tcMar>
-          </w:tcPr>
-          <w:p>
-            <w:pPr>
-              <w:spacing w:before="40" w:after="40"/>
-            </w:pPr>
-            <w:r>
-              <w:rPr>
-                <w:rFonts w:ascii="Arial" w:hAnsi="Arial"/>
-                <w:color w:val="0F172A"/>
-                <w:sz w:val="19"/>
-              </w:rPr>
-              <w:t>Data QA/QC Coordinator</w:t>
-            </w:r>
-          </w:p>
-        </w:tc>
-      </w:tr>
-    </w:tbl>
-    <w:p>
-      <w:pPr>
-        <w:spacing w:before="80" w:after="40"/>
-      </w:pPr>
-      <w:r>
-        <w:rPr>
-          <w:rFonts w:ascii="Arial" w:hAnsi="Arial"/>
-          <w:b/>
-          <w:sz w:val="19"/>
-        </w:rPr>
-        <w:t>Scope/Details:</w:t>
-      </w:r>
-    </w:p>
-    <w:p>
-      <w:pPr>
-        <w:pStyle w:val="ListBullet"/>
-        <w:spacing w:before="40" w:after="60"/>
-        <w:ind w:left="504"/>
-      </w:pPr>
-      <w:r>
-        <w:rPr>
-          <w:rFonts w:ascii="Arial" w:hAnsi="Arial"/>
-          <w:b/>
-          <w:color w:val="1E293B"/>
-          <w:sz w:val="19"/>
-        </w:rPr>
-      </w:r>
-      <w:r>
-        <w:rPr>
-          <w:rFonts w:ascii="Arial" w:hAnsi="Arial"/>
-          <w:color w:val="475569"/>
-          <w:sz w:val="19"/>
-        </w:rPr>
-        <w:t>Final Reporting: Converted rough daily logs from offshore operations into polished, formal client reports.</w:t>
-      </w:r>
-    </w:p>
-    <w:p>
-      <w:pPr>
-        <w:pStyle w:val="ListBullet"/>
-        <w:spacing w:before="40" w:after="60"/>
-        <w:ind w:left="504"/>
-      </w:pPr>
-      <w:r>
-        <w:rPr>
-          <w:rFonts w:ascii="Arial" w:hAnsi="Arial"/>
-          <w:b/>
-          <w:color w:val="1E293B"/>
-          <w:sz w:val="19"/>
-        </w:rPr>
-      </w:r>
-      <w:r>
-        <w:rPr>
-          <w:rFonts w:ascii="Arial" w:hAnsi="Arial"/>
-          <w:color w:val="475569"/>
-          <w:sz w:val="19"/>
-        </w:rPr>
-        <w:t>Data QA/QC: Verified accuracy of subsea video footage, timestamps, and anomaly descriptions against physical logs.</w:t>
-      </w:r>
-    </w:p>
-    <w:p>
-      <w:pPr>
-        <w:pStyle w:val="ListBullet"/>
-        <w:spacing w:before="40" w:after="60"/>
-        <w:ind w:left="504"/>
-      </w:pPr>
-      <w:r>
-        <w:rPr>
-          <w:rFonts w:ascii="Arial" w:hAnsi="Arial"/>
-          <w:b/>
-          <w:color w:val="1E293B"/>
-          <w:sz w:val="19"/>
-        </w:rPr>
-      </w:r>
-      <w:r>
-        <w:rPr>
-          <w:rFonts w:ascii="Arial" w:hAnsi="Arial"/>
-          <w:color w:val="475569"/>
-          <w:sz w:val="19"/>
-        </w:rPr>
-        <w:t>Database Management: Uploaded validated offshore data and inspection logs into integrity software systems.</w:t>
-      </w:r>
-    </w:p>
-    <w:p>
-      <w:pPr>
-        <w:pStyle w:val="ListBullet"/>
-        <w:spacing w:before="40" w:after="60"/>
-        <w:ind w:left="504"/>
-      </w:pPr>
-      <w:r>
-        <w:rPr>
-          <w:rFonts w:ascii="Arial" w:hAnsi="Arial"/>
-          <w:b/>
-          <w:color w:val="1E293B"/>
-          <w:sz w:val="19"/>
-        </w:rPr>
-      </w:r>
-      <w:r>
-        <w:rPr>
-          <w:rFonts w:ascii="Arial" w:hAnsi="Arial"/>
-          <w:color w:val="475569"/>
-          <w:sz w:val="19"/>
-        </w:rPr>
-        <w:t>Drawing Updates: Marked up CAD and "As-Built" drawings to reflect new subsea findings and anomalies.</w:t>
-      </w:r>
-    </w:p>
-    <w:p>
-      <w:pPr>
-        <w:pStyle w:val="ListBullet"/>
-        <w:spacing w:before="40" w:after="60"/>
-        <w:ind w:left="504"/>
-      </w:pPr>
-      <w:r>
-        <w:rPr>
-          <w:rFonts w:ascii="Arial" w:hAnsi="Arial"/>
-          <w:b/>
-          <w:color w:val="1E293B"/>
-          <w:sz w:val="19"/>
-        </w:rPr>
-      </w:r>
-      <w:r>
-        <w:rPr>
-          <w:rFonts w:ascii="Arial" w:hAnsi="Arial"/>
-          <w:color w:val="475569"/>
-          <w:sz w:val="19"/>
-        </w:rPr>
-        <w:t>Work Pack Creation: Wrote detailed, step-by-step inspection procedures and checklists for upcoming subsea campaigns.</w:t>
-      </w:r>
-    </w:p>
-    <w:p>
-      <w:pPr>
-        <w:pStyle w:val="ListBullet"/>
-        <w:spacing w:before="40" w:after="60"/>
-        <w:ind w:left="504"/>
-      </w:pPr>
-      <w:r>
-        <w:rPr>
-          <w:rFonts w:ascii="Arial" w:hAnsi="Arial"/>
-          <w:b/>
-          <w:color w:val="1E293B"/>
-          <w:sz w:val="19"/>
-        </w:rPr>
-      </w:r>
-      <w:r>
-        <w:rPr>
-          <w:rFonts w:ascii="Arial" w:hAnsi="Arial"/>
-          <w:color w:val="475569"/>
-          <w:sz w:val="19"/>
-        </w:rPr>
-        <w:t>Desktop Studies: Reviewed historical integrity reports to identify targeted areas of interest for future monitoring.</w:t>
-      </w:r>
-    </w:p>
-    <w:p/>
     <w:tbl>
       <w:tblPr>
         <w:tblW w:type="auto" w:w="0"/>
@@ -7638,7 +7006,7 @@
           <w:color w:val="475569"/>
           <w:sz w:val="19"/>
         </w:rPr>
-        <w:t>Performed subsea inspections using ROV/Chinook with real-time data capture via Sirrihatt Inspection Suite and IDAMS Wincair.</w:t>
+        <w:t>Performed subsea inspections using ROV Chinook with real-time data capture via Sirrihatt Inspection Suite and IDAMS Wincair.</w:t>
       </w:r>
     </w:p>
     <w:p>
@@ -8765,6 +8133,482 @@
           <w:sz w:val="19"/>
         </w:rPr>
         <w:t>Monitored real-time ROV video feeds and logged anomalies, ensuring strict QA/QC standards for client PTTEP.</w:t>
+      </w:r>
+    </w:p>
+    <w:p/>
+    <w:tbl>
+      <w:tblPr>
+        <w:tblW w:type="auto" w:w="0"/>
+        <w:tblLayout w:type="fixed"/>
+        <w:tblLook w:firstColumn="1" w:firstRow="1" w:lastColumn="0" w:lastRow="0" w:noHBand="0" w:noVBand="1" w:val="04A0"/>
+      </w:tblPr>
+      <w:tblGrid>
+        <w:gridCol w:w="3360"/>
+        <w:gridCol w:w="3360"/>
+        <w:gridCol w:w="3360"/>
+      </w:tblGrid>
+      <w:tr>
+        <w:trPr>
+          <w:cantSplit/>
+        </w:trPr>
+        <w:tc>
+          <w:tcPr>
+            <w:tcW w:type="dxa" w:w="2592"/>
+            <w:tcMar>
+              <w:top w:w="60" w:type="dxa"/>
+              <w:bottom w:w="60" w:type="dxa"/>
+              <w:left w:w="0" w:type="dxa"/>
+              <w:right w:w="50" w:type="dxa"/>
+            </w:tcMar>
+          </w:tcPr>
+          <w:p>
+            <w:pPr>
+              <w:spacing w:before="40" w:after="40"/>
+            </w:pPr>
+            <w:r>
+              <w:rPr>
+                <w:rFonts w:ascii="Arial" w:hAnsi="Arial"/>
+                <w:b/>
+                <w:color w:val="475569"/>
+                <w:sz w:val="19"/>
+              </w:rPr>
+              <w:t>Company</w:t>
+            </w:r>
+          </w:p>
+        </w:tc>
+        <w:tc>
+          <w:tcPr>
+            <w:tcW w:type="dxa" w:w="288"/>
+            <w:tcMar>
+              <w:top w:w="60" w:type="dxa"/>
+              <w:bottom w:w="60" w:type="dxa"/>
+              <w:left w:w="0" w:type="dxa"/>
+              <w:right w:w="0" w:type="dxa"/>
+            </w:tcMar>
+          </w:tcPr>
+          <w:p>
+            <w:pPr>
+              <w:spacing w:before="40" w:after="40"/>
+            </w:pPr>
+            <w:r>
+              <w:rPr>
+                <w:rFonts w:ascii="Arial" w:hAnsi="Arial"/>
+                <w:color w:val="94A3B8"/>
+                <w:sz w:val="19"/>
+              </w:rPr>
+              <w:t>:</w:t>
+            </w:r>
+          </w:p>
+        </w:tc>
+        <w:tc>
+          <w:tcPr>
+            <w:tcW w:type="dxa" w:w="7200"/>
+            <w:tcMar>
+              <w:top w:w="60" w:type="dxa"/>
+              <w:bottom w:w="60" w:type="dxa"/>
+              <w:left w:w="50" w:type="dxa"/>
+              <w:right w:w="0" w:type="dxa"/>
+            </w:tcMar>
+          </w:tcPr>
+          <w:p>
+            <w:pPr>
+              <w:spacing w:before="40" w:after="40"/>
+            </w:pPr>
+            <w:r>
+              <w:rPr>
+                <w:rFonts w:ascii="Arial" w:hAnsi="Arial"/>
+                <w:color w:val="0F172A"/>
+                <w:sz w:val="19"/>
+              </w:rPr>
+              <w:t>Sirrihat Subsea Services Sdn Bhd</w:t>
+            </w:r>
+          </w:p>
+        </w:tc>
+      </w:tr>
+      <w:tr>
+        <w:trPr>
+          <w:cantSplit/>
+        </w:trPr>
+        <w:tc>
+          <w:tcPr>
+            <w:tcW w:type="dxa" w:w="2592"/>
+            <w:tcMar>
+              <w:top w:w="60" w:type="dxa"/>
+              <w:bottom w:w="60" w:type="dxa"/>
+              <w:left w:w="0" w:type="dxa"/>
+              <w:right w:w="50" w:type="dxa"/>
+            </w:tcMar>
+          </w:tcPr>
+          <w:p>
+            <w:pPr>
+              <w:spacing w:before="40" w:after="40"/>
+            </w:pPr>
+            <w:r>
+              <w:rPr>
+                <w:rFonts w:ascii="Arial" w:hAnsi="Arial"/>
+                <w:b/>
+                <w:color w:val="475569"/>
+                <w:sz w:val="19"/>
+              </w:rPr>
+              <w:t>Project</w:t>
+            </w:r>
+          </w:p>
+        </w:tc>
+        <w:tc>
+          <w:tcPr>
+            <w:tcW w:type="dxa" w:w="288"/>
+            <w:tcMar>
+              <w:top w:w="60" w:type="dxa"/>
+              <w:bottom w:w="60" w:type="dxa"/>
+              <w:left w:w="0" w:type="dxa"/>
+              <w:right w:w="0" w:type="dxa"/>
+            </w:tcMar>
+          </w:tcPr>
+          <w:p>
+            <w:pPr>
+              <w:spacing w:before="40" w:after="40"/>
+            </w:pPr>
+            <w:r>
+              <w:rPr>
+                <w:rFonts w:ascii="Arial" w:hAnsi="Arial"/>
+                <w:color w:val="94A3B8"/>
+                <w:sz w:val="19"/>
+              </w:rPr>
+              <w:t>:</w:t>
+            </w:r>
+          </w:p>
+        </w:tc>
+        <w:tc>
+          <w:tcPr>
+            <w:tcW w:type="dxa" w:w="7200"/>
+            <w:tcMar>
+              <w:top w:w="60" w:type="dxa"/>
+              <w:bottom w:w="60" w:type="dxa"/>
+              <w:left w:w="50" w:type="dxa"/>
+              <w:right w:w="0" w:type="dxa"/>
+            </w:tcMar>
+          </w:tcPr>
+          <w:p>
+            <w:pPr>
+              <w:spacing w:before="40" w:after="40"/>
+            </w:pPr>
+            <w:r>
+              <w:rPr>
+                <w:rFonts w:ascii="Arial" w:hAnsi="Arial"/>
+                <w:color w:val="0F172A"/>
+                <w:sz w:val="19"/>
+              </w:rPr>
+              <w:t>Onshore Engineering &amp; Reporting Support (Subang Jaya, Selangor, Malaysia)</w:t>
+            </w:r>
+          </w:p>
+        </w:tc>
+      </w:tr>
+      <w:tr>
+        <w:trPr>
+          <w:cantSplit/>
+        </w:trPr>
+        <w:tc>
+          <w:tcPr>
+            <w:tcW w:type="dxa" w:w="2592"/>
+            <w:tcMar>
+              <w:top w:w="60" w:type="dxa"/>
+              <w:bottom w:w="60" w:type="dxa"/>
+              <w:left w:w="0" w:type="dxa"/>
+              <w:right w:w="50" w:type="dxa"/>
+            </w:tcMar>
+          </w:tcPr>
+          <w:p>
+            <w:pPr>
+              <w:spacing w:before="40" w:after="40"/>
+            </w:pPr>
+            <w:r>
+              <w:rPr>
+                <w:rFonts w:ascii="Arial" w:hAnsi="Arial"/>
+                <w:b/>
+                <w:color w:val="475569"/>
+                <w:sz w:val="19"/>
+              </w:rPr>
+              <w:t>Duration</w:t>
+            </w:r>
+          </w:p>
+        </w:tc>
+        <w:tc>
+          <w:tcPr>
+            <w:tcW w:type="dxa" w:w="288"/>
+            <w:tcMar>
+              <w:top w:w="60" w:type="dxa"/>
+              <w:bottom w:w="60" w:type="dxa"/>
+              <w:left w:w="0" w:type="dxa"/>
+              <w:right w:w="0" w:type="dxa"/>
+            </w:tcMar>
+          </w:tcPr>
+          <w:p>
+            <w:pPr>
+              <w:spacing w:before="40" w:after="40"/>
+            </w:pPr>
+            <w:r>
+              <w:rPr>
+                <w:rFonts w:ascii="Arial" w:hAnsi="Arial"/>
+                <w:color w:val="94A3B8"/>
+                <w:sz w:val="19"/>
+              </w:rPr>
+              <w:t>:</w:t>
+            </w:r>
+          </w:p>
+        </w:tc>
+        <w:tc>
+          <w:tcPr>
+            <w:tcW w:type="dxa" w:w="7200"/>
+            <w:tcMar>
+              <w:top w:w="60" w:type="dxa"/>
+              <w:bottom w:w="60" w:type="dxa"/>
+              <w:left w:w="50" w:type="dxa"/>
+              <w:right w:w="0" w:type="dxa"/>
+            </w:tcMar>
+          </w:tcPr>
+          <w:p>
+            <w:pPr>
+              <w:spacing w:before="40" w:after="40"/>
+            </w:pPr>
+            <w:r>
+              <w:rPr>
+                <w:rFonts w:ascii="Arial" w:hAnsi="Arial"/>
+                <w:color w:val="0F172A"/>
+                <w:sz w:val="19"/>
+              </w:rPr>
+              <w:t>November 2022 – September 2023</w:t>
+            </w:r>
+          </w:p>
+        </w:tc>
+      </w:tr>
+      <w:tr>
+        <w:trPr>
+          <w:cantSplit/>
+        </w:trPr>
+        <w:tc>
+          <w:tcPr>
+            <w:tcW w:type="dxa" w:w="2592"/>
+            <w:tcMar>
+              <w:top w:w="60" w:type="dxa"/>
+              <w:bottom w:w="60" w:type="dxa"/>
+              <w:left w:w="0" w:type="dxa"/>
+              <w:right w:w="50" w:type="dxa"/>
+            </w:tcMar>
+          </w:tcPr>
+          <w:p>
+            <w:pPr>
+              <w:spacing w:before="40" w:after="40"/>
+            </w:pPr>
+            <w:r>
+              <w:rPr>
+                <w:rFonts w:ascii="Arial" w:hAnsi="Arial"/>
+                <w:b/>
+                <w:color w:val="475569"/>
+                <w:sz w:val="19"/>
+              </w:rPr>
+              <w:t>Position Title</w:t>
+            </w:r>
+          </w:p>
+        </w:tc>
+        <w:tc>
+          <w:tcPr>
+            <w:tcW w:type="dxa" w:w="288"/>
+            <w:tcMar>
+              <w:top w:w="60" w:type="dxa"/>
+              <w:bottom w:w="60" w:type="dxa"/>
+              <w:left w:w="0" w:type="dxa"/>
+              <w:right w:w="0" w:type="dxa"/>
+            </w:tcMar>
+          </w:tcPr>
+          <w:p>
+            <w:pPr>
+              <w:spacing w:before="40" w:after="40"/>
+            </w:pPr>
+            <w:r>
+              <w:rPr>
+                <w:rFonts w:ascii="Arial" w:hAnsi="Arial"/>
+                <w:color w:val="94A3B8"/>
+                <w:sz w:val="19"/>
+              </w:rPr>
+              <w:t>:</w:t>
+            </w:r>
+          </w:p>
+        </w:tc>
+        <w:tc>
+          <w:tcPr>
+            <w:tcW w:type="dxa" w:w="7200"/>
+            <w:tcMar>
+              <w:top w:w="60" w:type="dxa"/>
+              <w:bottom w:w="60" w:type="dxa"/>
+              <w:left w:w="50" w:type="dxa"/>
+              <w:right w:w="0" w:type="dxa"/>
+            </w:tcMar>
+          </w:tcPr>
+          <w:p>
+            <w:pPr>
+              <w:spacing w:before="40" w:after="40"/>
+            </w:pPr>
+            <w:r>
+              <w:rPr>
+                <w:rFonts w:ascii="Arial" w:hAnsi="Arial"/>
+                <w:color w:val="0F172A"/>
+                <w:sz w:val="19"/>
+              </w:rPr>
+              <w:t>Data QA/QC Coordinator</w:t>
+            </w:r>
+          </w:p>
+        </w:tc>
+      </w:tr>
+    </w:tbl>
+    <w:p>
+      <w:pPr>
+        <w:spacing w:before="80" w:after="40"/>
+      </w:pPr>
+      <w:r>
+        <w:rPr>
+          <w:rFonts w:ascii="Arial" w:hAnsi="Arial"/>
+          <w:b/>
+          <w:sz w:val="19"/>
+        </w:rPr>
+        <w:t>Scope/Details:</w:t>
+      </w:r>
+    </w:p>
+    <w:p>
+      <w:pPr>
+        <w:pStyle w:val="ListBullet"/>
+        <w:spacing w:before="40" w:after="60"/>
+        <w:ind w:left="504"/>
+      </w:pPr>
+      <w:r>
+        <w:rPr>
+          <w:rFonts w:ascii="Arial" w:hAnsi="Arial"/>
+          <w:b/>
+          <w:color w:val="1E293B"/>
+          <w:sz w:val="19"/>
+        </w:rPr>
+      </w:r>
+      <w:r>
+        <w:rPr>
+          <w:rFonts w:ascii="Arial" w:hAnsi="Arial"/>
+          <w:color w:val="475569"/>
+          <w:sz w:val="19"/>
+        </w:rPr>
+        <w:t>Final Reporting: Converted rough daily logs from offshore operations into polished, formal client reports.</w:t>
+      </w:r>
+    </w:p>
+    <w:p>
+      <w:pPr>
+        <w:pStyle w:val="ListBullet"/>
+        <w:spacing w:before="40" w:after="60"/>
+        <w:ind w:left="504"/>
+      </w:pPr>
+      <w:r>
+        <w:rPr>
+          <w:rFonts w:ascii="Arial" w:hAnsi="Arial"/>
+          <w:b/>
+          <w:color w:val="1E293B"/>
+          <w:sz w:val="19"/>
+        </w:rPr>
+      </w:r>
+      <w:r>
+        <w:rPr>
+          <w:rFonts w:ascii="Arial" w:hAnsi="Arial"/>
+          <w:color w:val="475569"/>
+          <w:sz w:val="19"/>
+        </w:rPr>
+        <w:t>Data QA/QC: Verified accuracy of subsea video footage, timestamps, and anomaly descriptions against physical logs.</w:t>
+      </w:r>
+    </w:p>
+    <w:p>
+      <w:pPr>
+        <w:pStyle w:val="ListBullet"/>
+        <w:spacing w:before="40" w:after="60"/>
+        <w:ind w:left="504"/>
+      </w:pPr>
+      <w:r>
+        <w:rPr>
+          <w:rFonts w:ascii="Arial" w:hAnsi="Arial"/>
+          <w:b/>
+          <w:color w:val="1E293B"/>
+          <w:sz w:val="19"/>
+        </w:rPr>
+      </w:r>
+      <w:r>
+        <w:rPr>
+          <w:rFonts w:ascii="Arial" w:hAnsi="Arial"/>
+          <w:color w:val="475569"/>
+          <w:sz w:val="19"/>
+        </w:rPr>
+        <w:t>Database Management: Uploaded validated offshore data and inspection logs into integrity software systems.</w:t>
+      </w:r>
+    </w:p>
+    <w:p>
+      <w:pPr>
+        <w:pStyle w:val="ListBullet"/>
+        <w:spacing w:before="40" w:after="60"/>
+        <w:ind w:left="504"/>
+      </w:pPr>
+      <w:r>
+        <w:rPr>
+          <w:rFonts w:ascii="Arial" w:hAnsi="Arial"/>
+          <w:b/>
+          <w:color w:val="1E293B"/>
+          <w:sz w:val="19"/>
+        </w:rPr>
+      </w:r>
+      <w:r>
+        <w:rPr>
+          <w:rFonts w:ascii="Arial" w:hAnsi="Arial"/>
+          <w:color w:val="475569"/>
+          <w:sz w:val="19"/>
+        </w:rPr>
+        <w:t>Drawing Updates: Marked up CAD and "As-Built" drawings to reflect new subsea findings and anomalies.</w:t>
+      </w:r>
+    </w:p>
+    <w:p>
+      <w:pPr>
+        <w:pStyle w:val="ListBullet"/>
+        <w:spacing w:before="40" w:after="60"/>
+        <w:ind w:left="504"/>
+      </w:pPr>
+      <w:r>
+        <w:rPr>
+          <w:rFonts w:ascii="Arial" w:hAnsi="Arial"/>
+          <w:b/>
+          <w:color w:val="1E293B"/>
+          <w:sz w:val="19"/>
+        </w:rPr>
+      </w:r>
+      <w:r>
+        <w:rPr>
+          <w:rFonts w:ascii="Arial" w:hAnsi="Arial"/>
+          <w:color w:val="475569"/>
+          <w:sz w:val="19"/>
+        </w:rPr>
+        <w:t>Work Pack Creation: Wrote detailed, step-by-step inspection procedures and checklists for upcoming subsea campaigns.</w:t>
+      </w:r>
+    </w:p>
+    <w:p>
+      <w:pPr>
+        <w:pStyle w:val="ListBullet"/>
+        <w:spacing w:before="40" w:after="60"/>
+        <w:ind w:left="504"/>
+      </w:pPr>
+      <w:r>
+        <w:rPr>
+          <w:rFonts w:ascii="Arial" w:hAnsi="Arial"/>
+          <w:b/>
+          <w:color w:val="1E293B"/>
+          <w:sz w:val="19"/>
+        </w:rPr>
+      </w:r>
+      <w:r>
+        <w:rPr>
+          <w:rFonts w:ascii="Arial" w:hAnsi="Arial"/>
+          <w:color w:val="475569"/>
+          <w:sz w:val="19"/>
+        </w:rPr>
+        <w:t>Desktop Studies: Reviewed historical integrity reports to identify targeted areas of interest for future monitoring.</w:t>
       </w:r>
     </w:p>
     <w:p>

</xml_diff>

<commit_message>
Optimize CV: add Referees section with Azman Aziz (Director, Sirrihatt Subsea Sdn Bhd) details in classic_cv.html and convert_to_word.py, regenerate Muhammad_Amin_Azman_CV.docx
</commit_message>
<xml_diff>
--- a/Muhammad_Amin_Azman_CV.docx
+++ b/Muhammad_Amin_Azman_CV.docx
@@ -8839,6 +8839,350 @@
         <w:t>Appraisal Letter Verification: tinyurl.com/aminazman-inspection (See Certificates section)</w:t>
       </w:r>
     </w:p>
+    <w:p>
+      <w:pPr>
+        <w:keepNext/>
+        <w:spacing w:before="360" w:after="120"/>
+        <w:pBdr>
+          <w:bottom w:val="single" w:sz="12" w:space="4" w:color="0284C7"/>
+        </w:pBdr>
+      </w:pPr>
+      <w:r>
+        <w:rPr>
+          <w:rFonts w:ascii="Arial" w:hAnsi="Arial"/>
+          <w:b/>
+          <w:color w:val="0F172A"/>
+          <w:sz w:val="23"/>
+        </w:rPr>
+        <w:t>REFEREES</w:t>
+      </w:r>
+    </w:p>
+    <w:tbl>
+      <w:tblPr>
+        <w:tblW w:type="auto" w:w="0"/>
+        <w:tblLayout w:type="fixed"/>
+        <w:tblLook w:firstColumn="1" w:firstRow="1" w:lastColumn="0" w:lastRow="0" w:noHBand="0" w:noVBand="1" w:val="04A0"/>
+      </w:tblPr>
+      <w:tblGrid>
+        <w:gridCol w:w="3360"/>
+        <w:gridCol w:w="3360"/>
+        <w:gridCol w:w="3360"/>
+      </w:tblGrid>
+      <w:tr>
+        <w:trPr>
+          <w:cantSplit/>
+        </w:trPr>
+        <w:tc>
+          <w:tcPr>
+            <w:tcW w:type="dxa" w:w="2592"/>
+            <w:tcMar>
+              <w:top w:w="60" w:type="dxa"/>
+              <w:bottom w:w="60" w:type="dxa"/>
+              <w:left w:w="0" w:type="dxa"/>
+              <w:right w:w="50" w:type="dxa"/>
+            </w:tcMar>
+          </w:tcPr>
+          <w:p>
+            <w:pPr>
+              <w:spacing w:before="40" w:after="40"/>
+            </w:pPr>
+            <w:r>
+              <w:rPr>
+                <w:rFonts w:ascii="Arial" w:hAnsi="Arial"/>
+                <w:b/>
+                <w:color w:val="475569"/>
+                <w:sz w:val="19"/>
+              </w:rPr>
+              <w:t>Name</w:t>
+            </w:r>
+          </w:p>
+        </w:tc>
+        <w:tc>
+          <w:tcPr>
+            <w:tcW w:type="dxa" w:w="288"/>
+            <w:tcMar>
+              <w:top w:w="60" w:type="dxa"/>
+              <w:bottom w:w="60" w:type="dxa"/>
+              <w:left w:w="0" w:type="dxa"/>
+              <w:right w:w="0" w:type="dxa"/>
+            </w:tcMar>
+          </w:tcPr>
+          <w:p>
+            <w:pPr>
+              <w:spacing w:before="40" w:after="40"/>
+            </w:pPr>
+            <w:r>
+              <w:rPr>
+                <w:rFonts w:ascii="Arial" w:hAnsi="Arial"/>
+                <w:color w:val="94A3B8"/>
+                <w:sz w:val="19"/>
+              </w:rPr>
+              <w:t>:</w:t>
+            </w:r>
+          </w:p>
+        </w:tc>
+        <w:tc>
+          <w:tcPr>
+            <w:tcW w:type="dxa" w:w="7200"/>
+            <w:tcMar>
+              <w:top w:w="60" w:type="dxa"/>
+              <w:bottom w:w="60" w:type="dxa"/>
+              <w:left w:w="50" w:type="dxa"/>
+              <w:right w:w="0" w:type="dxa"/>
+            </w:tcMar>
+          </w:tcPr>
+          <w:p>
+            <w:pPr>
+              <w:spacing w:before="40" w:after="40"/>
+            </w:pPr>
+            <w:r>
+              <w:rPr>
+                <w:rFonts w:ascii="Arial" w:hAnsi="Arial"/>
+                <w:b/>
+                <w:color w:val="0F172A"/>
+                <w:sz w:val="19"/>
+              </w:rPr>
+              <w:t>Azman Aziz</w:t>
+            </w:r>
+          </w:p>
+        </w:tc>
+      </w:tr>
+      <w:tr>
+        <w:trPr>
+          <w:cantSplit/>
+        </w:trPr>
+        <w:tc>
+          <w:tcPr>
+            <w:tcW w:type="dxa" w:w="2592"/>
+            <w:tcMar>
+              <w:top w:w="60" w:type="dxa"/>
+              <w:bottom w:w="60" w:type="dxa"/>
+              <w:left w:w="0" w:type="dxa"/>
+              <w:right w:w="50" w:type="dxa"/>
+            </w:tcMar>
+          </w:tcPr>
+          <w:p>
+            <w:pPr>
+              <w:spacing w:before="40" w:after="40"/>
+            </w:pPr>
+            <w:r>
+              <w:rPr>
+                <w:rFonts w:ascii="Arial" w:hAnsi="Arial"/>
+                <w:b/>
+                <w:color w:val="475569"/>
+                <w:sz w:val="19"/>
+              </w:rPr>
+              <w:t>Designation</w:t>
+            </w:r>
+          </w:p>
+        </w:tc>
+        <w:tc>
+          <w:tcPr>
+            <w:tcW w:type="dxa" w:w="288"/>
+            <w:tcMar>
+              <w:top w:w="60" w:type="dxa"/>
+              <w:bottom w:w="60" w:type="dxa"/>
+              <w:left w:w="0" w:type="dxa"/>
+              <w:right w:w="0" w:type="dxa"/>
+            </w:tcMar>
+          </w:tcPr>
+          <w:p>
+            <w:pPr>
+              <w:spacing w:before="40" w:after="40"/>
+            </w:pPr>
+            <w:r>
+              <w:rPr>
+                <w:rFonts w:ascii="Arial" w:hAnsi="Arial"/>
+                <w:color w:val="94A3B8"/>
+                <w:sz w:val="19"/>
+              </w:rPr>
+              <w:t>:</w:t>
+            </w:r>
+          </w:p>
+        </w:tc>
+        <w:tc>
+          <w:tcPr>
+            <w:tcW w:type="dxa" w:w="7200"/>
+            <w:tcMar>
+              <w:top w:w="60" w:type="dxa"/>
+              <w:bottom w:w="60" w:type="dxa"/>
+              <w:left w:w="50" w:type="dxa"/>
+              <w:right w:w="0" w:type="dxa"/>
+            </w:tcMar>
+          </w:tcPr>
+          <w:p>
+            <w:pPr>
+              <w:spacing w:before="40" w:after="40"/>
+            </w:pPr>
+            <w:r>
+              <w:rPr>
+                <w:rFonts w:ascii="Arial" w:hAnsi="Arial"/>
+                <w:color w:val="0F172A"/>
+                <w:sz w:val="19"/>
+              </w:rPr>
+              <w:t>Director, Sirrihatt Subsea Sdn Bhd</w:t>
+            </w:r>
+          </w:p>
+        </w:tc>
+      </w:tr>
+      <w:tr>
+        <w:trPr>
+          <w:cantSplit/>
+        </w:trPr>
+        <w:tc>
+          <w:tcPr>
+            <w:tcW w:type="dxa" w:w="2592"/>
+            <w:tcMar>
+              <w:top w:w="60" w:type="dxa"/>
+              <w:bottom w:w="60" w:type="dxa"/>
+              <w:left w:w="0" w:type="dxa"/>
+              <w:right w:w="50" w:type="dxa"/>
+            </w:tcMar>
+          </w:tcPr>
+          <w:p>
+            <w:pPr>
+              <w:spacing w:before="40" w:after="40"/>
+            </w:pPr>
+            <w:r>
+              <w:rPr>
+                <w:rFonts w:ascii="Arial" w:hAnsi="Arial"/>
+                <w:b/>
+                <w:color w:val="475569"/>
+                <w:sz w:val="19"/>
+              </w:rPr>
+              <w:t>Contact No.</w:t>
+            </w:r>
+          </w:p>
+        </w:tc>
+        <w:tc>
+          <w:tcPr>
+            <w:tcW w:type="dxa" w:w="288"/>
+            <w:tcMar>
+              <w:top w:w="60" w:type="dxa"/>
+              <w:bottom w:w="60" w:type="dxa"/>
+              <w:left w:w="0" w:type="dxa"/>
+              <w:right w:w="0" w:type="dxa"/>
+            </w:tcMar>
+          </w:tcPr>
+          <w:p>
+            <w:pPr>
+              <w:spacing w:before="40" w:after="40"/>
+            </w:pPr>
+            <w:r>
+              <w:rPr>
+                <w:rFonts w:ascii="Arial" w:hAnsi="Arial"/>
+                <w:color w:val="94A3B8"/>
+                <w:sz w:val="19"/>
+              </w:rPr>
+              <w:t>:</w:t>
+            </w:r>
+          </w:p>
+        </w:tc>
+        <w:tc>
+          <w:tcPr>
+            <w:tcW w:type="dxa" w:w="7200"/>
+            <w:tcMar>
+              <w:top w:w="60" w:type="dxa"/>
+              <w:bottom w:w="60" w:type="dxa"/>
+              <w:left w:w="50" w:type="dxa"/>
+              <w:right w:w="0" w:type="dxa"/>
+            </w:tcMar>
+          </w:tcPr>
+          <w:p>
+            <w:pPr>
+              <w:spacing w:before="40" w:after="40"/>
+            </w:pPr>
+            <w:r>
+              <w:rPr>
+                <w:rFonts w:ascii="Arial" w:hAnsi="Arial"/>
+                <w:color w:val="0F172A"/>
+                <w:sz w:val="19"/>
+              </w:rPr>
+              <w:t>+60173991576</w:t>
+            </w:r>
+          </w:p>
+        </w:tc>
+      </w:tr>
+      <w:tr>
+        <w:trPr>
+          <w:cantSplit/>
+        </w:trPr>
+        <w:tc>
+          <w:tcPr>
+            <w:tcW w:type="dxa" w:w="2592"/>
+            <w:tcMar>
+              <w:top w:w="60" w:type="dxa"/>
+              <w:bottom w:w="60" w:type="dxa"/>
+              <w:left w:w="0" w:type="dxa"/>
+              <w:right w:w="50" w:type="dxa"/>
+            </w:tcMar>
+          </w:tcPr>
+          <w:p>
+            <w:pPr>
+              <w:spacing w:before="40" w:after="40"/>
+            </w:pPr>
+            <w:r>
+              <w:rPr>
+                <w:rFonts w:ascii="Arial" w:hAnsi="Arial"/>
+                <w:b/>
+                <w:color w:val="475569"/>
+                <w:sz w:val="19"/>
+              </w:rPr>
+              <w:t>Email Address</w:t>
+            </w:r>
+          </w:p>
+        </w:tc>
+        <w:tc>
+          <w:tcPr>
+            <w:tcW w:type="dxa" w:w="288"/>
+            <w:tcMar>
+              <w:top w:w="60" w:type="dxa"/>
+              <w:bottom w:w="60" w:type="dxa"/>
+              <w:left w:w="0" w:type="dxa"/>
+              <w:right w:w="0" w:type="dxa"/>
+            </w:tcMar>
+          </w:tcPr>
+          <w:p>
+            <w:pPr>
+              <w:spacing w:before="40" w:after="40"/>
+            </w:pPr>
+            <w:r>
+              <w:rPr>
+                <w:rFonts w:ascii="Arial" w:hAnsi="Arial"/>
+                <w:color w:val="94A3B8"/>
+                <w:sz w:val="19"/>
+              </w:rPr>
+              <w:t>:</w:t>
+            </w:r>
+          </w:p>
+        </w:tc>
+        <w:tc>
+          <w:tcPr>
+            <w:tcW w:type="dxa" w:w="7200"/>
+            <w:tcMar>
+              <w:top w:w="60" w:type="dxa"/>
+              <w:bottom w:w="60" w:type="dxa"/>
+              <w:left w:w="50" w:type="dxa"/>
+              <w:right w:w="0" w:type="dxa"/>
+            </w:tcMar>
+          </w:tcPr>
+          <w:p>
+            <w:pPr>
+              <w:spacing w:before="40" w:after="40"/>
+            </w:pPr>
+            <w:r>
+              <w:rPr>
+                <w:rFonts w:ascii="Arial" w:hAnsi="Arial"/>
+                <w:color w:val="0F172A"/>
+                <w:sz w:val="19"/>
+              </w:rPr>
+              <w:t>azman@sirrihatt.com</w:t>
+            </w:r>
+          </w:p>
+        </w:tc>
+      </w:tr>
+    </w:tbl>
+    <w:p/>
     <w:sectPr>
       <w:pgSz w:w="12240" w:h="15840"/>
       <w:pgMar w:top="1080" w:right="1080" w:bottom="1080" w:left="1080" w:header="720" w:footer="720" w:gutter="0"/>

</xml_diff>

<commit_message>
Optimize CV: sync Word document generator (convert_to_word.py) with all new web features including profile photo, native page borders, repeating headers, native page numbers, and referees section, regenerate Muhammad_Amin_Azman_CV.docx
</commit_message>
<xml_diff>
--- a/Muhammad_Amin_Azman_CV.docx
+++ b/Muhammad_Amin_Azman_CV.docx
@@ -2,35 +2,116 @@
 <file path=word/document.xml><?xml version="1.0" encoding="utf-8"?>
 <w:document xmlns:wpc="http://schemas.microsoft.com/office/word/2010/wordprocessingCanvas" xmlns:mo="http://schemas.microsoft.com/office/mac/office/2008/main" xmlns:mc="http://schemas.openxmlformats.org/markup-compatibility/2006" xmlns:mv="urn:schemas-microsoft-com:mac:vml" xmlns:o="urn:schemas-microsoft-com:office:office" xmlns:r="http://schemas.openxmlformats.org/officeDocument/2006/relationships" xmlns:m="http://schemas.openxmlformats.org/officeDocument/2006/math" xmlns:v="urn:schemas-microsoft-com:vml" xmlns:wp14="http://schemas.microsoft.com/office/word/2010/wordprocessingDrawing" xmlns:wp="http://schemas.openxmlformats.org/drawingml/2006/wordprocessingDrawing" xmlns:w10="urn:schemas-microsoft-com:office:word" xmlns:w="http://schemas.openxmlformats.org/wordprocessingml/2006/main" xmlns:w14="http://schemas.microsoft.com/office/word/2010/wordml" xmlns:wpg="http://schemas.microsoft.com/office/word/2010/wordprocessingGroup" xmlns:wpi="http://schemas.microsoft.com/office/word/2010/wordprocessingInk" xmlns:wne="http://schemas.microsoft.com/office/word/2006/wordml" xmlns:wps="http://schemas.microsoft.com/office/word/2010/wordprocessingShape" mc:Ignorable="w14 wp14">
   <w:body>
+    <w:tbl>
+      <w:tblPr>
+        <w:tblW w:type="auto" w:w="0"/>
+        <w:tblLayout w:type="fixed"/>
+        <w:tblLook w:firstColumn="1" w:firstRow="1" w:lastColumn="0" w:lastRow="0" w:noHBand="0" w:noVBand="1" w:val="04A0"/>
+      </w:tblPr>
+      <w:tblGrid>
+        <w:gridCol w:w="7776"/>
+        <w:gridCol w:w="2304"/>
+      </w:tblGrid>
+      <w:tr>
+        <w:tc>
+          <w:tcPr>
+            <w:tcW w:type="dxa" w:w="5040"/>
+            <w:tcMar>
+              <w:top w:w="0" w:type="dxa"/>
+              <w:bottom w:w="0" w:type="dxa"/>
+              <w:left w:w="0" w:type="dxa"/>
+              <w:right w:w="0" w:type="dxa"/>
+            </w:tcMar>
+          </w:tcPr>
+          <w:p>
+            <w:pPr>
+              <w:spacing w:before="0" w:after="40"/>
+            </w:pPr>
+            <w:r>
+              <w:rPr>
+                <w:rFonts w:ascii="Arial" w:hAnsi="Arial"/>
+                <w:b/>
+                <w:color w:val="0F172A"/>
+                <w:sz w:val="34"/>
+              </w:rPr>
+              <w:t>MUHAMMAD AMIN BIN AZMAN</w:t>
+            </w:r>
+          </w:p>
+          <w:p>
+            <w:pPr>
+              <w:spacing w:before="0" w:after="0"/>
+            </w:pPr>
+            <w:r>
+              <w:rPr>
+                <w:rFonts w:ascii="Arial" w:hAnsi="Arial"/>
+                <w:b/>
+                <w:color w:val="0284C7"/>
+                <w:sz w:val="21"/>
+              </w:rPr>
+              <w:t>3.4U INSPECTION ENGINEER / DATA RECORDER (OFFSHORE)</w:t>
+            </w:r>
+          </w:p>
+        </w:tc>
+        <w:tc>
+          <w:tcPr>
+            <w:tcW w:type="dxa" w:w="5040"/>
+            <w:tcMar>
+              <w:top w:w="0" w:type="dxa"/>
+              <w:bottom w:w="0" w:type="dxa"/>
+              <w:left w:w="0" w:type="dxa"/>
+              <w:right w:w="0" w:type="dxa"/>
+            </w:tcMar>
+          </w:tcPr>
+          <w:p>
+            <w:pPr>
+              <w:spacing w:before="0" w:after="0"/>
+              <w:jc w:val="right"/>
+            </w:pPr>
+            <w:r>
+              <w:drawing>
+                <wp:inline xmlns:a="http://schemas.openxmlformats.org/drawingml/2006/main" xmlns:pic="http://schemas.openxmlformats.org/drawingml/2006/picture">
+                  <wp:extent cx="960120" cy="1188720"/>
+                  <wp:docPr id="1" name="Picture 1"/>
+                  <wp:cNvGraphicFramePr>
+                    <a:graphicFrameLocks noChangeAspect="1"/>
+                  </wp:cNvGraphicFramePr>
+                  <a:graphic>
+                    <a:graphicData uri="http://schemas.openxmlformats.org/drawingml/2006/picture">
+                      <pic:pic>
+                        <pic:nvPicPr>
+                          <pic:cNvPr id="0" name="8. Passport Photo - Amin Azman.png"/>
+                          <pic:cNvPicPr/>
+                        </pic:nvPicPr>
+                        <pic:blipFill>
+                          <a:blip r:embed="rId10"/>
+                          <a:stretch>
+                            <a:fillRect/>
+                          </a:stretch>
+                        </pic:blipFill>
+                        <pic:spPr>
+                          <a:xfrm>
+                            <a:off x="0" y="0"/>
+                            <a:ext cx="960120" cy="1188720"/>
+                          </a:xfrm>
+                          <a:prstGeom prst="rect"/>
+                        </pic:spPr>
+                      </pic:pic>
+                    </a:graphicData>
+                  </a:graphic>
+                </wp:inline>
+              </w:drawing>
+            </w:r>
+          </w:p>
+        </w:tc>
+      </w:tr>
+    </w:tbl>
     <w:p>
       <w:pPr>
-        <w:spacing w:before="0" w:after="40"/>
-        <w:jc w:val="center"/>
+        <w:spacing w:before="160" w:after="240"/>
+        <w:pBdr>
+          <w:bottom w:val="double" w:sz="12" w:space="1" w:color="CCCCCC"/>
+        </w:pBdr>
       </w:pPr>
-      <w:r>
-        <w:rPr>
-          <w:rFonts w:ascii="Arial" w:hAnsi="Arial"/>
-          <w:b/>
-          <w:color w:val="0F172A"/>
-          <w:sz w:val="36"/>
-        </w:rPr>
-        <w:t>MUHAMMAD AMIN BIN AZMAN</w:t>
-      </w:r>
-    </w:p>
-    <w:p>
-      <w:pPr>
-        <w:spacing w:before="0" w:after="360"/>
-        <w:jc w:val="center"/>
-      </w:pPr>
-      <w:r>
-        <w:rPr>
-          <w:rFonts w:ascii="Arial" w:hAnsi="Arial"/>
-          <w:b/>
-          <w:color w:val="0284C7"/>
-          <w:sz w:val="21"/>
-        </w:rPr>
-        <w:t>3.4U INSPECTION ENGINEER / DATA RECORDER</w:t>
-      </w:r>
     </w:p>
     <w:p>
       <w:pPr>
@@ -67,7 +148,7 @@
         </w:trPr>
         <w:tc>
           <w:tcPr>
-            <w:tcW w:type="dxa" w:w="2592"/>
+            <w:tcW w:type="dxa" w:w="3024"/>
             <w:tcMar>
               <w:top w:w="60" w:type="dxa"/>
               <w:bottom w:w="60" w:type="dxa"/>
@@ -116,7 +197,7 @@
         </w:tc>
         <w:tc>
           <w:tcPr>
-            <w:tcW w:type="dxa" w:w="7200"/>
+            <w:tcW w:type="dxa" w:w="6768"/>
             <w:tcMar>
               <w:top w:w="60" w:type="dxa"/>
               <w:bottom w:w="60" w:type="dxa"/>
@@ -131,7 +212,6 @@
             <w:r>
               <w:rPr>
                 <w:rFonts w:ascii="Arial" w:hAnsi="Arial"/>
-                <w:b/>
                 <w:color w:val="0F172A"/>
                 <w:sz w:val="19"/>
               </w:rPr>
@@ -146,7 +226,7 @@
         </w:trPr>
         <w:tc>
           <w:tcPr>
-            <w:tcW w:type="dxa" w:w="2592"/>
+            <w:tcW w:type="dxa" w:w="3024"/>
             <w:tcMar>
               <w:top w:w="60" w:type="dxa"/>
               <w:bottom w:w="60" w:type="dxa"/>
@@ -195,7 +275,7 @@
         </w:tc>
         <w:tc>
           <w:tcPr>
-            <w:tcW w:type="dxa" w:w="7200"/>
+            <w:tcW w:type="dxa" w:w="6768"/>
             <w:tcMar>
               <w:top w:w="60" w:type="dxa"/>
               <w:bottom w:w="60" w:type="dxa"/>
@@ -224,7 +304,7 @@
         </w:trPr>
         <w:tc>
           <w:tcPr>
-            <w:tcW w:type="dxa" w:w="2592"/>
+            <w:tcW w:type="dxa" w:w="3024"/>
             <w:tcMar>
               <w:top w:w="60" w:type="dxa"/>
               <w:bottom w:w="60" w:type="dxa"/>
@@ -273,7 +353,7 @@
         </w:tc>
         <w:tc>
           <w:tcPr>
-            <w:tcW w:type="dxa" w:w="7200"/>
+            <w:tcW w:type="dxa" w:w="6768"/>
             <w:tcMar>
               <w:top w:w="60" w:type="dxa"/>
               <w:bottom w:w="60" w:type="dxa"/>
@@ -302,7 +382,7 @@
         </w:trPr>
         <w:tc>
           <w:tcPr>
-            <w:tcW w:type="dxa" w:w="2592"/>
+            <w:tcW w:type="dxa" w:w="3024"/>
             <w:tcMar>
               <w:top w:w="60" w:type="dxa"/>
               <w:bottom w:w="60" w:type="dxa"/>
@@ -351,7 +431,7 @@
         </w:tc>
         <w:tc>
           <w:tcPr>
-            <w:tcW w:type="dxa" w:w="7200"/>
+            <w:tcW w:type="dxa" w:w="6768"/>
             <w:tcMar>
               <w:top w:w="60" w:type="dxa"/>
               <w:bottom w:w="60" w:type="dxa"/>
@@ -380,7 +460,7 @@
         </w:trPr>
         <w:tc>
           <w:tcPr>
-            <w:tcW w:type="dxa" w:w="2592"/>
+            <w:tcW w:type="dxa" w:w="3024"/>
             <w:tcMar>
               <w:top w:w="60" w:type="dxa"/>
               <w:bottom w:w="60" w:type="dxa"/>
@@ -429,7 +509,7 @@
         </w:tc>
         <w:tc>
           <w:tcPr>
-            <w:tcW w:type="dxa" w:w="7200"/>
+            <w:tcW w:type="dxa" w:w="6768"/>
             <w:tcMar>
               <w:top w:w="60" w:type="dxa"/>
               <w:bottom w:w="60" w:type="dxa"/>
@@ -458,7 +538,7 @@
         </w:trPr>
         <w:tc>
           <w:tcPr>
-            <w:tcW w:type="dxa" w:w="2592"/>
+            <w:tcW w:type="dxa" w:w="3024"/>
             <w:tcMar>
               <w:top w:w="60" w:type="dxa"/>
               <w:bottom w:w="60" w:type="dxa"/>
@@ -507,7 +587,7 @@
         </w:tc>
         <w:tc>
           <w:tcPr>
-            <w:tcW w:type="dxa" w:w="7200"/>
+            <w:tcW w:type="dxa" w:w="6768"/>
             <w:tcMar>
               <w:top w:w="60" w:type="dxa"/>
               <w:bottom w:w="60" w:type="dxa"/>
@@ -536,7 +616,7 @@
         </w:trPr>
         <w:tc>
           <w:tcPr>
-            <w:tcW w:type="dxa" w:w="2592"/>
+            <w:tcW w:type="dxa" w:w="3024"/>
             <w:tcMar>
               <w:top w:w="60" w:type="dxa"/>
               <w:bottom w:w="60" w:type="dxa"/>
@@ -585,7 +665,7 @@
         </w:tc>
         <w:tc>
           <w:tcPr>
-            <w:tcW w:type="dxa" w:w="7200"/>
+            <w:tcW w:type="dxa" w:w="6768"/>
             <w:tcMar>
               <w:top w:w="60" w:type="dxa"/>
               <w:bottom w:w="60" w:type="dxa"/>
@@ -614,7 +694,7 @@
         </w:trPr>
         <w:tc>
           <w:tcPr>
-            <w:tcW w:type="dxa" w:w="2592"/>
+            <w:tcW w:type="dxa" w:w="3024"/>
             <w:tcMar>
               <w:top w:w="60" w:type="dxa"/>
               <w:bottom w:w="60" w:type="dxa"/>
@@ -663,7 +743,7 @@
         </w:tc>
         <w:tc>
           <w:tcPr>
-            <w:tcW w:type="dxa" w:w="7200"/>
+            <w:tcW w:type="dxa" w:w="6768"/>
             <w:tcMar>
               <w:top w:w="60" w:type="dxa"/>
               <w:bottom w:w="60" w:type="dxa"/>
@@ -692,7 +772,7 @@
         </w:trPr>
         <w:tc>
           <w:tcPr>
-            <w:tcW w:type="dxa" w:w="2592"/>
+            <w:tcW w:type="dxa" w:w="3024"/>
             <w:tcMar>
               <w:top w:w="60" w:type="dxa"/>
               <w:bottom w:w="60" w:type="dxa"/>
@@ -741,7 +821,7 @@
         </w:tc>
         <w:tc>
           <w:tcPr>
-            <w:tcW w:type="dxa" w:w="7200"/>
+            <w:tcW w:type="dxa" w:w="6768"/>
             <w:tcMar>
               <w:top w:w="60" w:type="dxa"/>
               <w:bottom w:w="60" w:type="dxa"/>
@@ -770,7 +850,7 @@
         </w:trPr>
         <w:tc>
           <w:tcPr>
-            <w:tcW w:type="dxa" w:w="2592"/>
+            <w:tcW w:type="dxa" w:w="3024"/>
             <w:tcMar>
               <w:top w:w="60" w:type="dxa"/>
               <w:bottom w:w="60" w:type="dxa"/>
@@ -819,7 +899,7 @@
         </w:tc>
         <w:tc>
           <w:tcPr>
-            <w:tcW w:type="dxa" w:w="7200"/>
+            <w:tcW w:type="dxa" w:w="6768"/>
             <w:tcMar>
               <w:top w:w="60" w:type="dxa"/>
               <w:bottom w:w="60" w:type="dxa"/>
@@ -1108,7 +1188,7 @@
           <w:sz w:val="19"/>
         </w:rPr>
         <w:br/>
-        <w:t>Passport No: A70360403 (Red / Blue)</w:t>
+        <w:t>Passport No: A70360403</w:t>
       </w:r>
     </w:p>
     <w:p>
@@ -1171,7 +1251,7 @@
         </w:trPr>
         <w:tc>
           <w:tcPr>
-            <w:tcW w:type="dxa" w:w="2592"/>
+            <w:tcW w:type="dxa" w:w="3024"/>
             <w:tcMar>
               <w:top w:w="60" w:type="dxa"/>
               <w:bottom w:w="60" w:type="dxa"/>
@@ -1220,7 +1300,7 @@
         </w:tc>
         <w:tc>
           <w:tcPr>
-            <w:tcW w:type="dxa" w:w="7200"/>
+            <w:tcW w:type="dxa" w:w="6768"/>
             <w:tcMar>
               <w:top w:w="60" w:type="dxa"/>
               <w:bottom w:w="60" w:type="dxa"/>
@@ -1249,7 +1329,7 @@
         </w:trPr>
         <w:tc>
           <w:tcPr>
-            <w:tcW w:type="dxa" w:w="2592"/>
+            <w:tcW w:type="dxa" w:w="3024"/>
             <w:tcMar>
               <w:top w:w="60" w:type="dxa"/>
               <w:bottom w:w="60" w:type="dxa"/>
@@ -1268,7 +1348,7 @@
                 <w:color w:val="475569"/>
                 <w:sz w:val="19"/>
               </w:rPr>
-              <w:t>Corporate &amp; Trained</w:t>
+              <w:t>Corporate &amp; Manufacturer Trained</w:t>
             </w:r>
           </w:p>
         </w:tc>
@@ -1298,7 +1378,7 @@
         </w:tc>
         <w:tc>
           <w:tcPr>
-            <w:tcW w:type="dxa" w:w="7200"/>
+            <w:tcW w:type="dxa" w:w="6768"/>
             <w:tcMar>
               <w:top w:w="60" w:type="dxa"/>
               <w:bottom w:w="60" w:type="dxa"/>
@@ -1316,7 +1396,7 @@
                 <w:color w:val="0F172A"/>
                 <w:sz w:val="19"/>
               </w:rPr>
-              <w:t>Fugro DVR &amp; Fugro Sense Structures (Fugro HQ, Dubai), Voyis Discovery, VSLAM Acquisition, Agisoft Photogrammetry (Voyis Canada)</w:t>
+              <w:t>Fugro DVR &amp; Fugro Sense Structures (Trained under Fugro HQ, JAFZA, Dubai), Voyis Discovery, VSLAM Acquisition, Agisoft Photogrammetry (Officially Trained by Voyis Canada)</w:t>
             </w:r>
           </w:p>
         </w:tc>
@@ -1327,7 +1407,7 @@
         </w:trPr>
         <w:tc>
           <w:tcPr>
-            <w:tcW w:type="dxa" w:w="2592"/>
+            <w:tcW w:type="dxa" w:w="3024"/>
             <w:tcMar>
               <w:top w:w="60" w:type="dxa"/>
               <w:bottom w:w="60" w:type="dxa"/>
@@ -1376,7 +1456,7 @@
         </w:tc>
         <w:tc>
           <w:tcPr>
-            <w:tcW w:type="dxa" w:w="7200"/>
+            <w:tcW w:type="dxa" w:w="6768"/>
             <w:tcMar>
               <w:top w:w="60" w:type="dxa"/>
               <w:bottom w:w="60" w:type="dxa"/>
@@ -1405,7 +1485,7 @@
         </w:trPr>
         <w:tc>
           <w:tcPr>
-            <w:tcW w:type="dxa" w:w="2592"/>
+            <w:tcW w:type="dxa" w:w="3024"/>
             <w:tcMar>
               <w:top w:w="60" w:type="dxa"/>
               <w:bottom w:w="60" w:type="dxa"/>
@@ -1454,7 +1534,7 @@
         </w:tc>
         <w:tc>
           <w:tcPr>
-            <w:tcW w:type="dxa" w:w="7200"/>
+            <w:tcW w:type="dxa" w:w="6768"/>
             <w:tcMar>
               <w:top w:w="60" w:type="dxa"/>
               <w:bottom w:w="60" w:type="dxa"/>
@@ -1483,7 +1563,7 @@
         </w:trPr>
         <w:tc>
           <w:tcPr>
-            <w:tcW w:type="dxa" w:w="2592"/>
+            <w:tcW w:type="dxa" w:w="3024"/>
             <w:tcMar>
               <w:top w:w="60" w:type="dxa"/>
               <w:bottom w:w="60" w:type="dxa"/>
@@ -1532,7 +1612,7 @@
         </w:tc>
         <w:tc>
           <w:tcPr>
-            <w:tcW w:type="dxa" w:w="7200"/>
+            <w:tcW w:type="dxa" w:w="6768"/>
             <w:tcMar>
               <w:top w:w="60" w:type="dxa"/>
               <w:bottom w:w="60" w:type="dxa"/>
@@ -1591,7 +1671,7 @@
         </w:trPr>
         <w:tc>
           <w:tcPr>
-            <w:tcW w:type="dxa" w:w="2592"/>
+            <w:tcW w:type="dxa" w:w="3024"/>
             <w:tcMar>
               <w:top w:w="60" w:type="dxa"/>
               <w:bottom w:w="60" w:type="dxa"/>
@@ -1640,7 +1720,86 @@
         </w:tc>
         <w:tc>
           <w:tcPr>
-            <w:tcW w:type="dxa" w:w="7200"/>
+            <w:tcW w:type="dxa" w:w="6768"/>
+            <w:tcMar>
+              <w:top w:w="60" w:type="dxa"/>
+              <w:bottom w:w="60" w:type="dxa"/>
+              <w:left w:w="50" w:type="dxa"/>
+              <w:right w:w="0" w:type="dxa"/>
+            </w:tcMar>
+          </w:tcPr>
+          <w:p>
+            <w:pPr>
+              <w:spacing w:before="40" w:after="40"/>
+            </w:pPr>
+            <w:r>
+              <w:rPr>
+                <w:rFonts w:ascii="Arial" w:hAnsi="Arial"/>
+                <w:b/>
+                <w:color w:val="0F172A"/>
+                <w:sz w:val="19"/>
+              </w:rPr>
+              <w:t>Sirrihat Subsea Services Sdn Bhd</w:t>
+            </w:r>
+          </w:p>
+        </w:tc>
+      </w:tr>
+      <w:tr>
+        <w:trPr>
+          <w:cantSplit/>
+        </w:trPr>
+        <w:tc>
+          <w:tcPr>
+            <w:tcW w:type="dxa" w:w="3024"/>
+            <w:tcMar>
+              <w:top w:w="60" w:type="dxa"/>
+              <w:bottom w:w="60" w:type="dxa"/>
+              <w:left w:w="0" w:type="dxa"/>
+              <w:right w:w="50" w:type="dxa"/>
+            </w:tcMar>
+          </w:tcPr>
+          <w:p>
+            <w:pPr>
+              <w:spacing w:before="40" w:after="40"/>
+            </w:pPr>
+            <w:r>
+              <w:rPr>
+                <w:rFonts w:ascii="Arial" w:hAnsi="Arial"/>
+                <w:b/>
+                <w:color w:val="475569"/>
+                <w:sz w:val="19"/>
+              </w:rPr>
+              <w:t>Project</w:t>
+            </w:r>
+          </w:p>
+        </w:tc>
+        <w:tc>
+          <w:tcPr>
+            <w:tcW w:type="dxa" w:w="288"/>
+            <w:tcMar>
+              <w:top w:w="60" w:type="dxa"/>
+              <w:bottom w:w="60" w:type="dxa"/>
+              <w:left w:w="0" w:type="dxa"/>
+              <w:right w:w="0" w:type="dxa"/>
+            </w:tcMar>
+          </w:tcPr>
+          <w:p>
+            <w:pPr>
+              <w:spacing w:before="40" w:after="40"/>
+            </w:pPr>
+            <w:r>
+              <w:rPr>
+                <w:rFonts w:ascii="Arial" w:hAnsi="Arial"/>
+                <w:color w:val="94A3B8"/>
+                <w:sz w:val="19"/>
+              </w:rPr>
+              <w:t>:</w:t>
+            </w:r>
+          </w:p>
+        </w:tc>
+        <w:tc>
+          <w:tcPr>
+            <w:tcW w:type="dxa" w:w="6768"/>
             <w:tcMar>
               <w:top w:w="60" w:type="dxa"/>
               <w:bottom w:w="60" w:type="dxa"/>
@@ -1658,6 +1817,405 @@
                 <w:color w:val="0F172A"/>
                 <w:sz w:val="19"/>
               </w:rPr>
+              <w:t>Onshore Engineering &amp; Reporting Support (Subang Jaya, Selangor, Malaysia)</w:t>
+            </w:r>
+          </w:p>
+        </w:tc>
+      </w:tr>
+      <w:tr>
+        <w:trPr>
+          <w:cantSplit/>
+        </w:trPr>
+        <w:tc>
+          <w:tcPr>
+            <w:tcW w:type="dxa" w:w="3024"/>
+            <w:tcMar>
+              <w:top w:w="60" w:type="dxa"/>
+              <w:bottom w:w="60" w:type="dxa"/>
+              <w:left w:w="0" w:type="dxa"/>
+              <w:right w:w="50" w:type="dxa"/>
+            </w:tcMar>
+          </w:tcPr>
+          <w:p>
+            <w:pPr>
+              <w:spacing w:before="40" w:after="40"/>
+            </w:pPr>
+            <w:r>
+              <w:rPr>
+                <w:rFonts w:ascii="Arial" w:hAnsi="Arial"/>
+                <w:b/>
+                <w:color w:val="475569"/>
+                <w:sz w:val="19"/>
+              </w:rPr>
+              <w:t>Duration</w:t>
+            </w:r>
+          </w:p>
+        </w:tc>
+        <w:tc>
+          <w:tcPr>
+            <w:tcW w:type="dxa" w:w="288"/>
+            <w:tcMar>
+              <w:top w:w="60" w:type="dxa"/>
+              <w:bottom w:w="60" w:type="dxa"/>
+              <w:left w:w="0" w:type="dxa"/>
+              <w:right w:w="0" w:type="dxa"/>
+            </w:tcMar>
+          </w:tcPr>
+          <w:p>
+            <w:pPr>
+              <w:spacing w:before="40" w:after="40"/>
+            </w:pPr>
+            <w:r>
+              <w:rPr>
+                <w:rFonts w:ascii="Arial" w:hAnsi="Arial"/>
+                <w:color w:val="94A3B8"/>
+                <w:sz w:val="19"/>
+              </w:rPr>
+              <w:t>:</w:t>
+            </w:r>
+          </w:p>
+        </w:tc>
+        <w:tc>
+          <w:tcPr>
+            <w:tcW w:type="dxa" w:w="6768"/>
+            <w:tcMar>
+              <w:top w:w="60" w:type="dxa"/>
+              <w:bottom w:w="60" w:type="dxa"/>
+              <w:left w:w="50" w:type="dxa"/>
+              <w:right w:w="0" w:type="dxa"/>
+            </w:tcMar>
+          </w:tcPr>
+          <w:p>
+            <w:pPr>
+              <w:spacing w:before="40" w:after="40"/>
+            </w:pPr>
+            <w:r>
+              <w:rPr>
+                <w:rFonts w:ascii="Arial" w:hAnsi="Arial"/>
+                <w:color w:val="0F172A"/>
+                <w:sz w:val="19"/>
+              </w:rPr>
+              <w:t>November 2022 – September 2023</w:t>
+            </w:r>
+          </w:p>
+        </w:tc>
+      </w:tr>
+      <w:tr>
+        <w:trPr>
+          <w:cantSplit/>
+        </w:trPr>
+        <w:tc>
+          <w:tcPr>
+            <w:tcW w:type="dxa" w:w="3024"/>
+            <w:tcMar>
+              <w:top w:w="60" w:type="dxa"/>
+              <w:bottom w:w="60" w:type="dxa"/>
+              <w:left w:w="0" w:type="dxa"/>
+              <w:right w:w="50" w:type="dxa"/>
+            </w:tcMar>
+          </w:tcPr>
+          <w:p>
+            <w:pPr>
+              <w:spacing w:before="40" w:after="40"/>
+            </w:pPr>
+            <w:r>
+              <w:rPr>
+                <w:rFonts w:ascii="Arial" w:hAnsi="Arial"/>
+                <w:b/>
+                <w:color w:val="475569"/>
+                <w:sz w:val="19"/>
+              </w:rPr>
+              <w:t>Position Title</w:t>
+            </w:r>
+          </w:p>
+        </w:tc>
+        <w:tc>
+          <w:tcPr>
+            <w:tcW w:type="dxa" w:w="288"/>
+            <w:tcMar>
+              <w:top w:w="60" w:type="dxa"/>
+              <w:bottom w:w="60" w:type="dxa"/>
+              <w:left w:w="0" w:type="dxa"/>
+              <w:right w:w="0" w:type="dxa"/>
+            </w:tcMar>
+          </w:tcPr>
+          <w:p>
+            <w:pPr>
+              <w:spacing w:before="40" w:after="40"/>
+            </w:pPr>
+            <w:r>
+              <w:rPr>
+                <w:rFonts w:ascii="Arial" w:hAnsi="Arial"/>
+                <w:color w:val="94A3B8"/>
+                <w:sz w:val="19"/>
+              </w:rPr>
+              <w:t>:</w:t>
+            </w:r>
+          </w:p>
+        </w:tc>
+        <w:tc>
+          <w:tcPr>
+            <w:tcW w:type="dxa" w:w="6768"/>
+            <w:tcMar>
+              <w:top w:w="60" w:type="dxa"/>
+              <w:bottom w:w="60" w:type="dxa"/>
+              <w:left w:w="50" w:type="dxa"/>
+              <w:right w:w="0" w:type="dxa"/>
+            </w:tcMar>
+          </w:tcPr>
+          <w:p>
+            <w:pPr>
+              <w:spacing w:before="40" w:after="40"/>
+            </w:pPr>
+            <w:r>
+              <w:rPr>
+                <w:rFonts w:ascii="Arial" w:hAnsi="Arial"/>
+                <w:color w:val="0F172A"/>
+                <w:sz w:val="19"/>
+              </w:rPr>
+              <w:t>Data QA/QC Coordinator</w:t>
+            </w:r>
+          </w:p>
+        </w:tc>
+      </w:tr>
+    </w:tbl>
+    <w:p>
+      <w:pPr>
+        <w:spacing w:before="80" w:after="40"/>
+      </w:pPr>
+      <w:r>
+        <w:rPr>
+          <w:rFonts w:ascii="Arial" w:hAnsi="Arial"/>
+          <w:b/>
+          <w:sz w:val="19"/>
+        </w:rPr>
+        <w:t>Scope/Details:</w:t>
+      </w:r>
+    </w:p>
+    <w:p>
+      <w:pPr>
+        <w:pStyle w:val="ListBullet"/>
+        <w:spacing w:before="40" w:after="60"/>
+        <w:ind w:left="504"/>
+      </w:pPr>
+      <w:r>
+        <w:rPr>
+          <w:rFonts w:ascii="Arial" w:hAnsi="Arial"/>
+          <w:b/>
+          <w:color w:val="1E293B"/>
+          <w:sz w:val="19"/>
+        </w:rPr>
+      </w:r>
+      <w:r>
+        <w:rPr>
+          <w:rFonts w:ascii="Arial" w:hAnsi="Arial"/>
+          <w:color w:val="475569"/>
+          <w:sz w:val="19"/>
+        </w:rPr>
+        <w:t>Final Reporting: Converted rough daily logs from offshore operations into polished, formal client reports.</w:t>
+      </w:r>
+    </w:p>
+    <w:p>
+      <w:pPr>
+        <w:pStyle w:val="ListBullet"/>
+        <w:spacing w:before="40" w:after="60"/>
+        <w:ind w:left="504"/>
+      </w:pPr>
+      <w:r>
+        <w:rPr>
+          <w:rFonts w:ascii="Arial" w:hAnsi="Arial"/>
+          <w:b/>
+          <w:color w:val="1E293B"/>
+          <w:sz w:val="19"/>
+        </w:rPr>
+      </w:r>
+      <w:r>
+        <w:rPr>
+          <w:rFonts w:ascii="Arial" w:hAnsi="Arial"/>
+          <w:color w:val="475569"/>
+          <w:sz w:val="19"/>
+        </w:rPr>
+        <w:t>Data QA/QC: Verified accuracy of subsea video footage, timestamps, and anomaly descriptions against physical logs.</w:t>
+      </w:r>
+    </w:p>
+    <w:p>
+      <w:pPr>
+        <w:pStyle w:val="ListBullet"/>
+        <w:spacing w:before="40" w:after="60"/>
+        <w:ind w:left="504"/>
+      </w:pPr>
+      <w:r>
+        <w:rPr>
+          <w:rFonts w:ascii="Arial" w:hAnsi="Arial"/>
+          <w:b/>
+          <w:color w:val="1E293B"/>
+          <w:sz w:val="19"/>
+        </w:rPr>
+      </w:r>
+      <w:r>
+        <w:rPr>
+          <w:rFonts w:ascii="Arial" w:hAnsi="Arial"/>
+          <w:color w:val="475569"/>
+          <w:sz w:val="19"/>
+        </w:rPr>
+        <w:t>Database Management: Uploaded validated offshore data and inspection logs into integrity software systems.</w:t>
+      </w:r>
+    </w:p>
+    <w:p>
+      <w:pPr>
+        <w:pStyle w:val="ListBullet"/>
+        <w:spacing w:before="40" w:after="60"/>
+        <w:ind w:left="504"/>
+      </w:pPr>
+      <w:r>
+        <w:rPr>
+          <w:rFonts w:ascii="Arial" w:hAnsi="Arial"/>
+          <w:b/>
+          <w:color w:val="1E293B"/>
+          <w:sz w:val="19"/>
+        </w:rPr>
+      </w:r>
+      <w:r>
+        <w:rPr>
+          <w:rFonts w:ascii="Arial" w:hAnsi="Arial"/>
+          <w:color w:val="475569"/>
+          <w:sz w:val="19"/>
+        </w:rPr>
+        <w:t>Drawing Updates: Marked up CAD and 'As-Built' drawings to reflect new subsea findings and anomalies.</w:t>
+      </w:r>
+    </w:p>
+    <w:p>
+      <w:pPr>
+        <w:pStyle w:val="ListBullet"/>
+        <w:spacing w:before="40" w:after="60"/>
+        <w:ind w:left="504"/>
+      </w:pPr>
+      <w:r>
+        <w:rPr>
+          <w:rFonts w:ascii="Arial" w:hAnsi="Arial"/>
+          <w:b/>
+          <w:color w:val="1E293B"/>
+          <w:sz w:val="19"/>
+        </w:rPr>
+      </w:r>
+      <w:r>
+        <w:rPr>
+          <w:rFonts w:ascii="Arial" w:hAnsi="Arial"/>
+          <w:color w:val="475569"/>
+          <w:sz w:val="19"/>
+        </w:rPr>
+        <w:t>Work Pack Creation: Wrote detailed, step-by-step inspection procedures and checklists for upcoming subsea campaigns.</w:t>
+      </w:r>
+    </w:p>
+    <w:p>
+      <w:pPr>
+        <w:pStyle w:val="ListBullet"/>
+        <w:spacing w:before="40" w:after="60"/>
+        <w:ind w:left="504"/>
+      </w:pPr>
+      <w:r>
+        <w:rPr>
+          <w:rFonts w:ascii="Arial" w:hAnsi="Arial"/>
+          <w:b/>
+          <w:color w:val="1E293B"/>
+          <w:sz w:val="19"/>
+        </w:rPr>
+      </w:r>
+      <w:r>
+        <w:rPr>
+          <w:rFonts w:ascii="Arial" w:hAnsi="Arial"/>
+          <w:color w:val="475569"/>
+          <w:sz w:val="19"/>
+        </w:rPr>
+        <w:t>Desktop Studies: Reviewed historical integrity reports to identify targeted areas of interest for future monitoring.</w:t>
+      </w:r>
+    </w:p>
+    <w:p/>
+    <w:tbl>
+      <w:tblPr>
+        <w:tblW w:type="auto" w:w="0"/>
+        <w:tblLayout w:type="fixed"/>
+        <w:tblLook w:firstColumn="1" w:firstRow="1" w:lastColumn="0" w:lastRow="0" w:noHBand="0" w:noVBand="1" w:val="04A0"/>
+      </w:tblPr>
+      <w:tblGrid>
+        <w:gridCol w:w="3360"/>
+        <w:gridCol w:w="3360"/>
+        <w:gridCol w:w="3360"/>
+      </w:tblGrid>
+      <w:tr>
+        <w:trPr>
+          <w:cantSplit/>
+        </w:trPr>
+        <w:tc>
+          <w:tcPr>
+            <w:tcW w:type="dxa" w:w="3024"/>
+            <w:tcMar>
+              <w:top w:w="60" w:type="dxa"/>
+              <w:bottom w:w="60" w:type="dxa"/>
+              <w:left w:w="0" w:type="dxa"/>
+              <w:right w:w="50" w:type="dxa"/>
+            </w:tcMar>
+          </w:tcPr>
+          <w:p>
+            <w:pPr>
+              <w:spacing w:before="40" w:after="40"/>
+            </w:pPr>
+            <w:r>
+              <w:rPr>
+                <w:rFonts w:ascii="Arial" w:hAnsi="Arial"/>
+                <w:b/>
+                <w:color w:val="475569"/>
+                <w:sz w:val="19"/>
+              </w:rPr>
+              <w:t>Company</w:t>
+            </w:r>
+          </w:p>
+        </w:tc>
+        <w:tc>
+          <w:tcPr>
+            <w:tcW w:type="dxa" w:w="288"/>
+            <w:tcMar>
+              <w:top w:w="60" w:type="dxa"/>
+              <w:bottom w:w="60" w:type="dxa"/>
+              <w:left w:w="0" w:type="dxa"/>
+              <w:right w:w="0" w:type="dxa"/>
+            </w:tcMar>
+          </w:tcPr>
+          <w:p>
+            <w:pPr>
+              <w:spacing w:before="40" w:after="40"/>
+            </w:pPr>
+            <w:r>
+              <w:rPr>
+                <w:rFonts w:ascii="Arial" w:hAnsi="Arial"/>
+                <w:color w:val="94A3B8"/>
+                <w:sz w:val="19"/>
+              </w:rPr>
+              <w:t>:</w:t>
+            </w:r>
+          </w:p>
+        </w:tc>
+        <w:tc>
+          <w:tcPr>
+            <w:tcW w:type="dxa" w:w="6768"/>
+            <w:tcMar>
+              <w:top w:w="60" w:type="dxa"/>
+              <w:bottom w:w="60" w:type="dxa"/>
+              <w:left w:w="50" w:type="dxa"/>
+              <w:right w:w="0" w:type="dxa"/>
+            </w:tcMar>
+          </w:tcPr>
+          <w:p>
+            <w:pPr>
+              <w:spacing w:before="40" w:after="40"/>
+            </w:pPr>
+            <w:r>
+              <w:rPr>
+                <w:rFonts w:ascii="Arial" w:hAnsi="Arial"/>
+                <w:b/>
+                <w:color w:val="0F172A"/>
+                <w:sz w:val="19"/>
+              </w:rPr>
               <w:t>Sapura Subsea Services Sdn Bhd</w:t>
             </w:r>
           </w:p>
@@ -1669,7 +2227,7 @@
         </w:trPr>
         <w:tc>
           <w:tcPr>
-            <w:tcW w:type="dxa" w:w="2592"/>
+            <w:tcW w:type="dxa" w:w="3024"/>
             <w:tcMar>
               <w:top w:w="60" w:type="dxa"/>
               <w:bottom w:w="60" w:type="dxa"/>
@@ -1718,7 +2276,7 @@
         </w:tc>
         <w:tc>
           <w:tcPr>
-            <w:tcW w:type="dxa" w:w="7200"/>
+            <w:tcW w:type="dxa" w:w="6768"/>
             <w:tcMar>
               <w:top w:w="60" w:type="dxa"/>
               <w:bottom w:w="60" w:type="dxa"/>
@@ -1747,7 +2305,7 @@
         </w:trPr>
         <w:tc>
           <w:tcPr>
-            <w:tcW w:type="dxa" w:w="2592"/>
+            <w:tcW w:type="dxa" w:w="3024"/>
             <w:tcMar>
               <w:top w:w="60" w:type="dxa"/>
               <w:bottom w:w="60" w:type="dxa"/>
@@ -1796,7 +2354,7 @@
         </w:tc>
         <w:tc>
           <w:tcPr>
-            <w:tcW w:type="dxa" w:w="7200"/>
+            <w:tcW w:type="dxa" w:w="6768"/>
             <w:tcMar>
               <w:top w:w="60" w:type="dxa"/>
               <w:bottom w:w="60" w:type="dxa"/>
@@ -1825,7 +2383,7 @@
         </w:trPr>
         <w:tc>
           <w:tcPr>
-            <w:tcW w:type="dxa" w:w="2592"/>
+            <w:tcW w:type="dxa" w:w="3024"/>
             <w:tcMar>
               <w:top w:w="60" w:type="dxa"/>
               <w:bottom w:w="60" w:type="dxa"/>
@@ -1874,7 +2432,7 @@
         </w:tc>
         <w:tc>
           <w:tcPr>
-            <w:tcW w:type="dxa" w:w="7200"/>
+            <w:tcW w:type="dxa" w:w="6768"/>
             <w:tcMar>
               <w:top w:w="60" w:type="dxa"/>
               <w:bottom w:w="60" w:type="dxa"/>
@@ -1903,7 +2461,7 @@
         </w:trPr>
         <w:tc>
           <w:tcPr>
-            <w:tcW w:type="dxa" w:w="2592"/>
+            <w:tcW w:type="dxa" w:w="3024"/>
             <w:tcMar>
               <w:top w:w="60" w:type="dxa"/>
               <w:bottom w:w="60" w:type="dxa"/>
@@ -1952,7 +2510,7 @@
         </w:tc>
         <w:tc>
           <w:tcPr>
-            <w:tcW w:type="dxa" w:w="7200"/>
+            <w:tcW w:type="dxa" w:w="6768"/>
             <w:tcMar>
               <w:top w:w="60" w:type="dxa"/>
               <w:bottom w:w="60" w:type="dxa"/>
@@ -2076,7 +2634,7 @@
         </w:trPr>
         <w:tc>
           <w:tcPr>
-            <w:tcW w:type="dxa" w:w="2592"/>
+            <w:tcW w:type="dxa" w:w="3024"/>
             <w:tcMar>
               <w:top w:w="60" w:type="dxa"/>
               <w:bottom w:w="60" w:type="dxa"/>
@@ -2125,7 +2683,7 @@
         </w:tc>
         <w:tc>
           <w:tcPr>
-            <w:tcW w:type="dxa" w:w="7200"/>
+            <w:tcW w:type="dxa" w:w="6768"/>
             <w:tcMar>
               <w:top w:w="60" w:type="dxa"/>
               <w:bottom w:w="60" w:type="dxa"/>
@@ -2140,6 +2698,7 @@
             <w:r>
               <w:rPr>
                 <w:rFonts w:ascii="Arial" w:hAnsi="Arial"/>
+                <w:b/>
                 <w:color w:val="0F172A"/>
                 <w:sz w:val="19"/>
               </w:rPr>
@@ -2154,7 +2713,7 @@
         </w:trPr>
         <w:tc>
           <w:tcPr>
-            <w:tcW w:type="dxa" w:w="2592"/>
+            <w:tcW w:type="dxa" w:w="3024"/>
             <w:tcMar>
               <w:top w:w="60" w:type="dxa"/>
               <w:bottom w:w="60" w:type="dxa"/>
@@ -2203,7 +2762,7 @@
         </w:tc>
         <w:tc>
           <w:tcPr>
-            <w:tcW w:type="dxa" w:w="7200"/>
+            <w:tcW w:type="dxa" w:w="6768"/>
             <w:tcMar>
               <w:top w:w="60" w:type="dxa"/>
               <w:bottom w:w="60" w:type="dxa"/>
@@ -2232,7 +2791,7 @@
         </w:trPr>
         <w:tc>
           <w:tcPr>
-            <w:tcW w:type="dxa" w:w="2592"/>
+            <w:tcW w:type="dxa" w:w="3024"/>
             <w:tcMar>
               <w:top w:w="60" w:type="dxa"/>
               <w:bottom w:w="60" w:type="dxa"/>
@@ -2281,7 +2840,7 @@
         </w:tc>
         <w:tc>
           <w:tcPr>
-            <w:tcW w:type="dxa" w:w="7200"/>
+            <w:tcW w:type="dxa" w:w="6768"/>
             <w:tcMar>
               <w:top w:w="60" w:type="dxa"/>
               <w:bottom w:w="60" w:type="dxa"/>
@@ -2310,7 +2869,7 @@
         </w:trPr>
         <w:tc>
           <w:tcPr>
-            <w:tcW w:type="dxa" w:w="2592"/>
+            <w:tcW w:type="dxa" w:w="3024"/>
             <w:tcMar>
               <w:top w:w="60" w:type="dxa"/>
               <w:bottom w:w="60" w:type="dxa"/>
@@ -2359,7 +2918,7 @@
         </w:tc>
         <w:tc>
           <w:tcPr>
-            <w:tcW w:type="dxa" w:w="7200"/>
+            <w:tcW w:type="dxa" w:w="6768"/>
             <w:tcMar>
               <w:top w:w="60" w:type="dxa"/>
               <w:bottom w:w="60" w:type="dxa"/>
@@ -2388,7 +2947,7 @@
         </w:trPr>
         <w:tc>
           <w:tcPr>
-            <w:tcW w:type="dxa" w:w="2592"/>
+            <w:tcW w:type="dxa" w:w="3024"/>
             <w:tcMar>
               <w:top w:w="60" w:type="dxa"/>
               <w:bottom w:w="60" w:type="dxa"/>
@@ -2437,7 +2996,7 @@
         </w:tc>
         <w:tc>
           <w:tcPr>
-            <w:tcW w:type="dxa" w:w="7200"/>
+            <w:tcW w:type="dxa" w:w="6768"/>
             <w:tcMar>
               <w:top w:w="60" w:type="dxa"/>
               <w:bottom w:w="60" w:type="dxa"/>
@@ -2466,7 +3025,7 @@
         </w:trPr>
         <w:tc>
           <w:tcPr>
-            <w:tcW w:type="dxa" w:w="2592"/>
+            <w:tcW w:type="dxa" w:w="3024"/>
             <w:tcMar>
               <w:top w:w="60" w:type="dxa"/>
               <w:bottom w:w="60" w:type="dxa"/>
@@ -2515,7 +3074,7 @@
         </w:tc>
         <w:tc>
           <w:tcPr>
-            <w:tcW w:type="dxa" w:w="7200"/>
+            <w:tcW w:type="dxa" w:w="6768"/>
             <w:tcMar>
               <w:top w:w="60" w:type="dxa"/>
               <w:bottom w:w="60" w:type="dxa"/>
@@ -2616,7 +3175,7 @@
         </w:trPr>
         <w:tc>
           <w:tcPr>
-            <w:tcW w:type="dxa" w:w="2592"/>
+            <w:tcW w:type="dxa" w:w="3024"/>
             <w:tcMar>
               <w:top w:w="60" w:type="dxa"/>
               <w:bottom w:w="60" w:type="dxa"/>
@@ -2665,7 +3224,7 @@
         </w:tc>
         <w:tc>
           <w:tcPr>
-            <w:tcW w:type="dxa" w:w="7200"/>
+            <w:tcW w:type="dxa" w:w="6768"/>
             <w:tcMar>
               <w:top w:w="60" w:type="dxa"/>
               <w:bottom w:w="60" w:type="dxa"/>
@@ -2680,6 +3239,7 @@
             <w:r>
               <w:rPr>
                 <w:rFonts w:ascii="Arial" w:hAnsi="Arial"/>
+                <w:b/>
                 <w:color w:val="0F172A"/>
                 <w:sz w:val="19"/>
               </w:rPr>
@@ -2694,7 +3254,7 @@
         </w:trPr>
         <w:tc>
           <w:tcPr>
-            <w:tcW w:type="dxa" w:w="2592"/>
+            <w:tcW w:type="dxa" w:w="3024"/>
             <w:tcMar>
               <w:top w:w="60" w:type="dxa"/>
               <w:bottom w:w="60" w:type="dxa"/>
@@ -2743,7 +3303,7 @@
         </w:tc>
         <w:tc>
           <w:tcPr>
-            <w:tcW w:type="dxa" w:w="7200"/>
+            <w:tcW w:type="dxa" w:w="6768"/>
             <w:tcMar>
               <w:top w:w="60" w:type="dxa"/>
               <w:bottom w:w="60" w:type="dxa"/>
@@ -2772,7 +3332,7 @@
         </w:trPr>
         <w:tc>
           <w:tcPr>
-            <w:tcW w:type="dxa" w:w="2592"/>
+            <w:tcW w:type="dxa" w:w="3024"/>
             <w:tcMar>
               <w:top w:w="60" w:type="dxa"/>
               <w:bottom w:w="60" w:type="dxa"/>
@@ -2821,7 +3381,7 @@
         </w:tc>
         <w:tc>
           <w:tcPr>
-            <w:tcW w:type="dxa" w:w="7200"/>
+            <w:tcW w:type="dxa" w:w="6768"/>
             <w:tcMar>
               <w:top w:w="60" w:type="dxa"/>
               <w:bottom w:w="60" w:type="dxa"/>
@@ -2850,7 +3410,7 @@
         </w:trPr>
         <w:tc>
           <w:tcPr>
-            <w:tcW w:type="dxa" w:w="2592"/>
+            <w:tcW w:type="dxa" w:w="3024"/>
             <w:tcMar>
               <w:top w:w="60" w:type="dxa"/>
               <w:bottom w:w="60" w:type="dxa"/>
@@ -2899,7 +3459,7 @@
         </w:tc>
         <w:tc>
           <w:tcPr>
-            <w:tcW w:type="dxa" w:w="7200"/>
+            <w:tcW w:type="dxa" w:w="6768"/>
             <w:tcMar>
               <w:top w:w="60" w:type="dxa"/>
               <w:bottom w:w="60" w:type="dxa"/>
@@ -2928,7 +3488,7 @@
         </w:trPr>
         <w:tc>
           <w:tcPr>
-            <w:tcW w:type="dxa" w:w="2592"/>
+            <w:tcW w:type="dxa" w:w="3024"/>
             <w:tcMar>
               <w:top w:w="60" w:type="dxa"/>
               <w:bottom w:w="60" w:type="dxa"/>
@@ -2977,7 +3537,7 @@
         </w:tc>
         <w:tc>
           <w:tcPr>
-            <w:tcW w:type="dxa" w:w="7200"/>
+            <w:tcW w:type="dxa" w:w="6768"/>
             <w:tcMar>
               <w:top w:w="60" w:type="dxa"/>
               <w:bottom w:w="60" w:type="dxa"/>
@@ -3006,7 +3566,7 @@
         </w:trPr>
         <w:tc>
           <w:tcPr>
-            <w:tcW w:type="dxa" w:w="2592"/>
+            <w:tcW w:type="dxa" w:w="3024"/>
             <w:tcMar>
               <w:top w:w="60" w:type="dxa"/>
               <w:bottom w:w="60" w:type="dxa"/>
@@ -3055,7 +3615,7 @@
         </w:tc>
         <w:tc>
           <w:tcPr>
-            <w:tcW w:type="dxa" w:w="7200"/>
+            <w:tcW w:type="dxa" w:w="6768"/>
             <w:tcMar>
               <w:top w:w="60" w:type="dxa"/>
               <w:bottom w:w="60" w:type="dxa"/>
@@ -3156,7 +3716,7 @@
         </w:trPr>
         <w:tc>
           <w:tcPr>
-            <w:tcW w:type="dxa" w:w="2592"/>
+            <w:tcW w:type="dxa" w:w="3024"/>
             <w:tcMar>
               <w:top w:w="60" w:type="dxa"/>
               <w:bottom w:w="60" w:type="dxa"/>
@@ -3205,7 +3765,7 @@
         </w:tc>
         <w:tc>
           <w:tcPr>
-            <w:tcW w:type="dxa" w:w="7200"/>
+            <w:tcW w:type="dxa" w:w="6768"/>
             <w:tcMar>
               <w:top w:w="60" w:type="dxa"/>
               <w:bottom w:w="60" w:type="dxa"/>
@@ -3220,6 +3780,7 @@
             <w:r>
               <w:rPr>
                 <w:rFonts w:ascii="Arial" w:hAnsi="Arial"/>
+                <w:b/>
                 <w:color w:val="0F172A"/>
                 <w:sz w:val="19"/>
               </w:rPr>
@@ -3234,7 +3795,7 @@
         </w:trPr>
         <w:tc>
           <w:tcPr>
-            <w:tcW w:type="dxa" w:w="2592"/>
+            <w:tcW w:type="dxa" w:w="3024"/>
             <w:tcMar>
               <w:top w:w="60" w:type="dxa"/>
               <w:bottom w:w="60" w:type="dxa"/>
@@ -3283,7 +3844,7 @@
         </w:tc>
         <w:tc>
           <w:tcPr>
-            <w:tcW w:type="dxa" w:w="7200"/>
+            <w:tcW w:type="dxa" w:w="6768"/>
             <w:tcMar>
               <w:top w:w="60" w:type="dxa"/>
               <w:bottom w:w="60" w:type="dxa"/>
@@ -3312,7 +3873,7 @@
         </w:trPr>
         <w:tc>
           <w:tcPr>
-            <w:tcW w:type="dxa" w:w="2592"/>
+            <w:tcW w:type="dxa" w:w="3024"/>
             <w:tcMar>
               <w:top w:w="60" w:type="dxa"/>
               <w:bottom w:w="60" w:type="dxa"/>
@@ -3361,7 +3922,7 @@
         </w:tc>
         <w:tc>
           <w:tcPr>
-            <w:tcW w:type="dxa" w:w="7200"/>
+            <w:tcW w:type="dxa" w:w="6768"/>
             <w:tcMar>
               <w:top w:w="60" w:type="dxa"/>
               <w:bottom w:w="60" w:type="dxa"/>
@@ -3390,7 +3951,7 @@
         </w:trPr>
         <w:tc>
           <w:tcPr>
-            <w:tcW w:type="dxa" w:w="2592"/>
+            <w:tcW w:type="dxa" w:w="3024"/>
             <w:tcMar>
               <w:top w:w="60" w:type="dxa"/>
               <w:bottom w:w="60" w:type="dxa"/>
@@ -3439,7 +4000,7 @@
         </w:tc>
         <w:tc>
           <w:tcPr>
-            <w:tcW w:type="dxa" w:w="7200"/>
+            <w:tcW w:type="dxa" w:w="6768"/>
             <w:tcMar>
               <w:top w:w="60" w:type="dxa"/>
               <w:bottom w:w="60" w:type="dxa"/>
@@ -3468,7 +4029,7 @@
         </w:trPr>
         <w:tc>
           <w:tcPr>
-            <w:tcW w:type="dxa" w:w="2592"/>
+            <w:tcW w:type="dxa" w:w="3024"/>
             <w:tcMar>
               <w:top w:w="60" w:type="dxa"/>
               <w:bottom w:w="60" w:type="dxa"/>
@@ -3517,7 +4078,7 @@
         </w:tc>
         <w:tc>
           <w:tcPr>
-            <w:tcW w:type="dxa" w:w="7200"/>
+            <w:tcW w:type="dxa" w:w="6768"/>
             <w:tcMar>
               <w:top w:w="60" w:type="dxa"/>
               <w:bottom w:w="60" w:type="dxa"/>
@@ -3546,7 +4107,7 @@
         </w:trPr>
         <w:tc>
           <w:tcPr>
-            <w:tcW w:type="dxa" w:w="2592"/>
+            <w:tcW w:type="dxa" w:w="3024"/>
             <w:tcMar>
               <w:top w:w="60" w:type="dxa"/>
               <w:bottom w:w="60" w:type="dxa"/>
@@ -3595,7 +4156,7 @@
         </w:tc>
         <w:tc>
           <w:tcPr>
-            <w:tcW w:type="dxa" w:w="7200"/>
+            <w:tcW w:type="dxa" w:w="6768"/>
             <w:tcMar>
               <w:top w:w="60" w:type="dxa"/>
               <w:bottom w:w="60" w:type="dxa"/>
@@ -3719,7 +4280,7 @@
         </w:trPr>
         <w:tc>
           <w:tcPr>
-            <w:tcW w:type="dxa" w:w="2592"/>
+            <w:tcW w:type="dxa" w:w="3024"/>
             <w:tcMar>
               <w:top w:w="60" w:type="dxa"/>
               <w:bottom w:w="60" w:type="dxa"/>
@@ -3768,7 +4329,7 @@
         </w:tc>
         <w:tc>
           <w:tcPr>
-            <w:tcW w:type="dxa" w:w="7200"/>
+            <w:tcW w:type="dxa" w:w="6768"/>
             <w:tcMar>
               <w:top w:w="60" w:type="dxa"/>
               <w:bottom w:w="60" w:type="dxa"/>
@@ -3783,6 +4344,7 @@
             <w:r>
               <w:rPr>
                 <w:rFonts w:ascii="Arial" w:hAnsi="Arial"/>
+                <w:b/>
                 <w:color w:val="0F172A"/>
                 <w:sz w:val="19"/>
               </w:rPr>
@@ -3797,7 +4359,7 @@
         </w:trPr>
         <w:tc>
           <w:tcPr>
-            <w:tcW w:type="dxa" w:w="2592"/>
+            <w:tcW w:type="dxa" w:w="3024"/>
             <w:tcMar>
               <w:top w:w="60" w:type="dxa"/>
               <w:bottom w:w="60" w:type="dxa"/>
@@ -3846,7 +4408,7 @@
         </w:tc>
         <w:tc>
           <w:tcPr>
-            <w:tcW w:type="dxa" w:w="7200"/>
+            <w:tcW w:type="dxa" w:w="6768"/>
             <w:tcMar>
               <w:top w:w="60" w:type="dxa"/>
               <w:bottom w:w="60" w:type="dxa"/>
@@ -3875,7 +4437,7 @@
         </w:trPr>
         <w:tc>
           <w:tcPr>
-            <w:tcW w:type="dxa" w:w="2592"/>
+            <w:tcW w:type="dxa" w:w="3024"/>
             <w:tcMar>
               <w:top w:w="60" w:type="dxa"/>
               <w:bottom w:w="60" w:type="dxa"/>
@@ -3924,7 +4486,7 @@
         </w:tc>
         <w:tc>
           <w:tcPr>
-            <w:tcW w:type="dxa" w:w="7200"/>
+            <w:tcW w:type="dxa" w:w="6768"/>
             <w:tcMar>
               <w:top w:w="60" w:type="dxa"/>
               <w:bottom w:w="60" w:type="dxa"/>
@@ -3953,7 +4515,7 @@
         </w:trPr>
         <w:tc>
           <w:tcPr>
-            <w:tcW w:type="dxa" w:w="2592"/>
+            <w:tcW w:type="dxa" w:w="3024"/>
             <w:tcMar>
               <w:top w:w="60" w:type="dxa"/>
               <w:bottom w:w="60" w:type="dxa"/>
@@ -4002,7 +4564,7 @@
         </w:tc>
         <w:tc>
           <w:tcPr>
-            <w:tcW w:type="dxa" w:w="7200"/>
+            <w:tcW w:type="dxa" w:w="6768"/>
             <w:tcMar>
               <w:top w:w="60" w:type="dxa"/>
               <w:bottom w:w="60" w:type="dxa"/>
@@ -4031,7 +4593,7 @@
         </w:trPr>
         <w:tc>
           <w:tcPr>
-            <w:tcW w:type="dxa" w:w="2592"/>
+            <w:tcW w:type="dxa" w:w="3024"/>
             <w:tcMar>
               <w:top w:w="60" w:type="dxa"/>
               <w:bottom w:w="60" w:type="dxa"/>
@@ -4080,7 +4642,7 @@
         </w:tc>
         <w:tc>
           <w:tcPr>
-            <w:tcW w:type="dxa" w:w="7200"/>
+            <w:tcW w:type="dxa" w:w="6768"/>
             <w:tcMar>
               <w:top w:w="60" w:type="dxa"/>
               <w:bottom w:w="60" w:type="dxa"/>
@@ -4108,7 +4670,7 @@
         </w:trPr>
         <w:tc>
           <w:tcPr>
-            <w:tcW w:type="dxa" w:w="2592"/>
+            <w:tcW w:type="dxa" w:w="3024"/>
             <w:tcMar>
               <w:top w:w="60" w:type="dxa"/>
               <w:bottom w:w="60" w:type="dxa"/>
@@ -4157,7 +4719,7 @@
         </w:tc>
         <w:tc>
           <w:tcPr>
-            <w:tcW w:type="dxa" w:w="7200"/>
+            <w:tcW w:type="dxa" w:w="6768"/>
             <w:tcMar>
               <w:top w:w="60" w:type="dxa"/>
               <w:bottom w:w="60" w:type="dxa"/>
@@ -4281,7 +4843,7 @@
         </w:trPr>
         <w:tc>
           <w:tcPr>
-            <w:tcW w:type="dxa" w:w="2592"/>
+            <w:tcW w:type="dxa" w:w="3024"/>
             <w:tcMar>
               <w:top w:w="60" w:type="dxa"/>
               <w:bottom w:w="60" w:type="dxa"/>
@@ -4330,7 +4892,7 @@
         </w:tc>
         <w:tc>
           <w:tcPr>
-            <w:tcW w:type="dxa" w:w="7200"/>
+            <w:tcW w:type="dxa" w:w="6768"/>
             <w:tcMar>
               <w:top w:w="60" w:type="dxa"/>
               <w:bottom w:w="60" w:type="dxa"/>
@@ -4345,6 +4907,7 @@
             <w:r>
               <w:rPr>
                 <w:rFonts w:ascii="Arial" w:hAnsi="Arial"/>
+                <w:b/>
                 <w:color w:val="0F172A"/>
                 <w:sz w:val="19"/>
               </w:rPr>
@@ -4359,7 +4922,7 @@
         </w:trPr>
         <w:tc>
           <w:tcPr>
-            <w:tcW w:type="dxa" w:w="2592"/>
+            <w:tcW w:type="dxa" w:w="3024"/>
             <w:tcMar>
               <w:top w:w="60" w:type="dxa"/>
               <w:bottom w:w="60" w:type="dxa"/>
@@ -4408,7 +4971,7 @@
         </w:tc>
         <w:tc>
           <w:tcPr>
-            <w:tcW w:type="dxa" w:w="7200"/>
+            <w:tcW w:type="dxa" w:w="6768"/>
             <w:tcMar>
               <w:top w:w="60" w:type="dxa"/>
               <w:bottom w:w="60" w:type="dxa"/>
@@ -4437,7 +5000,7 @@
         </w:trPr>
         <w:tc>
           <w:tcPr>
-            <w:tcW w:type="dxa" w:w="2592"/>
+            <w:tcW w:type="dxa" w:w="3024"/>
             <w:tcMar>
               <w:top w:w="60" w:type="dxa"/>
               <w:bottom w:w="60" w:type="dxa"/>
@@ -4486,7 +5049,7 @@
         </w:tc>
         <w:tc>
           <w:tcPr>
-            <w:tcW w:type="dxa" w:w="7200"/>
+            <w:tcW w:type="dxa" w:w="6768"/>
             <w:tcMar>
               <w:top w:w="60" w:type="dxa"/>
               <w:bottom w:w="60" w:type="dxa"/>
@@ -4515,7 +5078,7 @@
         </w:trPr>
         <w:tc>
           <w:tcPr>
-            <w:tcW w:type="dxa" w:w="2592"/>
+            <w:tcW w:type="dxa" w:w="3024"/>
             <w:tcMar>
               <w:top w:w="60" w:type="dxa"/>
               <w:bottom w:w="60" w:type="dxa"/>
@@ -4564,7 +5127,7 @@
         </w:tc>
         <w:tc>
           <w:tcPr>
-            <w:tcW w:type="dxa" w:w="7200"/>
+            <w:tcW w:type="dxa" w:w="6768"/>
             <w:tcMar>
               <w:top w:w="60" w:type="dxa"/>
               <w:bottom w:w="60" w:type="dxa"/>
@@ -4593,7 +5156,7 @@
         </w:trPr>
         <w:tc>
           <w:tcPr>
-            <w:tcW w:type="dxa" w:w="2592"/>
+            <w:tcW w:type="dxa" w:w="3024"/>
             <w:tcMar>
               <w:top w:w="60" w:type="dxa"/>
               <w:bottom w:w="60" w:type="dxa"/>
@@ -4642,7 +5205,7 @@
         </w:tc>
         <w:tc>
           <w:tcPr>
-            <w:tcW w:type="dxa" w:w="7200"/>
+            <w:tcW w:type="dxa" w:w="6768"/>
             <w:tcMar>
               <w:top w:w="60" w:type="dxa"/>
               <w:bottom w:w="60" w:type="dxa"/>
@@ -4671,7 +5234,7 @@
         </w:trPr>
         <w:tc>
           <w:tcPr>
-            <w:tcW w:type="dxa" w:w="2592"/>
+            <w:tcW w:type="dxa" w:w="3024"/>
             <w:tcMar>
               <w:top w:w="60" w:type="dxa"/>
               <w:bottom w:w="60" w:type="dxa"/>
@@ -4720,7 +5283,7 @@
         </w:tc>
         <w:tc>
           <w:tcPr>
-            <w:tcW w:type="dxa" w:w="7200"/>
+            <w:tcW w:type="dxa" w:w="6768"/>
             <w:tcMar>
               <w:top w:w="60" w:type="dxa"/>
               <w:bottom w:w="60" w:type="dxa"/>
@@ -4867,7 +5430,7 @@
         </w:trPr>
         <w:tc>
           <w:tcPr>
-            <w:tcW w:type="dxa" w:w="2592"/>
+            <w:tcW w:type="dxa" w:w="3024"/>
             <w:tcMar>
               <w:top w:w="60" w:type="dxa"/>
               <w:bottom w:w="60" w:type="dxa"/>
@@ -4916,7 +5479,7 @@
         </w:tc>
         <w:tc>
           <w:tcPr>
-            <w:tcW w:type="dxa" w:w="7200"/>
+            <w:tcW w:type="dxa" w:w="6768"/>
             <w:tcMar>
               <w:top w:w="60" w:type="dxa"/>
               <w:bottom w:w="60" w:type="dxa"/>
@@ -4931,6 +5494,7 @@
             <w:r>
               <w:rPr>
                 <w:rFonts w:ascii="Arial" w:hAnsi="Arial"/>
+                <w:b/>
                 <w:color w:val="0F172A"/>
                 <w:sz w:val="19"/>
               </w:rPr>
@@ -4945,7 +5509,7 @@
         </w:trPr>
         <w:tc>
           <w:tcPr>
-            <w:tcW w:type="dxa" w:w="2592"/>
+            <w:tcW w:type="dxa" w:w="3024"/>
             <w:tcMar>
               <w:top w:w="60" w:type="dxa"/>
               <w:bottom w:w="60" w:type="dxa"/>
@@ -4994,7 +5558,7 @@
         </w:tc>
         <w:tc>
           <w:tcPr>
-            <w:tcW w:type="dxa" w:w="7200"/>
+            <w:tcW w:type="dxa" w:w="6768"/>
             <w:tcMar>
               <w:top w:w="60" w:type="dxa"/>
               <w:bottom w:w="60" w:type="dxa"/>
@@ -5023,7 +5587,7 @@
         </w:trPr>
         <w:tc>
           <w:tcPr>
-            <w:tcW w:type="dxa" w:w="2592"/>
+            <w:tcW w:type="dxa" w:w="3024"/>
             <w:tcMar>
               <w:top w:w="60" w:type="dxa"/>
               <w:bottom w:w="60" w:type="dxa"/>
@@ -5072,7 +5636,7 @@
         </w:tc>
         <w:tc>
           <w:tcPr>
-            <w:tcW w:type="dxa" w:w="7200"/>
+            <w:tcW w:type="dxa" w:w="6768"/>
             <w:tcMar>
               <w:top w:w="60" w:type="dxa"/>
               <w:bottom w:w="60" w:type="dxa"/>
@@ -5101,7 +5665,7 @@
         </w:trPr>
         <w:tc>
           <w:tcPr>
-            <w:tcW w:type="dxa" w:w="2592"/>
+            <w:tcW w:type="dxa" w:w="3024"/>
             <w:tcMar>
               <w:top w:w="60" w:type="dxa"/>
               <w:bottom w:w="60" w:type="dxa"/>
@@ -5150,7 +5714,7 @@
         </w:tc>
         <w:tc>
           <w:tcPr>
-            <w:tcW w:type="dxa" w:w="7200"/>
+            <w:tcW w:type="dxa" w:w="6768"/>
             <w:tcMar>
               <w:top w:w="60" w:type="dxa"/>
               <w:bottom w:w="60" w:type="dxa"/>
@@ -5179,7 +5743,7 @@
         </w:trPr>
         <w:tc>
           <w:tcPr>
-            <w:tcW w:type="dxa" w:w="2592"/>
+            <w:tcW w:type="dxa" w:w="3024"/>
             <w:tcMar>
               <w:top w:w="60" w:type="dxa"/>
               <w:bottom w:w="60" w:type="dxa"/>
@@ -5228,7 +5792,7 @@
         </w:tc>
         <w:tc>
           <w:tcPr>
-            <w:tcW w:type="dxa" w:w="7200"/>
+            <w:tcW w:type="dxa" w:w="6768"/>
             <w:tcMar>
               <w:top w:w="60" w:type="dxa"/>
               <w:bottom w:w="60" w:type="dxa"/>
@@ -5257,7 +5821,7 @@
         </w:trPr>
         <w:tc>
           <w:tcPr>
-            <w:tcW w:type="dxa" w:w="2592"/>
+            <w:tcW w:type="dxa" w:w="3024"/>
             <w:tcMar>
               <w:top w:w="60" w:type="dxa"/>
               <w:bottom w:w="60" w:type="dxa"/>
@@ -5306,7 +5870,7 @@
         </w:tc>
         <w:tc>
           <w:tcPr>
-            <w:tcW w:type="dxa" w:w="7200"/>
+            <w:tcW w:type="dxa" w:w="6768"/>
             <w:tcMar>
               <w:top w:w="60" w:type="dxa"/>
               <w:bottom w:w="60" w:type="dxa"/>
@@ -5430,7 +5994,7 @@
         </w:trPr>
         <w:tc>
           <w:tcPr>
-            <w:tcW w:type="dxa" w:w="2592"/>
+            <w:tcW w:type="dxa" w:w="3024"/>
             <w:tcMar>
               <w:top w:w="60" w:type="dxa"/>
               <w:bottom w:w="60" w:type="dxa"/>
@@ -5479,7 +6043,7 @@
         </w:tc>
         <w:tc>
           <w:tcPr>
-            <w:tcW w:type="dxa" w:w="7200"/>
+            <w:tcW w:type="dxa" w:w="6768"/>
             <w:tcMar>
               <w:top w:w="60" w:type="dxa"/>
               <w:bottom w:w="60" w:type="dxa"/>
@@ -5494,6 +6058,7 @@
             <w:r>
               <w:rPr>
                 <w:rFonts w:ascii="Arial" w:hAnsi="Arial"/>
+                <w:b/>
                 <w:color w:val="0F172A"/>
                 <w:sz w:val="19"/>
               </w:rPr>
@@ -5508,7 +6073,7 @@
         </w:trPr>
         <w:tc>
           <w:tcPr>
-            <w:tcW w:type="dxa" w:w="2592"/>
+            <w:tcW w:type="dxa" w:w="3024"/>
             <w:tcMar>
               <w:top w:w="60" w:type="dxa"/>
               <w:bottom w:w="60" w:type="dxa"/>
@@ -5557,7 +6122,7 @@
         </w:tc>
         <w:tc>
           <w:tcPr>
-            <w:tcW w:type="dxa" w:w="7200"/>
+            <w:tcW w:type="dxa" w:w="6768"/>
             <w:tcMar>
               <w:top w:w="60" w:type="dxa"/>
               <w:bottom w:w="60" w:type="dxa"/>
@@ -5586,7 +6151,7 @@
         </w:trPr>
         <w:tc>
           <w:tcPr>
-            <w:tcW w:type="dxa" w:w="2592"/>
+            <w:tcW w:type="dxa" w:w="3024"/>
             <w:tcMar>
               <w:top w:w="60" w:type="dxa"/>
               <w:bottom w:w="60" w:type="dxa"/>
@@ -5635,7 +6200,7 @@
         </w:tc>
         <w:tc>
           <w:tcPr>
-            <w:tcW w:type="dxa" w:w="7200"/>
+            <w:tcW w:type="dxa" w:w="6768"/>
             <w:tcMar>
               <w:top w:w="60" w:type="dxa"/>
               <w:bottom w:w="60" w:type="dxa"/>
@@ -5664,7 +6229,7 @@
         </w:trPr>
         <w:tc>
           <w:tcPr>
-            <w:tcW w:type="dxa" w:w="2592"/>
+            <w:tcW w:type="dxa" w:w="3024"/>
             <w:tcMar>
               <w:top w:w="60" w:type="dxa"/>
               <w:bottom w:w="60" w:type="dxa"/>
@@ -5713,7 +6278,7 @@
         </w:tc>
         <w:tc>
           <w:tcPr>
-            <w:tcW w:type="dxa" w:w="7200"/>
+            <w:tcW w:type="dxa" w:w="6768"/>
             <w:tcMar>
               <w:top w:w="60" w:type="dxa"/>
               <w:bottom w:w="60" w:type="dxa"/>
@@ -5742,7 +6307,7 @@
         </w:trPr>
         <w:tc>
           <w:tcPr>
-            <w:tcW w:type="dxa" w:w="2592"/>
+            <w:tcW w:type="dxa" w:w="3024"/>
             <w:tcMar>
               <w:top w:w="60" w:type="dxa"/>
               <w:bottom w:w="60" w:type="dxa"/>
@@ -5791,7 +6356,7 @@
         </w:tc>
         <w:tc>
           <w:tcPr>
-            <w:tcW w:type="dxa" w:w="7200"/>
+            <w:tcW w:type="dxa" w:w="6768"/>
             <w:tcMar>
               <w:top w:w="60" w:type="dxa"/>
               <w:bottom w:w="60" w:type="dxa"/>
@@ -5820,7 +6385,7 @@
         </w:trPr>
         <w:tc>
           <w:tcPr>
-            <w:tcW w:type="dxa" w:w="2592"/>
+            <w:tcW w:type="dxa" w:w="3024"/>
             <w:tcMar>
               <w:top w:w="60" w:type="dxa"/>
               <w:bottom w:w="60" w:type="dxa"/>
@@ -5869,7 +6434,7 @@
         </w:tc>
         <w:tc>
           <w:tcPr>
-            <w:tcW w:type="dxa" w:w="7200"/>
+            <w:tcW w:type="dxa" w:w="6768"/>
             <w:tcMar>
               <w:top w:w="60" w:type="dxa"/>
               <w:bottom w:w="60" w:type="dxa"/>
@@ -5970,7 +6535,7 @@
         </w:trPr>
         <w:tc>
           <w:tcPr>
-            <w:tcW w:type="dxa" w:w="2592"/>
+            <w:tcW w:type="dxa" w:w="3024"/>
             <w:tcMar>
               <w:top w:w="60" w:type="dxa"/>
               <w:bottom w:w="60" w:type="dxa"/>
@@ -6019,7 +6584,7 @@
         </w:tc>
         <w:tc>
           <w:tcPr>
-            <w:tcW w:type="dxa" w:w="7200"/>
+            <w:tcW w:type="dxa" w:w="6768"/>
             <w:tcMar>
               <w:top w:w="60" w:type="dxa"/>
               <w:bottom w:w="60" w:type="dxa"/>
@@ -6034,6 +6599,7 @@
             <w:r>
               <w:rPr>
                 <w:rFonts w:ascii="Arial" w:hAnsi="Arial"/>
+                <w:b/>
                 <w:color w:val="0F172A"/>
                 <w:sz w:val="19"/>
               </w:rPr>
@@ -6048,7 +6614,7 @@
         </w:trPr>
         <w:tc>
           <w:tcPr>
-            <w:tcW w:type="dxa" w:w="2592"/>
+            <w:tcW w:type="dxa" w:w="3024"/>
             <w:tcMar>
               <w:top w:w="60" w:type="dxa"/>
               <w:bottom w:w="60" w:type="dxa"/>
@@ -6097,7 +6663,7 @@
         </w:tc>
         <w:tc>
           <w:tcPr>
-            <w:tcW w:type="dxa" w:w="7200"/>
+            <w:tcW w:type="dxa" w:w="6768"/>
             <w:tcMar>
               <w:top w:w="60" w:type="dxa"/>
               <w:bottom w:w="60" w:type="dxa"/>
@@ -6126,7 +6692,7 @@
         </w:trPr>
         <w:tc>
           <w:tcPr>
-            <w:tcW w:type="dxa" w:w="2592"/>
+            <w:tcW w:type="dxa" w:w="3024"/>
             <w:tcMar>
               <w:top w:w="60" w:type="dxa"/>
               <w:bottom w:w="60" w:type="dxa"/>
@@ -6175,7 +6741,7 @@
         </w:tc>
         <w:tc>
           <w:tcPr>
-            <w:tcW w:type="dxa" w:w="7200"/>
+            <w:tcW w:type="dxa" w:w="6768"/>
             <w:tcMar>
               <w:top w:w="60" w:type="dxa"/>
               <w:bottom w:w="60" w:type="dxa"/>
@@ -6204,7 +6770,7 @@
         </w:trPr>
         <w:tc>
           <w:tcPr>
-            <w:tcW w:type="dxa" w:w="2592"/>
+            <w:tcW w:type="dxa" w:w="3024"/>
             <w:tcMar>
               <w:top w:w="60" w:type="dxa"/>
               <w:bottom w:w="60" w:type="dxa"/>
@@ -6253,7 +6819,7 @@
         </w:tc>
         <w:tc>
           <w:tcPr>
-            <w:tcW w:type="dxa" w:w="7200"/>
+            <w:tcW w:type="dxa" w:w="6768"/>
             <w:tcMar>
               <w:top w:w="60" w:type="dxa"/>
               <w:bottom w:w="60" w:type="dxa"/>
@@ -6282,7 +6848,7 @@
         </w:trPr>
         <w:tc>
           <w:tcPr>
-            <w:tcW w:type="dxa" w:w="2592"/>
+            <w:tcW w:type="dxa" w:w="3024"/>
             <w:tcMar>
               <w:top w:w="60" w:type="dxa"/>
               <w:bottom w:w="60" w:type="dxa"/>
@@ -6331,7 +6897,7 @@
         </w:tc>
         <w:tc>
           <w:tcPr>
-            <w:tcW w:type="dxa" w:w="7200"/>
+            <w:tcW w:type="dxa" w:w="6768"/>
             <w:tcMar>
               <w:top w:w="60" w:type="dxa"/>
               <w:bottom w:w="60" w:type="dxa"/>
@@ -6360,7 +6926,7 @@
         </w:trPr>
         <w:tc>
           <w:tcPr>
-            <w:tcW w:type="dxa" w:w="2592"/>
+            <w:tcW w:type="dxa" w:w="3024"/>
             <w:tcMar>
               <w:top w:w="60" w:type="dxa"/>
               <w:bottom w:w="60" w:type="dxa"/>
@@ -6409,7 +6975,7 @@
         </w:tc>
         <w:tc>
           <w:tcPr>
-            <w:tcW w:type="dxa" w:w="7200"/>
+            <w:tcW w:type="dxa" w:w="6768"/>
             <w:tcMar>
               <w:top w:w="60" w:type="dxa"/>
               <w:bottom w:w="60" w:type="dxa"/>
@@ -6510,7 +7076,7 @@
         </w:trPr>
         <w:tc>
           <w:tcPr>
-            <w:tcW w:type="dxa" w:w="2592"/>
+            <w:tcW w:type="dxa" w:w="3024"/>
             <w:tcMar>
               <w:top w:w="60" w:type="dxa"/>
               <w:bottom w:w="60" w:type="dxa"/>
@@ -6559,7 +7125,7 @@
         </w:tc>
         <w:tc>
           <w:tcPr>
-            <w:tcW w:type="dxa" w:w="7200"/>
+            <w:tcW w:type="dxa" w:w="6768"/>
             <w:tcMar>
               <w:top w:w="60" w:type="dxa"/>
               <w:bottom w:w="60" w:type="dxa"/>
@@ -6574,6 +7140,7 @@
             <w:r>
               <w:rPr>
                 <w:rFonts w:ascii="Arial" w:hAnsi="Arial"/>
+                <w:b/>
                 <w:color w:val="0F172A"/>
                 <w:sz w:val="19"/>
               </w:rPr>
@@ -6588,7 +7155,7 @@
         </w:trPr>
         <w:tc>
           <w:tcPr>
-            <w:tcW w:type="dxa" w:w="2592"/>
+            <w:tcW w:type="dxa" w:w="3024"/>
             <w:tcMar>
               <w:top w:w="60" w:type="dxa"/>
               <w:bottom w:w="60" w:type="dxa"/>
@@ -6637,7 +7204,7 @@
         </w:tc>
         <w:tc>
           <w:tcPr>
-            <w:tcW w:type="dxa" w:w="7200"/>
+            <w:tcW w:type="dxa" w:w="6768"/>
             <w:tcMar>
               <w:top w:w="60" w:type="dxa"/>
               <w:bottom w:w="60" w:type="dxa"/>
@@ -6666,7 +7233,7 @@
         </w:trPr>
         <w:tc>
           <w:tcPr>
-            <w:tcW w:type="dxa" w:w="2592"/>
+            <w:tcW w:type="dxa" w:w="3024"/>
             <w:tcMar>
               <w:top w:w="60" w:type="dxa"/>
               <w:bottom w:w="60" w:type="dxa"/>
@@ -6715,7 +7282,7 @@
         </w:tc>
         <w:tc>
           <w:tcPr>
-            <w:tcW w:type="dxa" w:w="7200"/>
+            <w:tcW w:type="dxa" w:w="6768"/>
             <w:tcMar>
               <w:top w:w="60" w:type="dxa"/>
               <w:bottom w:w="60" w:type="dxa"/>
@@ -6744,7 +7311,7 @@
         </w:trPr>
         <w:tc>
           <w:tcPr>
-            <w:tcW w:type="dxa" w:w="2592"/>
+            <w:tcW w:type="dxa" w:w="3024"/>
             <w:tcMar>
               <w:top w:w="60" w:type="dxa"/>
               <w:bottom w:w="60" w:type="dxa"/>
@@ -6793,7 +7360,7 @@
         </w:tc>
         <w:tc>
           <w:tcPr>
-            <w:tcW w:type="dxa" w:w="7200"/>
+            <w:tcW w:type="dxa" w:w="6768"/>
             <w:tcMar>
               <w:top w:w="60" w:type="dxa"/>
               <w:bottom w:w="60" w:type="dxa"/>
@@ -6822,7 +7389,7 @@
         </w:trPr>
         <w:tc>
           <w:tcPr>
-            <w:tcW w:type="dxa" w:w="2592"/>
+            <w:tcW w:type="dxa" w:w="3024"/>
             <w:tcMar>
               <w:top w:w="60" w:type="dxa"/>
               <w:bottom w:w="60" w:type="dxa"/>
@@ -6871,7 +7438,7 @@
         </w:tc>
         <w:tc>
           <w:tcPr>
-            <w:tcW w:type="dxa" w:w="7200"/>
+            <w:tcW w:type="dxa" w:w="6768"/>
             <w:tcMar>
               <w:top w:w="60" w:type="dxa"/>
               <w:bottom w:w="60" w:type="dxa"/>
@@ -6900,7 +7467,7 @@
         </w:trPr>
         <w:tc>
           <w:tcPr>
-            <w:tcW w:type="dxa" w:w="2592"/>
+            <w:tcW w:type="dxa" w:w="3024"/>
             <w:tcMar>
               <w:top w:w="60" w:type="dxa"/>
               <w:bottom w:w="60" w:type="dxa"/>
@@ -6949,7 +7516,7 @@
         </w:tc>
         <w:tc>
           <w:tcPr>
-            <w:tcW w:type="dxa" w:w="7200"/>
+            <w:tcW w:type="dxa" w:w="6768"/>
             <w:tcMar>
               <w:top w:w="60" w:type="dxa"/>
               <w:bottom w:w="60" w:type="dxa"/>
@@ -7050,7 +7617,7 @@
         </w:trPr>
         <w:tc>
           <w:tcPr>
-            <w:tcW w:type="dxa" w:w="2592"/>
+            <w:tcW w:type="dxa" w:w="3024"/>
             <w:tcMar>
               <w:top w:w="60" w:type="dxa"/>
               <w:bottom w:w="60" w:type="dxa"/>
@@ -7099,7 +7666,7 @@
         </w:tc>
         <w:tc>
           <w:tcPr>
-            <w:tcW w:type="dxa" w:w="7200"/>
+            <w:tcW w:type="dxa" w:w="6768"/>
             <w:tcMar>
               <w:top w:w="60" w:type="dxa"/>
               <w:bottom w:w="60" w:type="dxa"/>
@@ -7114,6 +7681,7 @@
             <w:r>
               <w:rPr>
                 <w:rFonts w:ascii="Arial" w:hAnsi="Arial"/>
+                <w:b/>
                 <w:color w:val="0F172A"/>
                 <w:sz w:val="19"/>
               </w:rPr>
@@ -7128,7 +7696,7 @@
         </w:trPr>
         <w:tc>
           <w:tcPr>
-            <w:tcW w:type="dxa" w:w="2592"/>
+            <w:tcW w:type="dxa" w:w="3024"/>
             <w:tcMar>
               <w:top w:w="60" w:type="dxa"/>
               <w:bottom w:w="60" w:type="dxa"/>
@@ -7177,7 +7745,7 @@
         </w:tc>
         <w:tc>
           <w:tcPr>
-            <w:tcW w:type="dxa" w:w="7200"/>
+            <w:tcW w:type="dxa" w:w="6768"/>
             <w:tcMar>
               <w:top w:w="60" w:type="dxa"/>
               <w:bottom w:w="60" w:type="dxa"/>
@@ -7206,7 +7774,7 @@
         </w:trPr>
         <w:tc>
           <w:tcPr>
-            <w:tcW w:type="dxa" w:w="2592"/>
+            <w:tcW w:type="dxa" w:w="3024"/>
             <w:tcMar>
               <w:top w:w="60" w:type="dxa"/>
               <w:bottom w:w="60" w:type="dxa"/>
@@ -7255,7 +7823,7 @@
         </w:tc>
         <w:tc>
           <w:tcPr>
-            <w:tcW w:type="dxa" w:w="7200"/>
+            <w:tcW w:type="dxa" w:w="6768"/>
             <w:tcMar>
               <w:top w:w="60" w:type="dxa"/>
               <w:bottom w:w="60" w:type="dxa"/>
@@ -7284,7 +7852,7 @@
         </w:trPr>
         <w:tc>
           <w:tcPr>
-            <w:tcW w:type="dxa" w:w="2592"/>
+            <w:tcW w:type="dxa" w:w="3024"/>
             <w:tcMar>
               <w:top w:w="60" w:type="dxa"/>
               <w:bottom w:w="60" w:type="dxa"/>
@@ -7333,7 +7901,7 @@
         </w:tc>
         <w:tc>
           <w:tcPr>
-            <w:tcW w:type="dxa" w:w="7200"/>
+            <w:tcW w:type="dxa" w:w="6768"/>
             <w:tcMar>
               <w:top w:w="60" w:type="dxa"/>
               <w:bottom w:w="60" w:type="dxa"/>
@@ -7362,7 +7930,7 @@
         </w:trPr>
         <w:tc>
           <w:tcPr>
-            <w:tcW w:type="dxa" w:w="2592"/>
+            <w:tcW w:type="dxa" w:w="3024"/>
             <w:tcMar>
               <w:top w:w="60" w:type="dxa"/>
               <w:bottom w:w="60" w:type="dxa"/>
@@ -7411,7 +7979,7 @@
         </w:tc>
         <w:tc>
           <w:tcPr>
-            <w:tcW w:type="dxa" w:w="7200"/>
+            <w:tcW w:type="dxa" w:w="6768"/>
             <w:tcMar>
               <w:top w:w="60" w:type="dxa"/>
               <w:bottom w:w="60" w:type="dxa"/>
@@ -7440,7 +8008,7 @@
         </w:trPr>
         <w:tc>
           <w:tcPr>
-            <w:tcW w:type="dxa" w:w="2592"/>
+            <w:tcW w:type="dxa" w:w="3024"/>
             <w:tcMar>
               <w:top w:w="60" w:type="dxa"/>
               <w:bottom w:w="60" w:type="dxa"/>
@@ -7489,7 +8057,7 @@
         </w:tc>
         <w:tc>
           <w:tcPr>
-            <w:tcW w:type="dxa" w:w="7200"/>
+            <w:tcW w:type="dxa" w:w="6768"/>
             <w:tcMar>
               <w:top w:w="60" w:type="dxa"/>
               <w:bottom w:w="60" w:type="dxa"/>
@@ -7590,7 +8158,7 @@
         </w:trPr>
         <w:tc>
           <w:tcPr>
-            <w:tcW w:type="dxa" w:w="2592"/>
+            <w:tcW w:type="dxa" w:w="3024"/>
             <w:tcMar>
               <w:top w:w="60" w:type="dxa"/>
               <w:bottom w:w="60" w:type="dxa"/>
@@ -7639,7 +8207,7 @@
         </w:tc>
         <w:tc>
           <w:tcPr>
-            <w:tcW w:type="dxa" w:w="7200"/>
+            <w:tcW w:type="dxa" w:w="6768"/>
             <w:tcMar>
               <w:top w:w="60" w:type="dxa"/>
               <w:bottom w:w="60" w:type="dxa"/>
@@ -7654,6 +8222,7 @@
             <w:r>
               <w:rPr>
                 <w:rFonts w:ascii="Arial" w:hAnsi="Arial"/>
+                <w:b/>
                 <w:color w:val="0F172A"/>
                 <w:sz w:val="19"/>
               </w:rPr>
@@ -7668,7 +8237,7 @@
         </w:trPr>
         <w:tc>
           <w:tcPr>
-            <w:tcW w:type="dxa" w:w="2592"/>
+            <w:tcW w:type="dxa" w:w="3024"/>
             <w:tcMar>
               <w:top w:w="60" w:type="dxa"/>
               <w:bottom w:w="60" w:type="dxa"/>
@@ -7717,7 +8286,7 @@
         </w:tc>
         <w:tc>
           <w:tcPr>
-            <w:tcW w:type="dxa" w:w="7200"/>
+            <w:tcW w:type="dxa" w:w="6768"/>
             <w:tcMar>
               <w:top w:w="60" w:type="dxa"/>
               <w:bottom w:w="60" w:type="dxa"/>
@@ -7746,7 +8315,7 @@
         </w:trPr>
         <w:tc>
           <w:tcPr>
-            <w:tcW w:type="dxa" w:w="2592"/>
+            <w:tcW w:type="dxa" w:w="3024"/>
             <w:tcMar>
               <w:top w:w="60" w:type="dxa"/>
               <w:bottom w:w="60" w:type="dxa"/>
@@ -7795,7 +8364,7 @@
         </w:tc>
         <w:tc>
           <w:tcPr>
-            <w:tcW w:type="dxa" w:w="7200"/>
+            <w:tcW w:type="dxa" w:w="6768"/>
             <w:tcMar>
               <w:top w:w="60" w:type="dxa"/>
               <w:bottom w:w="60" w:type="dxa"/>
@@ -7824,7 +8393,7 @@
         </w:trPr>
         <w:tc>
           <w:tcPr>
-            <w:tcW w:type="dxa" w:w="2592"/>
+            <w:tcW w:type="dxa" w:w="3024"/>
             <w:tcMar>
               <w:top w:w="60" w:type="dxa"/>
               <w:bottom w:w="60" w:type="dxa"/>
@@ -7873,7 +8442,7 @@
         </w:tc>
         <w:tc>
           <w:tcPr>
-            <w:tcW w:type="dxa" w:w="7200"/>
+            <w:tcW w:type="dxa" w:w="6768"/>
             <w:tcMar>
               <w:top w:w="60" w:type="dxa"/>
               <w:bottom w:w="60" w:type="dxa"/>
@@ -7902,7 +8471,7 @@
         </w:trPr>
         <w:tc>
           <w:tcPr>
-            <w:tcW w:type="dxa" w:w="2592"/>
+            <w:tcW w:type="dxa" w:w="3024"/>
             <w:tcMar>
               <w:top w:w="60" w:type="dxa"/>
               <w:bottom w:w="60" w:type="dxa"/>
@@ -7951,7 +8520,7 @@
         </w:tc>
         <w:tc>
           <w:tcPr>
-            <w:tcW w:type="dxa" w:w="7200"/>
+            <w:tcW w:type="dxa" w:w="6768"/>
             <w:tcMar>
               <w:top w:w="60" w:type="dxa"/>
               <w:bottom w:w="60" w:type="dxa"/>
@@ -7980,7 +8549,7 @@
         </w:trPr>
         <w:tc>
           <w:tcPr>
-            <w:tcW w:type="dxa" w:w="2592"/>
+            <w:tcW w:type="dxa" w:w="3024"/>
             <w:tcMar>
               <w:top w:w="60" w:type="dxa"/>
               <w:bottom w:w="60" w:type="dxa"/>
@@ -8029,7 +8598,7 @@
         </w:tc>
         <w:tc>
           <w:tcPr>
-            <w:tcW w:type="dxa" w:w="7200"/>
+            <w:tcW w:type="dxa" w:w="6768"/>
             <w:tcMar>
               <w:top w:w="60" w:type="dxa"/>
               <w:bottom w:w="60" w:type="dxa"/>
@@ -8135,482 +8704,6 @@
         <w:t>Monitored real-time ROV video feeds and logged anomalies, ensuring strict QA/QC standards for client PTTEP.</w:t>
       </w:r>
     </w:p>
-    <w:p/>
-    <w:tbl>
-      <w:tblPr>
-        <w:tblW w:type="auto" w:w="0"/>
-        <w:tblLayout w:type="fixed"/>
-        <w:tblLook w:firstColumn="1" w:firstRow="1" w:lastColumn="0" w:lastRow="0" w:noHBand="0" w:noVBand="1" w:val="04A0"/>
-      </w:tblPr>
-      <w:tblGrid>
-        <w:gridCol w:w="3360"/>
-        <w:gridCol w:w="3360"/>
-        <w:gridCol w:w="3360"/>
-      </w:tblGrid>
-      <w:tr>
-        <w:trPr>
-          <w:cantSplit/>
-        </w:trPr>
-        <w:tc>
-          <w:tcPr>
-            <w:tcW w:type="dxa" w:w="2592"/>
-            <w:tcMar>
-              <w:top w:w="60" w:type="dxa"/>
-              <w:bottom w:w="60" w:type="dxa"/>
-              <w:left w:w="0" w:type="dxa"/>
-              <w:right w:w="50" w:type="dxa"/>
-            </w:tcMar>
-          </w:tcPr>
-          <w:p>
-            <w:pPr>
-              <w:spacing w:before="40" w:after="40"/>
-            </w:pPr>
-            <w:r>
-              <w:rPr>
-                <w:rFonts w:ascii="Arial" w:hAnsi="Arial"/>
-                <w:b/>
-                <w:color w:val="475569"/>
-                <w:sz w:val="19"/>
-              </w:rPr>
-              <w:t>Company</w:t>
-            </w:r>
-          </w:p>
-        </w:tc>
-        <w:tc>
-          <w:tcPr>
-            <w:tcW w:type="dxa" w:w="288"/>
-            <w:tcMar>
-              <w:top w:w="60" w:type="dxa"/>
-              <w:bottom w:w="60" w:type="dxa"/>
-              <w:left w:w="0" w:type="dxa"/>
-              <w:right w:w="0" w:type="dxa"/>
-            </w:tcMar>
-          </w:tcPr>
-          <w:p>
-            <w:pPr>
-              <w:spacing w:before="40" w:after="40"/>
-            </w:pPr>
-            <w:r>
-              <w:rPr>
-                <w:rFonts w:ascii="Arial" w:hAnsi="Arial"/>
-                <w:color w:val="94A3B8"/>
-                <w:sz w:val="19"/>
-              </w:rPr>
-              <w:t>:</w:t>
-            </w:r>
-          </w:p>
-        </w:tc>
-        <w:tc>
-          <w:tcPr>
-            <w:tcW w:type="dxa" w:w="7200"/>
-            <w:tcMar>
-              <w:top w:w="60" w:type="dxa"/>
-              <w:bottom w:w="60" w:type="dxa"/>
-              <w:left w:w="50" w:type="dxa"/>
-              <w:right w:w="0" w:type="dxa"/>
-            </w:tcMar>
-          </w:tcPr>
-          <w:p>
-            <w:pPr>
-              <w:spacing w:before="40" w:after="40"/>
-            </w:pPr>
-            <w:r>
-              <w:rPr>
-                <w:rFonts w:ascii="Arial" w:hAnsi="Arial"/>
-                <w:color w:val="0F172A"/>
-                <w:sz w:val="19"/>
-              </w:rPr>
-              <w:t>Sirrihat Subsea Services Sdn Bhd</w:t>
-            </w:r>
-          </w:p>
-        </w:tc>
-      </w:tr>
-      <w:tr>
-        <w:trPr>
-          <w:cantSplit/>
-        </w:trPr>
-        <w:tc>
-          <w:tcPr>
-            <w:tcW w:type="dxa" w:w="2592"/>
-            <w:tcMar>
-              <w:top w:w="60" w:type="dxa"/>
-              <w:bottom w:w="60" w:type="dxa"/>
-              <w:left w:w="0" w:type="dxa"/>
-              <w:right w:w="50" w:type="dxa"/>
-            </w:tcMar>
-          </w:tcPr>
-          <w:p>
-            <w:pPr>
-              <w:spacing w:before="40" w:after="40"/>
-            </w:pPr>
-            <w:r>
-              <w:rPr>
-                <w:rFonts w:ascii="Arial" w:hAnsi="Arial"/>
-                <w:b/>
-                <w:color w:val="475569"/>
-                <w:sz w:val="19"/>
-              </w:rPr>
-              <w:t>Project</w:t>
-            </w:r>
-          </w:p>
-        </w:tc>
-        <w:tc>
-          <w:tcPr>
-            <w:tcW w:type="dxa" w:w="288"/>
-            <w:tcMar>
-              <w:top w:w="60" w:type="dxa"/>
-              <w:bottom w:w="60" w:type="dxa"/>
-              <w:left w:w="0" w:type="dxa"/>
-              <w:right w:w="0" w:type="dxa"/>
-            </w:tcMar>
-          </w:tcPr>
-          <w:p>
-            <w:pPr>
-              <w:spacing w:before="40" w:after="40"/>
-            </w:pPr>
-            <w:r>
-              <w:rPr>
-                <w:rFonts w:ascii="Arial" w:hAnsi="Arial"/>
-                <w:color w:val="94A3B8"/>
-                <w:sz w:val="19"/>
-              </w:rPr>
-              <w:t>:</w:t>
-            </w:r>
-          </w:p>
-        </w:tc>
-        <w:tc>
-          <w:tcPr>
-            <w:tcW w:type="dxa" w:w="7200"/>
-            <w:tcMar>
-              <w:top w:w="60" w:type="dxa"/>
-              <w:bottom w:w="60" w:type="dxa"/>
-              <w:left w:w="50" w:type="dxa"/>
-              <w:right w:w="0" w:type="dxa"/>
-            </w:tcMar>
-          </w:tcPr>
-          <w:p>
-            <w:pPr>
-              <w:spacing w:before="40" w:after="40"/>
-            </w:pPr>
-            <w:r>
-              <w:rPr>
-                <w:rFonts w:ascii="Arial" w:hAnsi="Arial"/>
-                <w:color w:val="0F172A"/>
-                <w:sz w:val="19"/>
-              </w:rPr>
-              <w:t>Onshore Engineering &amp; Reporting Support (Subang Jaya, Selangor, Malaysia)</w:t>
-            </w:r>
-          </w:p>
-        </w:tc>
-      </w:tr>
-      <w:tr>
-        <w:trPr>
-          <w:cantSplit/>
-        </w:trPr>
-        <w:tc>
-          <w:tcPr>
-            <w:tcW w:type="dxa" w:w="2592"/>
-            <w:tcMar>
-              <w:top w:w="60" w:type="dxa"/>
-              <w:bottom w:w="60" w:type="dxa"/>
-              <w:left w:w="0" w:type="dxa"/>
-              <w:right w:w="50" w:type="dxa"/>
-            </w:tcMar>
-          </w:tcPr>
-          <w:p>
-            <w:pPr>
-              <w:spacing w:before="40" w:after="40"/>
-            </w:pPr>
-            <w:r>
-              <w:rPr>
-                <w:rFonts w:ascii="Arial" w:hAnsi="Arial"/>
-                <w:b/>
-                <w:color w:val="475569"/>
-                <w:sz w:val="19"/>
-              </w:rPr>
-              <w:t>Duration</w:t>
-            </w:r>
-          </w:p>
-        </w:tc>
-        <w:tc>
-          <w:tcPr>
-            <w:tcW w:type="dxa" w:w="288"/>
-            <w:tcMar>
-              <w:top w:w="60" w:type="dxa"/>
-              <w:bottom w:w="60" w:type="dxa"/>
-              <w:left w:w="0" w:type="dxa"/>
-              <w:right w:w="0" w:type="dxa"/>
-            </w:tcMar>
-          </w:tcPr>
-          <w:p>
-            <w:pPr>
-              <w:spacing w:before="40" w:after="40"/>
-            </w:pPr>
-            <w:r>
-              <w:rPr>
-                <w:rFonts w:ascii="Arial" w:hAnsi="Arial"/>
-                <w:color w:val="94A3B8"/>
-                <w:sz w:val="19"/>
-              </w:rPr>
-              <w:t>:</w:t>
-            </w:r>
-          </w:p>
-        </w:tc>
-        <w:tc>
-          <w:tcPr>
-            <w:tcW w:type="dxa" w:w="7200"/>
-            <w:tcMar>
-              <w:top w:w="60" w:type="dxa"/>
-              <w:bottom w:w="60" w:type="dxa"/>
-              <w:left w:w="50" w:type="dxa"/>
-              <w:right w:w="0" w:type="dxa"/>
-            </w:tcMar>
-          </w:tcPr>
-          <w:p>
-            <w:pPr>
-              <w:spacing w:before="40" w:after="40"/>
-            </w:pPr>
-            <w:r>
-              <w:rPr>
-                <w:rFonts w:ascii="Arial" w:hAnsi="Arial"/>
-                <w:color w:val="0F172A"/>
-                <w:sz w:val="19"/>
-              </w:rPr>
-              <w:t>November 2022 – September 2023</w:t>
-            </w:r>
-          </w:p>
-        </w:tc>
-      </w:tr>
-      <w:tr>
-        <w:trPr>
-          <w:cantSplit/>
-        </w:trPr>
-        <w:tc>
-          <w:tcPr>
-            <w:tcW w:type="dxa" w:w="2592"/>
-            <w:tcMar>
-              <w:top w:w="60" w:type="dxa"/>
-              <w:bottom w:w="60" w:type="dxa"/>
-              <w:left w:w="0" w:type="dxa"/>
-              <w:right w:w="50" w:type="dxa"/>
-            </w:tcMar>
-          </w:tcPr>
-          <w:p>
-            <w:pPr>
-              <w:spacing w:before="40" w:after="40"/>
-            </w:pPr>
-            <w:r>
-              <w:rPr>
-                <w:rFonts w:ascii="Arial" w:hAnsi="Arial"/>
-                <w:b/>
-                <w:color w:val="475569"/>
-                <w:sz w:val="19"/>
-              </w:rPr>
-              <w:t>Position Title</w:t>
-            </w:r>
-          </w:p>
-        </w:tc>
-        <w:tc>
-          <w:tcPr>
-            <w:tcW w:type="dxa" w:w="288"/>
-            <w:tcMar>
-              <w:top w:w="60" w:type="dxa"/>
-              <w:bottom w:w="60" w:type="dxa"/>
-              <w:left w:w="0" w:type="dxa"/>
-              <w:right w:w="0" w:type="dxa"/>
-            </w:tcMar>
-          </w:tcPr>
-          <w:p>
-            <w:pPr>
-              <w:spacing w:before="40" w:after="40"/>
-            </w:pPr>
-            <w:r>
-              <w:rPr>
-                <w:rFonts w:ascii="Arial" w:hAnsi="Arial"/>
-                <w:color w:val="94A3B8"/>
-                <w:sz w:val="19"/>
-              </w:rPr>
-              <w:t>:</w:t>
-            </w:r>
-          </w:p>
-        </w:tc>
-        <w:tc>
-          <w:tcPr>
-            <w:tcW w:type="dxa" w:w="7200"/>
-            <w:tcMar>
-              <w:top w:w="60" w:type="dxa"/>
-              <w:bottom w:w="60" w:type="dxa"/>
-              <w:left w:w="50" w:type="dxa"/>
-              <w:right w:w="0" w:type="dxa"/>
-            </w:tcMar>
-          </w:tcPr>
-          <w:p>
-            <w:pPr>
-              <w:spacing w:before="40" w:after="40"/>
-            </w:pPr>
-            <w:r>
-              <w:rPr>
-                <w:rFonts w:ascii="Arial" w:hAnsi="Arial"/>
-                <w:color w:val="0F172A"/>
-                <w:sz w:val="19"/>
-              </w:rPr>
-              <w:t>Data QA/QC Coordinator</w:t>
-            </w:r>
-          </w:p>
-        </w:tc>
-      </w:tr>
-    </w:tbl>
-    <w:p>
-      <w:pPr>
-        <w:spacing w:before="80" w:after="40"/>
-      </w:pPr>
-      <w:r>
-        <w:rPr>
-          <w:rFonts w:ascii="Arial" w:hAnsi="Arial"/>
-          <w:b/>
-          <w:sz w:val="19"/>
-        </w:rPr>
-        <w:t>Scope/Details:</w:t>
-      </w:r>
-    </w:p>
-    <w:p>
-      <w:pPr>
-        <w:pStyle w:val="ListBullet"/>
-        <w:spacing w:before="40" w:after="60"/>
-        <w:ind w:left="504"/>
-      </w:pPr>
-      <w:r>
-        <w:rPr>
-          <w:rFonts w:ascii="Arial" w:hAnsi="Arial"/>
-          <w:b/>
-          <w:color w:val="1E293B"/>
-          <w:sz w:val="19"/>
-        </w:rPr>
-      </w:r>
-      <w:r>
-        <w:rPr>
-          <w:rFonts w:ascii="Arial" w:hAnsi="Arial"/>
-          <w:color w:val="475569"/>
-          <w:sz w:val="19"/>
-        </w:rPr>
-        <w:t>Final Reporting: Converted rough daily logs from offshore operations into polished, formal client reports.</w:t>
-      </w:r>
-    </w:p>
-    <w:p>
-      <w:pPr>
-        <w:pStyle w:val="ListBullet"/>
-        <w:spacing w:before="40" w:after="60"/>
-        <w:ind w:left="504"/>
-      </w:pPr>
-      <w:r>
-        <w:rPr>
-          <w:rFonts w:ascii="Arial" w:hAnsi="Arial"/>
-          <w:b/>
-          <w:color w:val="1E293B"/>
-          <w:sz w:val="19"/>
-        </w:rPr>
-      </w:r>
-      <w:r>
-        <w:rPr>
-          <w:rFonts w:ascii="Arial" w:hAnsi="Arial"/>
-          <w:color w:val="475569"/>
-          <w:sz w:val="19"/>
-        </w:rPr>
-        <w:t>Data QA/QC: Verified accuracy of subsea video footage, timestamps, and anomaly descriptions against physical logs.</w:t>
-      </w:r>
-    </w:p>
-    <w:p>
-      <w:pPr>
-        <w:pStyle w:val="ListBullet"/>
-        <w:spacing w:before="40" w:after="60"/>
-        <w:ind w:left="504"/>
-      </w:pPr>
-      <w:r>
-        <w:rPr>
-          <w:rFonts w:ascii="Arial" w:hAnsi="Arial"/>
-          <w:b/>
-          <w:color w:val="1E293B"/>
-          <w:sz w:val="19"/>
-        </w:rPr>
-      </w:r>
-      <w:r>
-        <w:rPr>
-          <w:rFonts w:ascii="Arial" w:hAnsi="Arial"/>
-          <w:color w:val="475569"/>
-          <w:sz w:val="19"/>
-        </w:rPr>
-        <w:t>Database Management: Uploaded validated offshore data and inspection logs into integrity software systems.</w:t>
-      </w:r>
-    </w:p>
-    <w:p>
-      <w:pPr>
-        <w:pStyle w:val="ListBullet"/>
-        <w:spacing w:before="40" w:after="60"/>
-        <w:ind w:left="504"/>
-      </w:pPr>
-      <w:r>
-        <w:rPr>
-          <w:rFonts w:ascii="Arial" w:hAnsi="Arial"/>
-          <w:b/>
-          <w:color w:val="1E293B"/>
-          <w:sz w:val="19"/>
-        </w:rPr>
-      </w:r>
-      <w:r>
-        <w:rPr>
-          <w:rFonts w:ascii="Arial" w:hAnsi="Arial"/>
-          <w:color w:val="475569"/>
-          <w:sz w:val="19"/>
-        </w:rPr>
-        <w:t>Drawing Updates: Marked up CAD and "As-Built" drawings to reflect new subsea findings and anomalies.</w:t>
-      </w:r>
-    </w:p>
-    <w:p>
-      <w:pPr>
-        <w:pStyle w:val="ListBullet"/>
-        <w:spacing w:before="40" w:after="60"/>
-        <w:ind w:left="504"/>
-      </w:pPr>
-      <w:r>
-        <w:rPr>
-          <w:rFonts w:ascii="Arial" w:hAnsi="Arial"/>
-          <w:b/>
-          <w:color w:val="1E293B"/>
-          <w:sz w:val="19"/>
-        </w:rPr>
-      </w:r>
-      <w:r>
-        <w:rPr>
-          <w:rFonts w:ascii="Arial" w:hAnsi="Arial"/>
-          <w:color w:val="475569"/>
-          <w:sz w:val="19"/>
-        </w:rPr>
-        <w:t>Work Pack Creation: Wrote detailed, step-by-step inspection procedures and checklists for upcoming subsea campaigns.</w:t>
-      </w:r>
-    </w:p>
-    <w:p>
-      <w:pPr>
-        <w:pStyle w:val="ListBullet"/>
-        <w:spacing w:before="40" w:after="60"/>
-        <w:ind w:left="504"/>
-      </w:pPr>
-      <w:r>
-        <w:rPr>
-          <w:rFonts w:ascii="Arial" w:hAnsi="Arial"/>
-          <w:b/>
-          <w:color w:val="1E293B"/>
-          <w:sz w:val="19"/>
-        </w:rPr>
-      </w:r>
-      <w:r>
-        <w:rPr>
-          <w:rFonts w:ascii="Arial" w:hAnsi="Arial"/>
-          <w:color w:val="475569"/>
-          <w:sz w:val="19"/>
-        </w:rPr>
-        <w:t>Desktop Studies: Reviewed historical integrity reports to identify targeted areas of interest for future monitoring.</w:t>
-      </w:r>
-    </w:p>
     <w:p>
       <w:pPr>
         <w:keepNext/>
@@ -8646,7 +8739,7 @@
         </w:trPr>
         <w:tc>
           <w:tcPr>
-            <w:tcW w:type="dxa" w:w="2592"/>
+            <w:tcW w:type="dxa" w:w="3024"/>
             <w:tcMar>
               <w:top w:w="60" w:type="dxa"/>
               <w:bottom w:w="60" w:type="dxa"/>
@@ -8695,7 +8788,7 @@
         </w:tc>
         <w:tc>
           <w:tcPr>
-            <w:tcW w:type="dxa" w:w="7200"/>
+            <w:tcW w:type="dxa" w:w="6768"/>
             <w:tcMar>
               <w:top w:w="60" w:type="dxa"/>
               <w:bottom w:w="60" w:type="dxa"/>
@@ -8724,7 +8817,7 @@
         </w:trPr>
         <w:tc>
           <w:tcPr>
-            <w:tcW w:type="dxa" w:w="2592"/>
+            <w:tcW w:type="dxa" w:w="3024"/>
             <w:tcMar>
               <w:top w:w="60" w:type="dxa"/>
               <w:bottom w:w="60" w:type="dxa"/>
@@ -8773,7 +8866,7 @@
         </w:tc>
         <w:tc>
           <w:tcPr>
-            <w:tcW w:type="dxa" w:w="7200"/>
+            <w:tcW w:type="dxa" w:w="6768"/>
             <w:tcMar>
               <w:top w:w="60" w:type="dxa"/>
               <w:bottom w:w="60" w:type="dxa"/>
@@ -8874,7 +8967,7 @@
         </w:trPr>
         <w:tc>
           <w:tcPr>
-            <w:tcW w:type="dxa" w:w="2592"/>
+            <w:tcW w:type="dxa" w:w="3024"/>
             <w:tcMar>
               <w:top w:w="60" w:type="dxa"/>
               <w:bottom w:w="60" w:type="dxa"/>
@@ -8923,7 +9016,7 @@
         </w:tc>
         <w:tc>
           <w:tcPr>
-            <w:tcW w:type="dxa" w:w="7200"/>
+            <w:tcW w:type="dxa" w:w="6768"/>
             <w:tcMar>
               <w:top w:w="60" w:type="dxa"/>
               <w:bottom w:w="60" w:type="dxa"/>
@@ -8938,7 +9031,6 @@
             <w:r>
               <w:rPr>
                 <w:rFonts w:ascii="Arial" w:hAnsi="Arial"/>
-                <w:b/>
                 <w:color w:val="0F172A"/>
                 <w:sz w:val="19"/>
               </w:rPr>
@@ -8953,7 +9045,7 @@
         </w:trPr>
         <w:tc>
           <w:tcPr>
-            <w:tcW w:type="dxa" w:w="2592"/>
+            <w:tcW w:type="dxa" w:w="3024"/>
             <w:tcMar>
               <w:top w:w="60" w:type="dxa"/>
               <w:bottom w:w="60" w:type="dxa"/>
@@ -9002,7 +9094,7 @@
         </w:tc>
         <w:tc>
           <w:tcPr>
-            <w:tcW w:type="dxa" w:w="7200"/>
+            <w:tcW w:type="dxa" w:w="6768"/>
             <w:tcMar>
               <w:top w:w="60" w:type="dxa"/>
               <w:bottom w:w="60" w:type="dxa"/>
@@ -9031,7 +9123,7 @@
         </w:trPr>
         <w:tc>
           <w:tcPr>
-            <w:tcW w:type="dxa" w:w="2592"/>
+            <w:tcW w:type="dxa" w:w="3024"/>
             <w:tcMar>
               <w:top w:w="60" w:type="dxa"/>
               <w:bottom w:w="60" w:type="dxa"/>
@@ -9080,7 +9172,7 @@
         </w:tc>
         <w:tc>
           <w:tcPr>
-            <w:tcW w:type="dxa" w:w="7200"/>
+            <w:tcW w:type="dxa" w:w="6768"/>
             <w:tcMar>
               <w:top w:w="60" w:type="dxa"/>
               <w:bottom w:w="60" w:type="dxa"/>
@@ -9109,7 +9201,7 @@
         </w:trPr>
         <w:tc>
           <w:tcPr>
-            <w:tcW w:type="dxa" w:w="2592"/>
+            <w:tcW w:type="dxa" w:w="3024"/>
             <w:tcMar>
               <w:top w:w="60" w:type="dxa"/>
               <w:bottom w:w="60" w:type="dxa"/>
@@ -9158,7 +9250,7 @@
         </w:tc>
         <w:tc>
           <w:tcPr>
-            <w:tcW w:type="dxa" w:w="7200"/>
+            <w:tcW w:type="dxa" w:w="6768"/>
             <w:tcMar>
               <w:top w:w="60" w:type="dxa"/>
               <w:bottom w:w="60" w:type="dxa"/>
@@ -9184,13 +9276,62 @@
     </w:tbl>
     <w:p/>
     <w:sectPr>
+      <w:headerReference w:type="default" r:id="rId9"/>
       <w:pgSz w:w="12240" w:h="15840"/>
-      <w:pgMar w:top="1080" w:right="1080" w:bottom="1080" w:left="1080" w:header="720" w:footer="720" w:gutter="0"/>
+      <w:pgMar w:top="1368" w:right="1080" w:bottom="1080" w:left="1080" w:header="720" w:footer="720" w:gutter="0"/>
       <w:cols w:space="720"/>
       <w:docGrid w:linePitch="360"/>
+      <w:pgBorders>
+        <w:top w:val="single" w:sz="8" w:space="12" w:color="CCCCCC"/>
+        <w:left w:val="single" w:sz="8" w:space="12" w:color="CCCCCC"/>
+        <w:bottom w:val="single" w:sz="8" w:space="12" w:color="CCCCCC"/>
+        <w:right w:val="single" w:sz="8" w:space="12" w:color="CCCCCC"/>
+      </w:pgBorders>
     </w:sectPr>
   </w:body>
 </w:document>
+</file>
+
+<file path=word/header1.xml><?xml version="1.0" encoding="utf-8"?>
+<w:hdr xmlns:m="http://schemas.openxmlformats.org/officeDocument/2006/math" xmlns:mc="http://schemas.openxmlformats.org/markup-compatibility/2006" xmlns:mo="http://schemas.microsoft.com/office/mac/office/2008/main" xmlns:mv="urn:schemas-microsoft-com:mac:vml" xmlns:o="urn:schemas-microsoft-com:office:office" xmlns:r="http://schemas.openxmlformats.org/officeDocument/2006/relationships" xmlns:v="urn:schemas-microsoft-com:vml" xmlns:w10="urn:schemas-microsoft-com:office:word" xmlns:w14="http://schemas.microsoft.com/office/word/2010/wordml" xmlns:w="http://schemas.openxmlformats.org/wordprocessingml/2006/main" xmlns:wne="http://schemas.microsoft.com/office/word/2006/wordml" xmlns:wp14="http://schemas.microsoft.com/office/word/2010/wordprocessingDrawing" xmlns:wp="http://schemas.openxmlformats.org/drawingml/2006/wordprocessingDrawing" xmlns:wpc="http://schemas.microsoft.com/office/word/2010/wordprocessingCanvas" xmlns:wpg="http://schemas.microsoft.com/office/word/2010/wordprocessingGroup" xmlns:wpi="http://schemas.microsoft.com/office/word/2010/wordprocessingInk" xmlns:wps="http://schemas.microsoft.com/office/word/2010/wordprocessingShape" mc:Ignorable="w14 wp14">
+  <w:p>
+    <w:pPr>
+      <w:pStyle w:val="Header"/>
+      <w:tabs>
+        <w:tab w:pos="10080" w:val="right"/>
+      </w:tabs>
+      <w:spacing w:before="0" w:after="240"/>
+      <w:jc w:val="left"/>
+      <w:pBdr>
+        <w:bottom w:val="single" w:sz="4" w:space="4" w:color="CCCCCC"/>
+      </w:pBdr>
+    </w:pPr>
+    <w:r>
+      <w:rPr>
+        <w:rFonts w:ascii="Arial" w:hAnsi="Arial"/>
+        <w:b/>
+        <w:color w:val="475569"/>
+        <w:sz w:val="17"/>
+      </w:rPr>
+      <w:t>Muhammad Amin bin Azman</w:t>
+    </w:r>
+    <w:r>
+      <w:rPr>
+        <w:rFonts w:ascii="Arial" w:hAnsi="Arial"/>
+      </w:rPr>
+      <w:tab/>
+    </w:r>
+    <w:r>
+      <w:rPr>
+        <w:rFonts w:ascii="Arial" w:hAnsi="Arial"/>
+        <w:color w:val="475569"/>
+        <w:sz w:val="17"/>
+      </w:rPr>
+      <w:t xml:space="preserve">Page </w:t>
+      <w:fldSimple w:instr="PAGE"/>
+    </w:r>
+  </w:p>
+</w:hdr>
 </file>
 
 <file path=word/numbering.xml><?xml version="1.0" encoding="utf-8"?>

</xml_diff>

<commit_message>
Optimize CV: regenerate Muhammad_Amin_Azman_CV.docx with qualifications section structured into a 2-column table layout
</commit_message>
<xml_diff>
--- a/Muhammad_Amin_Azman_CV.docx
+++ b/Muhammad_Amin_Azman_CV.docx
@@ -941,281 +941,876 @@
         <w:t>PROFESSIONAL QUALIFICATIONS &amp; COURSES ATTENDED</w:t>
       </w:r>
     </w:p>
-    <w:p>
-      <w:pPr>
-        <w:pStyle w:val="ListBullet"/>
-        <w:spacing w:before="40" w:after="60"/>
-        <w:ind w:left="216"/>
-      </w:pPr>
-      <w:r>
-        <w:rPr>
-          <w:rFonts w:ascii="Arial" w:hAnsi="Arial"/>
-          <w:b/>
-          <w:color w:val="1E293B"/>
-          <w:sz w:val="19"/>
-        </w:rPr>
-        <w:t>Underwater Inspection Controller Grade CSWIP 3.4U</w:t>
-      </w:r>
-      <w:r>
-        <w:rPr>
-          <w:rFonts w:ascii="Arial" w:hAnsi="Arial"/>
-          <w:color w:val="475569"/>
-          <w:sz w:val="19"/>
-        </w:rPr>
-        <w:br/>
-        <w:t>Cert No: 542968 | Issued: 24 Oct 2023 | Date of Expiry: 25th July 2028</w:t>
-      </w:r>
-    </w:p>
-    <w:p>
-      <w:pPr>
-        <w:pStyle w:val="ListBullet"/>
-        <w:spacing w:before="40" w:after="60"/>
-        <w:ind w:left="216"/>
-      </w:pPr>
-      <w:r>
-        <w:rPr>
-          <w:rFonts w:ascii="Arial" w:hAnsi="Arial"/>
-          <w:b/>
-          <w:color w:val="1E293B"/>
-          <w:sz w:val="19"/>
-        </w:rPr>
-        <w:t>Petronas Offshore Safety Passport</w:t>
-      </w:r>
-      <w:r>
-        <w:rPr>
-          <w:rFonts w:ascii="Arial" w:hAnsi="Arial"/>
-          <w:color w:val="475569"/>
-          <w:sz w:val="19"/>
-        </w:rPr>
-        <w:br/>
-        <w:t>Cert No: OSP20240040915 | Date of Expiry: 16th September 2026</w:t>
-      </w:r>
-    </w:p>
-    <w:p>
-      <w:pPr>
-        <w:pStyle w:val="ListBullet"/>
-        <w:spacing w:before="40" w:after="60"/>
-        <w:ind w:left="216"/>
-      </w:pPr>
-      <w:r>
-        <w:rPr>
-          <w:rFonts w:ascii="Arial" w:hAnsi="Arial"/>
-          <w:b/>
-          <w:color w:val="1E293B"/>
-          <w:sz w:val="19"/>
-        </w:rPr>
-        <w:t>FOET &amp; Travel Safely By Boat with CA-EBS (OPITO approved / BOSIET)</w:t>
-      </w:r>
-      <w:r>
-        <w:rPr>
-          <w:rFonts w:ascii="Arial" w:hAnsi="Arial"/>
-          <w:color w:val="475569"/>
-          <w:sz w:val="19"/>
-        </w:rPr>
-        <w:br/>
-        <w:t>OPITO Standard: 5707 / 5750 | Date of Expiry: 1st December 2026</w:t>
-      </w:r>
-    </w:p>
-    <w:p>
-      <w:pPr>
-        <w:pStyle w:val="ListBullet"/>
-        <w:spacing w:before="40" w:after="60"/>
-        <w:ind w:left="216"/>
-      </w:pPr>
-      <w:r>
-        <w:rPr>
-          <w:rFonts w:ascii="Arial" w:hAnsi="Arial"/>
-          <w:b/>
-          <w:color w:val="1E293B"/>
-          <w:sz w:val="19"/>
-        </w:rPr>
-        <w:t>Offshore Medical Examination (ADNOC Approved)</w:t>
-      </w:r>
-      <w:r>
-        <w:rPr>
-          <w:rFonts w:ascii="Arial" w:hAnsi="Arial"/>
-          <w:color w:val="475569"/>
-          <w:sz w:val="19"/>
-        </w:rPr>
-        <w:br/>
-        <w:t>Date of Expiry: 27th October 2026</w:t>
-      </w:r>
-    </w:p>
-    <w:p>
-      <w:pPr>
-        <w:pStyle w:val="ListBullet"/>
-        <w:spacing w:before="40" w:after="60"/>
-        <w:ind w:left="216"/>
-      </w:pPr>
-      <w:r>
-        <w:rPr>
-          <w:rFonts w:ascii="Arial" w:hAnsi="Arial"/>
-          <w:b/>
-          <w:color w:val="1E293B"/>
-          <w:sz w:val="19"/>
-        </w:rPr>
-        <w:t>ADNOC HSE Induction</w:t>
-      </w:r>
-      <w:r>
-        <w:rPr>
-          <w:rFonts w:ascii="Arial" w:hAnsi="Arial"/>
-          <w:color w:val="475569"/>
-          <w:sz w:val="19"/>
-        </w:rPr>
-        <w:br/>
-        <w:t>Date of Expiry: 30th October 2027</w:t>
-      </w:r>
-    </w:p>
-    <w:p>
-      <w:pPr>
-        <w:pStyle w:val="ListBullet"/>
-        <w:spacing w:before="40" w:after="60"/>
-        <w:ind w:left="216"/>
-      </w:pPr>
-      <w:r>
-        <w:rPr>
-          <w:rFonts w:ascii="Arial" w:hAnsi="Arial"/>
-          <w:b/>
-          <w:color w:val="1E293B"/>
-          <w:sz w:val="19"/>
-        </w:rPr>
-        <w:t>Offshore Medical Examination (OEUK &amp; Petronas Approved)</w:t>
-      </w:r>
-      <w:r>
-        <w:rPr>
-          <w:rFonts w:ascii="Arial" w:hAnsi="Arial"/>
-          <w:color w:val="475569"/>
-          <w:sz w:val="19"/>
-        </w:rPr>
-        <w:br/>
-        <w:t>Clinic: Klinik Berkat Sentral | Date of Expiry: 16th September 2026</w:t>
-      </w:r>
-    </w:p>
-    <w:p>
-      <w:pPr>
-        <w:pStyle w:val="ListBullet"/>
-        <w:spacing w:before="40" w:after="60"/>
-        <w:ind w:left="216"/>
-      </w:pPr>
-      <w:r>
-        <w:rPr>
-          <w:rFonts w:ascii="Arial" w:hAnsi="Arial"/>
-          <w:b/>
-          <w:color w:val="1E293B"/>
-          <w:sz w:val="19"/>
-        </w:rPr>
-        <w:t>Basic H2S Training (OPITO Approved / Solas)</w:t>
-      </w:r>
-      <w:r>
-        <w:rPr>
-          <w:rFonts w:ascii="Arial" w:hAnsi="Arial"/>
-          <w:color w:val="475569"/>
-          <w:sz w:val="19"/>
-        </w:rPr>
-        <w:br/>
-        <w:t>OPITO Course Code: 9014 | Date of Expiry: 27th October 2027</w:t>
-      </w:r>
-    </w:p>
-    <w:p>
-      <w:pPr>
-        <w:pStyle w:val="ListBullet"/>
-        <w:spacing w:before="40" w:after="60"/>
-        <w:ind w:left="216"/>
-      </w:pPr>
-      <w:r>
-        <w:rPr>
-          <w:rFonts w:ascii="Arial" w:hAnsi="Arial"/>
-          <w:b/>
-          <w:color w:val="1E293B"/>
-          <w:sz w:val="19"/>
-        </w:rPr>
-        <w:t>Mercury Awareness Training (CLBSADL012)</w:t>
-      </w:r>
-      <w:r>
-        <w:rPr>
-          <w:rFonts w:ascii="Arial" w:hAnsi="Arial"/>
-          <w:color w:val="475569"/>
-          <w:sz w:val="19"/>
-        </w:rPr>
-        <w:br/>
-        <w:t>Date of Expiry: 3rd June 2027</w:t>
-      </w:r>
-    </w:p>
-    <w:p>
-      <w:pPr>
-        <w:pStyle w:val="ListBullet"/>
-        <w:spacing w:before="40" w:after="60"/>
-        <w:ind w:left="216"/>
-      </w:pPr>
-      <w:r>
-        <w:rPr>
-          <w:rFonts w:ascii="Arial" w:hAnsi="Arial"/>
-          <w:b/>
-          <w:color w:val="1E293B"/>
-          <w:sz w:val="19"/>
-        </w:rPr>
-        <w:t>Petronas Carigali Sdn Bhd Permit to Work (PCSB PTW Level 1)</w:t>
-      </w:r>
-      <w:r>
-        <w:rPr>
-          <w:rFonts w:ascii="Arial" w:hAnsi="Arial"/>
-          <w:color w:val="475569"/>
-          <w:sz w:val="19"/>
-        </w:rPr>
-        <w:br/>
-        <w:t>Date of Expiry: 13th October 2027</w:t>
-      </w:r>
-    </w:p>
-    <w:p>
-      <w:pPr>
-        <w:pStyle w:val="ListBullet"/>
-        <w:spacing w:before="40" w:after="60"/>
-        <w:ind w:left="216"/>
-      </w:pPr>
-      <w:r>
-        <w:rPr>
-          <w:rFonts w:ascii="Arial" w:hAnsi="Arial"/>
-          <w:b/>
-          <w:color w:val="1E293B"/>
-          <w:sz w:val="19"/>
-        </w:rPr>
-        <w:t>International Passport</w:t>
-      </w:r>
-      <w:r>
-        <w:rPr>
-          <w:rFonts w:ascii="Arial" w:hAnsi="Arial"/>
-          <w:color w:val="475569"/>
-          <w:sz w:val="19"/>
-        </w:rPr>
-        <w:br/>
-        <w:t>Passport No: A70360403</w:t>
-      </w:r>
-    </w:p>
-    <w:p>
-      <w:pPr>
-        <w:pStyle w:val="ListBullet"/>
-        <w:spacing w:before="40" w:after="60"/>
-        <w:ind w:left="216"/>
-      </w:pPr>
-      <w:r>
-        <w:rPr>
-          <w:rFonts w:ascii="Arial" w:hAnsi="Arial"/>
-          <w:b/>
-          <w:color w:val="1E293B"/>
-          <w:sz w:val="19"/>
-        </w:rPr>
-        <w:t>Bachelor of Engineering (Honours) Petroleum Engineering</w:t>
-      </w:r>
-      <w:r>
-        <w:rPr>
-          <w:rFonts w:ascii="Arial" w:hAnsi="Arial"/>
-          <w:color w:val="475569"/>
-          <w:sz w:val="19"/>
-        </w:rPr>
-        <w:br/>
-        <w:t>Issued by: Universiti Teknologi Malaysia (UTM) | CGPA: 3.44 | Graduation Date: 25th September 2010</w:t>
-      </w:r>
-    </w:p>
+    <w:tbl>
+      <w:tblPr>
+        <w:tblW w:type="auto" w:w="0"/>
+        <w:tblLayout w:type="fixed"/>
+        <w:tblLook w:firstColumn="1" w:firstRow="1" w:lastColumn="0" w:lastRow="0" w:noHBand="0" w:noVBand="1" w:val="04A0"/>
+      </w:tblPr>
+      <w:tblGrid>
+        <w:gridCol w:w="3360"/>
+        <w:gridCol w:w="3360"/>
+        <w:gridCol w:w="3360"/>
+      </w:tblGrid>
+      <w:tr>
+        <w:trPr>
+          <w:cantSplit/>
+        </w:trPr>
+        <w:tc>
+          <w:tcPr>
+            <w:tcW w:type="dxa" w:w="3024"/>
+            <w:tcMar>
+              <w:top w:w="60" w:type="dxa"/>
+              <w:bottom w:w="60" w:type="dxa"/>
+              <w:left w:w="0" w:type="dxa"/>
+              <w:right w:w="50" w:type="dxa"/>
+            </w:tcMar>
+          </w:tcPr>
+          <w:p>
+            <w:pPr>
+              <w:spacing w:before="40" w:after="40"/>
+            </w:pPr>
+            <w:r>
+              <w:rPr>
+                <w:rFonts w:ascii="Arial" w:hAnsi="Arial"/>
+                <w:b/>
+                <w:color w:val="475569"/>
+                <w:sz w:val="19"/>
+              </w:rPr>
+              <w:t>Underwater Inspection Controller Grade CSWIP 3.4U</w:t>
+            </w:r>
+          </w:p>
+        </w:tc>
+        <w:tc>
+          <w:tcPr>
+            <w:tcW w:type="dxa" w:w="288"/>
+            <w:tcMar>
+              <w:top w:w="60" w:type="dxa"/>
+              <w:bottom w:w="60" w:type="dxa"/>
+              <w:left w:w="0" w:type="dxa"/>
+              <w:right w:w="0" w:type="dxa"/>
+            </w:tcMar>
+          </w:tcPr>
+          <w:p>
+            <w:pPr>
+              <w:spacing w:before="40" w:after="40"/>
+            </w:pPr>
+            <w:r>
+              <w:rPr>
+                <w:rFonts w:ascii="Arial" w:hAnsi="Arial"/>
+                <w:color w:val="94A3B8"/>
+                <w:sz w:val="19"/>
+              </w:rPr>
+              <w:t>:</w:t>
+            </w:r>
+          </w:p>
+        </w:tc>
+        <w:tc>
+          <w:tcPr>
+            <w:tcW w:type="dxa" w:w="6768"/>
+            <w:tcMar>
+              <w:top w:w="60" w:type="dxa"/>
+              <w:bottom w:w="60" w:type="dxa"/>
+              <w:left w:w="50" w:type="dxa"/>
+              <w:right w:w="0" w:type="dxa"/>
+            </w:tcMar>
+          </w:tcPr>
+          <w:p>
+            <w:pPr>
+              <w:spacing w:before="40" w:after="40"/>
+            </w:pPr>
+            <w:r>
+              <w:rPr>
+                <w:rFonts w:ascii="Arial" w:hAnsi="Arial"/>
+                <w:color w:val="0F172A"/>
+                <w:sz w:val="19"/>
+              </w:rPr>
+              <w:t>Cert No: 542968 | Issued: 24 Oct 2023 | Date of Expiry: 25th July 2028</w:t>
+            </w:r>
+          </w:p>
+        </w:tc>
+      </w:tr>
+      <w:tr>
+        <w:trPr>
+          <w:cantSplit/>
+        </w:trPr>
+        <w:tc>
+          <w:tcPr>
+            <w:tcW w:type="dxa" w:w="3024"/>
+            <w:tcMar>
+              <w:top w:w="60" w:type="dxa"/>
+              <w:bottom w:w="60" w:type="dxa"/>
+              <w:left w:w="0" w:type="dxa"/>
+              <w:right w:w="50" w:type="dxa"/>
+            </w:tcMar>
+          </w:tcPr>
+          <w:p>
+            <w:pPr>
+              <w:spacing w:before="40" w:after="40"/>
+            </w:pPr>
+            <w:r>
+              <w:rPr>
+                <w:rFonts w:ascii="Arial" w:hAnsi="Arial"/>
+                <w:b/>
+                <w:color w:val="475569"/>
+                <w:sz w:val="19"/>
+              </w:rPr>
+              <w:t>Petronas Offshore Safety Passport</w:t>
+            </w:r>
+          </w:p>
+        </w:tc>
+        <w:tc>
+          <w:tcPr>
+            <w:tcW w:type="dxa" w:w="288"/>
+            <w:tcMar>
+              <w:top w:w="60" w:type="dxa"/>
+              <w:bottom w:w="60" w:type="dxa"/>
+              <w:left w:w="0" w:type="dxa"/>
+              <w:right w:w="0" w:type="dxa"/>
+            </w:tcMar>
+          </w:tcPr>
+          <w:p>
+            <w:pPr>
+              <w:spacing w:before="40" w:after="40"/>
+            </w:pPr>
+            <w:r>
+              <w:rPr>
+                <w:rFonts w:ascii="Arial" w:hAnsi="Arial"/>
+                <w:color w:val="94A3B8"/>
+                <w:sz w:val="19"/>
+              </w:rPr>
+              <w:t>:</w:t>
+            </w:r>
+          </w:p>
+        </w:tc>
+        <w:tc>
+          <w:tcPr>
+            <w:tcW w:type="dxa" w:w="6768"/>
+            <w:tcMar>
+              <w:top w:w="60" w:type="dxa"/>
+              <w:bottom w:w="60" w:type="dxa"/>
+              <w:left w:w="50" w:type="dxa"/>
+              <w:right w:w="0" w:type="dxa"/>
+            </w:tcMar>
+          </w:tcPr>
+          <w:p>
+            <w:pPr>
+              <w:spacing w:before="40" w:after="40"/>
+            </w:pPr>
+            <w:r>
+              <w:rPr>
+                <w:rFonts w:ascii="Arial" w:hAnsi="Arial"/>
+                <w:color w:val="0F172A"/>
+                <w:sz w:val="19"/>
+              </w:rPr>
+              <w:t>Cert No: OSP20240040915 | Date of Expiry: 16th September 2026</w:t>
+            </w:r>
+          </w:p>
+        </w:tc>
+      </w:tr>
+      <w:tr>
+        <w:trPr>
+          <w:cantSplit/>
+        </w:trPr>
+        <w:tc>
+          <w:tcPr>
+            <w:tcW w:type="dxa" w:w="3024"/>
+            <w:tcMar>
+              <w:top w:w="60" w:type="dxa"/>
+              <w:bottom w:w="60" w:type="dxa"/>
+              <w:left w:w="0" w:type="dxa"/>
+              <w:right w:w="50" w:type="dxa"/>
+            </w:tcMar>
+          </w:tcPr>
+          <w:p>
+            <w:pPr>
+              <w:spacing w:before="40" w:after="40"/>
+            </w:pPr>
+            <w:r>
+              <w:rPr>
+                <w:rFonts w:ascii="Arial" w:hAnsi="Arial"/>
+                <w:b/>
+                <w:color w:val="475569"/>
+                <w:sz w:val="19"/>
+              </w:rPr>
+              <w:t>FOET &amp; Travel Safely By Boat with CA-EBS (OPITO approved / BOSIET)</w:t>
+            </w:r>
+          </w:p>
+        </w:tc>
+        <w:tc>
+          <w:tcPr>
+            <w:tcW w:type="dxa" w:w="288"/>
+            <w:tcMar>
+              <w:top w:w="60" w:type="dxa"/>
+              <w:bottom w:w="60" w:type="dxa"/>
+              <w:left w:w="0" w:type="dxa"/>
+              <w:right w:w="0" w:type="dxa"/>
+            </w:tcMar>
+          </w:tcPr>
+          <w:p>
+            <w:pPr>
+              <w:spacing w:before="40" w:after="40"/>
+            </w:pPr>
+            <w:r>
+              <w:rPr>
+                <w:rFonts w:ascii="Arial" w:hAnsi="Arial"/>
+                <w:color w:val="94A3B8"/>
+                <w:sz w:val="19"/>
+              </w:rPr>
+              <w:t>:</w:t>
+            </w:r>
+          </w:p>
+        </w:tc>
+        <w:tc>
+          <w:tcPr>
+            <w:tcW w:type="dxa" w:w="6768"/>
+            <w:tcMar>
+              <w:top w:w="60" w:type="dxa"/>
+              <w:bottom w:w="60" w:type="dxa"/>
+              <w:left w:w="50" w:type="dxa"/>
+              <w:right w:w="0" w:type="dxa"/>
+            </w:tcMar>
+          </w:tcPr>
+          <w:p>
+            <w:pPr>
+              <w:spacing w:before="40" w:after="40"/>
+            </w:pPr>
+            <w:r>
+              <w:rPr>
+                <w:rFonts w:ascii="Arial" w:hAnsi="Arial"/>
+                <w:color w:val="0F172A"/>
+                <w:sz w:val="19"/>
+              </w:rPr>
+              <w:t>OPITO Standard: 5707 / 5750 | Date of Expiry: 1st December 2026</w:t>
+            </w:r>
+          </w:p>
+        </w:tc>
+      </w:tr>
+      <w:tr>
+        <w:trPr>
+          <w:cantSplit/>
+        </w:trPr>
+        <w:tc>
+          <w:tcPr>
+            <w:tcW w:type="dxa" w:w="3024"/>
+            <w:tcMar>
+              <w:top w:w="60" w:type="dxa"/>
+              <w:bottom w:w="60" w:type="dxa"/>
+              <w:left w:w="0" w:type="dxa"/>
+              <w:right w:w="50" w:type="dxa"/>
+            </w:tcMar>
+          </w:tcPr>
+          <w:p>
+            <w:pPr>
+              <w:spacing w:before="40" w:after="40"/>
+            </w:pPr>
+            <w:r>
+              <w:rPr>
+                <w:rFonts w:ascii="Arial" w:hAnsi="Arial"/>
+                <w:b/>
+                <w:color w:val="475569"/>
+                <w:sz w:val="19"/>
+              </w:rPr>
+              <w:t>Offshore Medical Examination (ADNOC Approved)</w:t>
+            </w:r>
+          </w:p>
+        </w:tc>
+        <w:tc>
+          <w:tcPr>
+            <w:tcW w:type="dxa" w:w="288"/>
+            <w:tcMar>
+              <w:top w:w="60" w:type="dxa"/>
+              <w:bottom w:w="60" w:type="dxa"/>
+              <w:left w:w="0" w:type="dxa"/>
+              <w:right w:w="0" w:type="dxa"/>
+            </w:tcMar>
+          </w:tcPr>
+          <w:p>
+            <w:pPr>
+              <w:spacing w:before="40" w:after="40"/>
+            </w:pPr>
+            <w:r>
+              <w:rPr>
+                <w:rFonts w:ascii="Arial" w:hAnsi="Arial"/>
+                <w:color w:val="94A3B8"/>
+                <w:sz w:val="19"/>
+              </w:rPr>
+              <w:t>:</w:t>
+            </w:r>
+          </w:p>
+        </w:tc>
+        <w:tc>
+          <w:tcPr>
+            <w:tcW w:type="dxa" w:w="6768"/>
+            <w:tcMar>
+              <w:top w:w="60" w:type="dxa"/>
+              <w:bottom w:w="60" w:type="dxa"/>
+              <w:left w:w="50" w:type="dxa"/>
+              <w:right w:w="0" w:type="dxa"/>
+            </w:tcMar>
+          </w:tcPr>
+          <w:p>
+            <w:pPr>
+              <w:spacing w:before="40" w:after="40"/>
+            </w:pPr>
+            <w:r>
+              <w:rPr>
+                <w:rFonts w:ascii="Arial" w:hAnsi="Arial"/>
+                <w:color w:val="0F172A"/>
+                <w:sz w:val="19"/>
+              </w:rPr>
+              <w:t>Date of Expiry: 27th October 2026</w:t>
+            </w:r>
+          </w:p>
+        </w:tc>
+      </w:tr>
+      <w:tr>
+        <w:trPr>
+          <w:cantSplit/>
+        </w:trPr>
+        <w:tc>
+          <w:tcPr>
+            <w:tcW w:type="dxa" w:w="3024"/>
+            <w:tcMar>
+              <w:top w:w="60" w:type="dxa"/>
+              <w:bottom w:w="60" w:type="dxa"/>
+              <w:left w:w="0" w:type="dxa"/>
+              <w:right w:w="50" w:type="dxa"/>
+            </w:tcMar>
+          </w:tcPr>
+          <w:p>
+            <w:pPr>
+              <w:spacing w:before="40" w:after="40"/>
+            </w:pPr>
+            <w:r>
+              <w:rPr>
+                <w:rFonts w:ascii="Arial" w:hAnsi="Arial"/>
+                <w:b/>
+                <w:color w:val="475569"/>
+                <w:sz w:val="19"/>
+              </w:rPr>
+              <w:t>ADNOC HSE Induction</w:t>
+            </w:r>
+          </w:p>
+        </w:tc>
+        <w:tc>
+          <w:tcPr>
+            <w:tcW w:type="dxa" w:w="288"/>
+            <w:tcMar>
+              <w:top w:w="60" w:type="dxa"/>
+              <w:bottom w:w="60" w:type="dxa"/>
+              <w:left w:w="0" w:type="dxa"/>
+              <w:right w:w="0" w:type="dxa"/>
+            </w:tcMar>
+          </w:tcPr>
+          <w:p>
+            <w:pPr>
+              <w:spacing w:before="40" w:after="40"/>
+            </w:pPr>
+            <w:r>
+              <w:rPr>
+                <w:rFonts w:ascii="Arial" w:hAnsi="Arial"/>
+                <w:color w:val="94A3B8"/>
+                <w:sz w:val="19"/>
+              </w:rPr>
+              <w:t>:</w:t>
+            </w:r>
+          </w:p>
+        </w:tc>
+        <w:tc>
+          <w:tcPr>
+            <w:tcW w:type="dxa" w:w="6768"/>
+            <w:tcMar>
+              <w:top w:w="60" w:type="dxa"/>
+              <w:bottom w:w="60" w:type="dxa"/>
+              <w:left w:w="50" w:type="dxa"/>
+              <w:right w:w="0" w:type="dxa"/>
+            </w:tcMar>
+          </w:tcPr>
+          <w:p>
+            <w:pPr>
+              <w:spacing w:before="40" w:after="40"/>
+            </w:pPr>
+            <w:r>
+              <w:rPr>
+                <w:rFonts w:ascii="Arial" w:hAnsi="Arial"/>
+                <w:color w:val="0F172A"/>
+                <w:sz w:val="19"/>
+              </w:rPr>
+              <w:t>Date of Expiry: 30th October 2027</w:t>
+            </w:r>
+          </w:p>
+        </w:tc>
+      </w:tr>
+      <w:tr>
+        <w:trPr>
+          <w:cantSplit/>
+        </w:trPr>
+        <w:tc>
+          <w:tcPr>
+            <w:tcW w:type="dxa" w:w="3024"/>
+            <w:tcMar>
+              <w:top w:w="60" w:type="dxa"/>
+              <w:bottom w:w="60" w:type="dxa"/>
+              <w:left w:w="0" w:type="dxa"/>
+              <w:right w:w="50" w:type="dxa"/>
+            </w:tcMar>
+          </w:tcPr>
+          <w:p>
+            <w:pPr>
+              <w:spacing w:before="40" w:after="40"/>
+            </w:pPr>
+            <w:r>
+              <w:rPr>
+                <w:rFonts w:ascii="Arial" w:hAnsi="Arial"/>
+                <w:b/>
+                <w:color w:val="475569"/>
+                <w:sz w:val="19"/>
+              </w:rPr>
+              <w:t>Offshore Medical Examination (OEUK &amp; Petronas Approved)</w:t>
+            </w:r>
+          </w:p>
+        </w:tc>
+        <w:tc>
+          <w:tcPr>
+            <w:tcW w:type="dxa" w:w="288"/>
+            <w:tcMar>
+              <w:top w:w="60" w:type="dxa"/>
+              <w:bottom w:w="60" w:type="dxa"/>
+              <w:left w:w="0" w:type="dxa"/>
+              <w:right w:w="0" w:type="dxa"/>
+            </w:tcMar>
+          </w:tcPr>
+          <w:p>
+            <w:pPr>
+              <w:spacing w:before="40" w:after="40"/>
+            </w:pPr>
+            <w:r>
+              <w:rPr>
+                <w:rFonts w:ascii="Arial" w:hAnsi="Arial"/>
+                <w:color w:val="94A3B8"/>
+                <w:sz w:val="19"/>
+              </w:rPr>
+              <w:t>:</w:t>
+            </w:r>
+          </w:p>
+        </w:tc>
+        <w:tc>
+          <w:tcPr>
+            <w:tcW w:type="dxa" w:w="6768"/>
+            <w:tcMar>
+              <w:top w:w="60" w:type="dxa"/>
+              <w:bottom w:w="60" w:type="dxa"/>
+              <w:left w:w="50" w:type="dxa"/>
+              <w:right w:w="0" w:type="dxa"/>
+            </w:tcMar>
+          </w:tcPr>
+          <w:p>
+            <w:pPr>
+              <w:spacing w:before="40" w:after="40"/>
+            </w:pPr>
+            <w:r>
+              <w:rPr>
+                <w:rFonts w:ascii="Arial" w:hAnsi="Arial"/>
+                <w:color w:val="0F172A"/>
+                <w:sz w:val="19"/>
+              </w:rPr>
+              <w:t>Clinic: Klinik Berkat Sentral | Date of Expiry: 16th September 2026</w:t>
+            </w:r>
+          </w:p>
+        </w:tc>
+      </w:tr>
+      <w:tr>
+        <w:trPr>
+          <w:cantSplit/>
+        </w:trPr>
+        <w:tc>
+          <w:tcPr>
+            <w:tcW w:type="dxa" w:w="3024"/>
+            <w:tcMar>
+              <w:top w:w="60" w:type="dxa"/>
+              <w:bottom w:w="60" w:type="dxa"/>
+              <w:left w:w="0" w:type="dxa"/>
+              <w:right w:w="50" w:type="dxa"/>
+            </w:tcMar>
+          </w:tcPr>
+          <w:p>
+            <w:pPr>
+              <w:spacing w:before="40" w:after="40"/>
+            </w:pPr>
+            <w:r>
+              <w:rPr>
+                <w:rFonts w:ascii="Arial" w:hAnsi="Arial"/>
+                <w:b/>
+                <w:color w:val="475569"/>
+                <w:sz w:val="19"/>
+              </w:rPr>
+              <w:t>Basic H2S Training (OPITO Approved / Solas)</w:t>
+            </w:r>
+          </w:p>
+        </w:tc>
+        <w:tc>
+          <w:tcPr>
+            <w:tcW w:type="dxa" w:w="288"/>
+            <w:tcMar>
+              <w:top w:w="60" w:type="dxa"/>
+              <w:bottom w:w="60" w:type="dxa"/>
+              <w:left w:w="0" w:type="dxa"/>
+              <w:right w:w="0" w:type="dxa"/>
+            </w:tcMar>
+          </w:tcPr>
+          <w:p>
+            <w:pPr>
+              <w:spacing w:before="40" w:after="40"/>
+            </w:pPr>
+            <w:r>
+              <w:rPr>
+                <w:rFonts w:ascii="Arial" w:hAnsi="Arial"/>
+                <w:color w:val="94A3B8"/>
+                <w:sz w:val="19"/>
+              </w:rPr>
+              <w:t>:</w:t>
+            </w:r>
+          </w:p>
+        </w:tc>
+        <w:tc>
+          <w:tcPr>
+            <w:tcW w:type="dxa" w:w="6768"/>
+            <w:tcMar>
+              <w:top w:w="60" w:type="dxa"/>
+              <w:bottom w:w="60" w:type="dxa"/>
+              <w:left w:w="50" w:type="dxa"/>
+              <w:right w:w="0" w:type="dxa"/>
+            </w:tcMar>
+          </w:tcPr>
+          <w:p>
+            <w:pPr>
+              <w:spacing w:before="40" w:after="40"/>
+            </w:pPr>
+            <w:r>
+              <w:rPr>
+                <w:rFonts w:ascii="Arial" w:hAnsi="Arial"/>
+                <w:color w:val="0F172A"/>
+                <w:sz w:val="19"/>
+              </w:rPr>
+              <w:t>OPITO Course Code: 9014 | Date of Expiry: 27th October 2027</w:t>
+            </w:r>
+          </w:p>
+        </w:tc>
+      </w:tr>
+      <w:tr>
+        <w:trPr>
+          <w:cantSplit/>
+        </w:trPr>
+        <w:tc>
+          <w:tcPr>
+            <w:tcW w:type="dxa" w:w="3024"/>
+            <w:tcMar>
+              <w:top w:w="60" w:type="dxa"/>
+              <w:bottom w:w="60" w:type="dxa"/>
+              <w:left w:w="0" w:type="dxa"/>
+              <w:right w:w="50" w:type="dxa"/>
+            </w:tcMar>
+          </w:tcPr>
+          <w:p>
+            <w:pPr>
+              <w:spacing w:before="40" w:after="40"/>
+            </w:pPr>
+            <w:r>
+              <w:rPr>
+                <w:rFonts w:ascii="Arial" w:hAnsi="Arial"/>
+                <w:b/>
+                <w:color w:val="475569"/>
+                <w:sz w:val="19"/>
+              </w:rPr>
+              <w:t>Mercury Awareness Training (CLBSADL012)</w:t>
+            </w:r>
+          </w:p>
+        </w:tc>
+        <w:tc>
+          <w:tcPr>
+            <w:tcW w:type="dxa" w:w="288"/>
+            <w:tcMar>
+              <w:top w:w="60" w:type="dxa"/>
+              <w:bottom w:w="60" w:type="dxa"/>
+              <w:left w:w="0" w:type="dxa"/>
+              <w:right w:w="0" w:type="dxa"/>
+            </w:tcMar>
+          </w:tcPr>
+          <w:p>
+            <w:pPr>
+              <w:spacing w:before="40" w:after="40"/>
+            </w:pPr>
+            <w:r>
+              <w:rPr>
+                <w:rFonts w:ascii="Arial" w:hAnsi="Arial"/>
+                <w:color w:val="94A3B8"/>
+                <w:sz w:val="19"/>
+              </w:rPr>
+              <w:t>:</w:t>
+            </w:r>
+          </w:p>
+        </w:tc>
+        <w:tc>
+          <w:tcPr>
+            <w:tcW w:type="dxa" w:w="6768"/>
+            <w:tcMar>
+              <w:top w:w="60" w:type="dxa"/>
+              <w:bottom w:w="60" w:type="dxa"/>
+              <w:left w:w="50" w:type="dxa"/>
+              <w:right w:w="0" w:type="dxa"/>
+            </w:tcMar>
+          </w:tcPr>
+          <w:p>
+            <w:pPr>
+              <w:spacing w:before="40" w:after="40"/>
+            </w:pPr>
+            <w:r>
+              <w:rPr>
+                <w:rFonts w:ascii="Arial" w:hAnsi="Arial"/>
+                <w:color w:val="0F172A"/>
+                <w:sz w:val="19"/>
+              </w:rPr>
+              <w:t>Date of Expiry: 3rd June 2027</w:t>
+            </w:r>
+          </w:p>
+        </w:tc>
+      </w:tr>
+      <w:tr>
+        <w:trPr>
+          <w:cantSplit/>
+        </w:trPr>
+        <w:tc>
+          <w:tcPr>
+            <w:tcW w:type="dxa" w:w="3024"/>
+            <w:tcMar>
+              <w:top w:w="60" w:type="dxa"/>
+              <w:bottom w:w="60" w:type="dxa"/>
+              <w:left w:w="0" w:type="dxa"/>
+              <w:right w:w="50" w:type="dxa"/>
+            </w:tcMar>
+          </w:tcPr>
+          <w:p>
+            <w:pPr>
+              <w:spacing w:before="40" w:after="40"/>
+            </w:pPr>
+            <w:r>
+              <w:rPr>
+                <w:rFonts w:ascii="Arial" w:hAnsi="Arial"/>
+                <w:b/>
+                <w:color w:val="475569"/>
+                <w:sz w:val="19"/>
+              </w:rPr>
+              <w:t>Petronas Carigali Sdn Bhd Permit to Work (PCSB PTW Level 1)</w:t>
+            </w:r>
+          </w:p>
+        </w:tc>
+        <w:tc>
+          <w:tcPr>
+            <w:tcW w:type="dxa" w:w="288"/>
+            <w:tcMar>
+              <w:top w:w="60" w:type="dxa"/>
+              <w:bottom w:w="60" w:type="dxa"/>
+              <w:left w:w="0" w:type="dxa"/>
+              <w:right w:w="0" w:type="dxa"/>
+            </w:tcMar>
+          </w:tcPr>
+          <w:p>
+            <w:pPr>
+              <w:spacing w:before="40" w:after="40"/>
+            </w:pPr>
+            <w:r>
+              <w:rPr>
+                <w:rFonts w:ascii="Arial" w:hAnsi="Arial"/>
+                <w:color w:val="94A3B8"/>
+                <w:sz w:val="19"/>
+              </w:rPr>
+              <w:t>:</w:t>
+            </w:r>
+          </w:p>
+        </w:tc>
+        <w:tc>
+          <w:tcPr>
+            <w:tcW w:type="dxa" w:w="6768"/>
+            <w:tcMar>
+              <w:top w:w="60" w:type="dxa"/>
+              <w:bottom w:w="60" w:type="dxa"/>
+              <w:left w:w="50" w:type="dxa"/>
+              <w:right w:w="0" w:type="dxa"/>
+            </w:tcMar>
+          </w:tcPr>
+          <w:p>
+            <w:pPr>
+              <w:spacing w:before="40" w:after="40"/>
+            </w:pPr>
+            <w:r>
+              <w:rPr>
+                <w:rFonts w:ascii="Arial" w:hAnsi="Arial"/>
+                <w:color w:val="0F172A"/>
+                <w:sz w:val="19"/>
+              </w:rPr>
+              <w:t>Date of Expiry: 13th October 2027</w:t>
+            </w:r>
+          </w:p>
+        </w:tc>
+      </w:tr>
+      <w:tr>
+        <w:trPr>
+          <w:cantSplit/>
+        </w:trPr>
+        <w:tc>
+          <w:tcPr>
+            <w:tcW w:type="dxa" w:w="3024"/>
+            <w:tcMar>
+              <w:top w:w="60" w:type="dxa"/>
+              <w:bottom w:w="60" w:type="dxa"/>
+              <w:left w:w="0" w:type="dxa"/>
+              <w:right w:w="50" w:type="dxa"/>
+            </w:tcMar>
+          </w:tcPr>
+          <w:p>
+            <w:pPr>
+              <w:spacing w:before="40" w:after="40"/>
+            </w:pPr>
+            <w:r>
+              <w:rPr>
+                <w:rFonts w:ascii="Arial" w:hAnsi="Arial"/>
+                <w:b/>
+                <w:color w:val="475569"/>
+                <w:sz w:val="19"/>
+              </w:rPr>
+              <w:t>International Passport</w:t>
+            </w:r>
+          </w:p>
+        </w:tc>
+        <w:tc>
+          <w:tcPr>
+            <w:tcW w:type="dxa" w:w="288"/>
+            <w:tcMar>
+              <w:top w:w="60" w:type="dxa"/>
+              <w:bottom w:w="60" w:type="dxa"/>
+              <w:left w:w="0" w:type="dxa"/>
+              <w:right w:w="0" w:type="dxa"/>
+            </w:tcMar>
+          </w:tcPr>
+          <w:p>
+            <w:pPr>
+              <w:spacing w:before="40" w:after="40"/>
+            </w:pPr>
+            <w:r>
+              <w:rPr>
+                <w:rFonts w:ascii="Arial" w:hAnsi="Arial"/>
+                <w:color w:val="94A3B8"/>
+                <w:sz w:val="19"/>
+              </w:rPr>
+              <w:t>:</w:t>
+            </w:r>
+          </w:p>
+        </w:tc>
+        <w:tc>
+          <w:tcPr>
+            <w:tcW w:type="dxa" w:w="6768"/>
+            <w:tcMar>
+              <w:top w:w="60" w:type="dxa"/>
+              <w:bottom w:w="60" w:type="dxa"/>
+              <w:left w:w="50" w:type="dxa"/>
+              <w:right w:w="0" w:type="dxa"/>
+            </w:tcMar>
+          </w:tcPr>
+          <w:p>
+            <w:pPr>
+              <w:spacing w:before="40" w:after="40"/>
+            </w:pPr>
+            <w:r>
+              <w:rPr>
+                <w:rFonts w:ascii="Arial" w:hAnsi="Arial"/>
+                <w:color w:val="0F172A"/>
+                <w:sz w:val="19"/>
+              </w:rPr>
+              <w:t>Passport No: A70360403</w:t>
+            </w:r>
+          </w:p>
+        </w:tc>
+      </w:tr>
+      <w:tr>
+        <w:trPr>
+          <w:cantSplit/>
+        </w:trPr>
+        <w:tc>
+          <w:tcPr>
+            <w:tcW w:type="dxa" w:w="3024"/>
+            <w:tcMar>
+              <w:top w:w="60" w:type="dxa"/>
+              <w:bottom w:w="60" w:type="dxa"/>
+              <w:left w:w="0" w:type="dxa"/>
+              <w:right w:w="50" w:type="dxa"/>
+            </w:tcMar>
+          </w:tcPr>
+          <w:p>
+            <w:pPr>
+              <w:spacing w:before="40" w:after="40"/>
+            </w:pPr>
+            <w:r>
+              <w:rPr>
+                <w:rFonts w:ascii="Arial" w:hAnsi="Arial"/>
+                <w:b/>
+                <w:color w:val="475569"/>
+                <w:sz w:val="19"/>
+              </w:rPr>
+              <w:t>Bachelor of Engineering (Honours) Petroleum Engineering</w:t>
+            </w:r>
+          </w:p>
+        </w:tc>
+        <w:tc>
+          <w:tcPr>
+            <w:tcW w:type="dxa" w:w="288"/>
+            <w:tcMar>
+              <w:top w:w="60" w:type="dxa"/>
+              <w:bottom w:w="60" w:type="dxa"/>
+              <w:left w:w="0" w:type="dxa"/>
+              <w:right w:w="0" w:type="dxa"/>
+            </w:tcMar>
+          </w:tcPr>
+          <w:p>
+            <w:pPr>
+              <w:spacing w:before="40" w:after="40"/>
+            </w:pPr>
+            <w:r>
+              <w:rPr>
+                <w:rFonts w:ascii="Arial" w:hAnsi="Arial"/>
+                <w:color w:val="94A3B8"/>
+                <w:sz w:val="19"/>
+              </w:rPr>
+              <w:t>:</w:t>
+            </w:r>
+          </w:p>
+        </w:tc>
+        <w:tc>
+          <w:tcPr>
+            <w:tcW w:type="dxa" w:w="6768"/>
+            <w:tcMar>
+              <w:top w:w="60" w:type="dxa"/>
+              <w:bottom w:w="60" w:type="dxa"/>
+              <w:left w:w="50" w:type="dxa"/>
+              <w:right w:w="0" w:type="dxa"/>
+            </w:tcMar>
+          </w:tcPr>
+          <w:p>
+            <w:pPr>
+              <w:spacing w:before="40" w:after="40"/>
+            </w:pPr>
+            <w:r>
+              <w:rPr>
+                <w:rFonts w:ascii="Arial" w:hAnsi="Arial"/>
+                <w:color w:val="0F172A"/>
+                <w:sz w:val="19"/>
+              </w:rPr>
+              <w:t>Issued by: Universiti Teknologi Malaysia (UTM) | CGPA: 3.44 | Graduation Date: 25th September 2010</w:t>
+            </w:r>
+          </w:p>
+        </w:tc>
+      </w:tr>
+    </w:tbl>
     <w:p>
       <w:pPr>
         <w:keepNext/>

</xml_diff>

<commit_message>
Optimize CV: set equal column widths (50/50 split) for the qualifications section in classic_cv.html and convert_to_word.py, regenerate Muhammad_Amin_Azman_CV.docx
</commit_message>
<xml_diff>
--- a/Muhammad_Amin_Azman_CV.docx
+++ b/Muhammad_Amin_Azman_CV.docx
@@ -958,7 +958,7 @@
         </w:trPr>
         <w:tc>
           <w:tcPr>
-            <w:tcW w:type="dxa" w:w="3024"/>
+            <w:tcW w:type="dxa" w:w="4896"/>
             <w:tcMar>
               <w:top w:w="60" w:type="dxa"/>
               <w:bottom w:w="60" w:type="dxa"/>
@@ -1007,7 +1007,7 @@
         </w:tc>
         <w:tc>
           <w:tcPr>
-            <w:tcW w:type="dxa" w:w="6768"/>
+            <w:tcW w:type="dxa" w:w="4896"/>
             <w:tcMar>
               <w:top w:w="60" w:type="dxa"/>
               <w:bottom w:w="60" w:type="dxa"/>
@@ -1036,7 +1036,7 @@
         </w:trPr>
         <w:tc>
           <w:tcPr>
-            <w:tcW w:type="dxa" w:w="3024"/>
+            <w:tcW w:type="dxa" w:w="4896"/>
             <w:tcMar>
               <w:top w:w="60" w:type="dxa"/>
               <w:bottom w:w="60" w:type="dxa"/>
@@ -1085,7 +1085,7 @@
         </w:tc>
         <w:tc>
           <w:tcPr>
-            <w:tcW w:type="dxa" w:w="6768"/>
+            <w:tcW w:type="dxa" w:w="4896"/>
             <w:tcMar>
               <w:top w:w="60" w:type="dxa"/>
               <w:bottom w:w="60" w:type="dxa"/>
@@ -1114,7 +1114,7 @@
         </w:trPr>
         <w:tc>
           <w:tcPr>
-            <w:tcW w:type="dxa" w:w="3024"/>
+            <w:tcW w:type="dxa" w:w="4896"/>
             <w:tcMar>
               <w:top w:w="60" w:type="dxa"/>
               <w:bottom w:w="60" w:type="dxa"/>
@@ -1163,7 +1163,7 @@
         </w:tc>
         <w:tc>
           <w:tcPr>
-            <w:tcW w:type="dxa" w:w="6768"/>
+            <w:tcW w:type="dxa" w:w="4896"/>
             <w:tcMar>
               <w:top w:w="60" w:type="dxa"/>
               <w:bottom w:w="60" w:type="dxa"/>
@@ -1192,7 +1192,7 @@
         </w:trPr>
         <w:tc>
           <w:tcPr>
-            <w:tcW w:type="dxa" w:w="3024"/>
+            <w:tcW w:type="dxa" w:w="4896"/>
             <w:tcMar>
               <w:top w:w="60" w:type="dxa"/>
               <w:bottom w:w="60" w:type="dxa"/>
@@ -1241,7 +1241,7 @@
         </w:tc>
         <w:tc>
           <w:tcPr>
-            <w:tcW w:type="dxa" w:w="6768"/>
+            <w:tcW w:type="dxa" w:w="4896"/>
             <w:tcMar>
               <w:top w:w="60" w:type="dxa"/>
               <w:bottom w:w="60" w:type="dxa"/>
@@ -1270,7 +1270,7 @@
         </w:trPr>
         <w:tc>
           <w:tcPr>
-            <w:tcW w:type="dxa" w:w="3024"/>
+            <w:tcW w:type="dxa" w:w="4896"/>
             <w:tcMar>
               <w:top w:w="60" w:type="dxa"/>
               <w:bottom w:w="60" w:type="dxa"/>
@@ -1319,7 +1319,7 @@
         </w:tc>
         <w:tc>
           <w:tcPr>
-            <w:tcW w:type="dxa" w:w="6768"/>
+            <w:tcW w:type="dxa" w:w="4896"/>
             <w:tcMar>
               <w:top w:w="60" w:type="dxa"/>
               <w:bottom w:w="60" w:type="dxa"/>
@@ -1348,7 +1348,7 @@
         </w:trPr>
         <w:tc>
           <w:tcPr>
-            <w:tcW w:type="dxa" w:w="3024"/>
+            <w:tcW w:type="dxa" w:w="4896"/>
             <w:tcMar>
               <w:top w:w="60" w:type="dxa"/>
               <w:bottom w:w="60" w:type="dxa"/>
@@ -1397,7 +1397,7 @@
         </w:tc>
         <w:tc>
           <w:tcPr>
-            <w:tcW w:type="dxa" w:w="6768"/>
+            <w:tcW w:type="dxa" w:w="4896"/>
             <w:tcMar>
               <w:top w:w="60" w:type="dxa"/>
               <w:bottom w:w="60" w:type="dxa"/>
@@ -1426,7 +1426,7 @@
         </w:trPr>
         <w:tc>
           <w:tcPr>
-            <w:tcW w:type="dxa" w:w="3024"/>
+            <w:tcW w:type="dxa" w:w="4896"/>
             <w:tcMar>
               <w:top w:w="60" w:type="dxa"/>
               <w:bottom w:w="60" w:type="dxa"/>
@@ -1475,7 +1475,7 @@
         </w:tc>
         <w:tc>
           <w:tcPr>
-            <w:tcW w:type="dxa" w:w="6768"/>
+            <w:tcW w:type="dxa" w:w="4896"/>
             <w:tcMar>
               <w:top w:w="60" w:type="dxa"/>
               <w:bottom w:w="60" w:type="dxa"/>
@@ -1504,7 +1504,7 @@
         </w:trPr>
         <w:tc>
           <w:tcPr>
-            <w:tcW w:type="dxa" w:w="3024"/>
+            <w:tcW w:type="dxa" w:w="4896"/>
             <w:tcMar>
               <w:top w:w="60" w:type="dxa"/>
               <w:bottom w:w="60" w:type="dxa"/>
@@ -1553,7 +1553,7 @@
         </w:tc>
         <w:tc>
           <w:tcPr>
-            <w:tcW w:type="dxa" w:w="6768"/>
+            <w:tcW w:type="dxa" w:w="4896"/>
             <w:tcMar>
               <w:top w:w="60" w:type="dxa"/>
               <w:bottom w:w="60" w:type="dxa"/>
@@ -1582,7 +1582,7 @@
         </w:trPr>
         <w:tc>
           <w:tcPr>
-            <w:tcW w:type="dxa" w:w="3024"/>
+            <w:tcW w:type="dxa" w:w="4896"/>
             <w:tcMar>
               <w:top w:w="60" w:type="dxa"/>
               <w:bottom w:w="60" w:type="dxa"/>
@@ -1631,7 +1631,7 @@
         </w:tc>
         <w:tc>
           <w:tcPr>
-            <w:tcW w:type="dxa" w:w="6768"/>
+            <w:tcW w:type="dxa" w:w="4896"/>
             <w:tcMar>
               <w:top w:w="60" w:type="dxa"/>
               <w:bottom w:w="60" w:type="dxa"/>
@@ -1660,7 +1660,7 @@
         </w:trPr>
         <w:tc>
           <w:tcPr>
-            <w:tcW w:type="dxa" w:w="3024"/>
+            <w:tcW w:type="dxa" w:w="4896"/>
             <w:tcMar>
               <w:top w:w="60" w:type="dxa"/>
               <w:bottom w:w="60" w:type="dxa"/>
@@ -1709,7 +1709,7 @@
         </w:tc>
         <w:tc>
           <w:tcPr>
-            <w:tcW w:type="dxa" w:w="6768"/>
+            <w:tcW w:type="dxa" w:w="4896"/>
             <w:tcMar>
               <w:top w:w="60" w:type="dxa"/>
               <w:bottom w:w="60" w:type="dxa"/>
@@ -1738,7 +1738,7 @@
         </w:trPr>
         <w:tc>
           <w:tcPr>
-            <w:tcW w:type="dxa" w:w="3024"/>
+            <w:tcW w:type="dxa" w:w="4896"/>
             <w:tcMar>
               <w:top w:w="60" w:type="dxa"/>
               <w:bottom w:w="60" w:type="dxa"/>
@@ -1787,7 +1787,7 @@
         </w:tc>
         <w:tc>
           <w:tcPr>
-            <w:tcW w:type="dxa" w:w="6768"/>
+            <w:tcW w:type="dxa" w:w="4896"/>
             <w:tcMar>
               <w:top w:w="60" w:type="dxa"/>
               <w:bottom w:w="60" w:type="dxa"/>

</xml_diff>

<commit_message>
Optimize CV: remove the Professional Evaluation / Appraisal section from classic_cv.html and convert_to_word.py, regenerate Muhammad_Amin_Azman_CV.docx
</commit_message>
<xml_diff>
--- a/Muhammad_Amin_Azman_CV.docx
+++ b/Muhammad_Amin_Azman_CV.docx
@@ -9500,48 +9500,6 @@
           <w:color w:val="0F172A"/>
           <w:sz w:val="23"/>
         </w:rPr>
-        <w:t>PROFESSIONAL EVALUATION / APPRAISAL</w:t>
-      </w:r>
-    </w:p>
-    <w:p>
-      <w:pPr>
-        <w:spacing w:before="120" w:after="240"/>
-      </w:pPr>
-      <w:r>
-        <w:rPr>
-          <w:rFonts w:ascii="Arial" w:hAnsi="Arial"/>
-          <w:i/>
-          <w:color w:val="475569"/>
-          <w:sz w:val="19"/>
-        </w:rPr>
-        <w:t>Professional Evaluation: Muhammad Amin has been recognized for his reliability, performance quality, and meticulous subsea reporting. RINA and Petronas clients have commended his data recorder workflows.</w:t>
-      </w:r>
-    </w:p>
-    <w:p>
-      <w:r>
-        <w:rPr>
-          <w:rFonts w:ascii="Arial" w:hAnsi="Arial"/>
-          <w:color w:val="0284C7"/>
-          <w:sz w:val="18"/>
-        </w:rPr>
-        <w:t>Appraisal Letter Verification: tinyurl.com/aminazman-inspection (See Certificates section)</w:t>
-      </w:r>
-    </w:p>
-    <w:p>
-      <w:pPr>
-        <w:keepNext/>
-        <w:spacing w:before="360" w:after="120"/>
-        <w:pBdr>
-          <w:bottom w:val="single" w:sz="12" w:space="4" w:color="0284C7"/>
-        </w:pBdr>
-      </w:pPr>
-      <w:r>
-        <w:rPr>
-          <w:rFonts w:ascii="Arial" w:hAnsi="Arial"/>
-          <w:b/>
-          <w:color w:val="0F172A"/>
-          <w:sz w:val="23"/>
-        </w:rPr>
         <w:t>REFEREES</w:t>
       </w:r>
     </w:p>

</xml_diff>

<commit_message>
Optimize CV: remove the Client ADNOC metadata rows from the two Fugro Middle East campaigns in classic_cv.html and convert_to_word.py, regenerate Muhammad_Amin_Azman_CV.docx
</commit_message>
<xml_diff>
--- a/Muhammad_Amin_Azman_CV.docx
+++ b/Muhammad_Amin_Azman_CV.docx
@@ -138,22 +138,22 @@
         <w:tblLook w:firstColumn="1" w:firstRow="1" w:lastColumn="0" w:lastRow="0" w:noHBand="0" w:noVBand="1" w:val="04A0"/>
       </w:tblPr>
       <w:tblGrid>
-        <w:gridCol w:w="3360"/>
-        <w:gridCol w:w="3360"/>
-        <w:gridCol w:w="3360"/>
+        <w:gridCol w:w="1680"/>
+        <w:gridCol w:w="1680"/>
+        <w:gridCol w:w="1680"/>
+        <w:gridCol w:w="1680"/>
+        <w:gridCol w:w="1680"/>
+        <w:gridCol w:w="1680"/>
       </w:tblGrid>
       <w:tr>
-        <w:trPr>
-          <w:cantSplit/>
-        </w:trPr>
         <w:tc>
           <w:tcPr>
-            <w:tcW w:type="dxa" w:w="3024"/>
+            <w:tcW w:type="dxa" w:w="1728"/>
             <w:tcMar>
               <w:top w:w="60" w:type="dxa"/>
               <w:bottom w:w="60" w:type="dxa"/>
               <w:left w:w="0" w:type="dxa"/>
-              <w:right w:w="50" w:type="dxa"/>
+              <w:right w:w="20" w:type="dxa"/>
             </w:tcMar>
           </w:tcPr>
           <w:p>
@@ -173,7 +173,7 @@
         </w:tc>
         <w:tc>
           <w:tcPr>
-            <w:tcW w:type="dxa" w:w="288"/>
+            <w:tcW w:type="dxa" w:w="216"/>
             <w:tcMar>
               <w:top w:w="60" w:type="dxa"/>
               <w:bottom w:w="60" w:type="dxa"/>
@@ -197,12 +197,12 @@
         </w:tc>
         <w:tc>
           <w:tcPr>
-            <w:tcW w:type="dxa" w:w="6768"/>
+            <w:tcW w:type="dxa" w:w="3096"/>
             <w:tcMar>
               <w:top w:w="60" w:type="dxa"/>
               <w:bottom w:w="60" w:type="dxa"/>
-              <w:left w:w="50" w:type="dxa"/>
-              <w:right w:w="0" w:type="dxa"/>
+              <w:left w:w="20" w:type="dxa"/>
+              <w:right w:w="30" w:type="dxa"/>
             </w:tcMar>
           </w:tcPr>
           <w:p>
@@ -212,26 +212,21 @@
             <w:r>
               <w:rPr>
                 <w:rFonts w:ascii="Arial" w:hAnsi="Arial"/>
-                <w:color w:val="0F172A"/>
+                <w:b/>
                 <w:sz w:val="19"/>
               </w:rPr>
               <w:t>MUHAMMAD AMIN BIN AZMAN</w:t>
             </w:r>
           </w:p>
         </w:tc>
-      </w:tr>
-      <w:tr>
-        <w:trPr>
-          <w:cantSplit/>
-        </w:trPr>
         <w:tc>
           <w:tcPr>
-            <w:tcW w:type="dxa" w:w="3024"/>
+            <w:tcW w:type="dxa" w:w="1728"/>
             <w:tcMar>
               <w:top w:w="60" w:type="dxa"/>
               <w:bottom w:w="60" w:type="dxa"/>
-              <w:left w:w="0" w:type="dxa"/>
-              <w:right w:w="50" w:type="dxa"/>
+              <w:left w:w="20" w:type="dxa"/>
+              <w:right w:w="20" w:type="dxa"/>
             </w:tcMar>
           </w:tcPr>
           <w:p>
@@ -245,13 +240,13 @@
                 <w:color w:val="475569"/>
                 <w:sz w:val="19"/>
               </w:rPr>
-              <w:t>I/C No.</w:t>
+              <w:t>Point of Hire</w:t>
             </w:r>
           </w:p>
         </w:tc>
         <w:tc>
           <w:tcPr>
-            <w:tcW w:type="dxa" w:w="288"/>
+            <w:tcW w:type="dxa" w:w="216"/>
             <w:tcMar>
               <w:top w:w="60" w:type="dxa"/>
               <w:bottom w:w="60" w:type="dxa"/>
@@ -275,11 +270,11 @@
         </w:tc>
         <w:tc>
           <w:tcPr>
-            <w:tcW w:type="dxa" w:w="6768"/>
+            <w:tcW w:type="dxa" w:w="3096"/>
             <w:tcMar>
               <w:top w:w="60" w:type="dxa"/>
               <w:bottom w:w="60" w:type="dxa"/>
-              <w:left w:w="50" w:type="dxa"/>
+              <w:left w:w="20" w:type="dxa"/>
               <w:right w:w="0" w:type="dxa"/>
             </w:tcMar>
           </w:tcPr>
@@ -290,26 +285,22 @@
             <w:r>
               <w:rPr>
                 <w:rFonts w:ascii="Arial" w:hAnsi="Arial"/>
-                <w:color w:val="0F172A"/>
                 <w:sz w:val="19"/>
               </w:rPr>
-              <w:t>870217-02-5591</w:t>
+              <w:t>PENANG, MALAYSIA</w:t>
             </w:r>
           </w:p>
         </w:tc>
       </w:tr>
       <w:tr>
-        <w:trPr>
-          <w:cantSplit/>
-        </w:trPr>
         <w:tc>
           <w:tcPr>
-            <w:tcW w:type="dxa" w:w="3024"/>
+            <w:tcW w:type="dxa" w:w="1728"/>
             <w:tcMar>
               <w:top w:w="60" w:type="dxa"/>
               <w:bottom w:w="60" w:type="dxa"/>
               <w:left w:w="0" w:type="dxa"/>
-              <w:right w:w="50" w:type="dxa"/>
+              <w:right w:w="20" w:type="dxa"/>
             </w:tcMar>
           </w:tcPr>
           <w:p>
@@ -323,13 +314,13 @@
                 <w:color w:val="475569"/>
                 <w:sz w:val="19"/>
               </w:rPr>
-              <w:t>Date of Birth</w:t>
+              <w:t>I/C No.</w:t>
             </w:r>
           </w:p>
         </w:tc>
         <w:tc>
           <w:tcPr>
-            <w:tcW w:type="dxa" w:w="288"/>
+            <w:tcW w:type="dxa" w:w="216"/>
             <w:tcMar>
               <w:top w:w="60" w:type="dxa"/>
               <w:bottom w:w="60" w:type="dxa"/>
@@ -353,12 +344,12 @@
         </w:tc>
         <w:tc>
           <w:tcPr>
-            <w:tcW w:type="dxa" w:w="6768"/>
+            <w:tcW w:type="dxa" w:w="3096"/>
             <w:tcMar>
               <w:top w:w="60" w:type="dxa"/>
               <w:bottom w:w="60" w:type="dxa"/>
-              <w:left w:w="50" w:type="dxa"/>
-              <w:right w:w="0" w:type="dxa"/>
+              <w:left w:w="20" w:type="dxa"/>
+              <w:right w:w="30" w:type="dxa"/>
             </w:tcMar>
           </w:tcPr>
           <w:p>
@@ -368,26 +359,20 @@
             <w:r>
               <w:rPr>
                 <w:rFonts w:ascii="Arial" w:hAnsi="Arial"/>
-                <w:color w:val="0F172A"/>
                 <w:sz w:val="19"/>
               </w:rPr>
-              <w:t>17th February 1987</w:t>
+              <w:t>870217-02-5591</w:t>
             </w:r>
           </w:p>
         </w:tc>
-      </w:tr>
-      <w:tr>
-        <w:trPr>
-          <w:cantSplit/>
-        </w:trPr>
         <w:tc>
           <w:tcPr>
-            <w:tcW w:type="dxa" w:w="3024"/>
+            <w:tcW w:type="dxa" w:w="1728"/>
             <w:tcMar>
               <w:top w:w="60" w:type="dxa"/>
               <w:bottom w:w="60" w:type="dxa"/>
-              <w:left w:w="0" w:type="dxa"/>
-              <w:right w:w="50" w:type="dxa"/>
+              <w:left w:w="20" w:type="dxa"/>
+              <w:right w:w="20" w:type="dxa"/>
             </w:tcMar>
           </w:tcPr>
           <w:p>
@@ -401,13 +386,13 @@
                 <w:color w:val="475569"/>
                 <w:sz w:val="19"/>
               </w:rPr>
-              <w:t>Nationality</w:t>
+              <w:t>Contact No.</w:t>
             </w:r>
           </w:p>
         </w:tc>
         <w:tc>
           <w:tcPr>
-            <w:tcW w:type="dxa" w:w="288"/>
+            <w:tcW w:type="dxa" w:w="216"/>
             <w:tcMar>
               <w:top w:w="60" w:type="dxa"/>
               <w:bottom w:w="60" w:type="dxa"/>
@@ -431,11 +416,11 @@
         </w:tc>
         <w:tc>
           <w:tcPr>
-            <w:tcW w:type="dxa" w:w="6768"/>
+            <w:tcW w:type="dxa" w:w="3096"/>
             <w:tcMar>
               <w:top w:w="60" w:type="dxa"/>
               <w:bottom w:w="60" w:type="dxa"/>
-              <w:left w:w="50" w:type="dxa"/>
+              <w:left w:w="20" w:type="dxa"/>
               <w:right w:w="0" w:type="dxa"/>
             </w:tcMar>
           </w:tcPr>
@@ -446,26 +431,22 @@
             <w:r>
               <w:rPr>
                 <w:rFonts w:ascii="Arial" w:hAnsi="Arial"/>
-                <w:color w:val="0F172A"/>
                 <w:sz w:val="19"/>
               </w:rPr>
-              <w:t>MALAYSIAN</w:t>
+              <w:t>+60125065516</w:t>
             </w:r>
           </w:p>
         </w:tc>
       </w:tr>
       <w:tr>
-        <w:trPr>
-          <w:cantSplit/>
-        </w:trPr>
         <w:tc>
           <w:tcPr>
-            <w:tcW w:type="dxa" w:w="3024"/>
+            <w:tcW w:type="dxa" w:w="1728"/>
             <w:tcMar>
               <w:top w:w="60" w:type="dxa"/>
               <w:bottom w:w="60" w:type="dxa"/>
               <w:left w:w="0" w:type="dxa"/>
-              <w:right w:w="50" w:type="dxa"/>
+              <w:right w:w="20" w:type="dxa"/>
             </w:tcMar>
           </w:tcPr>
           <w:p>
@@ -479,13 +460,13 @@
                 <w:color w:val="475569"/>
                 <w:sz w:val="19"/>
               </w:rPr>
-              <w:t>Marital Status</w:t>
+              <w:t>Date of Birth</w:t>
             </w:r>
           </w:p>
         </w:tc>
         <w:tc>
           <w:tcPr>
-            <w:tcW w:type="dxa" w:w="288"/>
+            <w:tcW w:type="dxa" w:w="216"/>
             <w:tcMar>
               <w:top w:w="60" w:type="dxa"/>
               <w:bottom w:w="60" w:type="dxa"/>
@@ -509,12 +490,12 @@
         </w:tc>
         <w:tc>
           <w:tcPr>
-            <w:tcW w:type="dxa" w:w="6768"/>
+            <w:tcW w:type="dxa" w:w="3096"/>
             <w:tcMar>
               <w:top w:w="60" w:type="dxa"/>
               <w:bottom w:w="60" w:type="dxa"/>
-              <w:left w:w="50" w:type="dxa"/>
-              <w:right w:w="0" w:type="dxa"/>
+              <w:left w:w="20" w:type="dxa"/>
+              <w:right w:w="30" w:type="dxa"/>
             </w:tcMar>
           </w:tcPr>
           <w:p>
@@ -524,26 +505,20 @@
             <w:r>
               <w:rPr>
                 <w:rFonts w:ascii="Arial" w:hAnsi="Arial"/>
-                <w:color w:val="0F172A"/>
                 <w:sz w:val="19"/>
               </w:rPr>
-              <w:t>MARRIED</w:t>
+              <w:t>17th February 1987</w:t>
             </w:r>
           </w:p>
         </w:tc>
-      </w:tr>
-      <w:tr>
-        <w:trPr>
-          <w:cantSplit/>
-        </w:trPr>
         <w:tc>
           <w:tcPr>
-            <w:tcW w:type="dxa" w:w="3024"/>
+            <w:tcW w:type="dxa" w:w="1728"/>
             <w:tcMar>
               <w:top w:w="60" w:type="dxa"/>
               <w:bottom w:w="60" w:type="dxa"/>
-              <w:left w:w="0" w:type="dxa"/>
-              <w:right w:w="50" w:type="dxa"/>
+              <w:left w:w="20" w:type="dxa"/>
+              <w:right w:w="20" w:type="dxa"/>
             </w:tcMar>
           </w:tcPr>
           <w:p>
@@ -557,13 +532,13 @@
                 <w:color w:val="475569"/>
                 <w:sz w:val="19"/>
               </w:rPr>
-              <w:t>Point of Hire</w:t>
+              <w:t>Email Address</w:t>
             </w:r>
           </w:p>
         </w:tc>
         <w:tc>
           <w:tcPr>
-            <w:tcW w:type="dxa" w:w="288"/>
+            <w:tcW w:type="dxa" w:w="216"/>
             <w:tcMar>
               <w:top w:w="60" w:type="dxa"/>
               <w:bottom w:w="60" w:type="dxa"/>
@@ -587,11 +562,11 @@
         </w:tc>
         <w:tc>
           <w:tcPr>
-            <w:tcW w:type="dxa" w:w="6768"/>
+            <w:tcW w:type="dxa" w:w="3096"/>
             <w:tcMar>
               <w:top w:w="60" w:type="dxa"/>
               <w:bottom w:w="60" w:type="dxa"/>
-              <w:left w:w="50" w:type="dxa"/>
+              <w:left w:w="20" w:type="dxa"/>
               <w:right w:w="0" w:type="dxa"/>
             </w:tcMar>
           </w:tcPr>
@@ -602,26 +577,22 @@
             <w:r>
               <w:rPr>
                 <w:rFonts w:ascii="Arial" w:hAnsi="Arial"/>
-                <w:color w:val="0F172A"/>
                 <w:sz w:val="19"/>
               </w:rPr>
-              <w:t>PENANG, MALAYSIA</w:t>
+              <w:t>aminazman.inspection@gmail.com</w:t>
             </w:r>
           </w:p>
         </w:tc>
       </w:tr>
       <w:tr>
-        <w:trPr>
-          <w:cantSplit/>
-        </w:trPr>
         <w:tc>
           <w:tcPr>
-            <w:tcW w:type="dxa" w:w="3024"/>
+            <w:tcW w:type="dxa" w:w="1728"/>
             <w:tcMar>
               <w:top w:w="60" w:type="dxa"/>
               <w:bottom w:w="60" w:type="dxa"/>
               <w:left w:w="0" w:type="dxa"/>
-              <w:right w:w="50" w:type="dxa"/>
+              <w:right w:w="20" w:type="dxa"/>
             </w:tcMar>
           </w:tcPr>
           <w:p>
@@ -635,13 +606,13 @@
                 <w:color w:val="475569"/>
                 <w:sz w:val="19"/>
               </w:rPr>
-              <w:t>Contact No.</w:t>
+              <w:t>Nationality</w:t>
             </w:r>
           </w:p>
         </w:tc>
         <w:tc>
           <w:tcPr>
-            <w:tcW w:type="dxa" w:w="288"/>
+            <w:tcW w:type="dxa" w:w="216"/>
             <w:tcMar>
               <w:top w:w="60" w:type="dxa"/>
               <w:bottom w:w="60" w:type="dxa"/>
@@ -665,12 +636,12 @@
         </w:tc>
         <w:tc>
           <w:tcPr>
-            <w:tcW w:type="dxa" w:w="6768"/>
+            <w:tcW w:type="dxa" w:w="3096"/>
             <w:tcMar>
               <w:top w:w="60" w:type="dxa"/>
               <w:bottom w:w="60" w:type="dxa"/>
-              <w:left w:w="50" w:type="dxa"/>
-              <w:right w:w="0" w:type="dxa"/>
+              <w:left w:w="20" w:type="dxa"/>
+              <w:right w:w="30" w:type="dxa"/>
             </w:tcMar>
           </w:tcPr>
           <w:p>
@@ -680,26 +651,20 @@
             <w:r>
               <w:rPr>
                 <w:rFonts w:ascii="Arial" w:hAnsi="Arial"/>
-                <w:color w:val="0F172A"/>
                 <w:sz w:val="19"/>
               </w:rPr>
-              <w:t>+60125065516</w:t>
+              <w:t>MALAYSIAN</w:t>
             </w:r>
           </w:p>
         </w:tc>
-      </w:tr>
-      <w:tr>
-        <w:trPr>
-          <w:cantSplit/>
-        </w:trPr>
         <w:tc>
           <w:tcPr>
-            <w:tcW w:type="dxa" w:w="3024"/>
+            <w:tcW w:type="dxa" w:w="1728"/>
             <w:tcMar>
               <w:top w:w="60" w:type="dxa"/>
               <w:bottom w:w="60" w:type="dxa"/>
-              <w:left w:w="0" w:type="dxa"/>
-              <w:right w:w="50" w:type="dxa"/>
+              <w:left w:w="20" w:type="dxa"/>
+              <w:right w:w="20" w:type="dxa"/>
             </w:tcMar>
           </w:tcPr>
           <w:p>
@@ -713,13 +678,13 @@
                 <w:color w:val="475569"/>
                 <w:sz w:val="19"/>
               </w:rPr>
-              <w:t>Email Address</w:t>
+              <w:t>LinkedIn</w:t>
             </w:r>
           </w:p>
         </w:tc>
         <w:tc>
           <w:tcPr>
-            <w:tcW w:type="dxa" w:w="288"/>
+            <w:tcW w:type="dxa" w:w="216"/>
             <w:tcMar>
               <w:top w:w="60" w:type="dxa"/>
               <w:bottom w:w="60" w:type="dxa"/>
@@ -743,11 +708,11 @@
         </w:tc>
         <w:tc>
           <w:tcPr>
-            <w:tcW w:type="dxa" w:w="6768"/>
+            <w:tcW w:type="dxa" w:w="3096"/>
             <w:tcMar>
               <w:top w:w="60" w:type="dxa"/>
               <w:bottom w:w="60" w:type="dxa"/>
-              <w:left w:w="50" w:type="dxa"/>
+              <w:left w:w="20" w:type="dxa"/>
               <w:right w:w="0" w:type="dxa"/>
             </w:tcMar>
           </w:tcPr>
@@ -758,26 +723,22 @@
             <w:r>
               <w:rPr>
                 <w:rFonts w:ascii="Arial" w:hAnsi="Arial"/>
-                <w:color w:val="0F172A"/>
                 <w:sz w:val="19"/>
               </w:rPr>
-              <w:t>aminazman.inspection@gmail.com</w:t>
+              <w:t>linkedin.com/in/aminazman-inspection</w:t>
             </w:r>
           </w:p>
         </w:tc>
       </w:tr>
       <w:tr>
-        <w:trPr>
-          <w:cantSplit/>
-        </w:trPr>
         <w:tc>
           <w:tcPr>
-            <w:tcW w:type="dxa" w:w="3024"/>
+            <w:tcW w:type="dxa" w:w="1728"/>
             <w:tcMar>
               <w:top w:w="60" w:type="dxa"/>
               <w:bottom w:w="60" w:type="dxa"/>
               <w:left w:w="0" w:type="dxa"/>
-              <w:right w:w="50" w:type="dxa"/>
+              <w:right w:w="20" w:type="dxa"/>
             </w:tcMar>
           </w:tcPr>
           <w:p>
@@ -791,13 +752,13 @@
                 <w:color w:val="475569"/>
                 <w:sz w:val="19"/>
               </w:rPr>
-              <w:t>LinkedIn</w:t>
+              <w:t>Marital Status</w:t>
             </w:r>
           </w:p>
         </w:tc>
         <w:tc>
           <w:tcPr>
-            <w:tcW w:type="dxa" w:w="288"/>
+            <w:tcW w:type="dxa" w:w="216"/>
             <w:tcMar>
               <w:top w:w="60" w:type="dxa"/>
               <w:bottom w:w="60" w:type="dxa"/>
@@ -821,12 +782,12 @@
         </w:tc>
         <w:tc>
           <w:tcPr>
-            <w:tcW w:type="dxa" w:w="6768"/>
+            <w:tcW w:type="dxa" w:w="3096"/>
             <w:tcMar>
               <w:top w:w="60" w:type="dxa"/>
               <w:bottom w:w="60" w:type="dxa"/>
-              <w:left w:w="50" w:type="dxa"/>
-              <w:right w:w="0" w:type="dxa"/>
+              <w:left w:w="20" w:type="dxa"/>
+              <w:right w:w="30" w:type="dxa"/>
             </w:tcMar>
           </w:tcPr>
           <w:p>
@@ -836,26 +797,20 @@
             <w:r>
               <w:rPr>
                 <w:rFonts w:ascii="Arial" w:hAnsi="Arial"/>
-                <w:color w:val="0F172A"/>
                 <w:sz w:val="19"/>
               </w:rPr>
-              <w:t>linkedin.com/in/aminazman-inspection</w:t>
+              <w:t>MARRIED</w:t>
             </w:r>
           </w:p>
         </w:tc>
-      </w:tr>
-      <w:tr>
-        <w:trPr>
-          <w:cantSplit/>
-        </w:trPr>
         <w:tc>
           <w:tcPr>
-            <w:tcW w:type="dxa" w:w="3024"/>
+            <w:tcW w:type="dxa" w:w="1728"/>
             <w:tcMar>
               <w:top w:w="60" w:type="dxa"/>
               <w:bottom w:w="60" w:type="dxa"/>
-              <w:left w:w="0" w:type="dxa"/>
-              <w:right w:w="50" w:type="dxa"/>
+              <w:left w:w="20" w:type="dxa"/>
+              <w:right w:w="20" w:type="dxa"/>
             </w:tcMar>
           </w:tcPr>
           <w:p>
@@ -875,7 +830,7 @@
         </w:tc>
         <w:tc>
           <w:tcPr>
-            <w:tcW w:type="dxa" w:w="288"/>
+            <w:tcW w:type="dxa" w:w="216"/>
             <w:tcMar>
               <w:top w:w="60" w:type="dxa"/>
               <w:bottom w:w="60" w:type="dxa"/>
@@ -899,11 +854,11 @@
         </w:tc>
         <w:tc>
           <w:tcPr>
-            <w:tcW w:type="dxa" w:w="6768"/>
+            <w:tcW w:type="dxa" w:w="3096"/>
             <w:tcMar>
               <w:top w:w="60" w:type="dxa"/>
               <w:bottom w:w="60" w:type="dxa"/>
-              <w:left w:w="50" w:type="dxa"/>
+              <w:left w:w="20" w:type="dxa"/>
               <w:right w:w="0" w:type="dxa"/>
             </w:tcMar>
           </w:tcPr>
@@ -914,7 +869,6 @@
             <w:r>
               <w:rPr>
                 <w:rFonts w:ascii="Arial" w:hAnsi="Arial"/>
-                <w:color w:val="0F172A"/>
                 <w:sz w:val="19"/>
               </w:rPr>
               <w:t>tinyurl.com/aminazman-inspection</w:t>
@@ -923,6 +877,7 @@
         </w:tc>
       </w:tr>
     </w:tbl>
+    <w:p/>
     <w:p>
       <w:pPr>
         <w:keepNext/>

</xml_diff>